<commit_message>
Restrict literature review to 2019+ citations with verified recent references
Co-authored-by: Bit Raven <bitraveneth@users.noreply.github.com>
</commit_message>
<xml_diff>
--- a/thesis/Literature_Review_Gumai_Beel_Ichamoti_HEC-HMS.docx
+++ b/thesis/Literature_Review_Gumai_Beel_Ichamoti_HEC-HMS.docx
@@ -105,7 +105,7 @@
         <w:jc w:val="left"/>
       </w:pPr>
       <w:r>
-        <w:t>This chapter reviews the body of scientific literature that underpins the present study, which develops a rainfall–runoff model of the Gumai Beel catchment within the Ichamoti River system of Pabna District, Bangladesh, using the Hydrologic Engineering Center’s Hydrologic Modeling System (HEC-HMS). The review is organized to move from the general to the particular. It begins with the conceptual foundations of rainfall–runoff processes and the classification of hydrological models, and then examines the structure of the HEC-HMS framework and the scientific basis of its principal computational methods. Subsequent sections review the role of geographic information systems (GIS) and remote sensing in supplying model inputs, survey applications of HEC-HMS across diverse hydro-climatic regions, and narrow the focus to hydrological modeling experience in Bangladesh. Because the study area is not an ordinary upland catchment but a low-lying floodplain wetland (beel) drained by a moribund distributary of the Padma River, a dedicated section reviews the hydrology of beel and floodplain-wetland systems, the anthropogenic decline of the Ichamoti River, and the chronic drainage congestion of the Pabna region. The chapter then reviews accepted standards for model calibration, validation, and performance evaluation, and closes with a synthesis that identifies the research gap this thesis addresses.</w:t>
+        <w:t>This chapter reviews the recent body of scientific literature—published from 2019 onward—that underpins the present study, which develops a rainfall–runoff model of the Gumai Beel catchment within the Ichamoti River system of Pabna District, Bangladesh, using the Hydrologic Engineering Center’s Hydrologic Modeling System (HEC-HMS). Restricting the review to the most recent literature serves two purposes: it ensures that the methodological choices of this thesis reflect the current state of practice rather than superseded conventions, and it captures the newest generation of data products, evaluation standards, and regional studies that older reviews necessarily omit. The review is organized to move from the general to the particular. It begins with the conceptual foundations of rainfall–runoff modeling and the contemporary debate on model selection, and then examines the structure of the HEC-HMS framework and the scientific basis of its principal computational methods. Subsequent sections review the role of geographic information systems (GIS) and remote sensing in supplying model inputs, survey recent applications of HEC-HMS across diverse hydro-climatic regions, and narrow the focus to hydrological modeling experience in Bangladesh. Because the study area is not an ordinary upland catchment but a low-lying floodplain wetland (beel) drained by a moribund distributary of the Padma River, a dedicated section reviews the hydrology of beel and floodplain-wetland systems, the anthropogenic decline of the Ichamoti River, and the chronic drainage congestion of the Pabna region. The chapter then reviews current standards for model calibration, validation, and performance evaluation, and closes with a synthesis that identifies the research gap this thesis addresses.</w:t>
       </w:r>
     </w:p>
     <w:p>
@@ -122,7 +122,7 @@
         <w:rPr>
           <w:b/>
         </w:rPr>
-        <w:t>2.2 Rainfall–Runoff Processes and the Classification of Hydrological Models</w:t>
+        <w:t>2.2 Rainfall–Runoff Processes and the Selection of Hydrological Models</w:t>
       </w:r>
     </w:p>
     <w:p>
@@ -131,7 +131,7 @@
         <w:jc w:val="left"/>
       </w:pPr>
       <w:r>
-        <w:t>The transformation of rainfall into streamflow is the central problem of applied hydrology. Precipitation falling on a catchment is partitioned among interception, depression storage, infiltration, evapotranspiration, soil-moisture replenishment, and surface runoff, and the runoff component is subsequently translated and attenuated as it travels over hillslopes and through channel networks to the catchment outlet (Chow et al., 1988). Because direct measurement of each of these processes at the catchment scale is impossible, hydrologists rely on mathematical models that represent the catchment as a system converting an input hyetograph into an output hydrograph. Singh and Woolhiser (2002), in a comprehensive review of watershed modeling, traced the evolution of such models from the rational method and unit hydrograph theory of the early twentieth century to the distributed, physics-based codes of the modern era, and observed that model complexity must always be balanced against data availability and the purpose of the simulation.</w:t>
+        <w:t>The transformation of rainfall into streamflow remains the central problem of applied hydrology. Precipitation falling on a catchment is partitioned among interception, depression storage, infiltration, evapotranspiration, soil-moisture replenishment, and surface runoff, and the runoff component is subsequently translated and attenuated as it travels over hillslopes and through channel networks to the catchment outlet. Because direct measurement of each of these processes at the catchment scale is impossible, hydrologists rely on mathematical models that represent the catchment as a system converting an input hyetograph into an output hydrograph. The contemporary modeling landscape is characterized by an overwhelming diversity of such models. Horton et al. (2022), in a systematic review of the drivers of model diversification, showed that the coexistence of empirical, conceptual, and physically based models—and of lumped, semi-distributed, and fully distributed spatial structures—reflects not only genuine differences in application context but also institutional habit, and they observed that the motivations for selecting a particular model are rarely stated explicitly in published studies. Their central recommendation, that model choice be justified by the adequacy of the model for the landscape, the data, and the purpose at hand, frames the model-selection reasoning of this thesis.</w:t>
       </w:r>
     </w:p>
     <w:p>
@@ -140,7 +140,7 @@
         <w:jc w:val="left"/>
       </w:pPr>
       <w:r>
-        <w:t>Hydrological models are conventionally classified along two axes. The first concerns the treatment of process representation: empirical (or metric) models relate input to output through statistically fitted relationships with no claim to physical realism; conceptual models represent the catchment as a series of interconnected conceptual storages whose behavior mimics physical processes; and physically based models solve equations of mass, momentum, and energy conservation with parameters that are, in principle, measurable (Devia et al., 2015). The second axis concerns spatial discretization: lumped models treat the catchment as a single homogeneous unit, semi-distributed models divide it into sub-basins within which parameters are lumped, and fully distributed models resolve the catchment on a regular grid (Beven, 2012). No single position in this classification space is universally superior. Physically based distributed models offer the richest process description but demand data that rarely exist in developing-country catchments, and their many degrees of freedom can produce an illusion of realism that the available observations cannot constrain (Beven, 2012). Conceptual semi-distributed models, by contrast, require modest data, are computationally inexpensive, and have repeatedly been shown to reproduce observed hydrographs with accuracy sufficient for planning and design purposes (Devia et al., 2015; Singh &amp; Woolhiser, 2002).</w:t>
+        <w:t>For data-scarce developing-country catchments, the practical comparison is usually between conceptual semi-distributed systems such as HEC-HMS and more heavily parameterized ecohydrological models such as the Soil and Water Assessment Tool (SWAT). Recent head-to-head evaluations illuminate the trade-off. Aliye et al. (2020), comparing the two models for a data-scarce catchment of the Ethiopian Rift Valley Lakes basin, found both capable of credible streamflow simulation. Moniruzzaman and Mahalder (2026), performing the same comparison for the Atrai–Karatoa basin of northern Bangladesh, found that SWAT better reproduced high flows while HEC-HMS was more accurate for medium flows, with both models performing satisfactorily overall. These results indicate that HEC-HMS remains a defensible choice where the modeling objective centers on runoff-hydrograph generation rather than on sediment, nutrient, or land-management simulation, and where its far smaller parameter set suits the available data.</w:t>
       </w:r>
     </w:p>
     <w:p>
@@ -149,16 +149,7 @@
         <w:jc w:val="left"/>
       </w:pPr>
       <w:r>
-        <w:t>A further operational distinction separates event-based from continuous simulation. Event-based modeling simulates the catchment response to an individual storm and is appropriate for design-flood estimation and flood forecasting, whereas continuous modeling tracks moisture accounting through wet and dry periods over months or years and is appropriate for water-balance and water-resources assessment (Chu &amp; Steinman, 2009). Chu and Steinman (2009) demonstrated, for the Mona Lake watershed in Michigan, that the two modes are complementary: parameters identified through fine-time-step event calibration can be transferred to a coarse-time-step continuous model, improving its reliability where long-term intensive monitoring data are unavailable. This complementarity is directly relevant to the present study, in which monsoon-season runoff events superimposed on a strongly seasonal water balance govern the inundation behavior of the Gumai Beel.</w:t>
-      </w:r>
-    </w:p>
-    <w:p>
-      <w:pPr>
-        <w:ind w:firstLine="720"/>
-        <w:jc w:val="left"/>
-      </w:pPr>
-      <w:r>
-        <w:t>For a data-scarce, monsoon-dominated floodplain catchment such as the study area, the literature therefore points toward a conceptual, semi-distributed modeling strategy capable of both event and continuous operation. Among the freely available modeling systems that satisfy these criteria, HEC-HMS has become one of the most widely adopted worldwide, and the following section reviews its structure and methods in detail.</w:t>
+        <w:t>A further operational distinction separates event-based from continuous simulation. Event-based modeling simulates the catchment response to individual storms and is appropriate for design-flood estimation and flood forecasting; recent applications include the daily event-oriented modeling of the Al-Adhaim catchment in Iraq (Hamdan et al., 2021) and the flood-risk simulations of the Gumara River in Ethiopia (Admas et al., 2025). Continuous modeling, by contrast, tracks moisture accounting through wet and dry periods over months or years using algorithms such as the soil moisture accounting (SMA) loss method, as in the multi-year simulation of the Brahmaputra basin by Jawad (2024) and the climate-scenario modeling of the same basin by S. Haque et al. (2020). The inundation behavior of the Gumai Beel is governed both by individual monsoon storm events and by the strongly seasonal water balance, so the present study requires a modeling system capable of both modes, a requirement that HEC-HMS satisfies within a single framework (U.S. Army Corps of Engineers [USACE], n.d.).</w:t>
       </w:r>
     </w:p>
     <w:p>
@@ -184,7 +175,7 @@
         <w:jc w:val="left"/>
       </w:pPr>
       <w:r>
-        <w:t>HEC-HMS was developed by the Hydrologic Engineering Center of the U.S. Army Corps of Engineers as the successor to the HEC-1 flood hydrograph package, and it is designed to simulate the complete precipitation–runoff process of dendritic watershed systems (U.S. Army Corps of Engineers [USACE], 2000). A HEC-HMS project comprises three principal components: a basin model, which describes the physical catchment as a network of sub-basins, reaches, junctions, reservoirs, diversions, sources, and sinks; a meteorological model, which assigns precipitation and evapotranspiration boundary conditions to the sub-basins; and control specifications, which define the simulation window and time step (USACE, 2000). Within each sub-basin, the user selects one method from each of several interchangeable libraries—canopy and surface storage, loss (infiltration), direct-runoff transform, and baseflow—while each reach is assigned a channel-routing method. This modular architecture is the principal reason for the model’s versatility: the same software can be configured as a simple event-based lumped model or as a gridded, continuous, semi-distributed model. The program is in the public domain, is supported by extensive documentation, and integrates with GIS-based terrain preprocessing tools (Fleming &amp; Doan, 2013), all of which explain its popularity in regions where commercial modeling systems are unaffordable (Oleyiblo &amp; Li, 2010).</w:t>
+        <w:t>HEC-HMS was developed by the Hydrologic Engineering Center of the U.S. Army Corps of Engineers to simulate the complete precipitation–runoff process of dendritic watershed systems (USACE, n.d.). A HEC-HMS project comprises three principal components: a basin model, which describes the physical catchment as a network of sub-basins, reaches, junctions, reservoirs, diversions, sources, and sinks; a meteorological model, which assigns precipitation and evapotranspiration boundary conditions to the sub-basins; and control specifications, which define the simulation window and time step (USACE, n.d.). Within each sub-basin, the user selects one method from each of several interchangeable libraries—canopy and surface storage, loss (infiltration), direct-runoff transform, and baseflow—while each reach is assigned a channel-routing method. This modular architecture is the principal reason for the model’s versatility: the same software can be configured as a simple event-based lumped model or as a continuous, semi-distributed model. The program is in the public domain, is supported by extensive online documentation, and integrates with GIS-based terrain preprocessing, all of which explain its wide adoption in regions where commercial modeling systems are unaffordable (Hamdan et al., 2021; Tassew et al., 2019).</w:t>
       </w:r>
     </w:p>
     <w:p>
@@ -202,7 +193,7 @@
         <w:jc w:val="left"/>
       </w:pPr>
       <w:r>
-        <w:t>The loss model determines how much of the incident rainfall infiltrates or is otherwise abstracted, and therefore how much becomes precipitation excess available for direct runoff. The most widely used loss method in HEC-HMS applications is the Soil Conservation Service Curve Number (SCS-CN) method, developed by the U.S. Department of Agriculture from empirical analysis of small agricultural watersheds (USDA Soil Conservation Service, 1985). The method condenses the combined influence of soil hydrologic group, land use and treatment, surface condition, and antecedent moisture into a single dimensionless parameter, the curve number (CN), which varies between 0 and 100. Its appeal lies in its simplicity, its modest data requirements, and its direct linkage to mappable catchment properties, which allows CN values to be estimated for ungauged areas from land-cover and soil maps (Mishra &amp; Singh, 2003). The method has also attracted sustained critique. Ponce and Hawkins (1996), in a widely cited appraisal, concluded that while the method is well established for event-scale runoff estimation on agricultural catchments, its lack of an explicit time dimension and its sensitivity to antecedent moisture demand caution, particularly outside the range of conditions for which it was derived. Mishra and Singh (2003) provided a comprehensive theoretical re-derivation of the method and catalogued numerous modifications intended to extend its validity.</w:t>
+        <w:t>The loss model determines how much of the incident rainfall infiltrates or is otherwise abstracted, and therefore how much becomes precipitation excess available for direct runoff. The most widely used loss method in recent HEC-HMS applications remains the Soil Conservation Service Curve Number (SCS-CN) method, which condenses the combined influence of soil hydrologic group, land use, surface condition, and antecedent moisture into a single dimensionless parameter, the curve number (CN). Soulis (2021), reviewing the current state of the method more than six decades after its introduction, attributed its enduring dominance to its simplicity, its well-documented and easily obtained inputs, and its direct linkage to mappable catchment properties, while cataloguing the challenges that remain active research topics: the appropriate value of the initial abstraction ratio, the treatment of watershed slope, the representation of antecedent moisture, and the transfer of tabulated CN values to regions and land covers beyond those for which the method was derived. Notably, several studies reviewed by Soulis (2021) found that the conventional initial abstraction ratio of 0.2 substantially overestimates initial losses, with locally calibrated values often below 0.05, a finding directly relevant to CN calibration bounds in the present study.</w:t>
       </w:r>
     </w:p>
     <w:p>
@@ -211,7 +202,7 @@
         <w:jc w:val="left"/>
       </w:pPr>
       <w:r>
-        <w:t>HEC-HMS offers several alternatives to the SCS-CN approach, including the initial-and-constant loss method, the deficit-and-constant method, the Green–Ampt infiltration model, and, for continuous simulation, the five-layer soil moisture accounting (SMA) algorithm (USACE, 2000). The empirical evidence indicates that no loss method is universally best and that the choice must be tested against local data. Halwatura and Najim (2013), calibrating HEC-HMS 3.4 for the tropical Attanagalu Oya catchment in Sri Lanka, found that the deficit-and-constant loss method outperformed the SCS-CN method, which they reported to perform poorly for their wet-zone catchment. Conversely, Gilewski and Nawalany (2018) found the SCS-CN method to perform best for flood events with unimodal temporal distributions in a mountainous Polish catchment, and Tassew et al. (2019) obtained very good performance with the SCS-CN method in the monsoonal Gilgel Abay catchment of Ethiopia. For continuous applications, Chu and Steinman (2009) paired the SCS-CN method for event simulation with the SMA method for continuous simulation of the same watershed, illustrating how the two can be used in tandem. These mixed findings justify the comparative testing of loss methods that is undertaken in the methodology of the present study.</w:t>
+        <w:t>HEC-HMS offers several alternatives to the SCS-CN approach, including the initial-and-constant and deficit-and-constant loss methods, the Green–Ampt infiltration model, and, for continuous simulation, the five-layer SMA algorithm (USACE, n.d.). Recent empirical evidence indicates that the SCS-CN method performs well in monsoonal and semi-arid event simulation: Tassew et al. (2019) obtained very good performance with it in the Gilgel Abay catchment of Ethiopia, and Hamdan et al. (2021) reached the same conclusion for the Al-Adhaim catchment in Iraq. For continuous multi-year simulation, the SMA method is preferred, as in the Brahmaputra applications of Jawad (2024) and S. Haque et al. (2020). Equally consistent is the finding that the curve number is the single most sensitive parameter of the model: Tassew et al. (2019) identified CN as the controlling parameter in formal sensitivity analysis, and M. B. Haque et al. (2024) found the runoff–rainfall relationship of the Halda catchment to be highly sensitive to sub-basin CN values, which depend directly on the land-use classification. These findings justify the comparative testing of loss methods and the careful CN estimation undertaken in the methodology of this thesis.</w:t>
       </w:r>
     </w:p>
     <w:p>
@@ -229,7 +220,7 @@
         <w:jc w:val="left"/>
       </w:pPr>
       <w:r>
-        <w:t>The transform model converts precipitation excess into a direct-runoff hydrograph at the sub-basin outlet. Most HEC-HMS applications employ unit-hydrograph theory, of which three synthetic variants dominate: the SCS dimensionless unit hydrograph, parameterized by basin lag time; the Clark unit hydrograph, which combines a time–area histogram with a linear-reservoir storage coefficient to represent translation and attenuation separately; and the Snyder unit hydrograph, an empirical method parameterized by lag and peaking coefficients (Chow et al., 1988; USACE, 2000). Comparative evidence again indicates that the appropriate choice is catchment specific. Halwatura and Najim (2013) reported that the Snyder unit hydrograph simulated flows more reliably than the Clark unit hydrograph in their tropical catchment, while the SCS unit hydrograph combined with the SCS-CN loss model has been the most frequently adopted configuration in South Asian and African applications (Nujhat et al., 2024; Tassew et al., 2019). For very flat catchments, lag-time estimation deserves particular care because empirical lag equations were developed predominantly for sloping terrain, and misestimated lag propagates directly into errors in peak timing (Chow et al., 1988).</w:t>
+        <w:t>The transform model converts precipitation excess into a direct-runoff hydrograph at the sub-basin outlet. Most applications employ unit-hydrograph theory, for which HEC-HMS provides the SCS dimensionless unit hydrograph, parameterized by basin lag time; the Clark unit hydrograph, which combines a time–area histogram with a linear-reservoir storage coefficient; and the Snyder unit hydrograph, among others (USACE, n.d.). The SCS unit hydrograph paired with SCS-CN losses constitutes the dominant configuration in the recent application literature across Africa, the Middle East, and South Asia (Hamdan et al., 2021; Nujhat et al., 2024; Tassew et al., 2019), while the Clark formulation has been preferred in some continuous large-basin applications (Jawad, 2024). For very flat catchments such as the study area, lag-time estimation deserves particular care, because empirical lag equations were developed predominantly for sloping terrain and misestimated lag propagates directly into errors in simulated peak timing; the calibration of time-of-concentration and storage parameters was accordingly a central element of the optimization strategies reported by Jawad (2024) and Admas et al. (2025).</w:t>
       </w:r>
     </w:p>
     <w:p>
@@ -247,7 +238,7 @@
         <w:jc w:val="left"/>
       </w:pPr>
       <w:r>
-        <w:t>Baseflow representation is frequently the weakest element of event-oriented models, yet in floodplain-wetland systems the slow drainage component can dominate the recession limb and the dry-season water balance. HEC-HMS provides recession, bounded-recession, linear-reservoir, and constant-monthly baseflow methods (USACE, 2000). Experience in Bangladesh suggests that baseflow is a genuine difficulty: M. B. Haque et al. (2024), modeling the Halda River catchment, obtained satisfactory overall statistics but reported a poor match for the baseflow portion of the hydrograph during calibration, which they attributed to unrepresented groundwater–surface water exchange, and they recommended coupling with a groundwater model as a route to improvement. Such findings caution against interpreting event-calibrated models as complete descriptions of low-flow behavior, a caution of particular force in beel environments where monsoon storage is released gradually through the post-monsoon season.</w:t>
+        <w:t>Baseflow representation is frequently the weakest element of event-oriented models, yet in floodplain-wetland systems the slow drainage component can dominate the recession limb and the dry-season water balance. HEC-HMS provides recession, bounded-recession, linear-reservoir, and constant-monthly baseflow methods (USACE, n.d.); the linear-reservoir method with two groundwater layers was adopted in the continuous Brahmaputra modeling of Jawad (2024). Recent Bangladeshi experience suggests that baseflow is a genuine difficulty: M. B. Haque et al. (2024), modeling the Halda River catchment, obtained satisfactory overall statistics but reported a poor match for the baseflow portion of the hydrograph during calibration, which they attributed to unrepresented groundwater–surface water exchange, and they recommended coupling with a groundwater model as a route to improvement. Such findings caution against interpreting event-calibrated models as complete descriptions of low-flow behavior, a caution of particular force in beel environments where monsoon storage is released gradually through the post-monsoon season.</w:t>
       </w:r>
     </w:p>
     <w:p>
@@ -256,7 +247,7 @@
           <w:b/>
           <w:i/>
         </w:rPr>
-        <w:t>2.3.5 Channel Routing Methods</w:t>
+        <w:t>2.3.5 Channel Routing and Hydraulic Coupling</w:t>
       </w:r>
     </w:p>
     <w:p>
@@ -265,7 +256,7 @@
         <w:jc w:val="left"/>
       </w:pPr>
       <w:r>
-        <w:t>Flow routing through reaches is available in HEC-HMS through the Muskingum, Muskingum–Cunge, kinematic-wave, modified-Puls, and lag methods (USACE, 2000). The Muskingum method, which represents a reach as a linear storage with travel-time parameter K and weighting parameter X, remains the most commonly adopted in applications comparable to the present study (Nujhat et al., 2024; Tassew et al., 2019). Its limitation—shared by all hydrologic routing schemes—is that it cannot represent backwater effects, flow reversal, or looped stage–discharge relations, which are common in extremely flat deltaic channels. Where such hydraulic effects matter, the literature couples HEC-HMS with a hydraulic model: Knebl et al. (2005) demonstrated an influential framework in which HEC-HMS-derived hydrographs drive unsteady HEC-RAS simulation for floodplain mapping of the San Antonio River basin. An analogous coupling represents a natural extension of the present work, given that drainage of the Gumai Beel is partly controlled by water levels in the receiving Ichamoti channel rather than by catchment runoff alone.</w:t>
+        <w:t>Flow routing through reaches is available in HEC-HMS through the Muskingum, Muskingum–Cunge, kinematic-wave, modified-Puls, and lag methods (USACE, n.d.). The Muskingum method, which represents a reach as a linear storage with travel-time parameter K and weighting parameter X, remains the most commonly adopted in applications comparable to the present study (Hamdan et al., 2021; Nujhat et al., 2024; Tassew et al., 2019). Its limitation—shared by all hydrologic routing schemes—is that it cannot represent backwater effects, flow reversal, or looped stage–discharge relations, which are common in extremely flat deltaic channels. Where such hydraulic effects matter, the recent literature couples HEC-HMS with the HEC-RAS hydraulic model: Admas et al. (2025) drove HEC-RAS flood-risk simulations of the Gumara River floodplain in Ethiopia with HEC-HMS hydrographs to quantify inundation for return periods up to 100 years, and Jawad (2024) coupled the two models to map flood inundation along the lowermost 500 km of the Brahmaputra. An analogous coupling represents a natural extension of the present work, given that drainage of the Gumai Beel is partly controlled by water levels in the receiving Ichamoti channel rather than by catchment runoff alone.</w:t>
       </w:r>
     </w:p>
     <w:p>
@@ -291,7 +282,7 @@
         <w:jc w:val="left"/>
       </w:pPr>
       <w:r>
-        <w:t>Semi-distributed modeling begins with terrain analysis: delineation of sub-basins and stream networks from a digital elevation model (DEM), and extraction of physiographic parameters such as area, slope, and longest flow path. The Shuttle Radar Topography Mission (SRTM) provided the first near-global, freely available elevation dataset and remains the most widely used DEM in developing-country hydrology (Farr et al., 2007). The GIS companion tools of HEC-HMS, notably the HEC-GeoHMS extension and its successors integrated into recent program versions, automate terrain preprocessing, basin processing, and the assembly of basin-model files (Fleming &amp; Doan, 2013; Oleyiblo &amp; Li, 2010). The reliability of automated delineation, however, degrades precisely in the terrain type of the present study: low-relief floodplains. Datta et al. (2022), working on the Halda watershed in Bangladesh, showed systematically that delineation outcomes depend materially on the choice of DEM product, its spatial resolution, and the stream-definition area threshold, and that these choices propagate into sub-basin geometry and derived parameters. In flat deltaic terrain, where total relief may be only a few meters and anthropogenic features such as roads and embankments control actual flow paths, DEM vertical error can exceed the topographic signal, and the literature therefore recommends verification of automatically delineated drainage against field knowledge and hydrographic maps (Datta et al., 2022). This consideration is central to the delineation strategy adopted in Chapter 3 of this thesis.</w:t>
+        <w:t>Semi-distributed modeling begins with terrain analysis: delineation of sub-basins and stream networks from a digital elevation model (DEM), and extraction of physiographic parameters such as area, slope, and longest flow path. A growing family of freely available global DEMs—SRTM, NASADEM, ASTER, AW3D30, MERIT, and TanDEM-X—now competes for this role, and their quality differences are material. Uuemaa et al. (2020), in a systematic multi-region accuracy assessment against LiDAR references, found vertical accuracy to vary strongly among products and identified terrain slope as the dominant control on DEM error, with AW3D30 the most robust performer overall and NASADEM only marginally improving on SRTM. The reliability of automated delineation degrades precisely in the terrain type of the present study: low-relief floodplains. Datta et al. (2022), working on the Halda watershed in Bangladesh, showed systematically that delineation outcomes depend materially on the choice of DEM product, its spatial resolution, and the stream-definition area threshold, and that these choices propagate into sub-basin geometry and derived parameters. In flat deltaic terrain, where total relief may be only a few meters and anthropogenic features such as roads and embankments control actual flow paths, DEM vertical error can exceed the topographic signal, and the literature therefore recommends verification of automatically delineated drainage against field knowledge and hydrographic maps (Datta et al., 2022). This consideration is central to the delineation strategy adopted in Chapter 3 of this thesis.</w:t>
       </w:r>
     </w:p>
     <w:p>
@@ -309,7 +300,7 @@
         <w:jc w:val="left"/>
       </w:pPr>
       <w:r>
-        <w:t>Loss-model parameterization in ungauged or sparsely gauged basins rests on thematic mapping. The standard workflow intersects a land-use/land-cover (LULC) classification, commonly derived from Landsat or Sentinel-2 imagery, with a hydrologic soil group map derived from soil surveys, and assigns composite curve numbers to each sub-basin through standard lookup tables (Fleming &amp; Doan, 2013; USDA Soil Conservation Service, 1985). Applications across climates confirm both the practicality and the sensitivity of this workflow: Tassew et al. (2019) identified the curve number as the single most sensitive parameter of their model, and M. B. Haque et al. (2024) likewise found the runoff–rainfall relationship to be highly sensitive to sub-basin CN values, which depend directly on the LULC classification. These findings imply that LULC accuracy assessment and CN calibration bounds deserve explicit attention in the present study, particularly because beel environments exhibit strong seasonal alternation between open water, cropped land, and marsh vegetation that a single-date LULC classification cannot capture.</w:t>
+        <w:t>Loss-model parameterization in ungauged or sparsely gauged basins rests on thematic mapping. The standard workflow intersects a land-use/land-cover (LULC) classification, commonly derived from Landsat or Sentinel-2 imagery, with a hydrologic soil group map derived from soil surveys or global databases, and assigns composite curve numbers to each sub-basin through standard lookup tables (Hamdan et al., 2021; Soulis, 2021). Applications across climates confirm both the practicality and the sensitivity of this workflow: Tassew et al. (2019) identified the curve number as the single most sensitive parameter of their model, and M. B. Haque et al. (2024) likewise found simulated runoff to be highly sensitive to sub-basin CN values, which depend directly on the LULC classification. Remote sensing also documents the pace of land-cover change in Bangladeshi wetland environments: Bhattacharjee et al. (2021), analyzing three decades of Landsat imagery over a northeastern wetland (haor) system, quantified substantial conversion of wetland and vegetation classes to agriculture and settlement. These findings imply that LULC currency and accuracy assessment deserve explicit attention in the present study, particularly because beel environments exhibit strong seasonal alternation between open water, cropped land, and marsh vegetation that a single-date classification cannot capture.</w:t>
       </w:r>
     </w:p>
     <w:p>
@@ -327,7 +318,7 @@
         <w:jc w:val="left"/>
       </w:pPr>
       <w:r>
-        <w:t>Precipitation is the dominant control on simulated runoff, and its estimation is a major source of uncertainty where gauge networks are sparse. Three families of alternatives to gauge interpolation have matured over the past two decades: ground-based weather radar, satellite multi-sensor products such as the Integrated Multi-satellitE Retrievals for Global Precipitation Measurement (IMERG), and atmospheric reanalyses such as ERA5 (Hersbach et al., 2020). The Climate Hazards Group InfraRed Precipitation with Station data (CHIRPS) offers a long quasi-global record blending satellite estimates with station observations, designed expressly for data-sparse regions (Funk et al., 2015). Gilewski and Nawalany (2018) compared rain-gauge, adjusted-radar, and IMERG forcing of an HEC-HMS model and found that adjusted radar and IMERG were the most reliable sources for event-based modeling, while emphasizing that the model must be recalibrated separately for each forcing because the spatial and temporal structure of rainfall significantly affects parameter estimates. In Bangladesh, ERA5 forcing has been used successfully where Bangladesh Meteorological Department gauge records are sparse or discontinuous (M. B. Haque et al., 2024). For the present study, which can draw on Bangladesh Water Development Board (BWDB) and Bangladesh Meteorological Department gauges in and around Pabna, the literature supports a strategy of gauge-primary forcing with satellite or reanalysis products used for gap filling and consistency checking.</w:t>
+        <w:t>Precipitation is the dominant control on simulated runoff, and its estimation is a major source of uncertainty where gauge networks are sparse. Two families of alternatives to gauge interpolation have matured over the past decade: satellite multi-sensor products, foremost the Integrated Multi-satellitE Retrievals for GPM (IMERG), and atmospheric reanalyses, foremost ERA5 (Hersbach et al., 2020). Pradhan et al. (2022), in a global systematic review of IMERG validation studies, concluded that the product reliably captures regional precipitation patterns and improves with every version, while performing better at monthly than at daily and sub-daily scales and retaining known weaknesses for extreme intensities and complex terrain—weaknesses that matter for flood-oriented applications. In hydrological practice, satellite precipitation has proven usable even for operational simulation of very large, sparsely gauged basins: Jawad (2024) forced coupled HEC-HMS–HEC-RAS models of the Brahmaputra with near-real-time IMERG and GSMaP products, gauge-corrected where possible, and obtained credible discharge and inundation simulations at Bahadurabad. For the present study, which can draw on Bangladesh Water Development Board and Bangladesh Meteorological Department gauges in and around Pabna, this literature supports a strategy of gauge-primary forcing with reanalysis or satellite products used for gap filling and consistency checking (Hersbach et al., 2020; Pradhan et al., 2022).</w:t>
       </w:r>
     </w:p>
     <w:p>
@@ -335,7 +326,7 @@
         <w:rPr>
           <w:b/>
         </w:rPr>
-        <w:t>2.5 Applications of HEC-HMS Across Diverse Hydro-Climatic Regions</w:t>
+        <w:t>2.5 Recent Applications of HEC-HMS Across Diverse Hydro-Climatic Regions</w:t>
       </w:r>
     </w:p>
     <w:p>
@@ -344,7 +335,7 @@
         <w:jc w:val="left"/>
       </w:pPr>
       <w:r>
-        <w:t>The international literature on HEC-HMS applications is extensive, and a selective review of methodologically instructive studies is presented here; Table 2.1 summarizes their essential characteristics. In the United States, Knebl et al. (2005) established the template for regional-scale flood modeling by integrating NEXRAD radar rainfall, GIS preprocessing, HEC-HMS runoff simulation, and HEC-RAS hydraulic routing across the roughly 10,000 km² San Antonio River basin for the severe summer 2002 storm, demonstrating that manually calibrated sub-basin parameters could reproduce discharge at twelve interior points and support credible floodplain mapping. Chu and Steinman (2009) contributed the joint event–continuous calibration strategy described in Section 2.2. In China, Oleyiblo and Li (2010) applied HEC-HMS with HEC-GeoHMS terrain preprocessing to the Misai and Wan’an catchments and reported determination coefficients above 0.9 for all simulated flood events, with peak-discharge errors within acceptable forecasting limits, concluding that the model was suitable for flood forecasting in humid subtropical catchments.</w:t>
+        <w:t>The post-2019 application literature on HEC-HMS is extensive, and a selective review of methodologically instructive studies is presented here; Table 2.1 summarizes their essential characteristics. In Africa, Tassew et al. (2019) calibrated an event-based model of the 1,609 km² Gilgel Abay catchment in the Lake Tana basin of Ethiopia using the SCS-CN, SCS unit hydrograph, and Muskingum methods, achieving a Nash–Sutcliffe efficiency (NSE) of 0.884 and a coefficient of determination of 0.925, with sensitivity analysis identifying the curve number as the controlling parameter. Aliye et al. (2020) compared HEC-HMS and SWAT for a data-scarce catchment of the Ethiopian Rift Valley Lakes basin, finding both models applicable and thereby establishing HEC-HMS as a viable lightweight alternative to more heavily parameterized systems. Admas et al. (2025) extended the Ethiopian experience to integrated flood-risk analysis, coupling HEC-HMS design hydrographs with HEC-RAS hydraulics for the Gumara River floodplain and quantifying the inundation reduction achieved by dyke construction for return periods from 2 to 100 years.</w:t>
       </w:r>
     </w:p>
     <w:p>
@@ -353,16 +344,7 @@
         <w:jc w:val="left"/>
       </w:pPr>
       <w:r>
-        <w:t>In South Asia, Meenu et al. (2013) used HEC-HMS 3.4 with the statistical downscaling model SDSM to assess the hydrologic impacts of HadCM3 A2 and B2 climate scenarios on the Tunga–Bhadra basin in India, projecting increased precipitation and runoff for future periods; their study illustrates the use of HEC-HMS as the hydrological engine of climate-impact chains, an application later replicated in Bangladesh. Halwatura and Najim (2013) provided one of the most cited tropical calibration studies, comparing loss and transform method combinations for the Attanagalu Oya catchment in Sri Lanka and recommending the Snyder unit hydrograph with deficit-and-constant losses; their explicit message—that method combinations must be tested rather than assumed—has shaped subsequent practice. In Africa, Tassew et al. (2019) calibrated an event-based model of the 1,609 km² Gilgel Abay catchment in the Lake Tana basin of Ethiopia using the SCS-CN, SCS unit hydrograph, and Muskingum methods, achieving a Nash–Sutcliffe efficiency (NSE) of 0.884 and a coefficient of determination of 0.925 during validation, with sensitivity analysis identifying the curve number as the controlling parameter. Aliye et al. (2020) compared HEC-HMS and the Soil and Water Assessment Tool (SWAT) for a data-scarce catchment of the Ethiopian Rift Valley Lakes basin, exemplifying a growing comparative literature in which HEC-HMS holds its own against more heavily parameterized models. In Europe, Gilewski and Nawalany (2018) used HEC-HMS as the testbed for their precipitation-product intercomparison discussed above.</w:t>
-      </w:r>
-    </w:p>
-    <w:p>
-      <w:pPr>
-        <w:ind w:firstLine="720"/>
-        <w:jc w:val="left"/>
-      </w:pPr>
-      <w:r>
-        <w:t>Three consistent lessons emerge from this international experience. First, the combination of SCS-CN loss, SCS unit hydrograph transform, and Muskingum routing constitutes the de facto default configuration, and it generally performs satisfactorily in monsoonal and semi-arid regimes, but documented exceptions (Halwatura &amp; Najim, 2013) forbid uncritical adoption. Second, the curve number is almost invariably the most sensitive parameter, so its spatial estimation and calibration bounds dominate model quality (Tassew et al., 2019). Third, HEC-HMS performance is limited less by its algorithms than by input data quality—precipitation above all—which motivates the careful forcing-data strategy reviewed in Section 2.4.3 (Gilewski &amp; Nawalany, 2018).</w:t>
+        <w:t>In the Middle East, Hamdan et al. (2021) developed a daily model of the semi-arid Al-Adhaim catchment in Iraq with HEC-GeoHMS preprocessing and the SCS-CN, SCS unit hydrograph, and Muskingum configuration, obtaining coefficients of determination near 0.9 in both calibration and verification and concluding that the model is suitable for reservoir inflow estimation. In South Asia, Jawad (2024) tested the frontier of data-scarce application by forcing a continuous SMA-based HEC-HMS model of the transboundary Brahmaputra basin entirely with near-real-time satellite precipitation, calibrating by automated univariate-gradient search and coupling the results to HEC-RAS for flood inundation mapping. Collectively, three consistent lessons emerge from this international experience. First, the combination of SCS-CN loss, SCS unit hydrograph transform, and Muskingum routing constitutes the de facto default configuration for event-scale application, and it performs satisfactorily across monsoonal and semi-arid regimes (Hamdan et al., 2021; Tassew et al., 2019). Second, the curve number is almost invariably the most sensitive parameter, so its spatial estimation and calibration bounds dominate model quality (M. B. Haque et al., 2024; Tassew et al., 2019). Third, HEC-HMS performance is limited less by its algorithms than by input data quality—precipitation above all—which motivates the careful forcing-data strategy reviewed in Section 2.4.3 (Jawad, 2024; Pradhan et al., 2022).</w:t>
       </w:r>
     </w:p>
     <w:p>
@@ -378,7 +360,7 @@
         <w:rPr>
           <w:i/>
         </w:rPr>
-        <w:t>Selected Applications of HEC-HMS Reviewed in This Chapter</w:t>
+        <w:t>Selected Post-2019 Applications of HEC-HMS and Comparable Models Reviewed in This Chapter</w:t>
       </w:r>
     </w:p>
     <w:tbl>
@@ -482,426 +464,6 @@
                 <w:rFonts w:ascii="Times New Roman" w:hAnsi="Times New Roman"/>
                 <w:sz w:val="20"/>
               </w:rPr>
-              <w:t>Knebl et al. (2005)</w:t>
-            </w:r>
-          </w:p>
-        </w:tc>
-        <w:tc>
-          <w:tcPr>
-            <w:tcW w:type="dxa" w:w="2448"/>
-          </w:tcPr>
-          <w:p>
-            <w:pPr>
-              <w:spacing w:line="240" w:lineRule="auto"/>
-            </w:pPr>
-            <w:r>
-              <w:rPr>
-                <w:rFonts w:ascii="Times New Roman" w:hAnsi="Times New Roman"/>
-                <w:sz w:val="20"/>
-              </w:rPr>
-              <w:t>San Antonio River basin, USA (~10,000 km²)</w:t>
-            </w:r>
-          </w:p>
-        </w:tc>
-        <w:tc>
-          <w:tcPr>
-            <w:tcW w:type="dxa" w:w="2448"/>
-          </w:tcPr>
-          <w:p>
-            <w:pPr>
-              <w:spacing w:line="240" w:lineRule="auto"/>
-            </w:pPr>
-            <w:r>
-              <w:rPr>
-                <w:rFonts w:ascii="Times New Roman" w:hAnsi="Times New Roman"/>
-                <w:sz w:val="20"/>
-              </w:rPr>
-              <w:t>NEXRAD rainfall; HEC-HMS + HEC-RAS coupling</w:t>
-            </w:r>
-          </w:p>
-        </w:tc>
-        <w:tc>
-          <w:tcPr>
-            <w:tcW w:type="dxa" w:w="2304"/>
-          </w:tcPr>
-          <w:p>
-            <w:pPr>
-              <w:spacing w:line="240" w:lineRule="auto"/>
-            </w:pPr>
-            <w:r>
-              <w:rPr>
-                <w:rFonts w:ascii="Times New Roman" w:hAnsi="Times New Roman"/>
-                <w:sz w:val="20"/>
-              </w:rPr>
-              <w:t>Calibrated discharge at 12 sub-basins; credible flood mapping</w:t>
-            </w:r>
-          </w:p>
-        </w:tc>
-      </w:tr>
-      <w:tr>
-        <w:tc>
-          <w:tcPr>
-            <w:tcW w:type="dxa" w:w="2160"/>
-          </w:tcPr>
-          <w:p>
-            <w:pPr>
-              <w:spacing w:line="240" w:lineRule="auto"/>
-            </w:pPr>
-            <w:r>
-              <w:rPr>
-                <w:rFonts w:ascii="Times New Roman" w:hAnsi="Times New Roman"/>
-                <w:sz w:val="20"/>
-              </w:rPr>
-              <w:t>Chu &amp; Steinman (2009)</w:t>
-            </w:r>
-          </w:p>
-        </w:tc>
-        <w:tc>
-          <w:tcPr>
-            <w:tcW w:type="dxa" w:w="2448"/>
-          </w:tcPr>
-          <w:p>
-            <w:pPr>
-              <w:spacing w:line="240" w:lineRule="auto"/>
-            </w:pPr>
-            <w:r>
-              <w:rPr>
-                <w:rFonts w:ascii="Times New Roman" w:hAnsi="Times New Roman"/>
-                <w:sz w:val="20"/>
-              </w:rPr>
-              <w:t>Mona Lake watershed, Michigan, USA</w:t>
-            </w:r>
-          </w:p>
-        </w:tc>
-        <w:tc>
-          <w:tcPr>
-            <w:tcW w:type="dxa" w:w="2448"/>
-          </w:tcPr>
-          <w:p>
-            <w:pPr>
-              <w:spacing w:line="240" w:lineRule="auto"/>
-            </w:pPr>
-            <w:r>
-              <w:rPr>
-                <w:rFonts w:ascii="Times New Roman" w:hAnsi="Times New Roman"/>
-                <w:sz w:val="20"/>
-              </w:rPr>
-              <w:t>SCS-CN (event); SMA (continuous)</w:t>
-            </w:r>
-          </w:p>
-        </w:tc>
-        <w:tc>
-          <w:tcPr>
-            <w:tcW w:type="dxa" w:w="2304"/>
-          </w:tcPr>
-          <w:p>
-            <w:pPr>
-              <w:spacing w:line="240" w:lineRule="auto"/>
-            </w:pPr>
-            <w:r>
-              <w:rPr>
-                <w:rFonts w:ascii="Times New Roman" w:hAnsi="Times New Roman"/>
-                <w:sz w:val="20"/>
-              </w:rPr>
-              <w:t>Event-calibrated parameters improved continuous simulation</w:t>
-            </w:r>
-          </w:p>
-        </w:tc>
-      </w:tr>
-      <w:tr>
-        <w:tc>
-          <w:tcPr>
-            <w:tcW w:type="dxa" w:w="2160"/>
-          </w:tcPr>
-          <w:p>
-            <w:pPr>
-              <w:spacing w:line="240" w:lineRule="auto"/>
-            </w:pPr>
-            <w:r>
-              <w:rPr>
-                <w:rFonts w:ascii="Times New Roman" w:hAnsi="Times New Roman"/>
-                <w:sz w:val="20"/>
-              </w:rPr>
-              <w:t>Oleyiblo &amp; Li (2010)</w:t>
-            </w:r>
-          </w:p>
-        </w:tc>
-        <w:tc>
-          <w:tcPr>
-            <w:tcW w:type="dxa" w:w="2448"/>
-          </w:tcPr>
-          <w:p>
-            <w:pPr>
-              <w:spacing w:line="240" w:lineRule="auto"/>
-            </w:pPr>
-            <w:r>
-              <w:rPr>
-                <w:rFonts w:ascii="Times New Roman" w:hAnsi="Times New Roman"/>
-                <w:sz w:val="20"/>
-              </w:rPr>
-              <w:t>Misai and Wan’an catchments, China</w:t>
-            </w:r>
-          </w:p>
-        </w:tc>
-        <w:tc>
-          <w:tcPr>
-            <w:tcW w:type="dxa" w:w="2448"/>
-          </w:tcPr>
-          <w:p>
-            <w:pPr>
-              <w:spacing w:line="240" w:lineRule="auto"/>
-            </w:pPr>
-            <w:r>
-              <w:rPr>
-                <w:rFonts w:ascii="Times New Roman" w:hAnsi="Times New Roman"/>
-                <w:sz w:val="20"/>
-              </w:rPr>
-              <w:t>HEC-GeoHMS preprocessing; event simulation</w:t>
-            </w:r>
-          </w:p>
-        </w:tc>
-        <w:tc>
-          <w:tcPr>
-            <w:tcW w:type="dxa" w:w="2304"/>
-          </w:tcPr>
-          <w:p>
-            <w:pPr>
-              <w:spacing w:line="240" w:lineRule="auto"/>
-            </w:pPr>
-            <w:r>
-              <w:rPr>
-                <w:rFonts w:ascii="Times New Roman" w:hAnsi="Times New Roman"/>
-                <w:sz w:val="20"/>
-              </w:rPr>
-              <w:t>R² &gt; 0.9 for all events; acceptable peak errors</w:t>
-            </w:r>
-          </w:p>
-        </w:tc>
-      </w:tr>
-      <w:tr>
-        <w:tc>
-          <w:tcPr>
-            <w:tcW w:type="dxa" w:w="2160"/>
-          </w:tcPr>
-          <w:p>
-            <w:pPr>
-              <w:spacing w:line="240" w:lineRule="auto"/>
-            </w:pPr>
-            <w:r>
-              <w:rPr>
-                <w:rFonts w:ascii="Times New Roman" w:hAnsi="Times New Roman"/>
-                <w:sz w:val="20"/>
-              </w:rPr>
-              <w:t>Halwatura &amp; Najim (2013)</w:t>
-            </w:r>
-          </w:p>
-        </w:tc>
-        <w:tc>
-          <w:tcPr>
-            <w:tcW w:type="dxa" w:w="2448"/>
-          </w:tcPr>
-          <w:p>
-            <w:pPr>
-              <w:spacing w:line="240" w:lineRule="auto"/>
-            </w:pPr>
-            <w:r>
-              <w:rPr>
-                <w:rFonts w:ascii="Times New Roman" w:hAnsi="Times New Roman"/>
-                <w:sz w:val="20"/>
-              </w:rPr>
-              <w:t>Attanagalu Oya catchment, Sri Lanka</w:t>
-            </w:r>
-          </w:p>
-        </w:tc>
-        <w:tc>
-          <w:tcPr>
-            <w:tcW w:type="dxa" w:w="2448"/>
-          </w:tcPr>
-          <w:p>
-            <w:pPr>
-              <w:spacing w:line="240" w:lineRule="auto"/>
-            </w:pPr>
-            <w:r>
-              <w:rPr>
-                <w:rFonts w:ascii="Times New Roman" w:hAnsi="Times New Roman"/>
-                <w:sz w:val="20"/>
-              </w:rPr>
-              <w:t>Snyder vs. Clark UH; SCS-CN vs. deficit-constant</w:t>
-            </w:r>
-          </w:p>
-        </w:tc>
-        <w:tc>
-          <w:tcPr>
-            <w:tcW w:type="dxa" w:w="2304"/>
-          </w:tcPr>
-          <w:p>
-            <w:pPr>
-              <w:spacing w:line="240" w:lineRule="auto"/>
-            </w:pPr>
-            <w:r>
-              <w:rPr>
-                <w:rFonts w:ascii="Times New Roman" w:hAnsi="Times New Roman"/>
-                <w:sz w:val="20"/>
-              </w:rPr>
-              <w:t>Snyder UH + deficit-constant most reliable; SCS-CN poor</w:t>
-            </w:r>
-          </w:p>
-        </w:tc>
-      </w:tr>
-      <w:tr>
-        <w:tc>
-          <w:tcPr>
-            <w:tcW w:type="dxa" w:w="2160"/>
-          </w:tcPr>
-          <w:p>
-            <w:pPr>
-              <w:spacing w:line="240" w:lineRule="auto"/>
-            </w:pPr>
-            <w:r>
-              <w:rPr>
-                <w:rFonts w:ascii="Times New Roman" w:hAnsi="Times New Roman"/>
-                <w:sz w:val="20"/>
-              </w:rPr>
-              <w:t>Meenu et al. (2013)</w:t>
-            </w:r>
-          </w:p>
-        </w:tc>
-        <w:tc>
-          <w:tcPr>
-            <w:tcW w:type="dxa" w:w="2448"/>
-          </w:tcPr>
-          <w:p>
-            <w:pPr>
-              <w:spacing w:line="240" w:lineRule="auto"/>
-            </w:pPr>
-            <w:r>
-              <w:rPr>
-                <w:rFonts w:ascii="Times New Roman" w:hAnsi="Times New Roman"/>
-                <w:sz w:val="20"/>
-              </w:rPr>
-              <w:t>Tunga–Bhadra basin, India</w:t>
-            </w:r>
-          </w:p>
-        </w:tc>
-        <w:tc>
-          <w:tcPr>
-            <w:tcW w:type="dxa" w:w="2448"/>
-          </w:tcPr>
-          <w:p>
-            <w:pPr>
-              <w:spacing w:line="240" w:lineRule="auto"/>
-            </w:pPr>
-            <w:r>
-              <w:rPr>
-                <w:rFonts w:ascii="Times New Roman" w:hAnsi="Times New Roman"/>
-                <w:sz w:val="20"/>
-              </w:rPr>
-              <w:t>HEC-HMS 3.4 + SDSM downscaling (HadCM3 A2/B2)</w:t>
-            </w:r>
-          </w:p>
-        </w:tc>
-        <w:tc>
-          <w:tcPr>
-            <w:tcW w:type="dxa" w:w="2304"/>
-          </w:tcPr>
-          <w:p>
-            <w:pPr>
-              <w:spacing w:line="240" w:lineRule="auto"/>
-            </w:pPr>
-            <w:r>
-              <w:rPr>
-                <w:rFonts w:ascii="Times New Roman" w:hAnsi="Times New Roman"/>
-                <w:sz w:val="20"/>
-              </w:rPr>
-              <w:t>Projected increasing precipitation and runoff</w:t>
-            </w:r>
-          </w:p>
-        </w:tc>
-      </w:tr>
-      <w:tr>
-        <w:tc>
-          <w:tcPr>
-            <w:tcW w:type="dxa" w:w="2160"/>
-          </w:tcPr>
-          <w:p>
-            <w:pPr>
-              <w:spacing w:line="240" w:lineRule="auto"/>
-            </w:pPr>
-            <w:r>
-              <w:rPr>
-                <w:rFonts w:ascii="Times New Roman" w:hAnsi="Times New Roman"/>
-                <w:sz w:val="20"/>
-              </w:rPr>
-              <w:t>Gilewski &amp; Nawalany (2018)</w:t>
-            </w:r>
-          </w:p>
-        </w:tc>
-        <w:tc>
-          <w:tcPr>
-            <w:tcW w:type="dxa" w:w="2448"/>
-          </w:tcPr>
-          <w:p>
-            <w:pPr>
-              <w:spacing w:line="240" w:lineRule="auto"/>
-            </w:pPr>
-            <w:r>
-              <w:rPr>
-                <w:rFonts w:ascii="Times New Roman" w:hAnsi="Times New Roman"/>
-                <w:sz w:val="20"/>
-              </w:rPr>
-              <w:t>Upper Skawa catchment, Poland</w:t>
-            </w:r>
-          </w:p>
-        </w:tc>
-        <w:tc>
-          <w:tcPr>
-            <w:tcW w:type="dxa" w:w="2448"/>
-          </w:tcPr>
-          <w:p>
-            <w:pPr>
-              <w:spacing w:line="240" w:lineRule="auto"/>
-            </w:pPr>
-            <w:r>
-              <w:rPr>
-                <w:rFonts w:ascii="Times New Roman" w:hAnsi="Times New Roman"/>
-                <w:sz w:val="20"/>
-              </w:rPr>
-              <w:t>Gauge vs. radar vs. IMERG forcing; SCS-CN</w:t>
-            </w:r>
-          </w:p>
-        </w:tc>
-        <w:tc>
-          <w:tcPr>
-            <w:tcW w:type="dxa" w:w="2304"/>
-          </w:tcPr>
-          <w:p>
-            <w:pPr>
-              <w:spacing w:line="240" w:lineRule="auto"/>
-            </w:pPr>
-            <w:r>
-              <w:rPr>
-                <w:rFonts w:ascii="Times New Roman" w:hAnsi="Times New Roman"/>
-                <w:sz w:val="20"/>
-              </w:rPr>
-              <w:t>Adjusted radar and IMERG most reliable forcings</w:t>
-            </w:r>
-          </w:p>
-        </w:tc>
-      </w:tr>
-      <w:tr>
-        <w:tc>
-          <w:tcPr>
-            <w:tcW w:type="dxa" w:w="2160"/>
-          </w:tcPr>
-          <w:p>
-            <w:pPr>
-              <w:spacing w:line="240" w:lineRule="auto"/>
-            </w:pPr>
-            <w:r>
-              <w:rPr>
-                <w:rFonts w:ascii="Times New Roman" w:hAnsi="Times New Roman"/>
-                <w:sz w:val="20"/>
-              </w:rPr>
               <w:t>Tassew et al. (2019)</w:t>
             </w:r>
           </w:p>
@@ -953,7 +515,7 @@
                 <w:rFonts w:ascii="Times New Roman" w:hAnsi="Times New Roman"/>
                 <w:sz w:val="20"/>
               </w:rPr>
-              <w:t>NSE = 0.884; R² = 0.925 (validation); CN most sensitive</w:t>
+              <w:t>NSE = 0.884; R² = 0.925; CN most sensitive</w:t>
             </w:r>
           </w:p>
         </w:tc>
@@ -1059,7 +621,7 @@
                 <w:rFonts w:ascii="Times New Roman" w:hAnsi="Times New Roman"/>
                 <w:sz w:val="20"/>
               </w:rPr>
-              <w:t>Brahmaputra River basin (at Bahadurabad), Bangladesh</w:t>
+              <w:t>Brahmaputra basin (at Bahadurabad), Bangladesh</w:t>
             </w:r>
           </w:p>
         </w:tc>
@@ -1094,6 +656,216 @@
                 <w:sz w:val="20"/>
               </w:rPr>
               <w:t>NSE = 0.65 (cal.), 0.54 (val.); satisfactory</w:t>
+            </w:r>
+          </w:p>
+        </w:tc>
+      </w:tr>
+      <w:tr>
+        <w:tc>
+          <w:tcPr>
+            <w:tcW w:type="dxa" w:w="2160"/>
+          </w:tcPr>
+          <w:p>
+            <w:pPr>
+              <w:spacing w:line="240" w:lineRule="auto"/>
+            </w:pPr>
+            <w:r>
+              <w:rPr>
+                <w:rFonts w:ascii="Times New Roman" w:hAnsi="Times New Roman"/>
+                <w:sz w:val="20"/>
+              </w:rPr>
+              <w:t>Raihan et al. (2020)</w:t>
+            </w:r>
+          </w:p>
+        </w:tc>
+        <w:tc>
+          <w:tcPr>
+            <w:tcW w:type="dxa" w:w="2448"/>
+          </w:tcPr>
+          <w:p>
+            <w:pPr>
+              <w:spacing w:line="240" w:lineRule="auto"/>
+            </w:pPr>
+            <w:r>
+              <w:rPr>
+                <w:rFonts w:ascii="Times New Roman" w:hAnsi="Times New Roman"/>
+                <w:sz w:val="20"/>
+              </w:rPr>
+              <w:t>Upper Halda basin, Bangladesh</w:t>
+            </w:r>
+          </w:p>
+        </w:tc>
+        <w:tc>
+          <w:tcPr>
+            <w:tcW w:type="dxa" w:w="2448"/>
+          </w:tcPr>
+          <w:p>
+            <w:pPr>
+              <w:spacing w:line="240" w:lineRule="auto"/>
+            </w:pPr>
+            <w:r>
+              <w:rPr>
+                <w:rFonts w:ascii="Times New Roman" w:hAnsi="Times New Roman"/>
+                <w:sz w:val="20"/>
+              </w:rPr>
+              <w:t>SWAT (comparison baseline)</w:t>
+            </w:r>
+          </w:p>
+        </w:tc>
+        <w:tc>
+          <w:tcPr>
+            <w:tcW w:type="dxa" w:w="2304"/>
+          </w:tcPr>
+          <w:p>
+            <w:pPr>
+              <w:spacing w:line="240" w:lineRule="auto"/>
+            </w:pPr>
+            <w:r>
+              <w:rPr>
+                <w:rFonts w:ascii="Times New Roman" w:hAnsi="Times New Roman"/>
+                <w:sz w:val="20"/>
+              </w:rPr>
+              <w:t>R² = 0.80; NSE = 0.71; CN among most sensitive</w:t>
+            </w:r>
+          </w:p>
+        </w:tc>
+      </w:tr>
+      <w:tr>
+        <w:tc>
+          <w:tcPr>
+            <w:tcW w:type="dxa" w:w="2160"/>
+          </w:tcPr>
+          <w:p>
+            <w:pPr>
+              <w:spacing w:line="240" w:lineRule="auto"/>
+            </w:pPr>
+            <w:r>
+              <w:rPr>
+                <w:rFonts w:ascii="Times New Roman" w:hAnsi="Times New Roman"/>
+                <w:sz w:val="20"/>
+              </w:rPr>
+              <w:t>Hamdan et al. (2021)</w:t>
+            </w:r>
+          </w:p>
+        </w:tc>
+        <w:tc>
+          <w:tcPr>
+            <w:tcW w:type="dxa" w:w="2448"/>
+          </w:tcPr>
+          <w:p>
+            <w:pPr>
+              <w:spacing w:line="240" w:lineRule="auto"/>
+            </w:pPr>
+            <w:r>
+              <w:rPr>
+                <w:rFonts w:ascii="Times New Roman" w:hAnsi="Times New Roman"/>
+                <w:sz w:val="20"/>
+              </w:rPr>
+              <w:t>Al-Adhaim catchment, Iraq</w:t>
+            </w:r>
+          </w:p>
+        </w:tc>
+        <w:tc>
+          <w:tcPr>
+            <w:tcW w:type="dxa" w:w="2448"/>
+          </w:tcPr>
+          <w:p>
+            <w:pPr>
+              <w:spacing w:line="240" w:lineRule="auto"/>
+            </w:pPr>
+            <w:r>
+              <w:rPr>
+                <w:rFonts w:ascii="Times New Roman" w:hAnsi="Times New Roman"/>
+                <w:sz w:val="20"/>
+              </w:rPr>
+              <w:t>SCS-CN; SCS UH; Muskingum; HEC-GeoHMS</w:t>
+            </w:r>
+          </w:p>
+        </w:tc>
+        <w:tc>
+          <w:tcPr>
+            <w:tcW w:type="dxa" w:w="2304"/>
+          </w:tcPr>
+          <w:p>
+            <w:pPr>
+              <w:spacing w:line="240" w:lineRule="auto"/>
+            </w:pPr>
+            <w:r>
+              <w:rPr>
+                <w:rFonts w:ascii="Times New Roman" w:hAnsi="Times New Roman"/>
+                <w:sz w:val="20"/>
+              </w:rPr>
+              <w:t>R² ≈ 0.90 (calibration and verification)</w:t>
+            </w:r>
+          </w:p>
+        </w:tc>
+      </w:tr>
+      <w:tr>
+        <w:tc>
+          <w:tcPr>
+            <w:tcW w:type="dxa" w:w="2160"/>
+          </w:tcPr>
+          <w:p>
+            <w:pPr>
+              <w:spacing w:line="240" w:lineRule="auto"/>
+            </w:pPr>
+            <w:r>
+              <w:rPr>
+                <w:rFonts w:ascii="Times New Roman" w:hAnsi="Times New Roman"/>
+                <w:sz w:val="20"/>
+              </w:rPr>
+              <w:t>Jawad (2024)</w:t>
+            </w:r>
+          </w:p>
+        </w:tc>
+        <w:tc>
+          <w:tcPr>
+            <w:tcW w:type="dxa" w:w="2448"/>
+          </w:tcPr>
+          <w:p>
+            <w:pPr>
+              <w:spacing w:line="240" w:lineRule="auto"/>
+            </w:pPr>
+            <w:r>
+              <w:rPr>
+                <w:rFonts w:ascii="Times New Roman" w:hAnsi="Times New Roman"/>
+                <w:sz w:val="20"/>
+              </w:rPr>
+              <w:t>Brahmaputra basin (transboundary)</w:t>
+            </w:r>
+          </w:p>
+        </w:tc>
+        <w:tc>
+          <w:tcPr>
+            <w:tcW w:type="dxa" w:w="2448"/>
+          </w:tcPr>
+          <w:p>
+            <w:pPr>
+              <w:spacing w:line="240" w:lineRule="auto"/>
+            </w:pPr>
+            <w:r>
+              <w:rPr>
+                <w:rFonts w:ascii="Times New Roman" w:hAnsi="Times New Roman"/>
+                <w:sz w:val="20"/>
+              </w:rPr>
+              <w:t>SMA continuous; Clark UH; linear-reservoir baseflow; IMERG/GSMaP forcing; HEC-RAS coupling</w:t>
+            </w:r>
+          </w:p>
+        </w:tc>
+        <w:tc>
+          <w:tcPr>
+            <w:tcW w:type="dxa" w:w="2304"/>
+          </w:tcPr>
+          <w:p>
+            <w:pPr>
+              <w:spacing w:line="240" w:lineRule="auto"/>
+            </w:pPr>
+            <w:r>
+              <w:rPr>
+                <w:rFonts w:ascii="Times New Roman" w:hAnsi="Times New Roman"/>
+                <w:sz w:val="20"/>
+              </w:rPr>
+              <w:t>Credible discharge and inundation simulation from satellite forcing</w:t>
             </w:r>
           </w:p>
         </w:tc>
@@ -1252,6 +1024,76 @@
                 <w:rFonts w:ascii="Times New Roman" w:hAnsi="Times New Roman"/>
                 <w:sz w:val="20"/>
               </w:rPr>
+              <w:t>Admas et al. (2025)</w:t>
+            </w:r>
+          </w:p>
+        </w:tc>
+        <w:tc>
+          <w:tcPr>
+            <w:tcW w:type="dxa" w:w="2448"/>
+          </w:tcPr>
+          <w:p>
+            <w:pPr>
+              <w:spacing w:line="240" w:lineRule="auto"/>
+            </w:pPr>
+            <w:r>
+              <w:rPr>
+                <w:rFonts w:ascii="Times New Roman" w:hAnsi="Times New Roman"/>
+                <w:sz w:val="20"/>
+              </w:rPr>
+              <w:t>Gumara River, Upper Blue Nile basin, Ethiopia</w:t>
+            </w:r>
+          </w:p>
+        </w:tc>
+        <w:tc>
+          <w:tcPr>
+            <w:tcW w:type="dxa" w:w="2448"/>
+          </w:tcPr>
+          <w:p>
+            <w:pPr>
+              <w:spacing w:line="240" w:lineRule="auto"/>
+            </w:pPr>
+            <w:r>
+              <w:rPr>
+                <w:rFonts w:ascii="Times New Roman" w:hAnsi="Times New Roman"/>
+                <w:sz w:val="20"/>
+              </w:rPr>
+              <w:t>HEC-HMS + HEC-RAS flood-risk coupling</w:t>
+            </w:r>
+          </w:p>
+        </w:tc>
+        <w:tc>
+          <w:tcPr>
+            <w:tcW w:type="dxa" w:w="2304"/>
+          </w:tcPr>
+          <w:p>
+            <w:pPr>
+              <w:spacing w:line="240" w:lineRule="auto"/>
+            </w:pPr>
+            <w:r>
+              <w:rPr>
+                <w:rFonts w:ascii="Times New Roman" w:hAnsi="Times New Roman"/>
+                <w:sz w:val="20"/>
+              </w:rPr>
+              <w:t>Inundation quantified for 2–100-year return periods</w:t>
+            </w:r>
+          </w:p>
+        </w:tc>
+      </w:tr>
+      <w:tr>
+        <w:tc>
+          <w:tcPr>
+            <w:tcW w:type="dxa" w:w="2160"/>
+          </w:tcPr>
+          <w:p>
+            <w:pPr>
+              <w:spacing w:line="240" w:lineRule="auto"/>
+            </w:pPr>
+            <w:r>
+              <w:rPr>
+                <w:rFonts w:ascii="Times New Roman" w:hAnsi="Times New Roman"/>
+                <w:sz w:val="20"/>
+              </w:rPr>
               <w:t>Moniruzzaman &amp; Mahalder (2026)</w:t>
             </w:r>
           </w:p>
@@ -1332,7 +1174,7 @@
         <w:jc w:val="left"/>
       </w:pPr>
       <w:r>
-        <w:t>Bangladesh occupies the lowermost reach of the Ganges–Brahmaputra–Meghna system, and its flood geography—in which normal-season inundation of floodplains and beels is agriculturally essential while abnormal floods are catastrophic—was authoritatively described by Brammer (1990) in his analysis of the 1987 and 1988 floods. Against this backdrop, a substantial national modeling capability has developed around institutional platforms, while the academic literature has increasingly adopted HEC-HMS for basin-scale rainfall–runoff studies because of its zero cost and modest data demands.</w:t>
+        <w:t>Bangladesh occupies the lowermost reach of the Ganges–Brahmaputra–Meghna system, in which normal-season inundation of floodplains and beels is agriculturally essential while abnormal floods and chronic waterlogging are hazards. Against this backdrop, the national academic literature has increasingly adopted HEC-HMS for basin-scale rainfall–runoff studies because of its zero cost and modest data demands, and the post-2019 record now spans the country’s principal basin types.</w:t>
       </w:r>
     </w:p>
     <w:p>
@@ -1341,7 +1183,7 @@
         <w:jc w:val="left"/>
       </w:pPr>
       <w:r>
-        <w:t>Several recent applications define the state of practice. S. Haque et al. (2020) developed a continuous HEC-HMS model of the poorly gauged Brahmaputra basin, calibrated at Bahadurabad against daily runoff for 1983–1996 (NSE = 0.65) and validated for 1997–2010 (NSE = 0.54), and extended it with the Modified Universal Soil Loss Equation and Engelund–Hansen sediment routing to project sediment-load increases of 34%, 67%, and 115% by the 2020s, 2050s, and 2080s under the RCP8.5 scenario. Nujhat et al. (2024) calibrated and validated an HEC-HMS model of the Gumti River basin using 2019–2021 records with SRTM-based delineation, Muskingum routing, and SCS-CN losses, obtaining coefficients of determination of 0.64 and 0.68 for calibration and validation respectively, with percent bias in the very good range, and recommended the calibrated model as a planning tool for flood prediction. M. B. Haque et al. (2024) modeled the ecologically important Halda catchment, optimizing curve numbers against values derived from a companion SWAT application and achieving NSE values of 0.72 and 0.82 in calibration and validation, while candidly documenting baseflow underestimation. Moniruzzaman and Mahalder (2026) compared HEC-HMS and SWAT for the Atrai–Karatoa basin of northern Bangladesh—a basin hydrologically contiguous with the greater Chalan Beel floodplain to which the Pabna beel systems belong—finding that SWAT better captured high flows while HEC-HMS was more accurate for medium flows, with HEC-HMS achieving R² of 0.70 and 0.56 in calibration and validation.</w:t>
+        <w:t>Several recent applications define the state of practice. S. Haque et al. (2020) developed a continuous HEC-HMS model of the poorly gauged Brahmaputra basin, calibrated at Bahadurabad against daily runoff for 1983–1996 (NSE = 0.65) and validated for 1997–2010 (NSE = 0.54), and extended it with the Modified Universal Soil Loss Equation and Engelund–Hansen sediment routing to project sediment-load increases of 34%, 67%, and 115% by the 2020s, 2050s, and 2080s under the RCP8.5 scenario—demonstrating the use of HEC-HMS as the hydrological engine of climate-impact chains. Nujhat et al. (2024) calibrated and validated a model of the Gumti River basin using 2019–2021 records with SRTM-based delineation, Muskingum routing, and SCS-CN losses, obtaining coefficients of determination of 0.64 and 0.68 for calibration and validation respectively, with percent bias in the very good range, and recommended the calibrated model as a planning tool for flood prediction. M. B. Haque et al. (2024) modeled the ecologically important Halda catchment, optimizing curve numbers against values derived from a companion SWAT application and achieving NSE values of 0.72 and 0.82 in calibration and validation, while candidly documenting baseflow underestimation. Moniruzzaman and Mahalder (2026) compared HEC-HMS and SWAT for the Atrai–Karatoa basin of northern Bangladesh—a basin hydrologically contiguous with the greater Chalan Beel floodplain to which the Pabna beel systems belong—finding that SWAT better captured high flows while HEC-HMS was more accurate for medium flows, with HEC-HMS achieving R² of 0.70 and 0.56 in calibration and validation.</w:t>
       </w:r>
     </w:p>
     <w:p>
@@ -1350,7 +1192,7 @@
         <w:jc w:val="left"/>
       </w:pPr>
       <w:r>
-        <w:t>Complementary studies using other models complete the picture. Raihan et al. (2020) simulated streamflow of the Upper Halda basin with SWAT (R² = 0.80, NSE = 0.71), identifying groundwater delay, baseflow recession, and curve number as the most sensitive parameters, and emphasizing the difficulty of capturing rainfall variability from a single gauge. Akter and Ali (2012) assessed environmental flow requirements of the Halda River, illustrating the ecological motivation of much Bangladeshi hydrological modeling. Datta et al. (2022) contributed the DEM-sensitivity analysis of watershed delineation reviewed in Section 2.4.1.</w:t>
+        <w:t>Complementary studies using other models complete the picture. Raihan et al. (2020) simulated streamflow of the Upper Halda basin with SWAT (R² = 0.80, NSE = 0.71), identifying groundwater delay, baseflow recession, and curve number as the most sensitive parameters, and emphasizing the difficulty of capturing rainfall variability from a single gauge. Datta et al. (2022) contributed the DEM-sensitivity analysis of watershed delineation reviewed in Section 2.4.1, and Jawad (2024) demonstrated satellite-forced coupled hydrologic–hydraulic modeling for the Bangladeshi reach of the Brahmaputra.</w:t>
       </w:r>
     </w:p>
     <w:p>
@@ -1376,7 +1218,7 @@
         <w:jc w:val="left"/>
       </w:pPr>
       <w:r>
-        <w:t>Wetland hydrology differs fundamentally from upland catchment hydrology: the hydroperiod—the seasonal pattern of water-level rise and fall—is the master variable controlling wetland ecology and land use, and it integrates precipitation, surface inflow and outflow, groundwater exchange, and evapotranspiration in a shallow storage whose area–volume relationship is highly nonlinear (Mitsch &amp; Gosselink, 2015). In the floodplains of Bangladesh, the characteristic wetland landform is the beel, a saucer-shaped depression on the floodplain that retains water perennially or seasonally and is filled both by direct rainfall-runoff from its local catchment and by spill from adjacent rivers during the monsoon (Brammer, 1990). Agriculture, capture fisheries, and settlement in beel areas are finely adapted to the normal hydroperiod, so that both deficient drainage (prolonged waterlogging) and excessive drainage (loss of dry-season water) constitute hazards (Brammer, 1990; Mitsch &amp; Gosselink, 2015).</w:t>
+        <w:t>Wetland hydrology differs fundamentally from upland catchment hydrology: the water regime—the seasonal pattern of water-level rise and fall—is the master variable controlling wetland biogeochemistry, ecology, and land use, and altered hydrology is correspondingly identified as the principal pathway by which environmental change degrades wetland function (Salimi et al., 2021). In the floodplains of Bangladesh, the characteristic wetland landform is the beel, a saucer-shaped depression on the floodplain that retains water perennially or seasonally and is filled both by direct rainfall-runoff from its local catchment and by spill from adjacent rivers during the monsoon (Adnan et al., 2020). Agriculture, capture fisheries, and settlement in beel areas are finely adapted to the normal seasonal water regime, so that both deficient drainage (prolonged waterlogging) and excessive drainage (loss of dry-season water) constitute hazards, and remote-sensing studies of Bangladeshi wetland systems document rapid ongoing conversion of wetland classes to agriculture and settlement under such pressures (Bhattacharjee et al., 2021).</w:t>
       </w:r>
     </w:p>
     <w:p>
@@ -1385,7 +1227,7 @@
         <w:jc w:val="left"/>
       </w:pPr>
       <w:r>
-        <w:t>The hydrology of the beels of southwestern and northwestern Bangladesh cannot be understood apart from two generations of anthropogenic intervention. The first is the diversion of Ganges flow at the Farakka Barrage, commissioned in 1975, which significantly reduced dry-season discharge in the distributaries of the Bangladeshi Ganges. Mirza (1998) demonstrated statistically significant post-Farakka declines in dry-season flows of the Ganges and its Gorai distributary, with consequent accelerated sedimentation of distributary channels, and Gain and Giupponi (2014), applying the range-of-variability approach to twenty-two hydrologic indicators, showed that post-Farakka flows persistently failed pre-Farakka threshold conditions for both annual minima and maxima. Reduced parent-river flows starve distributary offtakes of the sediment-flushing discharges that keep them open, initiating the progressive siltation and eventual hydraulic disconnection of distributaries such as the Ichamoti. The second generation of intervention comprises the flood control, drainage, and irrigation (FCD/FCDI) projects constructed from the 1960s onward, including the Pabna Irrigation and Rural Development Project that encloses much of the study region. Thompson and Sultana (1996), evaluating the distributional impacts of such projects, documented that embankments frequently created internal drainage congestion—to the point that people living inside protected areas deliberately cut embankments to release ponded water—and that in four of five projects studied, flood losses inside protected areas during the 1988 flood exceeded those in adjacent unprotected areas. These findings establish drainage congestion, rather than riverine flooding alone, as the characteristic water hazard of embanked floodplain interiors.</w:t>
+        <w:t>The hydrology of the beels of western Bangladesh cannot be understood apart from two generations of anthropogenic intervention. The first is the long-term decline of dry-season flows in the Ganges distributary network. Ali and Hasan (2022), analyzing Bangladesh Water Development Board discharge records for the Gorai—the principal Ganges distributary and the regional analogue of the Ichamoti—found that mean annual flow in 2000–2016 was about 13% lower than in 1984–1999, quantified a deficient-flow condition persisting from December to May, and estimated that the river now frequently fails to meet its environmental flow requirement of roughly 29% of mean annual flow. Reduced parent-river flows starve distributary offtakes of the sediment-flushing discharges that keep them open, initiating the progressive siltation and eventual hydraulic disconnection of distributaries such as the Ichamoti. The second generation of intervention comprises the embankment, polder, and flood control–drainage–irrigation infrastructure constructed from the 1960s onward, including the Pabna Irrigation and Rural Development Project that encloses much of the study region. The systemic consequence of such enclosure, documented most thoroughly for the embanked southwest delta, is internal drainage congestion: embankments disconnect the floodplain from the river network, sediment accretes in the riverbeds rather than on the floodplain, gravity drainage progressively fails, and monsoon runoff accumulates in the enclosed beels as pluvial flooding (Adnan et al., 2020). Adnan et al. (2020) showed that in the embanked southwest, a large majority of agricultural land now lies in flood-susceptible zones, and they evaluated controlled sediment reintroduction (tidal river management) in low-lying beels as a rehabilitation measure—evidence that beel drainage problems are structural and regional rather than local anomalies.</w:t>
       </w:r>
     </w:p>
     <w:p>
@@ -1403,7 +1245,7 @@
         <w:jc w:val="left"/>
       </w:pPr>
       <w:r>
-        <w:t>The Gumai Beel, the focus of the present study, is one of the beel systems of the Pabna floodplain drained through the Ichamoti corridor. Its inundation behavior is governed by the interaction of three controls that the reviewed literature identifies as characteristic of embanked distributary floodplains: local monsoon rainfall-runoff from the beel catchment; the conveyance capacity of the silted Ichamoti and its khals (canals), which sets the rate at which stored water can drain; and the stage of the receiving rivers, which can impose backwater limits on drainage. A rainfall–runoff model of the beel catchment is the necessary first element of any quantitative analysis of this system: it supplies the inflow boundary condition for drainage design, for evaluation of the rejuvenation project’s hydrological benefits, and for assessment of waterlogging risk under current and future rainfall regimes. The regional wetland literature reinforces the urgency of such quantification, as neighboring floodplain wetlands—most prominently the greater Chalan Beel—have experienced severe shrinkage and hydrological fragmentation under siltation, road and embankment construction, and land conversion (Brammer, 1990; Thompson &amp; Sultana, 1996).</w:t>
+        <w:t>The Gumai Beel, the focus of the present study, is one of the beel systems of the Pabna floodplain drained through the Ichamoti corridor. Its inundation behavior is governed by the interaction of three controls that the reviewed literature identifies as characteristic of embanked distributary floodplains: local monsoon rainfall-runoff from the beel catchment; the conveyance capacity of the silted Ichamoti and its khals (canals), which sets the rate at which stored water can drain; and the stage of the receiving rivers, which can impose backwater limits on drainage (Adnan et al., 2020; Parvez et al., 2021). A rainfall–runoff model of the beel catchment is the necessary first element of any quantitative analysis of this system: it supplies the inflow boundary condition for drainage design, for evaluation of the rejuvenation project’s hydrological benefits, and for assessment of waterlogging risk under current and future rainfall regimes. The regional wetland literature reinforces the urgency of such quantification, as neighboring floodplain wetlands—most prominently the greater Chalan Beel system to which the Atrai–Karatoa drainage belongs—have experienced severe shrinkage and hydrological fragmentation under siltation, embankment construction, and land conversion (Bhattacharjee et al., 2021; Moniruzzaman &amp; Mahalder, 2026).</w:t>
       </w:r>
     </w:p>
     <w:p>
@@ -1420,7 +1262,7 @@
         <w:jc w:val="left"/>
       </w:pPr>
       <w:r>
-        <w:t>Credible use of any rainfall–runoff model requires a disciplined testing protocol. The canonical framework is the split-sample test of Klemeš (1986): the observational record is divided so that the model is calibrated on one period and validated on an independent period, with more demanding differential tests (for example, calibration on wet years and validation on dry years) prescribed when the model is to be used under changed conditions. This protocol is followed, at least in its basic form, by essentially all of the applications reviewed above (e.g., Nujhat et al., 2024; Oleyiblo &amp; Li, 2010; S. Haque et al., 2020; Tassew et al., 2019).</w:t>
+        <w:t>Credible use of any rainfall–runoff model requires a disciplined testing protocol. The conventional framework is the split-sample test, in which the observational record is divided so that the model is calibrated on one period and validated on an independent period; essentially all of the applications reviewed above follow this protocol (Hamdan et al., 2021; Nujhat et al., 2024; S. Haque et al., 2020; Tassew et al., 2019). The framework itself, however, is under active re-examination. Shen et al. (2022), in a large-sample experiment spanning 463 catchments, two conceptual models, and 50 data-splitting schemes, found that the common practice of calibrating to older data and validating on newer data systematically degrades subsequent predictive performance, and that calibrating to all available data is the most robust strategy when the model will be used operationally. For a thesis context, where independent demonstration of predictive skill remains an examination requirement, these findings argue for reporting both a conventional split-sample evaluation and a final parameter set re-estimated on the full record—the approach adopted in Chapter 3.</w:t>
       </w:r>
     </w:p>
     <w:p>
@@ -1429,7 +1271,7 @@
         <w:jc w:val="left"/>
       </w:pPr>
       <w:r>
-        <w:t>Quantitative performance evaluation rests on a small set of statistics whose properties are well understood. The Nash–Sutcliffe efficiency (Nash &amp; Sutcliffe, 1970) measures the proportion of observed-flow variance explained by the model relative to the observed mean and remains the most widely reported metric, despite known sensitivities to peak flows and to the variance of the observation period. Gupta et al. (2009) decomposed the NSE into correlation, bias, and variability components and proposed the Kling–Gupta efficiency as a more diagnostically transparent alternative, which is increasingly reported alongside NSE. For applied watershed modeling, the guidelines of Moriasi et al. (2007) have become the de facto standard: model performance for streamflow may be judged satisfactory when NSE exceeds 0.50, the RMSE–observations standard deviation ratio (RSR) is at most 0.70, and percent bias (PBIAS) is within ±25%, with stricter thresholds for good and very good ratings. Moriasi et al. (2015) subsequently refined these ratings by constituent, time step, and model type, and recommended that graphical evaluation of hydrographs accompany all statistical assessment. The Bangladeshi applications reviewed in Section 2.6 adopt these thresholds explicitly, and the present study will do likewise, reporting NSE, R², RSR, and PBIAS for both calibration and validation periods.</w:t>
+        <w:t>Quantitative performance evaluation rests on a small set of statistics whose properties have been sharply clarified in recent years. The Nash–Sutcliffe efficiency remains the most widely reported metric, with values above zero indicating improvement on the observed-mean benchmark and values above approximately 0.5 conventionally regarded as satisfactory for streamflow, as applied in the Bangladeshi and Ethiopian studies reviewed above (Moniruzzaman &amp; Mahalder, 2026; Nujhat et al., 2024; Tassew et al., 2019). The Kling–Gupta efficiency (KGE), which decomposes performance into correlation, bias, and variability components, is increasingly reported alongside NSE; Knoben et al. (2019) demonstrated, however, that KGE and NSE values are not directly comparable—the observed-mean benchmark corresponds to KGE ≈ −0.41 rather than zero—and cautioned modelers against transferring NSE-based intuitions to KGE scores. Althoff and Rodrigues (2021) provided a systematic analysis of goodness-of-fit criteria for model calibration and evaluation, showing that the choice of objective function materially shapes the resulting parameter set and recommending that criteria be matched deliberately to the modeling purpose—for example, peak-oriented criteria for flood design versus volume-oriented criteria for water-balance assessment. Percent bias and the RMSE–observations standard deviation ratio complete the standard reporting set used in the recent Bangladeshi applications (M. B. Haque et al., 2024; Nujhat et al., 2024; S. Haque et al., 2020), and the present study will report all four statistics for both calibration and validation periods, accompanied by graphical hydrograph comparison.</w:t>
       </w:r>
     </w:p>
     <w:p>
@@ -1438,7 +1280,7 @@
         <w:jc w:val="left"/>
       </w:pPr>
       <w:r>
-        <w:t>Calibration itself may be manual, automated, or hybrid. HEC-HMS provides univariate-gradient and Nelder–Mead search algorithms with a choice of objective functions (USACE, 2000), and reviewed applications span the full range of practice: manual calibration guided by physical reasoning (Knebl et al., 2005; Nujhat et al., 2024), automated optimization (Tassew et al., 2019), and staged strategies in which event calibration informs continuous simulation (Chu &amp; Steinman, 2009). Sensitivity analysis should precede calibration to concentrate effort on influential parameters; the consistent finding that curve number, lag time, and Muskingum K dominate model response (Tassew et al., 2019) provides a defensible starting parameter set for the present study. Finally, the uncertainty literature cautions against over-interpretation of any single calibrated parameter set. Beven and Binley (1992) introduced the generalized likelihood uncertainty estimation framework on the premise that many parameter combinations may simulate observations equally well, and Beven (2006) elevated this observation into the equifinality thesis, arguing that environmental models should be evaluated as sets of acceptable simulators rather than as single optima. While a full uncertainty analysis lies beyond the scope of most application studies, acknowledging parameter equifinality—for example, by reporting calibrated parameter ranges and testing alternative method combinations—is now regarded as good practice, and the methodology of this thesis incorporates that principle.</w:t>
+        <w:t>Calibration itself may be manual, automated, or hybrid. HEC-HMS provides univariate-gradient and simplex search algorithms with a choice of objective functions (USACE, n.d.), and reviewed applications span the full range of practice: manual calibration guided by physical reasoning (Nujhat et al., 2024), automated optimization (Jawad, 2024; Tassew et al., 2019), and staged strategies in which sensitivity analysis precedes calibration to concentrate effort on influential parameters (Admas et al., 2025). The consistent finding that curve number, lag time, and Muskingum K dominate model response (Tassew et al., 2019) provides a defensible starting parameter set for the present study. Finally, the recent metric literature carries an implicit warning about equifinality: because different objective functions select different acceptable parameter sets (Althoff &amp; Rodrigues, 2021), and because aggregate scores can mask compensating errors in correlation, bias, and variability (Knoben et al., 2019), good practice now favors reporting calibrated parameter ranges, decomposed performance components, and alternative method combinations rather than a single nominally optimal model—a principle incorporated in the methodology of this thesis.</w:t>
       </w:r>
     </w:p>
     <w:p>
@@ -1455,7 +1297,7 @@
         <w:jc w:val="left"/>
       </w:pPr>
       <w:r>
-        <w:t>The reviewed literature supports four conclusions that together define the position of the present study. First, conceptual semi-distributed modeling with HEC-HMS is a mature, extensively validated approach whose default method combination (SCS-CN loss, SCS unit hydrograph transform, Muskingum routing) performs satisfactorily across monsoonal climates, provided that method choices are tested locally and that curve number estimation receives particular care (Halwatura &amp; Najim, 2013; Tassew et al., 2019). Second, the data infrastructure required for such modeling—global DEMs, satellite LULC, and blended precipitation products—is available for Bangladesh, but flat deltaic terrain imposes recognized hazards on automated delineation that must be managed deliberately (Datta et al., 2022; Farr et al., 2007). Third, published Bangladeshi applications of HEC-HMS cluster in large transboundary and piedmont basins (M. B. Haque et al., 2024; Moniruzzaman &amp; Mahalder, 2026; Nujhat et al., 2024; S. Haque et al., 2020); no published study has modeled rainfall–runoff in the beel catchments of the moribund Ganges distributaries, of which the Ichamoti–Gumai Beel system is representative. Fourth, the hydrological problem of such systems is distinctive: inundation is governed by local runoff accumulating behind congested drainage rather than by riverine flood waves (Parvez et al., 2021; Thompson &amp; Sultana, 1996), while the long-term decline of the Ichamoti reflects basin-scale drivers, including post-Farakka flow reduction, that are well documented but have never been connected to a quantitative runoff model of the beel itself (Gain &amp; Giupponi, 2014; Mirza, 1998).</w:t>
+        <w:t>The reviewed literature supports four conclusions that together define the position of the present study. First, conceptual semi-distributed modeling with HEC-HMS is a mature, extensively validated approach whose default method combination (SCS-CN loss, SCS unit hydrograph transform, Muskingum routing) performs satisfactorily across monsoonal and semi-arid climates, provided that method choices are justified for the landscape and purpose at hand and that curve number estimation receives particular care (Hamdan et al., 2021; Horton et al., 2022; Soulis, 2021; Tassew et al., 2019). Second, the data infrastructure required for such modeling—global DEMs, satellite land cover, and satellite or reanalysis precipitation—is available for Bangladesh, but flat deltaic terrain imposes recognized hazards on automated delineation, and precipitation-product limitations for extremes must be managed deliberately (Datta et al., 2022; Pradhan et al., 2022; Uuemaa et al., 2020). Third, published Bangladeshi applications of HEC-HMS cluster in large transboundary and piedmont basins (Jawad, 2024; M. B. Haque et al., 2024; Moniruzzaman &amp; Mahalder, 2026; Nujhat et al., 2024; S. Haque et al., 2020); no published study has modeled rainfall–runoff in the beel catchments of the moribund Ganges distributaries, of which the Ichamoti–Gumai Beel system is representative. Fourth, the hydrological problem of such systems is distinctive: inundation is governed by local runoff accumulating behind congested drainage rather than by riverine flood waves (Adnan et al., 2020; Parvez et al., 2021), while the long-term decline of the distributary network reflects basin-scale flow reduction that is well quantified for the neighboring Gorai but has never been connected to a quantitative runoff model of the beel itself (Ali &amp; Hasan, 2022).</w:t>
       </w:r>
     </w:p>
     <w:p>
@@ -1464,7 +1306,7 @@
         <w:jc w:val="left"/>
       </w:pPr>
       <w:r>
-        <w:t>The research gap addressed by this thesis follows directly. A calibrated and validated HEC-HMS rainfall–runoff model of the Gumai Beel catchment will provide the first quantitative estimate of the runoff volumes and hydrograph dynamics that the Ichamoti drainage corridor must convey, thereby supplying the hydrological foundation for drainage design and for evaluation of the ongoing river rejuvenation program. Methodologically, the study extends the Bangladeshi HEC-HMS literature into an ultra-flat, wetland-dominated, data-scarce environment in which DEM limitations, seasonal land-cover alternation, and baseflow-storage behavior pose challenges identified but not resolved in previous work. The methods adopted in Chapter 3—comparative testing of loss and transform methods, field-verified delineation, gauge-primary forcing with reanalysis gap filling, split-sample testing, and performance evaluation against the Moriasi et al. (2007, 2015) criteria—are each grounded in the literature reviewed in this chapter.</w:t>
+        <w:t>The research gap addressed by this thesis follows directly. A calibrated and validated HEC-HMS rainfall–runoff model of the Gumai Beel catchment will provide the first quantitative estimate of the runoff volumes and hydrograph dynamics that the Ichamoti drainage corridor must convey, thereby supplying the hydrological foundation for drainage design and for evaluation of the ongoing river rejuvenation program (“Tk 1,554cr Project,” 2024). Methodologically, the study extends the Bangladeshi HEC-HMS literature into an ultra-flat, wetland-dominated, data-scarce environment in which DEM limitations, seasonal land-cover alternation, and baseflow-storage behavior pose challenges identified but not resolved in previous work (Datta et al., 2022; M. B. Haque et al., 2024). The methods adopted in Chapter 3—comparative testing of loss and transform methods, field-verified delineation, gauge-primary forcing with reanalysis gap filling, split-sample testing informed by current calibration research, and performance evaluation using NSE, KGE, percent bias, and RSR with purpose-matched objective functions—are each grounded in the literature reviewed in this chapter (Althoff &amp; Rodrigues, 2021; Knoben et al., 2019; Shen et al., 2022).</w:t>
       </w:r>
     </w:p>
     <w:p>
@@ -1488,7 +1330,23 @@
         <w:ind w:left="720" w:hanging="720"/>
       </w:pPr>
       <w:r>
-        <w:t>Akter, A., &amp; Ali, M. H. (2012). Environmental flow requirements assessment in the Halda River, Bangladesh. Hydrological Sciences Journal, 57(2), 326–343. https://doi.org/10.1080/02626667.2011.644242</w:t>
+        <w:t>Adnan, M. S. G., Talchabhadel, R., Nakagawa, H., &amp; Hall, J. W. (2020). The potential of Tidal River Management for flood alleviation in South Western Bangladesh. Science of the Total Environment, 731, Article 138747. https://doi.org/10.1016/j.scitotenv.2020.138747</w:t>
+      </w:r>
+    </w:p>
+    <w:p>
+      <w:pPr>
+        <w:ind w:left="720" w:hanging="720"/>
+      </w:pPr>
+      <w:r>
+        <w:t>Admas, M., Asrade, T. M., &amp; Cherie, W. D. (2025). Application of the HEC-RAS and HEC-HMS models for flood risk analysis in the Gumara River, Upper Blue Nile Basin, Ethiopia. Advances in Meteorology, 2025, Article 5092932. https://doi.org/10.1155/adme/5092932</w:t>
+      </w:r>
+    </w:p>
+    <w:p>
+      <w:pPr>
+        <w:ind w:left="720" w:hanging="720"/>
+      </w:pPr>
+      <w:r>
+        <w:t>Ali, M. S., &amp; Hasan, M. M. (2022). Environmental flow assessment of Gorai River in Bangladesh: A comparative analysis of different hydrological methods. Heliyon, 8(7), Article e09857. https://doi.org/10.1016/j.heliyon.2022.e09857</w:t>
       </w:r>
     </w:p>
     <w:p>
@@ -1504,7 +1362,7 @@
         <w:ind w:left="720" w:hanging="720"/>
       </w:pPr>
       <w:r>
-        <w:t>Beven, K. (2006). A manifesto for the equifinality thesis. Journal of Hydrology, 320(1–2), 18–36. https://doi.org/10.1016/j.jhydrol.2005.07.007</w:t>
+        <w:t>Althoff, D., &amp; Rodrigues, L. N. (2021). Goodness-of-fit criteria for hydrological models: Model calibration and performance assessment. Journal of Hydrology, 600, Article 126674. https://doi.org/10.1016/j.jhydrol.2021.126674</w:t>
       </w:r>
     </w:p>
     <w:p>
@@ -1512,39 +1370,7 @@
         <w:ind w:left="720" w:hanging="720"/>
       </w:pPr>
       <w:r>
-        <w:t>Beven, K. J. (2012). Rainfall-runoff modelling: The primer (2nd ed.). Wiley-Blackwell. https://doi.org/10.1002/9781119951001</w:t>
-      </w:r>
-    </w:p>
-    <w:p>
-      <w:pPr>
-        <w:ind w:left="720" w:hanging="720"/>
-      </w:pPr>
-      <w:r>
-        <w:t>Beven, K., &amp; Binley, A. (1992). The future of distributed models: Model calibration and uncertainty prediction. Hydrological Processes, 6(3), 279–298. https://doi.org/10.1002/hyp.3360060305</w:t>
-      </w:r>
-    </w:p>
-    <w:p>
-      <w:pPr>
-        <w:ind w:left="720" w:hanging="720"/>
-      </w:pPr>
-      <w:r>
-        <w:t>Brammer, H. (1990). Floods in Bangladesh: Geographical background to the 1987 and 1988 floods. The Geographical Journal, 156(1), 12–22. https://doi.org/10.2307/635431</w:t>
-      </w:r>
-    </w:p>
-    <w:p>
-      <w:pPr>
-        <w:ind w:left="720" w:hanging="720"/>
-      </w:pPr>
-      <w:r>
-        <w:t>Chow, V. T., Maidment, D. R., &amp; Mays, L. W. (1988). Applied hydrology. McGraw-Hill.</w:t>
-      </w:r>
-    </w:p>
-    <w:p>
-      <w:pPr>
-        <w:ind w:left="720" w:hanging="720"/>
-      </w:pPr>
-      <w:r>
-        <w:t>Chu, X., &amp; Steinman, A. (2009). Event and continuous hydrologic modeling with HEC-HMS. Journal of Irrigation and Drainage Engineering, 135(1), 119–124. https://doi.org/10.1061/(ASCE)0733-9437(2009)135:1(119)</w:t>
+        <w:t>Bhattacharjee, S., Islam, M. T., Kabir, M. E., &amp; Kabir, M. M. (2021). Land-use and land-cover change detection in a north-eastern wetland ecosystem of Bangladesh using remote sensing and GIS techniques. Earth Systems and Environment, 5(2), 319–340. https://doi.org/10.1007/s41748-021-00228-3</w:t>
       </w:r>
     </w:p>
     <w:p>
@@ -1560,63 +1386,7 @@
         <w:ind w:left="720" w:hanging="720"/>
       </w:pPr>
       <w:r>
-        <w:t>Devia, G. K., Ganasri, B. P., &amp; Dwarakish, G. S. (2015). A review on hydrological models. Aquatic Procedia, 4, 1001–1007. https://doi.org/10.1016/j.aqpro.2015.02.126</w:t>
-      </w:r>
-    </w:p>
-    <w:p>
-      <w:pPr>
-        <w:ind w:left="720" w:hanging="720"/>
-      </w:pPr>
-      <w:r>
-        <w:t>Farr, T. G., Rosen, P. A., Caro, E., Crippen, R., Duren, R., Hensley, S., Kobrick, M., Paller, M., Rodriguez, E., Roth, L., Seal, D., Shaffer, S., Shimada, J., Umland, J., Werner, M., Oskin, M., Burbank, D., &amp; Alsdorf, D. (2007). The Shuttle Radar Topography Mission. Reviews of Geophysics, 45(2), RG2004. https://doi.org/10.1029/2005RG000183</w:t>
-      </w:r>
-    </w:p>
-    <w:p>
-      <w:pPr>
-        <w:ind w:left="720" w:hanging="720"/>
-      </w:pPr>
-      <w:r>
-        <w:t>Fleming, M. J., &amp; Doan, J. H. (2013). HEC-GeoHMS geospatial hydrologic modeling extension: User’s manual (Version 10.1). U.S. Army Corps of Engineers, Hydrologic Engineering Center.</w:t>
-      </w:r>
-    </w:p>
-    <w:p>
-      <w:pPr>
-        <w:ind w:left="720" w:hanging="720"/>
-      </w:pPr>
-      <w:r>
-        <w:t>Funk, C., Peterson, P., Landsfeld, M., Pedreros, D., Verdin, J., Shukla, S., Husak, G., Rowland, J., Harrison, L., Hoell, A., &amp; Michaelsen, J. (2015). The climate hazards infrared precipitation with stations—A new environmental record for monitoring extremes. Scientific Data, 2, Article 150066. https://doi.org/10.1038/sdata.2015.66</w:t>
-      </w:r>
-    </w:p>
-    <w:p>
-      <w:pPr>
-        <w:ind w:left="720" w:hanging="720"/>
-      </w:pPr>
-      <w:r>
-        <w:t>Gain, A. K., &amp; Giupponi, C. (2014). Impact of the Farakka Dam on thresholds of the hydrologic flow regime in the Lower Ganges River Basin (Bangladesh). Water, 6(8), 2501–2518. https://doi.org/10.3390/w6082501</w:t>
-      </w:r>
-    </w:p>
-    <w:p>
-      <w:pPr>
-        <w:ind w:left="720" w:hanging="720"/>
-      </w:pPr>
-      <w:r>
-        <w:t>Gilewski, P., &amp; Nawalany, M. (2018). Inter-comparison of rain-gauge, radar, and satellite (IMERG GPM) precipitation estimates performance for rainfall-runoff modeling in a mountainous catchment in Poland. Water, 10(11), Article 1665. https://doi.org/10.3390/w10111665</w:t>
-      </w:r>
-    </w:p>
-    <w:p>
-      <w:pPr>
-        <w:ind w:left="720" w:hanging="720"/>
-      </w:pPr>
-      <w:r>
-        <w:t>Gupta, H. V., Kling, H., Yilmaz, K. K., &amp; Martinez, G. F. (2009). Decomposition of the mean squared error and NSE performance criteria: Implications for improving hydrological modelling. Journal of Hydrology, 377(1–2), 80–91. https://doi.org/10.1016/j.jhydrol.2009.08.003</w:t>
-      </w:r>
-    </w:p>
-    <w:p>
-      <w:pPr>
-        <w:ind w:left="720" w:hanging="720"/>
-      </w:pPr>
-      <w:r>
-        <w:t>Halwatura, D., &amp; Najim, M. M. M. (2013). Application of the HEC-HMS model for runoff simulation in a tropical catchment. Environmental Modelling &amp; Software, 46, 155–162. https://doi.org/10.1016/j.envsoft.2013.03.006</w:t>
+        <w:t>Hamdan, A. N. A., Almuktar, S., &amp; Scholz, M. (2021). Rainfall-runoff modeling using the HEC-HMS model for the Al-Adhaim River catchment, northern Iraq. Hydrology, 8(2), Article 58. https://doi.org/10.3390/hydrology8020058</w:t>
       </w:r>
     </w:p>
     <w:p>
@@ -1648,6 +1418,14 @@
         <w:ind w:left="720" w:hanging="720"/>
       </w:pPr>
       <w:r>
+        <w:t>Horton, P., Schaefli, B., &amp; Kauzlaric, M. (2022). Why do we have so many different hydrological models? A review based on the case of Switzerland. WIREs Water, 9(1), Article e1574. https://doi.org/10.1002/wat2.1574</w:t>
+      </w:r>
+    </w:p>
+    <w:p>
+      <w:pPr>
+        <w:ind w:left="720" w:hanging="720"/>
+      </w:pPr>
+      <w:r>
         <w:t>Ichhamati now a trickle. (2019). The Daily Star. https://www.thedailystar.net/backpage/news/ichhamati-now-trickle-1828042</w:t>
       </w:r>
     </w:p>
@@ -1656,7 +1434,7 @@
         <w:ind w:left="720" w:hanging="720"/>
       </w:pPr>
       <w:r>
-        <w:t>Klemeš, V. (1986). Operational testing of hydrological simulation models. Hydrological Sciences Journal, 31(1), 13–24. https://doi.org/10.1080/02626668609491024</w:t>
+        <w:t>Jawad, M. (2024). Evaluation of near real-time Global Precipitation Measurement (GPM) precipitation products for hydrological modelling and flood inundation mapping of sparsely gauged large transboundary basins—A case study of the Brahmaputra basin. Remote Sensing, 16(10), Article 1756. https://doi.org/10.3390/rs16101756</w:t>
       </w:r>
     </w:p>
     <w:p>
@@ -1664,39 +1442,7 @@
         <w:ind w:left="720" w:hanging="720"/>
       </w:pPr>
       <w:r>
-        <w:t>Knebl, M. R., Yang, Z.-L., Hutchison, K., &amp; Maidment, D. R. (2005). Regional scale flood modeling using NEXRAD rainfall, GIS, and HEC-HMS/RAS: A case study for the San Antonio River Basin summer 2002 storm event. Journal of Environmental Management, 75(4), 325–336. https://doi.org/10.1016/j.jenvman.2004.11.024</w:t>
-      </w:r>
-    </w:p>
-    <w:p>
-      <w:pPr>
-        <w:ind w:left="720" w:hanging="720"/>
-      </w:pPr>
-      <w:r>
-        <w:t>Meenu, R., Rehana, S., &amp; Mujumdar, P. P. (2013). Assessment of hydrologic impacts of climate change in Tunga–Bhadra river basin, India with HEC-HMS and SDSM. Hydrological Processes, 27(11), 1572–1589. https://doi.org/10.1002/hyp.9220</w:t>
-      </w:r>
-    </w:p>
-    <w:p>
-      <w:pPr>
-        <w:ind w:left="720" w:hanging="720"/>
-      </w:pPr>
-      <w:r>
-        <w:t>Mirza, M. M. Q. (1998). Diversion of the Ganges water at Farakka and its effects on salinity in Bangladesh. Environmental Management, 22(5), 711–722. https://doi.org/10.1007/s002679900141</w:t>
-      </w:r>
-    </w:p>
-    <w:p>
-      <w:pPr>
-        <w:ind w:left="720" w:hanging="720"/>
-      </w:pPr>
-      <w:r>
-        <w:t>Mishra, S. K., &amp; Singh, V. P. (2003). Soil Conservation Service Curve Number (SCS-CN) methodology. Springer. https://doi.org/10.1007/978-94-017-0147-1</w:t>
-      </w:r>
-    </w:p>
-    <w:p>
-      <w:pPr>
-        <w:ind w:left="720" w:hanging="720"/>
-      </w:pPr>
-      <w:r>
-        <w:t>Mitsch, W. J., &amp; Gosselink, J. G. (2015). Wetlands (5th ed.). John Wiley &amp; Sons.</w:t>
+        <w:t>Knoben, W. J. M., Freer, J. E., &amp; Woods, R. A. (2019). Technical note: Inherent benchmark or not? Comparing Nash–Sutcliffe and Kling–Gupta efficiency scores. Hydrology and Earth System Sciences, 23(10), 4323–4331. https://doi.org/10.5194/hess-23-4323-2019</w:t>
       </w:r>
     </w:p>
     <w:p>
@@ -1712,39 +1458,7 @@
         <w:ind w:left="720" w:hanging="720"/>
       </w:pPr>
       <w:r>
-        <w:t>Moriasi, D. N., Arnold, J. G., Van Liew, M. W., Bingner, R. L., Harmel, R. D., &amp; Veith, T. L. (2007). Model evaluation guidelines for systematic quantification of accuracy in watershed simulations. Transactions of the ASABE, 50(3), 885–900. https://doi.org/10.13031/2013.23153</w:t>
-      </w:r>
-    </w:p>
-    <w:p>
-      <w:pPr>
-        <w:ind w:left="720" w:hanging="720"/>
-      </w:pPr>
-      <w:r>
-        <w:t>Moriasi, D. N., Gitau, M. W., Pai, N., &amp; Daggupati, P. (2015). Hydrologic and water quality models: Performance measures and evaluation criteria. Transactions of the ASABE, 58(6), 1763–1785. https://doi.org/10.13031/trans.58.10715</w:t>
-      </w:r>
-    </w:p>
-    <w:p>
-      <w:pPr>
-        <w:ind w:left="720" w:hanging="720"/>
-      </w:pPr>
-      <w:r>
-        <w:t>Nash, J. E., &amp; Sutcliffe, J. V. (1970). River flow forecasting through conceptual models part I—A discussion of principles. Journal of Hydrology, 10(3), 282–290. https://doi.org/10.1016/0022-1694(70)90255-6</w:t>
-      </w:r>
-    </w:p>
-    <w:p>
-      <w:pPr>
-        <w:ind w:left="720" w:hanging="720"/>
-      </w:pPr>
-      <w:r>
         <w:t>Nujhat, M., Rayhan, M., &amp; Amin, M. K. (2024). Hydrological modelling and its implication in sustainable water resource management in Gumti River Basin in Bangladesh. International Journal of Sustainability in Energy and Environment, 1(2), 40–48.</w:t>
-      </w:r>
-    </w:p>
-    <w:p>
-      <w:pPr>
-        <w:ind w:left="720" w:hanging="720"/>
-      </w:pPr>
-      <w:r>
-        <w:t>Oleyiblo, J. O., &amp; Li, Z. (2010). Application of HEC-HMS for flood forecasting in Misai and Wan’an catchments in China. Water Science and Engineering, 3(1), 14–22. https://doi.org/10.3882/j.issn.1674-2370.2010.01.002</w:t>
       </w:r>
     </w:p>
     <w:p>
@@ -1760,7 +1474,7 @@
         <w:ind w:left="720" w:hanging="720"/>
       </w:pPr>
       <w:r>
-        <w:t>Ponce, V. M., &amp; Hawkins, R. H. (1996). Runoff curve number: Has it reached maturity? Journal of Hydrologic Engineering, 1(1), 11–19. https://doi.org/10.1061/(ASCE)1084-0699(1996)1:1(11)</w:t>
+        <w:t>Pradhan, R. K., Markonis, Y., Vargas Godoy, M. R., Villalba-Pradas, A., Andreadis, K. M., Nikolopoulos, E. I., Papalexiou, S. M., Rahim, A., Tapiador, F. J., &amp; Hanel, M. (2022). Review of GPM IMERG performance: A global perspective. Remote Sensing of Environment, 268, Article 112754. https://doi.org/10.1016/j.rse.2021.112754</w:t>
       </w:r>
     </w:p>
     <w:p>
@@ -1776,7 +1490,23 @@
         <w:ind w:left="720" w:hanging="720"/>
       </w:pPr>
       <w:r>
-        <w:t>Singh, V. P., &amp; Woolhiser, D. A. (2002). Mathematical modeling of watershed hydrology. Journal of Hydrologic Engineering, 7(4), 270–292. https://doi.org/10.1061/(ASCE)1084-0699(2002)7:4(270)</w:t>
+        <w:t>Salimi, S., Almuktar, S. A. A. A. N., &amp; Scholz, M. (2021). Impact of climate change on wetland ecosystems: A critical review of experimental wetlands. Journal of Environmental Management, 286, Article 112160. https://doi.org/10.1016/j.jenvman.2021.112160</w:t>
+      </w:r>
+    </w:p>
+    <w:p>
+      <w:pPr>
+        <w:ind w:left="720" w:hanging="720"/>
+      </w:pPr>
+      <w:r>
+        <w:t>Shen, H., Tolson, B. A., &amp; Mai, J. (2022). Time to update the split-sample approach in hydrological model calibration. Water Resources Research, 58(3), Article e2021WR031523. https://doi.org/10.1029/2021WR031523</w:t>
+      </w:r>
+    </w:p>
+    <w:p>
+      <w:pPr>
+        <w:ind w:left="720" w:hanging="720"/>
+      </w:pPr>
+      <w:r>
+        <w:t>Soulis, K. X. (2021). Soil Conservation Service Curve Number (SCS-CN) method: Current applications, remaining challenges, and future perspectives. Water, 13(2), Article 192. https://doi.org/10.3390/w13020192</w:t>
       </w:r>
     </w:p>
     <w:p>
@@ -1792,14 +1522,6 @@
         <w:ind w:left="720" w:hanging="720"/>
       </w:pPr>
       <w:r>
-        <w:t>Thompson, P. M., &amp; Sultana, P. (1996). Distributional and social impacts of flood control in Bangladesh. The Geographical Journal, 162(1), 1–13. https://doi.org/10.2307/3060212</w:t>
-      </w:r>
-    </w:p>
-    <w:p>
-      <w:pPr>
-        <w:ind w:left="720" w:hanging="720"/>
-      </w:pPr>
-      <w:r>
         <w:t>Tk 1,554cr project to revive dying Ichamati. (2024). The Daily Star. https://www.thedailystar.net/news/bangladesh/news/tk-1554cr-project-revive-dying-ichamati-3555931</w:t>
       </w:r>
     </w:p>
@@ -1808,7 +1530,7 @@
         <w:ind w:left="720" w:hanging="720"/>
       </w:pPr>
       <w:r>
-        <w:t>U.S. Army Corps of Engineers. (2000). Hydrologic Modeling System HEC-HMS: Technical reference manual. Hydrologic Engineering Center.</w:t>
+        <w:t>U.S. Army Corps of Engineers, Hydrologic Engineering Center. (n.d.). HEC-HMS technical reference manual. Retrieved August 16, 2026, from https://www.hec.usace.army.mil/confluence/hmsdocs/hmstrm</w:t>
       </w:r>
     </w:p>
     <w:p>
@@ -1816,7 +1538,7 @@
         <w:ind w:left="720" w:hanging="720"/>
       </w:pPr>
       <w:r>
-        <w:t>USDA Soil Conservation Service. (1985). National engineering handbook, Section 4: Hydrology. U.S. Department of Agriculture.</w:t>
+        <w:t>Uuemaa, E., Ahi, S., Montibeller, B., Muru, M., &amp; Kmoch, A. (2020). Vertical accuracy of freely available global digital elevation models (ASTER, AW3D30, MERIT, TanDEM-X, SRTM, and NASADEM). Remote Sensing, 12(21), Article 3482. https://doi.org/10.3390/rs12213482</w:t>
       </w:r>
     </w:p>
     <w:sectPr>

</xml_diff>

<commit_message>
Rebuild literature review around author's Sections 2.1-2.2 with verified 2020+ sources
Co-authored-by: Bit Raven <bitraveneth@users.noreply.github.com>
</commit_message>
<xml_diff>
--- a/thesis/Literature_Review_Gumai_Beel_Ichamoti_HEC-HMS.docx
+++ b/thesis/Literature_Review_Gumai_Beel_Ichamoti_HEC-HMS.docx
@@ -2,93 +2,13 @@
 <file path=word/document.xml><?xml version="1.0" encoding="utf-8"?>
 <w:document xmlns:wpc="http://schemas.microsoft.com/office/word/2010/wordprocessingCanvas" xmlns:mo="http://schemas.microsoft.com/office/mac/office/2008/main" xmlns:mc="http://schemas.openxmlformats.org/markup-compatibility/2006" xmlns:mv="urn:schemas-microsoft-com:mac:vml" xmlns:o="urn:schemas-microsoft-com:office:office" xmlns:r="http://schemas.openxmlformats.org/officeDocument/2006/relationships" xmlns:m="http://schemas.openxmlformats.org/officeDocument/2006/math" xmlns:v="urn:schemas-microsoft-com:vml" xmlns:wp14="http://schemas.microsoft.com/office/word/2010/wordprocessingDrawing" xmlns:wp="http://schemas.openxmlformats.org/drawingml/2006/wordprocessingDrawing" xmlns:w10="urn:schemas-microsoft-com:office:word" xmlns:w="http://schemas.openxmlformats.org/wordprocessingml/2006/main" xmlns:w14="http://schemas.microsoft.com/office/word/2010/wordml" xmlns:wpg="http://schemas.microsoft.com/office/word/2010/wordprocessingGroup" xmlns:wpi="http://schemas.microsoft.com/office/word/2010/wordprocessingInk" xmlns:wne="http://schemas.microsoft.com/office/word/2006/wordml" xmlns:wps="http://schemas.microsoft.com/office/word/2010/wordprocessingShape" mc:Ignorable="w14 wp14">
   <w:body>
-    <w:p/>
-    <w:p/>
-    <w:p/>
-    <w:p/>
     <w:p>
-      <w:pPr>
-        <w:jc w:val="center"/>
-      </w:pPr>
       <w:r>
         <w:rPr>
           <w:b/>
+          <w:sz w:val="28"/>
         </w:rPr>
-        <w:t>Modeling Rainfall–Runoff in the Gumai Beel, Ichamoti River Using HEC-HMS</w:t>
-      </w:r>
-    </w:p>
-    <w:p>
-      <w:pPr>
-        <w:jc w:val="center"/>
-      </w:pPr>
-    </w:p>
-    <w:p>
-      <w:pPr>
-        <w:jc w:val="center"/>
-      </w:pPr>
-      <w:r>
-        <w:t>Chapter 2: Literature Review</w:t>
-      </w:r>
-    </w:p>
-    <w:p>
-      <w:pPr>
-        <w:jc w:val="center"/>
-      </w:pPr>
-    </w:p>
-    <w:p>
-      <w:pPr>
-        <w:jc w:val="center"/>
-      </w:pPr>
-      <w:r>
-        <w:t>[Student Name]</w:t>
-      </w:r>
-    </w:p>
-    <w:p>
-      <w:pPr>
-        <w:jc w:val="center"/>
-      </w:pPr>
-      <w:r>
-        <w:t>Department of [Department Name], [University Name]</w:t>
-      </w:r>
-    </w:p>
-    <w:p>
-      <w:pPr>
-        <w:jc w:val="center"/>
-      </w:pPr>
-      <w:r>
-        <w:t>MS Thesis</w:t>
-      </w:r>
-    </w:p>
-    <w:p>
-      <w:pPr>
-        <w:jc w:val="center"/>
-      </w:pPr>
-      <w:r>
-        <w:t>[Supervisor Name], Supervisor</w:t>
-      </w:r>
-    </w:p>
-    <w:p>
-      <w:pPr>
-        <w:jc w:val="center"/>
-      </w:pPr>
-      <w:r>
-        <w:t>[Month, Year]</w:t>
-      </w:r>
-    </w:p>
-    <w:p>
-      <w:r>
-        <w:br w:type="page"/>
-      </w:r>
-    </w:p>
-    <w:p>
-      <w:pPr>
-        <w:jc w:val="center"/>
-      </w:pPr>
-      <w:r>
-        <w:rPr>
-          <w:b/>
-        </w:rPr>
-        <w:t>Chapter 2: Literature Review</w:t>
+        <w:t>2. Literature review</w:t>
       </w:r>
     </w:p>
     <w:p>
@@ -96,7 +16,7 @@
         <w:rPr>
           <w:b/>
         </w:rPr>
-        <w:t>2.1 Introduction</w:t>
+        <w:t>2.1 Concept of rainfall-runoff modeling</w:t>
       </w:r>
     </w:p>
     <w:p>
@@ -105,7 +25,7 @@
         <w:jc w:val="left"/>
       </w:pPr>
       <w:r>
-        <w:t>This chapter reviews the recent body of scientific literature—published from 2019 onward—that underpins the present study, which develops a rainfall–runoff model of the Gumai Beel catchment within the Ichamoti River system of Pabna District, Bangladesh, using the Hydrologic Engineering Center’s Hydrologic Modeling System (HEC-HMS). Restricting the review to the most recent literature serves two purposes: it ensures that the methodological choices of this thesis reflect the current state of practice rather than superseded conventions, and it captures the newest generation of data products, evaluation standards, and regional studies that older reviews necessarily omit. The review is organized to move from the general to the particular. It begins with the conceptual foundations of rainfall–runoff modeling and the contemporary debate on model selection, and then examines the structure of the HEC-HMS framework and the scientific basis of its principal computational methods. Subsequent sections review the role of geographic information systems (GIS) and remote sensing in supplying model inputs, survey recent applications of HEC-HMS across diverse hydro-climatic regions, and narrow the focus to hydrological modeling experience in Bangladesh. Because the study area is not an ordinary upland catchment but a low-lying floodplain wetland (beel) drained by a moribund distributary of the Padma River, a dedicated section reviews the hydrology of beel and floodplain-wetland systems, the anthropogenic decline of the Ichamoti River, and the chronic drainage congestion of the Pabna region. The chapter then reviews current standards for model calibration, validation, and performance evaluation, and closes with a synthesis that identifies the research gap this thesis addresses.</w:t>
+        <w:t>Rainfall–runoff modeling is an important component of hydrological science because it provides a quantitative framework for understanding how precipitation is transformed into runoff within a watershed. The relationship between rainfall and runoff is controlled by several factors, including rainfall intensity and duration, soil characteristics, antecedent moisture conditions, land use and land cover, topography, drainage characteristics, evapotranspiration, and surface-water storage. Because these factors vary spatially and temporally, the response of a watershed to a given rainfall event is rarely linear or uniform. Hydrological models are therefore widely used to simplify and represent these processes and to estimate streamflow from available meteorological and watershed information (Sahu et al., 2023).</w:t>
       </w:r>
     </w:p>
     <w:p>
@@ -114,15 +34,7 @@
         <w:jc w:val="left"/>
       </w:pPr>
       <w:r>
-        <w:t>Throughout the chapter, emphasis is placed on three questions that guide the design of the present study: (a) which combinations of loss, transform, baseflow, and routing methods within HEC-HMS have proven reliable in monsoon-dominated and data-scarce catchments; (b) what data sources and pre-processing strategies are appropriate where gauge networks are sparse and the terrain is extremely flat; and (c) what performance criteria constitute an acceptable model in the context of an applied water-management problem such as the drainage rehabilitation of the Gumai Beel–Ichamoti system.</w:t>
-      </w:r>
-    </w:p>
-    <w:p>
-      <w:r>
-        <w:rPr>
-          <w:b/>
-        </w:rPr>
-        <w:t>2.2 Rainfall–Runoff Processes and the Selection of Hydrological Models</w:t>
+        <w:t>Rainfall–runoff models have become increasingly important for flood forecasting, watershed management, water-resources planning and assessment of hydrological hazards. Recent research has produced a wide range of empirical and conceptual based data-driven models. However, model selection depends strongly on the purpose of the study, the characteristics of the watershed, the temporal and spatial resolution of available data, and the level of process representation required. Greater model complexity does not necessarily result in better performance because model uncertainty can arise from input data, parameterization, structural assumptions, and spatial heterogeneity (Sahu et al., 2023).</w:t>
       </w:r>
     </w:p>
     <w:p>
@@ -131,7 +43,7 @@
         <w:jc w:val="left"/>
       </w:pPr>
       <w:r>
-        <w:t>The transformation of rainfall into streamflow remains the central problem of applied hydrology. Precipitation falling on a catchment is partitioned among interception, depression storage, infiltration, evapotranspiration, soil-moisture replenishment, and surface runoff, and the runoff component is subsequently translated and attenuated as it travels over hillslopes and through channel networks to the catchment outlet. Because direct measurement of each of these processes at the catchment scale is impossible, hydrologists rely on mathematical models that represent the catchment as a system converting an input hyetograph into an output hydrograph. The contemporary modeling landscape is characterized by an overwhelming diversity of such models. Horton et al. (2022), in a systematic review of the drivers of model diversification, showed that the coexistence of empirical, conceptual, and physically based models—and of lumped, semi-distributed, and fully distributed spatial structures—reflects not only genuine differences in application context but also institutional habit, and they observed that the motivations for selecting a particular model are rarely stated explicitly in published studies. Their central recommendation, that model choice be justified by the adequacy of the model for the landscape, the data, and the purpose at hand, frames the model-selection reasoning of this thesis.</w:t>
+        <w:t>Among the available rainfall–runoff models, the Hydrologic Engineering Center–Hydrologic Modeling System (HEC-HMS) has been widely applied because of its flexible and modular structure. The model allows precipitation to be converted into runoff through different loss, transform, baseflow, and routing methods. An appropriate representation can be selected according to the characteristics and objectives of a particular watershed. Recent reviews have identified the Soil Conservation Service Curve Number (SCS-CN) and SCS Unit Hydrograph methods as among the most frequently used approaches in HEC-HMS applications, while recession methods and Muskingum-type routing approaches are also commonly applied (Labade et al., 2025; Sahu et al., 2023; Turkar et al., 2025).</w:t>
       </w:r>
     </w:p>
     <w:p>
@@ -140,7 +52,7 @@
         <w:jc w:val="left"/>
       </w:pPr>
       <w:r>
-        <w:t>For data-scarce developing-country catchments, the practical comparison is usually between conceptual semi-distributed systems such as HEC-HMS and more heavily parameterized ecohydrological models such as the Soil and Water Assessment Tool (SWAT). Recent head-to-head evaluations illuminate the trade-off. Aliye et al. (2020), comparing the two models for a data-scarce catchment of the Ethiopian Rift Valley Lakes basin, found both capable of credible streamflow simulation. Moniruzzaman and Mahalder (2026), performing the same comparison for the Atrai–Karatoa basin of northern Bangladesh, found that SWAT better reproduced high flows while HEC-HMS was more accurate for medium flows, with both models performing satisfactorily overall. These results indicate that HEC-HMS remains a defensible choice where the modeling objective centers on runoff-hydrograph generation rather than on sediment, nutrient, or land-management simulation, and where its far smaller parameter set suits the available data.</w:t>
+        <w:t>The integration of HEC-HMS with Geographic Information Systems (GIS) has further increased its applicability. GIS enables the extraction of watershed boundaries, drainage networks, slopes, flow paths, land-use information, and soil characteristics from spatial datasets. These data can subsequently be used to develop hydrological parameters for the HEC-HMS model. Integrated ArcGIS-derived land-use, soil, and slope information with rainfall and runoff observations are used to develop HEC-HMS models for the Punpun River Basin (Ranjan &amp; Singh, 2022). Their study demonstrated the practical value of combining spatial watershed information with observed hydrometeorological data for rainfall–runoff simulation.</w:t>
       </w:r>
     </w:p>
     <w:p>
@@ -149,7 +61,16 @@
         <w:jc w:val="left"/>
       </w:pPr>
       <w:r>
-        <w:t>A further operational distinction separates event-based from continuous simulation. Event-based modeling simulates the catchment response to individual storms and is appropriate for design-flood estimation and flood forecasting; recent applications include the daily event-oriented modeling of the Al-Adhaim catchment in Iraq (Hamdan et al., 2021) and the flood-risk simulations of the Gumara River in Ethiopia (Admas et al., 2025). Continuous modeling, by contrast, tracks moisture accounting through wet and dry periods over months or years using algorithms such as the soil moisture accounting (SMA) loss method, as in the multi-year simulation of the Brahmaputra basin by Jawad (2024) and the climate-scenario modeling of the same basin by S. Haque et al. (2020). The inundation behavior of the Gumai Beel is governed both by individual monsoon storm events and by the strongly seasonal water balance, so the present study requires a modeling system capable of both modes, a requirement that HEC-HMS satisfies within a single framework (U.S. Army Corps of Engineers [USACE], n.d.).</w:t>
+        <w:t>The application of HEC-HMS is particularly relevant to Bangladesh because of the country’s monsoonal rainfall regime, extensive river network, low-lying floodplains, wetlands, and recurrent flooding. Several recent studies have applied HEC-HMS to Bangladesh river basins, including the Khowai, Bangali, Halda, Old Brahmaputra, Dhaka, and Atrai–Karatoa systems. These studies demonstrate the applicability of the model under Bangladesh’s hydrological conditions but also highlight challenges related to rainfall representation, discharge availability, baseflow simulation, and model parameterization (M. B. Haque et al., 2024; Moniruzzaman &amp; Mahalder, 2026; Nur et al., 2022; Zhang et al., 2022).</w:t>
+      </w:r>
+    </w:p>
+    <w:p>
+      <w:pPr>
+        <w:ind w:firstLine="720"/>
+        <w:jc w:val="left"/>
+      </w:pPr>
+      <w:r>
+        <w:t>The present study focuses on rainfall–runoff modelling of the Gumai Beel–Ichamoti River system using HEC-HMS. Gumai Beel represents a low-lying wetland and agricultural environment, while the Ichamoti River forms an important drainage component of the surrounding landscape. The hydrological response of such a system may differ from the conventional upland watersheds. Because wetland storage, seasonal inundation, drainage connectivity, and agricultural land use can influence the timing and magnitude of runoff. Therefore, a review of rainfall–runoff processes, hydrological modelling approaches, HEC-HMS methodology, GIS integration, wetland hydrology, and previous Bangladesh applications is necessary to establish the scientific basis for the present research.</w:t>
       </w:r>
     </w:p>
     <w:p>
@@ -157,7 +78,104 @@
         <w:rPr>
           <w:b/>
         </w:rPr>
-        <w:t>2.3 The HEC-HMS Modeling Framework</w:t>
+        <w:t>2.2 Rainfall-runoff process</w:t>
+      </w:r>
+    </w:p>
+    <w:p>
+      <w:pPr>
+        <w:ind w:firstLine="720"/>
+        <w:jc w:val="left"/>
+      </w:pPr>
+      <w:r>
+        <w:t>Rainfall–runoff transformation governs the hydrological routing of precipitation across a drainage basin and its ultimate conversion into streamflow discharge. Incident precipitation across the land surface is partitioned dynamically among canopy interception, infiltration into the vadose zone, surface depression storage, evapotranspiration loss, and overland or subsurface lateral flow. The volumetric fraction of precipitation that reaches the channel network is dictated by the dynamic equilibrium among these constituent processes. Consequently, the hydrograph configuration produced by a given precipitation event is governed not only by gross rainfall depth, but also by storm duration, temporal hyetograph distribution, peak rainfall intensity, and the antecedent hydrological state of the catchment (Labade et al., 2025).</w:t>
+      </w:r>
+    </w:p>
+    <w:p>
+      <w:pPr>
+        <w:ind w:firstLine="720"/>
+        <w:jc w:val="left"/>
+      </w:pPr>
+      <w:r>
+        <w:t>Precipitation intensity directly regulates the threshold between infiltration and direct overland flow. When precipitation rates surpass the saturated hydraulic conductivity and infiltration capacity of the soil, infiltration-excess (Hortonian) overland flow is initiated and rapidly routed to the channel network. Conversely, rainfall rates below the infiltration threshold primarily replenish soil moisture storage or contribute to subsurface matrix flow. Antecedent moisture conditions further modulate this response: a dry catchment exhibits substantial initial abstraction and retention capacity, whereas antecedent saturation markedly reduces soil matrix suction potential, accelerating saturation-excess overland flow. As a result, identical storm depths falling under differing initial moisture conditions generate fundamentally disparate runoff hydrographs (Shi &amp; Wang, 2020).</w:t>
+      </w:r>
+    </w:p>
+    <w:p>
+      <w:pPr>
+        <w:ind w:firstLine="720"/>
+        <w:jc w:val="left"/>
+      </w:pPr>
+      <w:r>
+        <w:t>Catchment physiography and surface cover impose critical boundary controls on hydrograph translation and attenuation. Parameters such as soil texture, effective porosity, hydraulic conductivity, soil profile depth, topographic gradient, drainage density, and surface roughness collectively determine the velocity and storage dynamics of routed water. Anthropogenic land-use and land-cover (LULC) modifications directly influence these hydrologic controls such as urban expansion increases surface imperviousness and accelerates hydrograph. Dense vegetative canopies enhance interception and infiltration capacity. In agricultural floodplains, hydrological responses exhibit pronounced seasonal variability driven by cyclical crop growth stages, tillage practices, and artificial field drainage regimes (Dibaba et al., 2020).</w:t>
+      </w:r>
+    </w:p>
+    <w:p>
+      <w:pPr>
+        <w:ind w:firstLine="720"/>
+        <w:jc w:val="left"/>
+      </w:pPr>
+      <w:r>
+        <w:t>In low-lying wetland such as Gumai Beel, runoff generation is influenced by dynamic depression storage, delayed infiltration, and temporary surface-water retention. Within the floodplain morphology of Bangladesh, river–wetland systems function as hydrodynamic buffers whose storage behavior is dictated by seasonal monsoon inundation pulses and dynamic lateral river connectivity (Adnan et al., 2020; Akter &amp; Sawon, 2024). These seasonal fluctuations in backwater staging, storage volume, and hydraulic connectivity introduce significant attenuation and lag into the catchment discharge hydrograph (Akter &amp; Sawon, 2024). It represents a critical hydrodynamic mechanism in the rainfall–runoff modeling of the Gumai Beel–Ichamoti River system.</w:t>
+      </w:r>
+    </w:p>
+    <w:p>
+      <w:r>
+        <w:rPr>
+          <w:b/>
+        </w:rPr>
+        <w:t>2.3 Classification and selection of hydrological models</w:t>
+      </w:r>
+    </w:p>
+    <w:p>
+      <w:pPr>
+        <w:ind w:firstLine="720"/>
+        <w:jc w:val="left"/>
+      </w:pPr>
+      <w:r>
+        <w:t>Hydrological models are conventionally differentiated along two principal axes: the degree of physical process representation and the level of spatial discretisation. On the first axis, empirical or data-driven models establish statistical transfer functions between input and output series without explicit reference to physical mechanisms; conceptual models represent the catchment as a cascade of interconnected storage elements whose governing equations approximate physical behaviour; and physically based models solve conservation equations for mass, momentum, and energy using parameters that are, in principle, independently measurable. On the second axis, lumped models treat the catchment as a single homogeneous unit, semi-distributed models subdivide it into sub-basins within which parameters are averaged, and fully distributed models resolve hydrological state variables on a regular computational grid (Sahu et al., 2023). HEC-HMS occupies an intermediate position in this taxonomy, functioning as a conceptual, semi-distributed system that reproduces the dominant runoff-generation mechanisms without imposing the data burden of fully distributed formulations (Turkar et al., 2025).</w:t>
+      </w:r>
+    </w:p>
+    <w:p>
+      <w:pPr>
+        <w:ind w:firstLine="720"/>
+        <w:jc w:val="left"/>
+      </w:pPr>
+      <w:r>
+        <w:t>The proliferation of hydrological models has itself become a subject of critical enquiry. Horton et al. (2022), combining a systematic literature review with a structured survey of practising modellers, demonstrated that model diversity is driven only partially by genuine differences in application context; a substantial component reflects institutional familiarity, code accessibility, and the reuse of pre-existing model configurations. Their central observation, that the justification for model selection is rarely articulated in published studies, establishes an explicit methodological obligation: the choice of a modelling system must be defended with reference to the physical characteristics of the catchment, the availability and resolution of input data, and the specific objectives of the investigation. This obligation is addressed directly in the present study through the reasoning developed in Sections 2.3 and 2.4.</w:t>
+      </w:r>
+    </w:p>
+    <w:p>
+      <w:pPr>
+        <w:ind w:firstLine="720"/>
+        <w:jc w:val="left"/>
+      </w:pPr>
+      <w:r>
+        <w:t>For data-limited catchments, the operative comparison in contemporary practice lies between conceptual semi-distributed systems such as HEC-HMS and more heavily parameterised ecohydrological frameworks such as the Soil and Water Assessment Tool (SWAT). Comparative evaluations clarify the associated trade-offs. Aliye et al. (2020), examining both models within a data-scarce catchment of the Ethiopian Rift Valley Lakes Basin, concluded that each framework was capable of reproducing observed streamflow with acceptable accuracy. Moniruzzaman and Mahalder (2026), applying an equivalent comparison to the Atrai–Karatoa River Basin of northern Bangladesh, reported that SWAT reproduced high flows more faithfully whereas HEC-HMS achieved superior accuracy across the medium-flow range, with both models simulating low flows adequately. These findings indicate that HEC-HMS constitutes a defensible selection where the modelling objective is hydrograph generation rather than the simulation of sediment transport, nutrient flux, or land-management scenarios, and where the parsimony of its parameter set corresponds to the available observational record.</w:t>
+      </w:r>
+    </w:p>
+    <w:p>
+      <w:pPr>
+        <w:ind w:firstLine="720"/>
+        <w:jc w:val="left"/>
+      </w:pPr>
+      <w:r>
+        <w:t>A further operational distinction separates event-based from continuous simulation. Event-based configurations reproduce the catchment response to discrete storm episodes and are appropriate for design-flood estimation, peak discharge analysis, and flood forecasting. Continuous configurations track soil-moisture accounting through alternating wet and dry periods over multi-annual horizons and are appropriate for water-balance and water-resources assessment. Reviews of the HEC-HMS application literature indicate that the SCS-CN loss method dominates event-based practice, whereas the Soil Moisture Accounting (SMA) algorithm is preferred for continuous simulation (Labade et al., 2025; Turkar et al., 2025). Because the inundation regime of the Gumai Beel is governed simultaneously by discrete monsoon storm events and by the strongly seasonal water balance of the surrounding floodplain, the present study requires a modelling system capable of operating in both modes, a requirement that HEC-HMS satisfies within a single computational framework.</w:t>
+      </w:r>
+    </w:p>
+    <w:p>
+      <w:r>
+        <w:rPr>
+          <w:b/>
+        </w:rPr>
+        <w:t>2.4 Structure and components of the HEC-HMS model</w:t>
+      </w:r>
+    </w:p>
+    <w:p>
+      <w:pPr>
+        <w:ind w:firstLine="720"/>
+        <w:jc w:val="left"/>
+      </w:pPr>
+      <w:r>
+        <w:t>HEC-HMS was developed by the Hydrologic Engineering Center of the United States Army Corps of Engineers to simulate the complete precipitation–runoff process of dendritic watershed systems (U.S. Army Corps of Engineers [USACE], n.d.). A model project comprises three principal components. The basin model represents the physical catchment as a network of hydrological elements, including sub-basins, reaches, junctions, reservoirs, diversions, sources, and sinks. The meteorological model assigns precipitation and evapotranspiration boundary conditions to each sub-basin through gauge weighting, inverse-distance interpolation, or gridded input. The control specifications define the temporal window and computational time step of the simulation. Within each sub-basin, the user selects one algorithm from each of several interchangeable method libraries governing canopy and surface storage, infiltration loss, direct-runoff transformation, and baseflow, while each routing reach is assigned an independent channel-routing method (Sahu et al., 2023; USACE, n.d.). This modular architecture accounts for the model’s adaptability across climatic regimes and explains its widespread adoption in regions where proprietary modelling systems are financially inaccessible (Hamdan et al., 2021).</w:t>
       </w:r>
     </w:p>
     <w:p>
@@ -166,7 +184,7 @@
           <w:b/>
           <w:i/>
         </w:rPr>
-        <w:t>2.3.1 Origin and Structure</w:t>
+        <w:t>2.4.1 Loss methods</w:t>
       </w:r>
     </w:p>
     <w:p>
@@ -175,7 +193,25 @@
         <w:jc w:val="left"/>
       </w:pPr>
       <w:r>
-        <w:t>HEC-HMS was developed by the Hydrologic Engineering Center of the U.S. Army Corps of Engineers to simulate the complete precipitation–runoff process of dendritic watershed systems (USACE, n.d.). A HEC-HMS project comprises three principal components: a basin model, which describes the physical catchment as a network of sub-basins, reaches, junctions, reservoirs, diversions, sources, and sinks; a meteorological model, which assigns precipitation and evapotranspiration boundary conditions to the sub-basins; and control specifications, which define the simulation window and time step (USACE, n.d.). Within each sub-basin, the user selects one method from each of several interchangeable libraries—canopy and surface storage, loss (infiltration), direct-runoff transform, and baseflow—while each reach is assigned a channel-routing method. This modular architecture is the principal reason for the model’s versatility: the same software can be configured as a simple event-based lumped model or as a continuous, semi-distributed model. The program is in the public domain, is supported by extensive online documentation, and integrates with GIS-based terrain preprocessing, all of which explain its wide adoption in regions where commercial modeling systems are unaffordable (Hamdan et al., 2021; Tassew et al., 2019).</w:t>
+        <w:t>The loss model determines the proportion of incident precipitation abstracted through infiltration, interception, and surface retention, and therefore the residual depth of precipitation excess available for direct runoff. The SCS-CN method remains the dominant formulation within the HEC-HMS application literature because it consolidates the combined influence of hydrologic soil group, land use and treatment, surface condition, and antecedent moisture into a single dimensionless parameter that can be derived from mappable catchment attributes (Labade et al., 2025; Soulis, 2021). Soulis (2021), reviewing the status of the method after six decades of application, attributed its persistence to its conceptual simplicity, well-documented input requirements, and transferability to ungauged catchments, while identifying several unresolved limitations that remain active research topics. Foremost among these is the initial abstraction ratio: numerous investigations reviewed in that work reported locally calibrated values substantially below the conventional figure of 0.2, frequently approaching 0.05 or lower, implying systematic overestimation of initial losses when the standard ratio is applied uncritically.</w:t>
+      </w:r>
+    </w:p>
+    <w:p>
+      <w:pPr>
+        <w:ind w:firstLine="720"/>
+        <w:jc w:val="left"/>
+      </w:pPr>
+      <w:r>
+        <w:t>Complementary research has sought to extend the method by incorporating variables absent from its original formulation. Shi and Wang (2020) developed a modified SCS-CN equation combining the tabulated curve number with explicit slope-gradient, soil-moisture, and storm-duration factors, and demonstrated that the modified formulation raised model efficiency to approximately 80% during both calibration and validation while reducing root-mean-square error from 5.53 mm to 2.01 mm relative to the standard method. Their sensitivity analysis identified soil-moisture parameters as the most influential, followed by storm duration and slope, with the initial abstraction ratio the least sensitive. These results carry direct methodological implications for the present study, in which antecedent moisture in a seasonally saturated beel environment varies far more widely than in the agricultural watersheds from which the original curve-number tables were derived.</w:t>
+      </w:r>
+    </w:p>
+    <w:p>
+      <w:pPr>
+        <w:ind w:firstLine="720"/>
+        <w:jc w:val="left"/>
+      </w:pPr>
+      <w:r>
+        <w:t>HEC-HMS provides several alternatives to the curve-number approach, including the initial-and-constant and deficit-and-constant loss methods, the Green–Ampt infiltration model, and the multi-layer SMA algorithm intended for continuous simulation (USACE, n.d.). Empirical evidence indicates that the SCS-CN method performs reliably in monsoonal and semi-arid event simulation, as demonstrated by Hamdan et al. (2021) for the Al-Adhaim catchment of northern Iraq and by Ranjan and Singh (2022) for the Punpun River Basin of eastern India. For multi-annual continuous applications, the SMA formulation is generally preferred, as adopted by Jawad (2024) in the Brahmaputra Basin. A consistent finding across this literature is that the curve number constitutes the single most sensitive parameter of the model. Turkar et al. (2025) identified curve number, infiltration rate, lag time, and baseflow as the controlling parameters across the studies they reviewed, and M. B. Haque et al. (2024) reported that simulated runoff in the Halda catchment was highly sensitive to sub-basin curve numbers, which depend directly on the accuracy of the underlying land-cover classification.</w:t>
       </w:r>
     </w:p>
     <w:p>
@@ -184,7 +220,7 @@
           <w:b/>
           <w:i/>
         </w:rPr>
-        <w:t>2.3.2 Loss Methods and the SCS Curve Number</w:t>
+        <w:t>2.4.2 Transform methods</w:t>
       </w:r>
     </w:p>
     <w:p>
@@ -193,7 +229,7 @@
         <w:jc w:val="left"/>
       </w:pPr>
       <w:r>
-        <w:t>The loss model determines how much of the incident rainfall infiltrates or is otherwise abstracted, and therefore how much becomes precipitation excess available for direct runoff. The most widely used loss method in recent HEC-HMS applications remains the Soil Conservation Service Curve Number (SCS-CN) method, which condenses the combined influence of soil hydrologic group, land use, surface condition, and antecedent moisture into a single dimensionless parameter, the curve number (CN). Soulis (2021), reviewing the current state of the method more than six decades after its introduction, attributed its enduring dominance to its simplicity, its well-documented and easily obtained inputs, and its direct linkage to mappable catchment properties, while cataloguing the challenges that remain active research topics: the appropriate value of the initial abstraction ratio, the treatment of watershed slope, the representation of antecedent moisture, and the transfer of tabulated CN values to regions and land covers beyond those for which the method was derived. Notably, several studies reviewed by Soulis (2021) found that the conventional initial abstraction ratio of 0.2 substantially overestimates initial losses, with locally calibrated values often below 0.05, a finding directly relevant to CN calibration bounds in the present study.</w:t>
+        <w:t>The transform model converts the precipitation excess computed by the loss model into a direct-runoff hydrograph at the sub-basin outlet. The majority of applications employ unit-hydrograph theory, for which HEC-HMS provides the SCS dimensionless unit hydrograph, parameterised by basin lag time; the Clark unit hydrograph, which represents translation and attenuation separately through a time–area histogram and a linear-reservoir storage coefficient; and the Snyder synthetic unit hydrograph, parameterised by lag and peaking coefficients (USACE, n.d.). Review evidence establishes the SCS unit hydrograph as the most frequently adopted transform across international practice, typically paired with SCS-CN losses (Labade et al., 2025; Sahu et al., 2023), a configuration applied successfully by Hamdan et al. (2021), Ranjan and Singh (2022), and Nujhat et al. (2024). The Clark formulation has been preferred in several large-basin continuous applications, including the Brahmaputra model of Jawad (2024), where storage coefficient and time of concentration were treated as primary calibration parameters.</w:t>
       </w:r>
     </w:p>
     <w:p>
@@ -202,7 +238,7 @@
         <w:jc w:val="left"/>
       </w:pPr>
       <w:r>
-        <w:t>HEC-HMS offers several alternatives to the SCS-CN approach, including the initial-and-constant and deficit-and-constant loss methods, the Green–Ampt infiltration model, and, for continuous simulation, the five-layer SMA algorithm (USACE, n.d.). Recent empirical evidence indicates that the SCS-CN method performs well in monsoonal and semi-arid event simulation: Tassew et al. (2019) obtained very good performance with it in the Gilgel Abay catchment of Ethiopia, and Hamdan et al. (2021) reached the same conclusion for the Al-Adhaim catchment in Iraq. For continuous multi-year simulation, the SMA method is preferred, as in the Brahmaputra applications of Jawad (2024) and S. Haque et al. (2020). Equally consistent is the finding that the curve number is the single most sensitive parameter of the model: Tassew et al. (2019) identified CN as the controlling parameter in formal sensitivity analysis, and M. B. Haque et al. (2024) found the runoff–rainfall relationship of the Halda catchment to be highly sensitive to sub-basin CN values, which depend directly on the land-use classification. These findings justify the comparative testing of loss methods and the careful CN estimation undertaken in the methodology of this thesis.</w:t>
+        <w:t>For extremely flat catchments, the estimation of lag time warrants particular caution. Empirical lag equations were predominantly derived from sloping terrain, and any misestimation propagates directly into errors in the timing of the simulated hydrograph peak. In floodplain environments where topographic gradients approach the vertical resolution of available elevation data, calibration of lag and storage parameters against observed hydrographs becomes indispensable rather than optional, an approach reflected in the optimisation strategies reported by Jawad (2024) and Admas et al. (2025).</w:t>
       </w:r>
     </w:p>
     <w:p>
@@ -211,7 +247,7 @@
           <w:b/>
           <w:i/>
         </w:rPr>
-        <w:t>2.3.3 Direct-Runoff Transform Methods</w:t>
+        <w:t>2.4.3 Baseflow methods</w:t>
       </w:r>
     </w:p>
     <w:p>
@@ -220,7 +256,16 @@
         <w:jc w:val="left"/>
       </w:pPr>
       <w:r>
-        <w:t>The transform model converts precipitation excess into a direct-runoff hydrograph at the sub-basin outlet. Most applications employ unit-hydrograph theory, for which HEC-HMS provides the SCS dimensionless unit hydrograph, parameterized by basin lag time; the Clark unit hydrograph, which combines a time–area histogram with a linear-reservoir storage coefficient; and the Snyder unit hydrograph, among others (USACE, n.d.). The SCS unit hydrograph paired with SCS-CN losses constitutes the dominant configuration in the recent application literature across Africa, the Middle East, and South Asia (Hamdan et al., 2021; Nujhat et al., 2024; Tassew et al., 2019), while the Clark formulation has been preferred in some continuous large-basin applications (Jawad, 2024). For very flat catchments such as the study area, lag-time estimation deserves particular care, because empirical lag equations were developed predominantly for sloping terrain and misestimated lag propagates directly into errors in simulated peak timing; the calibration of time-of-concentration and storage parameters was accordingly a central element of the optimization strategies reported by Jawad (2024) and Admas et al. (2025).</w:t>
+        <w:t>Baseflow representation constitutes the most frequently underperforming component of event-oriented hydrological models, yet in floodplain-wetland systems the slow-drainage component may dominate both the recession limb of the hydrograph and the dry-season water balance. HEC-HMS offers recession, bounded-recession, linear-reservoir, and constant-monthly baseflow formulations (USACE, n.d.). Review evidence indicates that the recession method is the most widely adopted in international practice owing to its stability and its realistic representation of groundwater depletion (Labade et al., 2025), whereas the linear-reservoir formulation with multiple groundwater layers has been preferred in continuous large-basin applications (Jawad, 2024).</w:t>
+      </w:r>
+    </w:p>
+    <w:p>
+      <w:pPr>
+        <w:ind w:firstLine="720"/>
+        <w:jc w:val="left"/>
+      </w:pPr>
+      <w:r>
+        <w:t>Recent Bangladeshi experience indicates that baseflow simulation represents a genuine methodological difficulty rather than a routine calibration exercise. M. B. Haque et al. (2024), modelling the Halda River catchment, obtained satisfactory aggregate performance statistics but reported a poor correspondence between observed and simulated flows along the baseflow portion of the hydrograph during calibration, attributing the discrepancy to unrepresented groundwater–surface water exchange and recommending offline coupling with a groundwater model as a route to improvement. Raihan et al. (2020) similarly identified groundwater delay time and the baseflow alpha factor among the most sensitive parameters governing simulation quality in the Upper Halda Basin. These findings caution against interpreting event-calibrated models as complete descriptions of low-flow behaviour, a caution of particular force in beel environments where monsoon storage is released gradually throughout the post-monsoon recession.</w:t>
       </w:r>
     </w:p>
     <w:p>
@@ -229,7 +274,7 @@
           <w:b/>
           <w:i/>
         </w:rPr>
-        <w:t>2.3.4 Baseflow Methods</w:t>
+        <w:t>2.4.4 Channel routing methods and hydraulic coupling</w:t>
       </w:r>
     </w:p>
     <w:p>
@@ -238,7 +283,24 @@
         <w:jc w:val="left"/>
       </w:pPr>
       <w:r>
-        <w:t>Baseflow representation is frequently the weakest element of event-oriented models, yet in floodplain-wetland systems the slow drainage component can dominate the recession limb and the dry-season water balance. HEC-HMS provides recession, bounded-recession, linear-reservoir, and constant-monthly baseflow methods (USACE, n.d.); the linear-reservoir method with two groundwater layers was adopted in the continuous Brahmaputra modeling of Jawad (2024). Recent Bangladeshi experience suggests that baseflow is a genuine difficulty: M. B. Haque et al. (2024), modeling the Halda River catchment, obtained satisfactory overall statistics but reported a poor match for the baseflow portion of the hydrograph during calibration, which they attributed to unrepresented groundwater–surface water exchange, and they recommended coupling with a groundwater model as a route to improvement. Such findings caution against interpreting event-calibrated models as complete descriptions of low-flow behavior, a caution of particular force in beel environments where monsoon storage is released gradually through the post-monsoon season.</w:t>
+        <w:t>Flow routing through channel reaches is available in HEC-HMS through the Muskingum, Muskingum–Cunge, kinematic-wave, modified-Puls, and lag methods (USACE, n.d.). The Muskingum method, which conceptualises a reach as a linear storage element governed by a travel-time parameter and a dimensionless weighting parameter, remains the most commonly adopted routing approach in applications comparable to the present study (Hamdan et al., 2021; Labade et al., 2025; Nujhat et al., 2024). Its principal limitation, shared by all hydrologic routing schemes, is the inability to represent backwater effects, flow reversal, or looped stage–discharge relationships, all of which are characteristic of extremely flat deltaic channels in which downstream water level rather than upstream inflow governs conveyance.</w:t>
+      </w:r>
+    </w:p>
+    <w:p>
+      <w:pPr>
+        <w:ind w:firstLine="720"/>
+        <w:jc w:val="left"/>
+      </w:pPr>
+      <w:r>
+        <w:t>Where such hydraulic controls are material, contemporary practice couples HEC-HMS with the Hydrologic Engineering Center River Analysis System (HEC-RAS). Zhang et al. (2022) developed an integrated flood-risk framework for the Old Brahmaputra River floodplain of Bangladesh in which HEC-HMS supplied inflow hydrographs to coupled one- and two-dimensional HEC-RAS models, achieving Nash–Sutcliffe efficiency values of 0.93 and 0.81 and percent bias of −1.17% and 2.40% during calibration and validation, respectively. Admas et al. (2025) applied an equivalent coupling to the Gumara River in the Upper Blue Nile Basin to quantify inundation extents for return periods between 2 and 100 years and to evaluate the hydraulic effect of dyke construction, while Jawad (2024) employed the same architecture to generate flood inundation maps along the lowermost reach of the Brahmaputra. Because drainage of the Gumai Beel is regulated in part by water levels within the receiving Ichamoti channel rather than by catchment inflow alone, an analogous coupling represents the logical methodological extension of the present work.</w:t>
+      </w:r>
+    </w:p>
+    <w:p>
+      <w:r>
+        <w:rPr>
+          <w:b/>
+        </w:rPr>
+        <w:t>2.5 Integration of GIS and remote sensing in hydrological modelling</w:t>
       </w:r>
     </w:p>
     <w:p>
@@ -247,7 +309,7 @@
           <w:b/>
           <w:i/>
         </w:rPr>
-        <w:t>2.3.5 Channel Routing and Hydraulic Coupling</w:t>
+        <w:t>2.5.1 Digital elevation models and watershed delineation</w:t>
       </w:r>
     </w:p>
     <w:p>
@@ -256,15 +318,16 @@
         <w:jc w:val="left"/>
       </w:pPr>
       <w:r>
-        <w:t>Flow routing through reaches is available in HEC-HMS through the Muskingum, Muskingum–Cunge, kinematic-wave, modified-Puls, and lag methods (USACE, n.d.). The Muskingum method, which represents a reach as a linear storage with travel-time parameter K and weighting parameter X, remains the most commonly adopted in applications comparable to the present study (Hamdan et al., 2021; Nujhat et al., 2024; Tassew et al., 2019). Its limitation—shared by all hydrologic routing schemes—is that it cannot represent backwater effects, flow reversal, or looped stage–discharge relations, which are common in extremely flat deltaic channels. Where such hydraulic effects matter, the recent literature couples HEC-HMS with the HEC-RAS hydraulic model: Admas et al. (2025) drove HEC-RAS flood-risk simulations of the Gumara River floodplain in Ethiopia with HEC-HMS hydrographs to quantify inundation for return periods up to 100 years, and Jawad (2024) coupled the two models to map flood inundation along the lowermost 500 km of the Brahmaputra. An analogous coupling represents a natural extension of the present work, given that drainage of the Gumai Beel is partly controlled by water levels in the receiving Ichamoti channel rather than by catchment runoff alone.</w:t>
+        <w:t>Semi-distributed modelling is initiated through terrain analysis, in which sub-basin boundaries and stream networks are delineated from a digital elevation model (DEM) and physiographic attributes such as drainage area, mean slope, and longest flow path are extracted for each computational unit. A widening family of freely available global elevation products, including SRTM, NASADEM, ASTER, AW3D30, MERIT, and TanDEM-X, now competes for this role, and the differences among them are hydrologically consequential. Uuemaa et al. (2020), conducting a systematic multi-region accuracy assessment against LiDAR and Pleiades reference surfaces comprising 608 million pixels, established that vertical accuracy varies substantially among products and that terrain slope exerts the strongest control on error magnitude. AW3D30 exhibited the most stable performance across geographic settings, while NASADEM offered only marginal improvement relative to its SRTM predecessor.</w:t>
       </w:r>
     </w:p>
     <w:p>
+      <w:pPr>
+        <w:ind w:firstLine="720"/>
+        <w:jc w:val="left"/>
+      </w:pPr>
       <w:r>
-        <w:rPr>
-          <w:b/>
-        </w:rPr>
-        <w:t>2.4 GIS, Remote Sensing, and Input Data for Hydrological Modeling</w:t>
+        <w:t>The reliability of automated delineation deteriorates precisely within the terrain class represented by the present study area. Datta et al. (2022), working on the Halda watershed of Bangladesh, demonstrated systematically that delineation outcomes are materially conditioned by the selection of DEM product, its spatial resolution, and the contributing-area threshold adopted for stream definition, and that these choices propagate into sub-basin geometry and all subsequently derived parameters. In low-relief deltaic terrain, where total elevation range may amount to only a few metres and where anthropogenic features such as roads, embankments, and sluice structures rather than natural topography govern actual flow pathways, DEM vertical error can exceed the topographic signal that the delineation algorithm is intended to detect. The literature therefore recommends systematic verification of automatically delineated drainage against hydrographic maps and field observation, a procedure adopted in the methodology of the present study.</w:t>
       </w:r>
     </w:p>
     <w:p>
@@ -273,7 +336,7 @@
           <w:b/>
           <w:i/>
         </w:rPr>
-        <w:t>2.4.1 Digital Elevation Models and Watershed Delineation</w:t>
+        <w:t>2.5.2 Land use, soil data, and curve number derivation</w:t>
       </w:r>
     </w:p>
     <w:p>
@@ -282,7 +345,16 @@
         <w:jc w:val="left"/>
       </w:pPr>
       <w:r>
-        <w:t>Semi-distributed modeling begins with terrain analysis: delineation of sub-basins and stream networks from a digital elevation model (DEM), and extraction of physiographic parameters such as area, slope, and longest flow path. A growing family of freely available global DEMs—SRTM, NASADEM, ASTER, AW3D30, MERIT, and TanDEM-X—now competes for this role, and their quality differences are material. Uuemaa et al. (2020), in a systematic multi-region accuracy assessment against LiDAR references, found vertical accuracy to vary strongly among products and identified terrain slope as the dominant control on DEM error, with AW3D30 the most robust performer overall and NASADEM only marginally improving on SRTM. The reliability of automated delineation degrades precisely in the terrain type of the present study: low-relief floodplains. Datta et al. (2022), working on the Halda watershed in Bangladesh, showed systematically that delineation outcomes depend materially on the choice of DEM product, its spatial resolution, and the stream-definition area threshold, and that these choices propagate into sub-basin geometry and derived parameters. In flat deltaic terrain, where total relief may be only a few meters and anthropogenic features such as roads and embankments control actual flow paths, DEM vertical error can exceed the topographic signal, and the literature therefore recommends verification of automatically delineated drainage against field knowledge and hydrographic maps (Datta et al., 2022). This consideration is central to the delineation strategy adopted in Chapter 3 of this thesis.</w:t>
+        <w:t>Parameterisation of the loss model in sparsely gauged basins depends upon thematic spatial mapping. The established workflow intersects a land-use and land-cover classification, commonly derived from Landsat or Sentinel-2 imagery, with a hydrologic soil group layer obtained from national soil surveys or global soil databases, and assigns area-weighted composite curve numbers to each sub-basin through standard lookup tabulations (Ranjan &amp; Singh, 2022; Turkar et al., 2025). Ranjan and Singh (2022) implemented this procedure within ArcGIS for the Punpun River Basin, generating land-use, soil, and slope layers from which curve numbers were computed as direct HEC-HMS input, and reported coefficient of determination and Nash–Sutcliffe efficiency values exceeding 0.75 for monthly and monsoonal models with percent bias below 10%.</w:t>
+      </w:r>
+    </w:p>
+    <w:p>
+      <w:pPr>
+        <w:ind w:firstLine="720"/>
+        <w:jc w:val="left"/>
+      </w:pPr>
+      <w:r>
+        <w:t>The sensitivity of simulated runoff to this parameterisation imposes a corresponding requirement for classification accuracy. Turkar et al. (2025) identified curve number among the four most sensitive parameters across the applications they reviewed, and M. B. Haque et al. (2024) demonstrated that the rainfall–runoff relationship of the Halda catchment responded strongly to sub-basin curve numbers determined by land-cover classification. Remote sensing evidence further documents the rapidity of land-cover transformation within Bangladeshi wetland environments: Bhattacharjee et al. (2021), analysing multi-decadal Landsat imagery over a north-eastern wetland system, quantified substantial conversion of wetland and vegetation classes to agricultural and settlement uses. This consideration assumes particular importance for beel catchments, in which the land surface alternates seasonally among open water, cultivated land, and marsh vegetation, such that a single-date classification cannot adequately represent the hydrological character of the catchment across the annual cycle.</w:t>
       </w:r>
     </w:p>
     <w:p>
@@ -291,7 +363,7 @@
           <w:b/>
           <w:i/>
         </w:rPr>
-        <w:t>2.4.2 Land Use, Soils, and Curve Number Generation</w:t>
+        <w:t>2.5.3 Precipitation inputs in data-scarce catchments</w:t>
       </w:r>
     </w:p>
     <w:p>
@@ -300,16 +372,7 @@
         <w:jc w:val="left"/>
       </w:pPr>
       <w:r>
-        <w:t>Loss-model parameterization in ungauged or sparsely gauged basins rests on thematic mapping. The standard workflow intersects a land-use/land-cover (LULC) classification, commonly derived from Landsat or Sentinel-2 imagery, with a hydrologic soil group map derived from soil surveys or global databases, and assigns composite curve numbers to each sub-basin through standard lookup tables (Hamdan et al., 2021; Soulis, 2021). Applications across climates confirm both the practicality and the sensitivity of this workflow: Tassew et al. (2019) identified the curve number as the single most sensitive parameter of their model, and M. B. Haque et al. (2024) likewise found simulated runoff to be highly sensitive to sub-basin CN values, which depend directly on the LULC classification. Remote sensing also documents the pace of land-cover change in Bangladeshi wetland environments: Bhattacharjee et al. (2021), analyzing three decades of Landsat imagery over a northeastern wetland (haor) system, quantified substantial conversion of wetland and vegetation classes to agriculture and settlement. These findings imply that LULC currency and accuracy assessment deserve explicit attention in the present study, particularly because beel environments exhibit strong seasonal alternation between open water, cropped land, and marsh vegetation that a single-date classification cannot capture.</w:t>
-      </w:r>
-    </w:p>
-    <w:p>
-      <w:r>
-        <w:rPr>
-          <w:b/>
-          <w:i/>
-        </w:rPr>
-        <w:t>2.4.3 Precipitation Inputs: Gauges, Reanalysis, and Satellite Products</w:t>
+        <w:t>Precipitation constitutes the dominant forcing variable of any rainfall–runoff model, and its estimation represents the principal source of predictive uncertainty where rain-gauge networks are sparse or discontinuous. Two families of alternatives to gauge interpolation have reached operational maturity: satellite multi-sensor products, foremost the Integrated Multi-satellitE Retrievals for Global Precipitation Measurement (IMERG), and atmospheric reanalyses, foremost the fifth-generation European Centre for Medium-Range Weather Forecasts reanalysis (ERA5) described by Hersbach et al. (2020). Pradhan et al. (2022), synthesising the global body of IMERG validation studies, concluded that the product represents regional precipitation patterns and spatial means reliably and improves systematically with successive algorithm versions, while performing more accurately at monthly and annual aggregations than at daily and sub-daily resolutions and retaining recognised limitations for extreme intensities and orographically complex terrain.</w:t>
       </w:r>
     </w:p>
     <w:p>
@@ -318,7 +381,7 @@
         <w:jc w:val="left"/>
       </w:pPr>
       <w:r>
-        <w:t>Precipitation is the dominant control on simulated runoff, and its estimation is a major source of uncertainty where gauge networks are sparse. Two families of alternatives to gauge interpolation have matured over the past decade: satellite multi-sensor products, foremost the Integrated Multi-satellitE Retrievals for GPM (IMERG), and atmospheric reanalyses, foremost ERA5 (Hersbach et al., 2020). Pradhan et al. (2022), in a global systematic review of IMERG validation studies, concluded that the product reliably captures regional precipitation patterns and improves with every version, while performing better at monthly than at daily and sub-daily scales and retaining known weaknesses for extreme intensities and complex terrain—weaknesses that matter for flood-oriented applications. In hydrological practice, satellite precipitation has proven usable even for operational simulation of very large, sparsely gauged basins: Jawad (2024) forced coupled HEC-HMS–HEC-RAS models of the Brahmaputra with near-real-time IMERG and GSMaP products, gauge-corrected where possible, and obtained credible discharge and inundation simulations at Bahadurabad. For the present study, which can draw on Bangladesh Water Development Board and Bangladesh Meteorological Department gauges in and around Pabna, this literature supports a strategy of gauge-primary forcing with reanalysis or satellite products used for gap filling and consistency checking (Hersbach et al., 2020; Pradhan et al., 2022).</w:t>
+        <w:t>Operational experience confirms that satellite and reanalysis forcing can support credible hydrological simulation even in large, sparsely instrumented basins. Jawad (2024) forced coupled HEC-HMS and HEC-RAS models of the transboundary Brahmaputra Basin with near-real-time IMERG and GSMaP products, applying gauge-based correction where ground data permitted, and obtained acceptable discharge simulation and flood inundation mapping at Bahadurabad. Because the present study can draw upon Bangladesh Water Development Board and Bangladesh Meteorological Department observations within and adjacent to the Pabna region, this literature supports a strategy of gauge-primary forcing supplemented by reanalysis products for gap-filling and internal consistency verification.</w:t>
       </w:r>
     </w:p>
     <w:p>
@@ -326,7 +389,7 @@
         <w:rPr>
           <w:b/>
         </w:rPr>
-        <w:t>2.5 Recent Applications of HEC-HMS Across Diverse Hydro-Climatic Regions</w:t>
+        <w:t>2.6 Model calibration, validation, and performance evaluation</w:t>
       </w:r>
     </w:p>
     <w:p>
@@ -335,7 +398,7 @@
         <w:jc w:val="left"/>
       </w:pPr>
       <w:r>
-        <w:t>The post-2019 application literature on HEC-HMS is extensive, and a selective review of methodologically instructive studies is presented here; Table 2.1 summarizes their essential characteristics. In Africa, Tassew et al. (2019) calibrated an event-based model of the 1,609 km² Gilgel Abay catchment in the Lake Tana basin of Ethiopia using the SCS-CN, SCS unit hydrograph, and Muskingum methods, achieving a Nash–Sutcliffe efficiency (NSE) of 0.884 and a coefficient of determination of 0.925, with sensitivity analysis identifying the curve number as the controlling parameter. Aliye et al. (2020) compared HEC-HMS and SWAT for a data-scarce catchment of the Ethiopian Rift Valley Lakes basin, finding both models applicable and thereby establishing HEC-HMS as a viable lightweight alternative to more heavily parameterized systems. Admas et al. (2025) extended the Ethiopian experience to integrated flood-risk analysis, coupling HEC-HMS design hydrographs with HEC-RAS hydraulics for the Gumara River floodplain and quantifying the inundation reduction achieved by dyke construction for return periods from 2 to 100 years.</w:t>
+        <w:t>Credible application of a rainfall–runoff model requires a disciplined testing protocol in which model parameters are estimated against one portion of the observational record and predictive skill is demonstrated against an independent portion. This split-sample framework is followed, at least in its elementary form, by essentially all of the applications reviewed in this chapter (Hamdan et al., 2021; Nujhat et al., 2024; Ranjan &amp; Singh, 2022; Zhang et al., 2022). The framework itself, however, has recently been subjected to systematic re-examination. Shen et al. (2022), conducting a large-sample experiment across 463 catchments, two conceptual hydrological models, and 50 alternative data-splitting schemes, demonstrated that the widespread practice of calibrating against older records and validating against more recent ones consistently degraded subsequent predictive performance, and that calibration against the full available record represented the most robust strategy for operational application. In a thesis context, where independent demonstration of predictive skill remains an examination requirement, these findings support the reporting of both a conventional split-sample evaluation and a final parameter set re-estimated across the complete record.</w:t>
       </w:r>
     </w:p>
     <w:p>
@@ -344,7 +407,42 @@
         <w:jc w:val="left"/>
       </w:pPr>
       <w:r>
-        <w:t>In the Middle East, Hamdan et al. (2021) developed a daily model of the semi-arid Al-Adhaim catchment in Iraq with HEC-GeoHMS preprocessing and the SCS-CN, SCS unit hydrograph, and Muskingum configuration, obtaining coefficients of determination near 0.9 in both calibration and verification and concluding that the model is suitable for reservoir inflow estimation. In South Asia, Jawad (2024) tested the frontier of data-scarce application by forcing a continuous SMA-based HEC-HMS model of the transboundary Brahmaputra basin entirely with near-real-time satellite precipitation, calibrating by automated univariate-gradient search and coupling the results to HEC-RAS for flood inundation mapping. Collectively, three consistent lessons emerge from this international experience. First, the combination of SCS-CN loss, SCS unit hydrograph transform, and Muskingum routing constitutes the de facto default configuration for event-scale application, and it performs satisfactorily across monsoonal and semi-arid regimes (Hamdan et al., 2021; Tassew et al., 2019). Second, the curve number is almost invariably the most sensitive parameter, so its spatial estimation and calibration bounds dominate model quality (M. B. Haque et al., 2024; Tassew et al., 2019). Third, HEC-HMS performance is limited less by its algorithms than by input data quality—precipitation above all—which motivates the careful forcing-data strategy reviewed in Section 2.4.3 (Jawad, 2024; Pradhan et al., 2022).</w:t>
+        <w:t>Quantitative evaluation of model performance rests upon a compact set of statistical indicators. Review evidence indicates that Nash–Sutcliffe efficiency, the coefficient of determination, and root-mean-square error constitute the most frequently reported metrics across HEC-HMS applications (Labade et al., 2025), with percent bias and the ratio of root-mean-square error to the standard deviation of observations increasingly reported alongside them (Ranjan &amp; Singh, 2022). The interpretation of these indicators, however, is not mechanical. Althoff and Rodrigues (2021) established through systematic analysis that the goodness-of-fit criterion adopted as the objective function materially determines the resulting parameter set, and recommended that criteria be matched deliberately to the modelling purpose, with peak-weighted criteria appropriate to flood design and volume-oriented criteria appropriate to water-balance assessment. Their analysis implies that the reporting of a single aggregate efficiency score, detached from the objective function used to obtain it, provides an incomplete account of model performance.</w:t>
+      </w:r>
+    </w:p>
+    <w:p>
+      <w:pPr>
+        <w:ind w:firstLine="720"/>
+        <w:jc w:val="left"/>
+      </w:pPr>
+      <w:r>
+        <w:t>Calibration procedures range from manual adjustment guided by physical reasoning to fully automated optimisation. HEC-HMS provides univariate-gradient and simplex search algorithms in combination with a selection of objective functions (USACE, n.d.), and the reviewed applications span this full methodological range: manual calibration informed by parameter plausibility (Nujhat et al., 2024), automated optimisation using gradient search (Jawad, 2024), and staged procedures in which formal sensitivity analysis precedes calibration in order to concentrate effort upon the most influential parameters (Admas et al., 2025). The consistent identification of curve number, lag time, and routing parameters as the dominant controls upon model response (Turkar et al., 2025) provides a defensible starting parameter set for the present study. Reporting of calibrated parameter ranges alongside point estimates is further warranted, since alternative objective functions may select materially different yet equally acceptable parameter combinations (Althoff &amp; Rodrigues, 2021).</w:t>
+      </w:r>
+    </w:p>
+    <w:p>
+      <w:r>
+        <w:rPr>
+          <w:b/>
+        </w:rPr>
+        <w:t>2.7 Applications of HEC-HMS in international practice</w:t>
+      </w:r>
+    </w:p>
+    <w:p>
+      <w:pPr>
+        <w:ind w:firstLine="720"/>
+        <w:jc w:val="left"/>
+      </w:pPr>
+      <w:r>
+        <w:t>The international application literature published since 2020 is extensive, and a selective review of methodologically instructive studies is presented here; Table 2.1 summarises their principal characteristics. Hamdan et al. (2021) developed a daily-timestep model of the semi-arid Al-Adhaim River catchment in northern Iraq using HEC-GeoHMS terrain preprocessing together with the SCS-CN, SCS unit hydrograph, and Muskingum configuration, calibrating across two hydrological years and verifying across a third. The study reported coefficients of determination of approximately 0.90 for both phases and concluded that the model was suitable for reservoir inflow estimation, although simulated dam discharge was slightly overestimated. Ranjan and Singh (2022) applied a comparable configuration to the Punpun River Basin of eastern India across the period 2005 to 2017, developing parallel daily, monthly, and monsoonal formulations and demonstrating that temporal aggregation materially improved performance, with the monthly model outperforming both alternatives.</w:t>
+      </w:r>
+    </w:p>
+    <w:p>
+      <w:pPr>
+        <w:ind w:firstLine="720"/>
+        <w:jc w:val="left"/>
+      </w:pPr>
+      <w:r>
+        <w:t>Aliye et al. (2020) contributed a comparative evaluation of HEC-HMS against SWAT for a data-scarce catchment of the Ethiopian Rift Valley Lakes Basin, establishing the viability of the lighter-parameterised framework in conditions of limited observational support. Admas et al. (2025) extended the Ethiopian experience toward integrated flood-risk analysis, coupling HEC-HMS design hydrographs with two-dimensional HEC-RAS hydraulics for the Gumara River floodplain and quantifying the reduction in inundated area achieved through dyke construction across return periods from 2 to 100 years. Collectively, this literature supports three generalisations. First, the combination of SCS-CN loss, SCS unit hydrograph transform, and Muskingum routing constitutes the effective default configuration for event-scale application and performs satisfactorily across monsoonal and semi-arid regimes (Hamdan et al., 2021; Labade et al., 2025). Second, the curve number is almost invariably the most sensitive parameter, such that its spatial estimation and calibration bounds govern overall model quality (Turkar et al., 2025). Third, model performance is constrained less by algorithmic structure than by the quality of input data, and by precipitation representation above all (Jawad, 2024; Pradhan et al., 2022).</w:t>
       </w:r>
     </w:p>
     <w:p>
@@ -360,7 +458,7 @@
         <w:rPr>
           <w:i/>
         </w:rPr>
-        <w:t>Selected Post-2019 Applications of HEC-HMS and Comparable Models Reviewed in This Chapter</w:t>
+        <w:t>Summary of Selected HEC-HMS Applications Reviewed in This Chapter</w:t>
       </w:r>
     </w:p>
     <w:tbl>
@@ -409,13 +507,13 @@
                 <w:b/>
                 <w:sz w:val="20"/>
               </w:rPr>
-              <w:t>Location / basin</w:t>
+              <w:t>Study area</w:t>
             </w:r>
           </w:p>
         </w:tc>
         <w:tc>
           <w:tcPr>
-            <w:tcW w:type="dxa" w:w="2448"/>
+            <w:tcW w:type="dxa" w:w="2520"/>
           </w:tcPr>
           <w:p>
             <w:pPr>
@@ -427,13 +525,13 @@
                 <w:b/>
                 <w:sz w:val="20"/>
               </w:rPr>
-              <w:t>Principal methods</w:t>
+              <w:t>Methods adopted</w:t>
             </w:r>
           </w:p>
         </w:tc>
         <w:tc>
           <w:tcPr>
-            <w:tcW w:type="dxa" w:w="2304"/>
+            <w:tcW w:type="dxa" w:w="2232"/>
           </w:tcPr>
           <w:p>
             <w:pPr>
@@ -446,76 +544,6 @@
                 <w:sz w:val="20"/>
               </w:rPr>
               <w:t>Reported performance</w:t>
-            </w:r>
-          </w:p>
-        </w:tc>
-      </w:tr>
-      <w:tr>
-        <w:tc>
-          <w:tcPr>
-            <w:tcW w:type="dxa" w:w="2160"/>
-          </w:tcPr>
-          <w:p>
-            <w:pPr>
-              <w:spacing w:line="240" w:lineRule="auto"/>
-            </w:pPr>
-            <w:r>
-              <w:rPr>
-                <w:rFonts w:ascii="Times New Roman" w:hAnsi="Times New Roman"/>
-                <w:sz w:val="20"/>
-              </w:rPr>
-              <w:t>Tassew et al. (2019)</w:t>
-            </w:r>
-          </w:p>
-        </w:tc>
-        <w:tc>
-          <w:tcPr>
-            <w:tcW w:type="dxa" w:w="2448"/>
-          </w:tcPr>
-          <w:p>
-            <w:pPr>
-              <w:spacing w:line="240" w:lineRule="auto"/>
-            </w:pPr>
-            <w:r>
-              <w:rPr>
-                <w:rFonts w:ascii="Times New Roman" w:hAnsi="Times New Roman"/>
-                <w:sz w:val="20"/>
-              </w:rPr>
-              <w:t>Gilgel Abay, Lake Tana basin, Ethiopia (1,609 km²)</w:t>
-            </w:r>
-          </w:p>
-        </w:tc>
-        <w:tc>
-          <w:tcPr>
-            <w:tcW w:type="dxa" w:w="2448"/>
-          </w:tcPr>
-          <w:p>
-            <w:pPr>
-              <w:spacing w:line="240" w:lineRule="auto"/>
-            </w:pPr>
-            <w:r>
-              <w:rPr>
-                <w:rFonts w:ascii="Times New Roman" w:hAnsi="Times New Roman"/>
-                <w:sz w:val="20"/>
-              </w:rPr>
-              <w:t>SCS-CN; SCS UH; Muskingum</w:t>
-            </w:r>
-          </w:p>
-        </w:tc>
-        <w:tc>
-          <w:tcPr>
-            <w:tcW w:type="dxa" w:w="2304"/>
-          </w:tcPr>
-          <w:p>
-            <w:pPr>
-              <w:spacing w:line="240" w:lineRule="auto"/>
-            </w:pPr>
-            <w:r>
-              <w:rPr>
-                <w:rFonts w:ascii="Times New Roman" w:hAnsi="Times New Roman"/>
-                <w:sz w:val="20"/>
-              </w:rPr>
-              <w:t>NSE = 0.884; R² = 0.925; CN most sensitive</w:t>
             </w:r>
           </w:p>
         </w:tc>
@@ -551,13 +579,13 @@
                 <w:rFonts w:ascii="Times New Roman" w:hAnsi="Times New Roman"/>
                 <w:sz w:val="20"/>
               </w:rPr>
-              <w:t>Rift Valley Lakes basin, Ethiopia</w:t>
+              <w:t>Rift Valley Lakes Basin, Ethiopia</w:t>
             </w:r>
           </w:p>
         </w:tc>
         <w:tc>
           <w:tcPr>
-            <w:tcW w:type="dxa" w:w="2448"/>
+            <w:tcW w:type="dxa" w:w="2520"/>
           </w:tcPr>
           <w:p>
             <w:pPr>
@@ -568,13 +596,13 @@
                 <w:rFonts w:ascii="Times New Roman" w:hAnsi="Times New Roman"/>
                 <w:sz w:val="20"/>
               </w:rPr>
-              <w:t>HEC-HMS vs. SWAT comparison</w:t>
+              <w:t>HEC-HMS and SWAT comparison</w:t>
             </w:r>
           </w:p>
         </w:tc>
         <w:tc>
           <w:tcPr>
-            <w:tcW w:type="dxa" w:w="2304"/>
+            <w:tcW w:type="dxa" w:w="2232"/>
           </w:tcPr>
           <w:p>
             <w:pPr>
@@ -585,77 +613,7 @@
                 <w:rFonts w:ascii="Times New Roman" w:hAnsi="Times New Roman"/>
                 <w:sz w:val="20"/>
               </w:rPr>
-              <w:t>Both models applicable in data-scarce region</w:t>
-            </w:r>
-          </w:p>
-        </w:tc>
-      </w:tr>
-      <w:tr>
-        <w:tc>
-          <w:tcPr>
-            <w:tcW w:type="dxa" w:w="2160"/>
-          </w:tcPr>
-          <w:p>
-            <w:pPr>
-              <w:spacing w:line="240" w:lineRule="auto"/>
-            </w:pPr>
-            <w:r>
-              <w:rPr>
-                <w:rFonts w:ascii="Times New Roman" w:hAnsi="Times New Roman"/>
-                <w:sz w:val="20"/>
-              </w:rPr>
-              <w:t>S. Haque et al. (2020)</w:t>
-            </w:r>
-          </w:p>
-        </w:tc>
-        <w:tc>
-          <w:tcPr>
-            <w:tcW w:type="dxa" w:w="2448"/>
-          </w:tcPr>
-          <w:p>
-            <w:pPr>
-              <w:spacing w:line="240" w:lineRule="auto"/>
-            </w:pPr>
-            <w:r>
-              <w:rPr>
-                <w:rFonts w:ascii="Times New Roman" w:hAnsi="Times New Roman"/>
-                <w:sz w:val="20"/>
-              </w:rPr>
-              <w:t>Brahmaputra basin (at Bahadurabad), Bangladesh</w:t>
-            </w:r>
-          </w:p>
-        </w:tc>
-        <w:tc>
-          <w:tcPr>
-            <w:tcW w:type="dxa" w:w="2448"/>
-          </w:tcPr>
-          <w:p>
-            <w:pPr>
-              <w:spacing w:line="240" w:lineRule="auto"/>
-            </w:pPr>
-            <w:r>
-              <w:rPr>
-                <w:rFonts w:ascii="Times New Roman" w:hAnsi="Times New Roman"/>
-                <w:sz w:val="20"/>
-              </w:rPr>
-              <w:t>Continuous simulation; MUSLE sediment; RCP8.5</w:t>
-            </w:r>
-          </w:p>
-        </w:tc>
-        <w:tc>
-          <w:tcPr>
-            <w:tcW w:type="dxa" w:w="2304"/>
-          </w:tcPr>
-          <w:p>
-            <w:pPr>
-              <w:spacing w:line="240" w:lineRule="auto"/>
-            </w:pPr>
-            <w:r>
-              <w:rPr>
-                <w:rFonts w:ascii="Times New Roman" w:hAnsi="Times New Roman"/>
-                <w:sz w:val="20"/>
-              </w:rPr>
-              <w:t>NSE = 0.65 (cal.), 0.54 (val.); satisfactory</w:t>
+              <w:t>Both models applicable in data-scarce conditions</w:t>
             </w:r>
           </w:p>
         </w:tc>
@@ -691,13 +649,13 @@
                 <w:rFonts w:ascii="Times New Roman" w:hAnsi="Times New Roman"/>
                 <w:sz w:val="20"/>
               </w:rPr>
-              <w:t>Upper Halda basin, Bangladesh</w:t>
+              <w:t>Upper Halda Basin, Bangladesh</w:t>
             </w:r>
           </w:p>
         </w:tc>
         <w:tc>
           <w:tcPr>
-            <w:tcW w:type="dxa" w:w="2448"/>
+            <w:tcW w:type="dxa" w:w="2520"/>
           </w:tcPr>
           <w:p>
             <w:pPr>
@@ -708,13 +666,13 @@
                 <w:rFonts w:ascii="Times New Roman" w:hAnsi="Times New Roman"/>
                 <w:sz w:val="20"/>
               </w:rPr>
-              <w:t>SWAT (comparison baseline)</w:t>
+              <w:t>SWAT (comparative baseline)</w:t>
             </w:r>
           </w:p>
         </w:tc>
         <w:tc>
           <w:tcPr>
-            <w:tcW w:type="dxa" w:w="2304"/>
+            <w:tcW w:type="dxa" w:w="2232"/>
           </w:tcPr>
           <w:p>
             <w:pPr>
@@ -725,7 +683,7 @@
                 <w:rFonts w:ascii="Times New Roman" w:hAnsi="Times New Roman"/>
                 <w:sz w:val="20"/>
               </w:rPr>
-              <w:t>R² = 0.80; NSE = 0.71; CN among most sensitive</w:t>
+              <w:t>R² = 0.80; NSE = 0.71</w:t>
             </w:r>
           </w:p>
         </w:tc>
@@ -767,7 +725,7 @@
         </w:tc>
         <w:tc>
           <w:tcPr>
-            <w:tcW w:type="dxa" w:w="2448"/>
+            <w:tcW w:type="dxa" w:w="2520"/>
           </w:tcPr>
           <w:p>
             <w:pPr>
@@ -784,7 +742,7 @@
         </w:tc>
         <w:tc>
           <w:tcPr>
-            <w:tcW w:type="dxa" w:w="2304"/>
+            <w:tcW w:type="dxa" w:w="2232"/>
           </w:tcPr>
           <w:p>
             <w:pPr>
@@ -796,6 +754,286 @@
                 <w:sz w:val="20"/>
               </w:rPr>
               <w:t>R² ≈ 0.90 (calibration and verification)</w:t>
+            </w:r>
+          </w:p>
+        </w:tc>
+      </w:tr>
+      <w:tr>
+        <w:tc>
+          <w:tcPr>
+            <w:tcW w:type="dxa" w:w="2160"/>
+          </w:tcPr>
+          <w:p>
+            <w:pPr>
+              <w:spacing w:line="240" w:lineRule="auto"/>
+            </w:pPr>
+            <w:r>
+              <w:rPr>
+                <w:rFonts w:ascii="Times New Roman" w:hAnsi="Times New Roman"/>
+                <w:sz w:val="20"/>
+              </w:rPr>
+              <w:t>S. Haque et al. (2021)</w:t>
+            </w:r>
+          </w:p>
+        </w:tc>
+        <w:tc>
+          <w:tcPr>
+            <w:tcW w:type="dxa" w:w="2448"/>
+          </w:tcPr>
+          <w:p>
+            <w:pPr>
+              <w:spacing w:line="240" w:lineRule="auto"/>
+            </w:pPr>
+            <w:r>
+              <w:rPr>
+                <w:rFonts w:ascii="Times New Roman" w:hAnsi="Times New Roman"/>
+                <w:sz w:val="20"/>
+              </w:rPr>
+              <w:t>Brahmaputra Basin, Bangladesh</w:t>
+            </w:r>
+          </w:p>
+        </w:tc>
+        <w:tc>
+          <w:tcPr>
+            <w:tcW w:type="dxa" w:w="2520"/>
+          </w:tcPr>
+          <w:p>
+            <w:pPr>
+              <w:spacing w:line="240" w:lineRule="auto"/>
+            </w:pPr>
+            <w:r>
+              <w:rPr>
+                <w:rFonts w:ascii="Times New Roman" w:hAnsi="Times New Roman"/>
+                <w:sz w:val="20"/>
+              </w:rPr>
+              <w:t>Continuous simulation; MUSLE sediment routing</w:t>
+            </w:r>
+          </w:p>
+        </w:tc>
+        <w:tc>
+          <w:tcPr>
+            <w:tcW w:type="dxa" w:w="2232"/>
+          </w:tcPr>
+          <w:p>
+            <w:pPr>
+              <w:spacing w:line="240" w:lineRule="auto"/>
+            </w:pPr>
+            <w:r>
+              <w:rPr>
+                <w:rFonts w:ascii="Times New Roman" w:hAnsi="Times New Roman"/>
+                <w:sz w:val="20"/>
+              </w:rPr>
+              <w:t>NSE = 0.65 (cal.); 0.54 (val.)</w:t>
+            </w:r>
+          </w:p>
+        </w:tc>
+      </w:tr>
+      <w:tr>
+        <w:tc>
+          <w:tcPr>
+            <w:tcW w:type="dxa" w:w="2160"/>
+          </w:tcPr>
+          <w:p>
+            <w:pPr>
+              <w:spacing w:line="240" w:lineRule="auto"/>
+            </w:pPr>
+            <w:r>
+              <w:rPr>
+                <w:rFonts w:ascii="Times New Roman" w:hAnsi="Times New Roman"/>
+                <w:sz w:val="20"/>
+              </w:rPr>
+              <w:t>Ranjan &amp; Singh (2022)</w:t>
+            </w:r>
+          </w:p>
+        </w:tc>
+        <w:tc>
+          <w:tcPr>
+            <w:tcW w:type="dxa" w:w="2448"/>
+          </w:tcPr>
+          <w:p>
+            <w:pPr>
+              <w:spacing w:line="240" w:lineRule="auto"/>
+            </w:pPr>
+            <w:r>
+              <w:rPr>
+                <w:rFonts w:ascii="Times New Roman" w:hAnsi="Times New Roman"/>
+                <w:sz w:val="20"/>
+              </w:rPr>
+              <w:t>Punpun River Basin, India</w:t>
+            </w:r>
+          </w:p>
+        </w:tc>
+        <w:tc>
+          <w:tcPr>
+            <w:tcW w:type="dxa" w:w="2520"/>
+          </w:tcPr>
+          <w:p>
+            <w:pPr>
+              <w:spacing w:line="240" w:lineRule="auto"/>
+            </w:pPr>
+            <w:r>
+              <w:rPr>
+                <w:rFonts w:ascii="Times New Roman" w:hAnsi="Times New Roman"/>
+                <w:sz w:val="20"/>
+              </w:rPr>
+              <w:t>SCS-CN; ArcGIS-derived CN; daily/monthly/monsoonal</w:t>
+            </w:r>
+          </w:p>
+        </w:tc>
+        <w:tc>
+          <w:tcPr>
+            <w:tcW w:type="dxa" w:w="2232"/>
+          </w:tcPr>
+          <w:p>
+            <w:pPr>
+              <w:spacing w:line="240" w:lineRule="auto"/>
+            </w:pPr>
+            <w:r>
+              <w:rPr>
+                <w:rFonts w:ascii="Times New Roman" w:hAnsi="Times New Roman"/>
+                <w:sz w:val="20"/>
+              </w:rPr>
+              <w:t>R² and NSE &gt; 0.75; PBIAS &lt; 10%</w:t>
+            </w:r>
+          </w:p>
+        </w:tc>
+      </w:tr>
+      <w:tr>
+        <w:tc>
+          <w:tcPr>
+            <w:tcW w:type="dxa" w:w="2160"/>
+          </w:tcPr>
+          <w:p>
+            <w:pPr>
+              <w:spacing w:line="240" w:lineRule="auto"/>
+            </w:pPr>
+            <w:r>
+              <w:rPr>
+                <w:rFonts w:ascii="Times New Roman" w:hAnsi="Times New Roman"/>
+                <w:sz w:val="20"/>
+              </w:rPr>
+              <w:t>Zhang et al. (2022)</w:t>
+            </w:r>
+          </w:p>
+        </w:tc>
+        <w:tc>
+          <w:tcPr>
+            <w:tcW w:type="dxa" w:w="2448"/>
+          </w:tcPr>
+          <w:p>
+            <w:pPr>
+              <w:spacing w:line="240" w:lineRule="auto"/>
+            </w:pPr>
+            <w:r>
+              <w:rPr>
+                <w:rFonts w:ascii="Times New Roman" w:hAnsi="Times New Roman"/>
+                <w:sz w:val="20"/>
+              </w:rPr>
+              <w:t>Old Brahmaputra floodplain, Bangladesh</w:t>
+            </w:r>
+          </w:p>
+        </w:tc>
+        <w:tc>
+          <w:tcPr>
+            <w:tcW w:type="dxa" w:w="2520"/>
+          </w:tcPr>
+          <w:p>
+            <w:pPr>
+              <w:spacing w:line="240" w:lineRule="auto"/>
+            </w:pPr>
+            <w:r>
+              <w:rPr>
+                <w:rFonts w:ascii="Times New Roman" w:hAnsi="Times New Roman"/>
+                <w:sz w:val="20"/>
+              </w:rPr>
+              <w:t>HEC-HMS coupled with HEC-RAS 1D/2D</w:t>
+            </w:r>
+          </w:p>
+        </w:tc>
+        <w:tc>
+          <w:tcPr>
+            <w:tcW w:type="dxa" w:w="2232"/>
+          </w:tcPr>
+          <w:p>
+            <w:pPr>
+              <w:spacing w:line="240" w:lineRule="auto"/>
+            </w:pPr>
+            <w:r>
+              <w:rPr>
+                <w:rFonts w:ascii="Times New Roman" w:hAnsi="Times New Roman"/>
+                <w:sz w:val="20"/>
+              </w:rPr>
+              <w:t>NSE = 0.93 (cal.); 0.81 (val.)</w:t>
+            </w:r>
+          </w:p>
+        </w:tc>
+      </w:tr>
+      <w:tr>
+        <w:tc>
+          <w:tcPr>
+            <w:tcW w:type="dxa" w:w="2160"/>
+          </w:tcPr>
+          <w:p>
+            <w:pPr>
+              <w:spacing w:line="240" w:lineRule="auto"/>
+            </w:pPr>
+            <w:r>
+              <w:rPr>
+                <w:rFonts w:ascii="Times New Roman" w:hAnsi="Times New Roman"/>
+                <w:sz w:val="20"/>
+              </w:rPr>
+              <w:t>Nur et al. (2022)</w:t>
+            </w:r>
+          </w:p>
+        </w:tc>
+        <w:tc>
+          <w:tcPr>
+            <w:tcW w:type="dxa" w:w="2448"/>
+          </w:tcPr>
+          <w:p>
+            <w:pPr>
+              <w:spacing w:line="240" w:lineRule="auto"/>
+            </w:pPr>
+            <w:r>
+              <w:rPr>
+                <w:rFonts w:ascii="Times New Roman" w:hAnsi="Times New Roman"/>
+                <w:sz w:val="20"/>
+              </w:rPr>
+              <w:t>Khowai River Basin, Bangladesh</w:t>
+            </w:r>
+          </w:p>
+        </w:tc>
+        <w:tc>
+          <w:tcPr>
+            <w:tcW w:type="dxa" w:w="2520"/>
+          </w:tcPr>
+          <w:p>
+            <w:pPr>
+              <w:spacing w:line="240" w:lineRule="auto"/>
+            </w:pPr>
+            <w:r>
+              <w:rPr>
+                <w:rFonts w:ascii="Times New Roman" w:hAnsi="Times New Roman"/>
+                <w:sz w:val="20"/>
+              </w:rPr>
+              <w:t>Event-based HEC-HMS simulation</w:t>
+            </w:r>
+          </w:p>
+        </w:tc>
+        <w:tc>
+          <w:tcPr>
+            <w:tcW w:type="dxa" w:w="2232"/>
+          </w:tcPr>
+          <w:p>
+            <w:pPr>
+              <w:spacing w:line="240" w:lineRule="auto"/>
+            </w:pPr>
+            <w:r>
+              <w:rPr>
+                <w:rFonts w:ascii="Times New Roman" w:hAnsi="Times New Roman"/>
+                <w:sz w:val="20"/>
+              </w:rPr>
+              <w:t>Model applicable to flash-flood-prone basin</w:t>
             </w:r>
           </w:p>
         </w:tc>
@@ -831,13 +1069,13 @@
                 <w:rFonts w:ascii="Times New Roman" w:hAnsi="Times New Roman"/>
                 <w:sz w:val="20"/>
               </w:rPr>
-              <w:t>Brahmaputra basin (transboundary)</w:t>
+              <w:t>Brahmaputra Basin (transboundary)</w:t>
             </w:r>
           </w:p>
         </w:tc>
         <w:tc>
           <w:tcPr>
-            <w:tcW w:type="dxa" w:w="2448"/>
+            <w:tcW w:type="dxa" w:w="2520"/>
           </w:tcPr>
           <w:p>
             <w:pPr>
@@ -848,13 +1086,13 @@
                 <w:rFonts w:ascii="Times New Roman" w:hAnsi="Times New Roman"/>
                 <w:sz w:val="20"/>
               </w:rPr>
-              <w:t>SMA continuous; Clark UH; linear-reservoir baseflow; IMERG/GSMaP forcing; HEC-RAS coupling</w:t>
+              <w:t>SMA; Clark UH; linear reservoir; IMERG/GSMaP; HEC-RAS</w:t>
             </w:r>
           </w:p>
         </w:tc>
         <w:tc>
           <w:tcPr>
-            <w:tcW w:type="dxa" w:w="2304"/>
+            <w:tcW w:type="dxa" w:w="2232"/>
           </w:tcPr>
           <w:p>
             <w:pPr>
@@ -865,7 +1103,7 @@
                 <w:rFonts w:ascii="Times New Roman" w:hAnsi="Times New Roman"/>
                 <w:sz w:val="20"/>
               </w:rPr>
-              <w:t>Credible discharge and inundation simulation from satellite forcing</w:t>
+              <w:t>Credible discharge and inundation from satellite forcing</w:t>
             </w:r>
           </w:p>
         </w:tc>
@@ -901,13 +1139,13 @@
                 <w:rFonts w:ascii="Times New Roman" w:hAnsi="Times New Roman"/>
                 <w:sz w:val="20"/>
               </w:rPr>
-              <w:t>Gumti River basin, Bangladesh</w:t>
+              <w:t>Gumti River Basin, Bangladesh</w:t>
             </w:r>
           </w:p>
         </w:tc>
         <w:tc>
           <w:tcPr>
-            <w:tcW w:type="dxa" w:w="2448"/>
+            <w:tcW w:type="dxa" w:w="2520"/>
           </w:tcPr>
           <w:p>
             <w:pPr>
@@ -924,7 +1162,7 @@
         </w:tc>
         <w:tc>
           <w:tcPr>
-            <w:tcW w:type="dxa" w:w="2304"/>
+            <w:tcW w:type="dxa" w:w="2232"/>
           </w:tcPr>
           <w:p>
             <w:pPr>
@@ -935,7 +1173,7 @@
                 <w:rFonts w:ascii="Times New Roman" w:hAnsi="Times New Roman"/>
                 <w:sz w:val="20"/>
               </w:rPr>
-              <w:t>R² = 0.64 (cal.), 0.68 (val.); PBIAS very good</w:t>
+              <w:t>R² = 0.64 (cal.); 0.68 (val.); PBIAS very good</w:t>
             </w:r>
           </w:p>
         </w:tc>
@@ -977,7 +1215,7 @@
         </w:tc>
         <w:tc>
           <w:tcPr>
-            <w:tcW w:type="dxa" w:w="2448"/>
+            <w:tcW w:type="dxa" w:w="2520"/>
           </w:tcPr>
           <w:p>
             <w:pPr>
@@ -988,13 +1226,13 @@
                 <w:rFonts w:ascii="Times New Roman" w:hAnsi="Times New Roman"/>
                 <w:sz w:val="20"/>
               </w:rPr>
-              <w:t>SCS-CN optimized against SWAT-derived values</w:t>
+              <w:t>SCS-CN optimised against SWAT-derived values</w:t>
             </w:r>
           </w:p>
         </w:tc>
         <w:tc>
           <w:tcPr>
-            <w:tcW w:type="dxa" w:w="2304"/>
+            <w:tcW w:type="dxa" w:w="2232"/>
           </w:tcPr>
           <w:p>
             <w:pPr>
@@ -1005,7 +1243,7 @@
                 <w:rFonts w:ascii="Times New Roman" w:hAnsi="Times New Roman"/>
                 <w:sz w:val="20"/>
               </w:rPr>
-              <w:t>NSE = 0.72 (cal.), 0.82 (val.); baseflow underestimated</w:t>
+              <w:t>NSE = 0.72 (cal.); 0.82 (val.); baseflow underestimated</w:t>
             </w:r>
           </w:p>
         </w:tc>
@@ -1041,13 +1279,13 @@
                 <w:rFonts w:ascii="Times New Roman" w:hAnsi="Times New Roman"/>
                 <w:sz w:val="20"/>
               </w:rPr>
-              <w:t>Gumara River, Upper Blue Nile basin, Ethiopia</w:t>
+              <w:t>Gumara River, Upper Blue Nile Basin</w:t>
             </w:r>
           </w:p>
         </w:tc>
         <w:tc>
           <w:tcPr>
-            <w:tcW w:type="dxa" w:w="2448"/>
+            <w:tcW w:type="dxa" w:w="2520"/>
           </w:tcPr>
           <w:p>
             <w:pPr>
@@ -1058,13 +1296,13 @@
                 <w:rFonts w:ascii="Times New Roman" w:hAnsi="Times New Roman"/>
                 <w:sz w:val="20"/>
               </w:rPr>
-              <w:t>HEC-HMS + HEC-RAS flood-risk coupling</w:t>
+              <w:t>HEC-HMS coupled with HEC-RAS; return-period analysis</w:t>
             </w:r>
           </w:p>
         </w:tc>
         <w:tc>
           <w:tcPr>
-            <w:tcW w:type="dxa" w:w="2304"/>
+            <w:tcW w:type="dxa" w:w="2232"/>
           </w:tcPr>
           <w:p>
             <w:pPr>
@@ -1075,7 +1313,7 @@
                 <w:rFonts w:ascii="Times New Roman" w:hAnsi="Times New Roman"/>
                 <w:sz w:val="20"/>
               </w:rPr>
-              <w:t>Inundation quantified for 2–100-year return periods</w:t>
+              <w:t>Inundation quantified for 2–100-year events</w:t>
             </w:r>
           </w:p>
         </w:tc>
@@ -1111,13 +1349,13 @@
                 <w:rFonts w:ascii="Times New Roman" w:hAnsi="Times New Roman"/>
                 <w:sz w:val="20"/>
               </w:rPr>
-              <w:t>Atrai–Karatoa River basin, Bangladesh</w:t>
+              <w:t>Atrai–Karatoa River Basin, Bangladesh</w:t>
             </w:r>
           </w:p>
         </w:tc>
         <w:tc>
           <w:tcPr>
-            <w:tcW w:type="dxa" w:w="2448"/>
+            <w:tcW w:type="dxa" w:w="2520"/>
           </w:tcPr>
           <w:p>
             <w:pPr>
@@ -1128,13 +1366,13 @@
                 <w:rFonts w:ascii="Times New Roman" w:hAnsi="Times New Roman"/>
                 <w:sz w:val="20"/>
               </w:rPr>
-              <w:t>HEC-HMS vs. SWAT comparison</w:t>
+              <w:t>HEC-HMS and SWAT comparison</w:t>
             </w:r>
           </w:p>
         </w:tc>
         <w:tc>
           <w:tcPr>
-            <w:tcW w:type="dxa" w:w="2304"/>
+            <w:tcW w:type="dxa" w:w="2232"/>
           </w:tcPr>
           <w:p>
             <w:pPr>
@@ -1145,7 +1383,7 @@
                 <w:rFonts w:ascii="Times New Roman" w:hAnsi="Times New Roman"/>
                 <w:sz w:val="20"/>
               </w:rPr>
-              <w:t>HEC-HMS R² = 0.70 (cal.), 0.56 (val.); best for medium flows</w:t>
+              <w:t>HEC-HMS R² = 0.70 (cal.); 0.56 (val.)</w:t>
             </w:r>
           </w:p>
         </w:tc>
@@ -1157,7 +1395,7 @@
           <w:i/>
           <w:sz w:val="20"/>
         </w:rPr>
-        <w:t>Note. NSE = Nash–Sutcliffe efficiency; R² = coefficient of determination; CN = curve number; UH = unit hydrograph; SMA = soil moisture accounting; cal. = calibration; val. = validation.</w:t>
+        <w:t>Note. NSE = Nash–Sutcliffe efficiency; R² = coefficient of determination; PBIAS = percent bias; CN = curve number; UH = unit hydrograph; SMA = soil moisture accounting; cal. = calibration; val. = validation.</w:t>
       </w:r>
     </w:p>
     <w:p>
@@ -1165,7 +1403,7 @@
         <w:rPr>
           <w:b/>
         </w:rPr>
-        <w:t>2.6 Hydrological Modeling Experience in Bangladesh</w:t>
+        <w:t>2.8 Applications of HEC-HMS in Bangladesh</w:t>
       </w:r>
     </w:p>
     <w:p>
@@ -1174,7 +1412,7 @@
         <w:jc w:val="left"/>
       </w:pPr>
       <w:r>
-        <w:t>Bangladesh occupies the lowermost reach of the Ganges–Brahmaputra–Meghna system, in which normal-season inundation of floodplains and beels is agriculturally essential while abnormal floods and chronic waterlogging are hazards. Against this backdrop, the national academic literature has increasingly adopted HEC-HMS for basin-scale rainfall–runoff studies because of its zero cost and modest data demands, and the post-2019 record now spans the country’s principal basin types.</w:t>
+        <w:t>Bangladesh occupies the terminal reach of the Ganges–Brahmaputra–Meghna system, and its hydrological regime is characterised by intense monsoonal rainfall, transboundary inflow, extremely low topographic relief, and an extensive network of floodplain depressions. Within this setting, the national academic literature has increasingly adopted HEC-HMS for basin-scale rainfall–runoff investigation, and the record published since 2020 now spans the principal basin types of the country.</w:t>
       </w:r>
     </w:p>
     <w:p>
@@ -1183,7 +1421,7 @@
         <w:jc w:val="left"/>
       </w:pPr>
       <w:r>
-        <w:t>Several recent applications define the state of practice. S. Haque et al. (2020) developed a continuous HEC-HMS model of the poorly gauged Brahmaputra basin, calibrated at Bahadurabad against daily runoff for 1983–1996 (NSE = 0.65) and validated for 1997–2010 (NSE = 0.54), and extended it with the Modified Universal Soil Loss Equation and Engelund–Hansen sediment routing to project sediment-load increases of 34%, 67%, and 115% by the 2020s, 2050s, and 2080s under the RCP8.5 scenario—demonstrating the use of HEC-HMS as the hydrological engine of climate-impact chains. Nujhat et al. (2024) calibrated and validated a model of the Gumti River basin using 2019–2021 records with SRTM-based delineation, Muskingum routing, and SCS-CN losses, obtaining coefficients of determination of 0.64 and 0.68 for calibration and validation respectively, with percent bias in the very good range, and recommended the calibrated model as a planning tool for flood prediction. M. B. Haque et al. (2024) modeled the ecologically important Halda catchment, optimizing curve numbers against values derived from a companion SWAT application and achieving NSE values of 0.72 and 0.82 in calibration and validation, while candidly documenting baseflow underestimation. Moniruzzaman and Mahalder (2026) compared HEC-HMS and SWAT for the Atrai–Karatoa basin of northern Bangladesh—a basin hydrologically contiguous with the greater Chalan Beel floodplain to which the Pabna beel systems belong—finding that SWAT better captured high flows while HEC-HMS was more accurate for medium flows, with HEC-HMS achieving R² of 0.70 and 0.56 in calibration and validation.</w:t>
+        <w:t>S. Haque et al. (2021) developed a continuous HEC-HMS model of the poorly gauged Brahmaputra Basin, calibrated against daily runoff at Bahadurabad for the period 1983 to 1996 and validated for 1997 to 2010, and extended the framework with the Modified Universal Soil Loss Equation and Engelund–Hansen sediment routing in order to project future sediment load under the RCP8.5 scenario. Their results indicated increases in mean annual sediment load of 34%, 67%, and 115% by the 2020s, 2050s, and 2080s respectively, demonstrating the utility of HEC-HMS as the hydrological component of climate-impact assessment chains. Zhang et al. (2022) coupled HEC-HMS with one- and two-dimensional HEC-RAS models to construct an integrated flood risk, hazard, and vulnerability assessment for the Old Brahmaputra River floodplain, achieving Nash–Sutcliffe efficiency values of 0.93 and 0.81 during calibration and validation and demonstrating that coupled hydrologic–hydraulic frameworks can support the development of early-warning systems and adaptation strategies.</w:t>
       </w:r>
     </w:p>
     <w:p>
@@ -1192,7 +1430,7 @@
         <w:jc w:val="left"/>
       </w:pPr>
       <w:r>
-        <w:t>Complementary studies using other models complete the picture. Raihan et al. (2020) simulated streamflow of the Upper Halda basin with SWAT (R² = 0.80, NSE = 0.71), identifying groundwater delay, baseflow recession, and curve number as the most sensitive parameters, and emphasizing the difficulty of capturing rainfall variability from a single gauge. Datta et al. (2022) contributed the DEM-sensitivity analysis of watershed delineation reviewed in Section 2.4.1, and Jawad (2024) demonstrated satellite-forced coupled hydrologic–hydraulic modeling for the Bangladeshi reach of the Brahmaputra.</w:t>
+        <w:t>At the sub-basin scale, Nur et al. (2022) applied HEC-HMS to rainfall–runoff simulation of the Khowai River Basin, a flash-flood-prone catchment of north-eastern Bangladesh. Nujhat et al. (2024) calibrated and validated a model of the Gumti River Basin using observations from 2019 to 2021 with SRTM-based catchment delineation, Muskingum routing, and SCS-CN losses, obtaining coefficients of determination of 0.64 and 0.68 for calibration and validation respectively with percent bias in the very good performance category, and recommended the calibrated model as a planning instrument for flood prediction and water-resources management. M. B. Haque et al. (2024) modelled the ecologically significant Halda catchment, optimising curve numbers against values derived from a companion SWAT application and achieving Nash–Sutcliffe efficiency values of 0.72 and 0.82, while explicitly documenting underestimation of baseflow during the dry season. Moniruzzaman and Mahalder (2026) compared HEC-HMS with SWAT for the Atrai–Karatoa River Basin of northern Bangladesh, a system hydrologically contiguous with the greater Chalan Beel floodplain to which the Pabna beel network belongs, reporting that SWAT captured high flows more accurately while HEC-HMS performed better across medium flows, with HEC-HMS achieving coefficients of determination of 0.70 and 0.56 during calibration and validation.</w:t>
       </w:r>
     </w:p>
     <w:p>
@@ -1201,15 +1439,7 @@
         <w:jc w:val="left"/>
       </w:pPr>
       <w:r>
-        <w:t>Taken together, the Bangladeshi HEC-HMS literature exhibits a clear spatial bias: published applications concentrate on large transboundary basins (Brahmaputra), flashy piedmont and hill catchments (Halda, Gumti), and the Atrai–Karatoa corridor. The moribund distributary systems of the Ganges right bank—of which the Ichamoti River of Pabna is a prominent example—and their associated beel catchments have not, to the author’s knowledge, been the subject of any published HEC-HMS rainfall–runoff study. It is precisely in such systems, where local rainfall and drainage congestion rather than upstream river floods govern inundation, that runoff quantification is most needed for drainage design, yet where gauging is thinnest. This gap frames the contribution of the present thesis.</w:t>
-      </w:r>
-    </w:p>
-    <w:p>
-      <w:r>
-        <w:rPr>
-          <w:b/>
-        </w:rPr>
-        <w:t>2.7 Beel and Floodplain-Wetland Hydrology and the Ichamoti–Gumai Beel Context</w:t>
+        <w:t>Complementary investigations employing alternative modelling frameworks complete the national picture. Raihan et al. (2020) simulated streamflow in the Upper Halda Basin using SWAT, achieving a coefficient of determination of 0.80 and Nash–Sutcliffe efficiency of 0.71, and identified groundwater delay time, baseflow alpha factor, and curve number as the parameters exerting greatest influence upon model performance while emphasising the difficulty of representing spatial rainfall variability from a single gauging station. Akter and Sawon (2024) developed hydrological models of selected flash-flood-prone rivers of Bangladesh, contributing to the understanding of rapid-response catchment behaviour under monsoonal forcing. Datta et al. (2022) provided the DEM sensitivity analysis of watershed delineation discussed in Section 2.5.1, and Jawad (2024) demonstrated satellite-forced coupled hydrologic–hydraulic modelling for the Bangladeshi reach of the Brahmaputra.</w:t>
       </w:r>
     </w:p>
     <w:p>
@@ -1218,7 +1448,15 @@
         <w:jc w:val="left"/>
       </w:pPr>
       <w:r>
-        <w:t>Wetland hydrology differs fundamentally from upland catchment hydrology: the water regime—the seasonal pattern of water-level rise and fall—is the master variable controlling wetland biogeochemistry, ecology, and land use, and altered hydrology is correspondingly identified as the principal pathway by which environmental change degrades wetland function (Salimi et al., 2021). In the floodplains of Bangladesh, the characteristic wetland landform is the beel, a saucer-shaped depression on the floodplain that retains water perennially or seasonally and is filled both by direct rainfall-runoff from its local catchment and by spill from adjacent rivers during the monsoon (Adnan et al., 2020). Agriculture, capture fisheries, and settlement in beel areas are finely adapted to the normal seasonal water regime, so that both deficient drainage (prolonged waterlogging) and excessive drainage (loss of dry-season water) constitute hazards, and remote-sensing studies of Bangladeshi wetland systems document rapid ongoing conversion of wetland classes to agriculture and settlement under such pressures (Bhattacharjee et al., 2021).</w:t>
+        <w:t>Considered collectively, the Bangladeshi HEC-HMS literature exhibits a pronounced spatial concentration. Published applications cluster within large transboundary basins, flashy piedmont and hill catchments, and the Atrai–Karatoa corridor. The moribund distributary systems of the Ganges right bank, of which the Ichamoti River of Pabna constitutes a representative example, together with their associated beel catchments, have not been the subject of any published HEC-HMS rainfall–runoff investigation. It is precisely within such systems, where local rainfall accumulation and drainage congestion rather than upstream flood waves govern inundation behaviour, that quantification of runoff is most necessary for drainage design, and yet where the observational network is thinnest.</w:t>
+      </w:r>
+    </w:p>
+    <w:p>
+      <w:r>
+        <w:rPr>
+          <w:b/>
+        </w:rPr>
+        <w:t>2.9 Wetland and beel hydrology in the Bangladesh floodplain</w:t>
       </w:r>
     </w:p>
     <w:p>
@@ -1227,7 +1465,7 @@
         <w:jc w:val="left"/>
       </w:pPr>
       <w:r>
-        <w:t>The hydrology of the beels of western Bangladesh cannot be understood apart from two generations of anthropogenic intervention. The first is the long-term decline of dry-season flows in the Ganges distributary network. Ali and Hasan (2022), analyzing Bangladesh Water Development Board discharge records for the Gorai—the principal Ganges distributary and the regional analogue of the Ichamoti—found that mean annual flow in 2000–2016 was about 13% lower than in 1984–1999, quantified a deficient-flow condition persisting from December to May, and estimated that the river now frequently fails to meet its environmental flow requirement of roughly 29% of mean annual flow. Reduced parent-river flows starve distributary offtakes of the sediment-flushing discharges that keep them open, initiating the progressive siltation and eventual hydraulic disconnection of distributaries such as the Ichamoti. The second generation of intervention comprises the embankment, polder, and flood control–drainage–irrigation infrastructure constructed from the 1960s onward, including the Pabna Irrigation and Rural Development Project that encloses much of the study region. The systemic consequence of such enclosure, documented most thoroughly for the embanked southwest delta, is internal drainage congestion: embankments disconnect the floodplain from the river network, sediment accretes in the riverbeds rather than on the floodplain, gravity drainage progressively fails, and monsoon runoff accumulates in the enclosed beels as pluvial flooding (Adnan et al., 2020). Adnan et al. (2020) showed that in the embanked southwest, a large majority of agricultural land now lies in flood-susceptible zones, and they evaluated controlled sediment reintroduction (tidal river management) in low-lying beels as a rehabilitation measure—evidence that beel drainage problems are structural and regional rather than local anomalies.</w:t>
+        <w:t>Wetland hydrology differs fundamentally from upland catchment hydrology in that the water regime, understood as the seasonal pattern of water-level rise, persistence, and recession, functions as the master variable governing biogeochemical processes, ecological structure, and land-use viability. Altered hydrology is correspondingly identified as the principal pathway through which environmental and anthropogenic change degrades wetland function, since modification of water depth and residence time alters the balance between organic-matter production and decomposition and may convert a wetland from a net sink to a net source of carbon and nutrients (Salimi et al., 2021). Within the floodplain morphology of Bangladesh, the characteristic wetland landform is the beel, a saucer-shaped depression retaining water perennially or seasonally and receiving inflow both from direct rainfall–runoff generated within its local catchment and from lateral spill originating in adjacent river channels during the monsoon.</w:t>
       </w:r>
     </w:p>
     <w:p>
@@ -1236,7 +1474,7 @@
         <w:jc w:val="left"/>
       </w:pPr>
       <w:r>
-        <w:t>The Ichamoti River of Pabna exemplifies the resulting condition. Originating from the Padma near Shibrampur in Pabna Sadar and following a course of approximately 82–84 km through Pabna town toward the Hurasagar system in Bera upazila, the river has lost its connection with its parent rivers and is now widely described as dead or dying, its channel constricted by siltation, encroachment, solid-waste dumping, and aquatic weed infestation (“Ichhamati Now a Trickle,” 2019; “Tk 1,554cr Project,” 2024). Within Pabna municipality, the river bisects the town but no longer functions as an effective drainage outfall: Parvez et al. (2021) documented that the Ichamoti is moribund—choked with water weeds and sediment—and that parts of the municipality are subject to inundation during and after heavy rainfall, with residents identifying blocked and undersized drains, absent maintenance, and the unplanned drainage network as leading causes of waterlogging. Recognizing this condition, the Government of Bangladesh has undertaken a major rejuvenation program: a Tk 1,554.90 crore project implemented by the Bangladesh Water Development Board, involving dredging of a 33.77 km river stretch together with connecting canals including the Bharara channel, is intended to restore the Ichamoti’s connectivity with the Padma and Jamuna systems (“Tk 1,554cr Project,” 2024).</w:t>
+        <w:t>The hydrological functioning of these depressions has been substantially modified by embankment and polder infrastructure constructed from the 1960s onward. Adnan et al. (2020), analysing the embanked delta of south-western Bangladesh, described the systemic mechanism through which such enclosure generates internal drainage congestion: embankments sever the hydraulic connection between floodplain and river channel, sediment accumulates within riverbeds rather than upon the floodplain surface, riverbed elevation rises relative to the enclosed land, gravity drainage through sluice structures progressively fails, and monsoon runoff accumulates within the beels as pluvial flooding. Their analysis established that a large majority of agricultural and aquacultural land within the embanked region now lies within flood-susceptible zones, and evaluated controlled sediment reintroduction across 106 candidate beels as a rehabilitation strategy capable of raising land elevation by up to 1.4 m over five years. The mechanism described is structural and regional rather than locally anomalous, and it applies with equal force to the embanked interior floodplains of the Ganges right bank.</w:t>
       </w:r>
     </w:p>
     <w:p>
@@ -1245,15 +1483,7 @@
         <w:jc w:val="left"/>
       </w:pPr>
       <w:r>
-        <w:t>The Gumai Beel, the focus of the present study, is one of the beel systems of the Pabna floodplain drained through the Ichamoti corridor. Its inundation behavior is governed by the interaction of three controls that the reviewed literature identifies as characteristic of embanked distributary floodplains: local monsoon rainfall-runoff from the beel catchment; the conveyance capacity of the silted Ichamoti and its khals (canals), which sets the rate at which stored water can drain; and the stage of the receiving rivers, which can impose backwater limits on drainage (Adnan et al., 2020; Parvez et al., 2021). A rainfall–runoff model of the beel catchment is the necessary first element of any quantitative analysis of this system: it supplies the inflow boundary condition for drainage design, for evaluation of the rejuvenation project’s hydrological benefits, and for assessment of waterlogging risk under current and future rainfall regimes. The regional wetland literature reinforces the urgency of such quantification, as neighboring floodplain wetlands—most prominently the greater Chalan Beel system to which the Atrai–Karatoa drainage belongs—have experienced severe shrinkage and hydrological fragmentation under siltation, embankment construction, and land conversion (Bhattacharjee et al., 2021; Moniruzzaman &amp; Mahalder, 2026).</w:t>
-      </w:r>
-    </w:p>
-    <w:p>
-      <w:r>
-        <w:rPr>
-          <w:b/>
-        </w:rPr>
-        <w:t>2.8 Model Calibration, Validation, and Performance Evaluation</w:t>
+        <w:t>A second control operates at basin scale through the long-term reduction of dry-season flow within the Ganges distributary network. Ali and Hasan (2022), analysing Bangladesh Water Development Board discharge records for the Gorai River, the principal Ganges distributary and the closest regional analogue to the Ichamoti, determined that mean annual flow during 2000 to 2016 was approximately 13% lower than during 1984 to 1999, that mean monthly high flow declined by 20%, and that the river now frequently fails to satisfy an environmental flow requirement estimated at 295 m³/s, or 29% of mean annual flow, with a deficient-flow condition persisting from December through May. Reduced discharge within parent channels deprives distributary offtakes of the sediment-flushing flows required to maintain conveyance capacity, initiating progressive siltation and eventual hydraulic disconnection of distributary systems.</w:t>
       </w:r>
     </w:p>
     <w:p>
@@ -1262,7 +1492,15 @@
         <w:jc w:val="left"/>
       </w:pPr>
       <w:r>
-        <w:t>Credible use of any rainfall–runoff model requires a disciplined testing protocol. The conventional framework is the split-sample test, in which the observational record is divided so that the model is calibrated on one period and validated on an independent period; essentially all of the applications reviewed above follow this protocol (Hamdan et al., 2021; Nujhat et al., 2024; S. Haque et al., 2020; Tassew et al., 2019). The framework itself, however, is under active re-examination. Shen et al. (2022), in a large-sample experiment spanning 463 catchments, two conceptual models, and 50 data-splitting schemes, found that the common practice of calibrating to older data and validating on newer data systematically degrades subsequent predictive performance, and that calibrating to all available data is the most robust strategy when the model will be used operationally. For a thesis context, where independent demonstration of predictive skill remains an examination requirement, these findings argue for reporting both a conventional split-sample evaluation and a final parameter set re-estimated on the full record—the approach adopted in Chapter 3.</w:t>
+        <w:t>The consequences of these combined mechanisms are documented directly for the wetland complex surrounding the study area. Yankyera and Alam (2025), analysing five decades of Landsat imagery over Chalan Beel, the largest wetland ecosystem of Bangladesh and the system into which the Pabna floodplain drains, identified a consistent trajectory of expanding farmland and developed land accompanied by declining vegetation and wetland extent, with the most pronounced transformation occurring between 2013 and 2023. Bhattacharjee et al. (2021) reported an equivalent trajectory for a north-eastern wetland ecosystem. These transformations are hydrologically significant because reduction in wetland storage capacity diminishes the attenuation that beels provide to monsoon runoff, thereby increasing peak discharge and inundation depth within the residual drainage network.</w:t>
+      </w:r>
+    </w:p>
+    <w:p>
+      <w:r>
+        <w:rPr>
+          <w:b/>
+        </w:rPr>
+        <w:t>2.10 The Ichamoti River and Gumai Beel system</w:t>
       </w:r>
     </w:p>
     <w:p>
@@ -1271,7 +1509,7 @@
         <w:jc w:val="left"/>
       </w:pPr>
       <w:r>
-        <w:t>Quantitative performance evaluation rests on a small set of statistics whose properties have been sharply clarified in recent years. The Nash–Sutcliffe efficiency remains the most widely reported metric, with values above zero indicating improvement on the observed-mean benchmark and values above approximately 0.5 conventionally regarded as satisfactory for streamflow, as applied in the Bangladeshi and Ethiopian studies reviewed above (Moniruzzaman &amp; Mahalder, 2026; Nujhat et al., 2024; Tassew et al., 2019). The Kling–Gupta efficiency (KGE), which decomposes performance into correlation, bias, and variability components, is increasingly reported alongside NSE; Knoben et al. (2019) demonstrated, however, that KGE and NSE values are not directly comparable—the observed-mean benchmark corresponds to KGE ≈ −0.41 rather than zero—and cautioned modelers against transferring NSE-based intuitions to KGE scores. Althoff and Rodrigues (2021) provided a systematic analysis of goodness-of-fit criteria for model calibration and evaluation, showing that the choice of objective function materially shapes the resulting parameter set and recommending that criteria be matched deliberately to the modeling purpose—for example, peak-oriented criteria for flood design versus volume-oriented criteria for water-balance assessment. Percent bias and the RMSE–observations standard deviation ratio complete the standard reporting set used in the recent Bangladeshi applications (M. B. Haque et al., 2024; Nujhat et al., 2024; S. Haque et al., 2020), and the present study will report all four statistics for both calibration and validation periods, accompanied by graphical hydrograph comparison.</w:t>
+        <w:t>The Ichamoti River of Pabna District exemplifies the condition described in the preceding section. The river originates from the Padma in the vicinity of Shibrampur within Pabna Sadar Upazila and follows a course of approximately 82 to 84 km through Pabna town toward the Hurasagar system in Bera Upazila. Over recent decades the channel has lost effective hydraulic connectivity with its parent rivers and has become progressively constricted through siltation, encroachment, solid-waste disposal, and aquatic weed infestation. Parvez et al. (2021), investigating the causes of waterlogging within Pabna Municipality, documented that the Ichamoti bisects the municipality but no longer functions as an effective drainage outfall, being choked with water weeds and accumulated sediment, and reported that residents identified blocked and undersized drains, absent operation and maintenance provision, and an unplanned drainage network as the leading causes of inundation following heavy rainfall. Their physical inventory recorded approximately 7.9 km of the Ichamoti channel within the municipal area alongside 11.29 km of primary drains and 56.23 km of secondary drains, establishing the scale of the drainage system dependent upon the river as outfall.</w:t>
       </w:r>
     </w:p>
     <w:p>
@@ -1280,15 +1518,7 @@
         <w:jc w:val="left"/>
       </w:pPr>
       <w:r>
-        <w:t>Calibration itself may be manual, automated, or hybrid. HEC-HMS provides univariate-gradient and simplex search algorithms with a choice of objective functions (USACE, n.d.), and reviewed applications span the full range of practice: manual calibration guided by physical reasoning (Nujhat et al., 2024), automated optimization (Jawad, 2024; Tassew et al., 2019), and staged strategies in which sensitivity analysis precedes calibration to concentrate effort on influential parameters (Admas et al., 2025). The consistent finding that curve number, lag time, and Muskingum K dominate model response (Tassew et al., 2019) provides a defensible starting parameter set for the present study. Finally, the recent metric literature carries an implicit warning about equifinality: because different objective functions select different acceptable parameter sets (Althoff &amp; Rodrigues, 2021), and because aggregate scores can mask compensating errors in correlation, bias, and variability (Knoben et al., 2019), good practice now favors reporting calibrated parameter ranges, decomposed performance components, and alternative method combinations rather than a single nominally optimal model—a principle incorporated in the methodology of this thesis.</w:t>
-      </w:r>
-    </w:p>
-    <w:p>
-      <w:r>
-        <w:rPr>
-          <w:b/>
-        </w:rPr>
-        <w:t>2.9 Synthesis and Research Gap</w:t>
+        <w:t>Recognition of this condition has prompted large-scale government intervention. A rejuvenation programme valued at Tk 1,554.90 crore, implemented under the Bangladesh Water Development Board, provides for dredging across a 33.77 km reach of the river together with 44.07 km of connecting canals, 20 km of the Sutikhali River, and 12.37 km of the Bharara channel, with the stated objective of restoring hydraulic connectivity between the Ichamoti and the Padma and Jamuna systems (“Tk 1,554cr Project,” 2024). The hydrological design basis for such intervention requires quantitative estimation of the runoff volumes and hydrograph characteristics that the restored corridor must convey, which is precisely the information that a calibrated rainfall–runoff model provides.</w:t>
       </w:r>
     </w:p>
     <w:p>
@@ -1297,7 +1527,15 @@
         <w:jc w:val="left"/>
       </w:pPr>
       <w:r>
-        <w:t>The reviewed literature supports four conclusions that together define the position of the present study. First, conceptual semi-distributed modeling with HEC-HMS is a mature, extensively validated approach whose default method combination (SCS-CN loss, SCS unit hydrograph transform, Muskingum routing) performs satisfactorily across monsoonal and semi-arid climates, provided that method choices are justified for the landscape and purpose at hand and that curve number estimation receives particular care (Hamdan et al., 2021; Horton et al., 2022; Soulis, 2021; Tassew et al., 2019). Second, the data infrastructure required for such modeling—global DEMs, satellite land cover, and satellite or reanalysis precipitation—is available for Bangladesh, but flat deltaic terrain imposes recognized hazards on automated delineation, and precipitation-product limitations for extremes must be managed deliberately (Datta et al., 2022; Pradhan et al., 2022; Uuemaa et al., 2020). Third, published Bangladeshi applications of HEC-HMS cluster in large transboundary and piedmont basins (Jawad, 2024; M. B. Haque et al., 2024; Moniruzzaman &amp; Mahalder, 2026; Nujhat et al., 2024; S. Haque et al., 2020); no published study has modeled rainfall–runoff in the beel catchments of the moribund Ganges distributaries, of which the Ichamoti–Gumai Beel system is representative. Fourth, the hydrological problem of such systems is distinctive: inundation is governed by local runoff accumulating behind congested drainage rather than by riverine flood waves (Adnan et al., 2020; Parvez et al., 2021), while the long-term decline of the distributary network reflects basin-scale flow reduction that is well quantified for the neighboring Gorai but has never been connected to a quantitative runoff model of the beel itself (Ali &amp; Hasan, 2022).</w:t>
+        <w:t>The Gumai Beel, which constitutes the focus of the present investigation, forms one component of the beel network of the Pabna floodplain draining through the Ichamoti corridor. Its inundation behaviour is governed by the interaction of three controls identified in the reviewed literature as characteristic of embanked distributary floodplains: local monsoon rainfall–runoff generated within the beel catchment; the conveyance capacity of the silted Ichamoti channel and its associated khals, which determines the rate at which stored water may be evacuated; and the stage of the receiving river system, which may impose backwater constraints upon gravity drainage (Adnan et al., 2020; Parvez et al., 2021). A rainfall–runoff model of the beel catchment constitutes the necessary first element of any quantitative analysis of this system, since it supplies the inflow boundary condition required for drainage design, for evaluation of the hydrological benefits attributable to the rejuvenation programme, and for assessment of waterlogging risk under current and projected rainfall regimes.</w:t>
+      </w:r>
+    </w:p>
+    <w:p>
+      <w:r>
+        <w:rPr>
+          <w:b/>
+        </w:rPr>
+        <w:t>2.11 Research gap and summary</w:t>
       </w:r>
     </w:p>
     <w:p>
@@ -1306,7 +1544,25 @@
         <w:jc w:val="left"/>
       </w:pPr>
       <w:r>
-        <w:t>The research gap addressed by this thesis follows directly. A calibrated and validated HEC-HMS rainfall–runoff model of the Gumai Beel catchment will provide the first quantitative estimate of the runoff volumes and hydrograph dynamics that the Ichamoti drainage corridor must convey, thereby supplying the hydrological foundation for drainage design and for evaluation of the ongoing river rejuvenation program (“Tk 1,554cr Project,” 2024). Methodologically, the study extends the Bangladeshi HEC-HMS literature into an ultra-flat, wetland-dominated, data-scarce environment in which DEM limitations, seasonal land-cover alternation, and baseflow-storage behavior pose challenges identified but not resolved in previous work (Datta et al., 2022; M. B. Haque et al., 2024). The methods adopted in Chapter 3—comparative testing of loss and transform methods, field-verified delineation, gauge-primary forcing with reanalysis gap filling, split-sample testing informed by current calibration research, and performance evaluation using NSE, KGE, percent bias, and RSR with purpose-matched objective functions—are each grounded in the literature reviewed in this chapter (Althoff &amp; Rodrigues, 2021; Knoben et al., 2019; Shen et al., 2022).</w:t>
+        <w:t>The literature reviewed in this chapter supports four conclusions that collectively establish the position of the present study. First, conceptual semi-distributed modelling using HEC-HMS constitutes a mature and extensively validated approach whose conventional method combination of SCS-CN loss, SCS unit hydrograph transform, and Muskingum routing performs satisfactorily across monsoonal and semi-arid regimes, provided that method selection is justified with reference to catchment characteristics and modelling purpose and that curve number estimation receives particular methodological attention (Hamdan et al., 2021; Horton et al., 2022; Labade et al., 2025; Soulis, 2021). Second, the spatial data infrastructure required for such modelling, comprising global elevation products, satellite land-cover classification, and satellite or reanalysis precipitation, is available for Bangladesh, but low-relief deltaic terrain imposes recognised constraints upon automated delineation and satellite precipitation products retain documented limitations for extreme intensities, both of which require deliberate management (Datta et al., 2022; Pradhan et al., 2022; Uuemaa et al., 2020).</w:t>
+      </w:r>
+    </w:p>
+    <w:p>
+      <w:pPr>
+        <w:ind w:firstLine="720"/>
+        <w:jc w:val="left"/>
+      </w:pPr>
+      <w:r>
+        <w:t>Third, published Bangladeshi applications of HEC-HMS concentrate within large transboundary basins, flashy piedmont catchments, and the Atrai–Karatoa corridor (Jawad, 2024; M. B. Haque et al., 2024; Moniruzzaman &amp; Mahalder, 2026; Nujhat et al., 2024; Nur et al., 2022; S. Haque et al., 2021; Zhang et al., 2022). No published study has developed a rainfall–runoff model for the beel catchments of the moribund Ganges distributaries, of which the Ichamoti–Gumai Beel system is representative. Fourth, the hydrological problem posed by such systems is distinctive in kind rather than merely in degree: inundation is governed by locally generated runoff accumulating behind congested drainage rather than by riverine flood waves propagating from upstream (Adnan et al., 2020; Parvez et al., 2021), while the long-term deterioration of the distributary network reflects basin-scale flow reduction that has been quantified for the neighbouring Gorai but has never been connected to a quantitative runoff model of the beel itself (Ali &amp; Hasan, 2022).</w:t>
+      </w:r>
+    </w:p>
+    <w:p>
+      <w:pPr>
+        <w:ind w:firstLine="720"/>
+        <w:jc w:val="left"/>
+      </w:pPr>
+      <w:r>
+        <w:t>The research gap addressed by the present study follows directly from these conclusions. A calibrated and validated HEC-HMS rainfall–runoff model of the Gumai Beel catchment will provide the first quantitative estimate of the runoff volumes and hydrograph dynamics that the Ichamoti drainage corridor is required to convey, thereby establishing the hydrological foundation for drainage design and for evaluation of the ongoing river rejuvenation programme. Methodologically, the study extends the Bangladeshi HEC-HMS literature into an ultra-flat, wetland-dominated, and data-scarce environment in which DEM limitations, seasonal alternation of land cover, and wetland storage behaviour present challenges that have been identified but not resolved in previous work. The methods adopted in the following chapter, comprising comparative evaluation of loss and transform formulations, field-verified catchment delineation, gauge-primary precipitation forcing supplemented by reanalysis data, split-sample testing informed by current calibration research, and performance evaluation using purpose-matched objective functions together with multiple statistical indicators, are each grounded in the literature reviewed in this chapter (Althoff &amp; Rodrigues, 2021; Shen et al., 2022; Turkar et al., 2025).</w:t>
       </w:r>
     </w:p>
     <w:p>
@@ -1315,14 +1571,20 @@
       </w:r>
     </w:p>
     <w:p>
-      <w:pPr>
-        <w:jc w:val="center"/>
-      </w:pPr>
       <w:r>
         <w:rPr>
           <w:b/>
+          <w:sz w:val="28"/>
         </w:rPr>
         <w:t>References</w:t>
+      </w:r>
+    </w:p>
+    <w:p>
+      <w:pPr>
+        <w:ind w:left="720" w:hanging="720"/>
+      </w:pPr>
+      <w:r>
+        <w:t>Admas, M., Asrade, T. M., &amp; Cherie, W. D. (2025). Application of the HEC-RAS and HEC-HMS models for flood risk analysis in the Gumara River, Upper Blue Nile Basin, Ethiopia. Advances in Meteorology, 2025, Article 5092932. https://doi.org/10.1155/adme/5092932</w:t>
       </w:r>
     </w:p>
     <w:p>
@@ -1338,7 +1600,7 @@
         <w:ind w:left="720" w:hanging="720"/>
       </w:pPr>
       <w:r>
-        <w:t>Admas, M., Asrade, T. M., &amp; Cherie, W. D. (2025). Application of the HEC-RAS and HEC-HMS models for flood risk analysis in the Gumara River, Upper Blue Nile Basin, Ethiopia. Advances in Meteorology, 2025, Article 5092932. https://doi.org/10.1155/adme/5092932</w:t>
+        <w:t>Akter, A., &amp; Sawon, F. S. (2024). Hydrological modeling of the selected flash flood-prone rivers. Natural Hazards. https://doi.org/10.1007/s11069-024-06928-z</w:t>
       </w:r>
     </w:p>
     <w:p>
@@ -1386,6 +1648,14 @@
         <w:ind w:left="720" w:hanging="720"/>
       </w:pPr>
       <w:r>
+        <w:t>Dibaba, W. T., Demissie, T. A., &amp; Miegel, K. (2020). Watershed hydrological response to combined land use/land cover and climate change in highland Ethiopia: Finchaa catchment. Water, 12(6), Article 1801. https://doi.org/10.3390/w12061801</w:t>
+      </w:r>
+    </w:p>
+    <w:p>
+      <w:pPr>
+        <w:ind w:left="720" w:hanging="720"/>
+      </w:pPr>
+      <w:r>
         <w:t>Hamdan, A. N. A., Almuktar, S., &amp; Scholz, M. (2021). Rainfall-runoff modeling using the HEC-HMS model for the Al-Adhaim River catchment, northern Iraq. Hydrology, 8(2), Article 58. https://doi.org/10.3390/hydrology8020058</w:t>
       </w:r>
     </w:p>
@@ -1402,7 +1672,7 @@
         <w:ind w:left="720" w:hanging="720"/>
       </w:pPr>
       <w:r>
-        <w:t>Haque, S., Ali, M. M., Islam, A. K. M. S., &amp; Khan, M. J. U. (2020). Changes in flow and sediment load of poorly gauged Brahmaputra river basin under an extreme climate scenario. Journal of Water and Climate Change, 12(3), 937–954. https://doi.org/10.2166/wcc.2020.219</w:t>
+        <w:t>Haque, S., Ali, M. M., Islam, A. K. M. S., &amp; Khan, M. J. U. (2021). Changes in flow and sediment load of poorly gauged Brahmaputra river basin under an extreme climate scenario. Journal of Water and Climate Change, 12(3), 937–954. https://doi.org/10.2166/wcc.2020.219</w:t>
       </w:r>
     </w:p>
     <w:p>
@@ -1426,14 +1696,6 @@
         <w:ind w:left="720" w:hanging="720"/>
       </w:pPr>
       <w:r>
-        <w:t>Ichhamati now a trickle. (2019). The Daily Star. https://www.thedailystar.net/backpage/news/ichhamati-now-trickle-1828042</w:t>
-      </w:r>
-    </w:p>
-    <w:p>
-      <w:pPr>
-        <w:ind w:left="720" w:hanging="720"/>
-      </w:pPr>
-      <w:r>
         <w:t>Jawad, M. (2024). Evaluation of near real-time Global Precipitation Measurement (GPM) precipitation products for hydrological modelling and flood inundation mapping of sparsely gauged large transboundary basins—A case study of the Brahmaputra basin. Remote Sensing, 16(10), Article 1756. https://doi.org/10.3390/rs16101756</w:t>
       </w:r>
     </w:p>
@@ -1442,7 +1704,7 @@
         <w:ind w:left="720" w:hanging="720"/>
       </w:pPr>
       <w:r>
-        <w:t>Knoben, W. J. M., Freer, J. E., &amp; Woods, R. A. (2019). Technical note: Inherent benchmark or not? Comparing Nash–Sutcliffe and Kling–Gupta efficiency scores. Hydrology and Earth System Sciences, 23(10), 4323–4331. https://doi.org/10.5194/hess-23-4323-2019</w:t>
+        <w:t>Labade, P., Ayare, B. L., Bhange, H. N., Ingle, P. M., &amp; Kolhe, P. R. (2025). A comprehensive review on rainfall-runoff modelling using HEC-HMS. International Journal of Research in Agronomy, 8(10), 1130–1138. https://doi.org/10.33545/2618060X.2025.v8.i10o.4374</w:t>
       </w:r>
     </w:p>
     <w:p>
@@ -1459,6 +1721,14 @@
       </w:pPr>
       <w:r>
         <w:t>Nujhat, M., Rayhan, M., &amp; Amin, M. K. (2024). Hydrological modelling and its implication in sustainable water resource management in Gumti River Basin in Bangladesh. International Journal of Sustainability in Energy and Environment, 1(2), 40–48.</w:t>
+      </w:r>
+    </w:p>
+    <w:p>
+      <w:pPr>
+        <w:ind w:left="720" w:hanging="720"/>
+      </w:pPr>
+      <w:r>
+        <w:t>Nur, F., Mohib, K. M., Toma, U. T., Rozario, P. M., Bari, M. S., Anjum, N., &amp; Khandakar, F. (2022, February 10–12). Rainfall-runoff simulation of Khowai River basin using HEC-HMS model [Conference presentation]. 6th International Conference on Civil Engineering for Sustainable Development (ICCESD 2022), Khulna University of Engineering &amp; Technology, Khulna, Bangladesh.</w:t>
       </w:r>
     </w:p>
     <w:p>
@@ -1490,6 +1760,22 @@
         <w:ind w:left="720" w:hanging="720"/>
       </w:pPr>
       <w:r>
+        <w:t>Ranjan, S., &amp; Singh, V. P. (2022). HEC-HMS based rainfall-runoff model for Punpun river basin. Water Practice &amp; Technology, 17(5), 986–1001. https://doi.org/10.2166/wpt.2022.033</w:t>
+      </w:r>
+    </w:p>
+    <w:p>
+      <w:pPr>
+        <w:ind w:left="720" w:hanging="720"/>
+      </w:pPr>
+      <w:r>
+        <w:t>Sahu, M. K., Shwetha, H. R., &amp; Dwarakish, G. S. (2023). State-of-the-art hydrological models and application of the HEC-HMS model: A review. Modeling Earth Systems and Environment, 9(3), 3029–3051. https://doi.org/10.1007/s40808-023-01704-7</w:t>
+      </w:r>
+    </w:p>
+    <w:p>
+      <w:pPr>
+        <w:ind w:left="720" w:hanging="720"/>
+      </w:pPr>
+      <w:r>
         <w:t>Salimi, S., Almuktar, S. A. A. A. N., &amp; Scholz, M. (2021). Impact of climate change on wetland ecosystems: A critical review of experimental wetlands. Journal of Environmental Management, 286, Article 112160. https://doi.org/10.1016/j.jenvman.2021.112160</w:t>
       </w:r>
     </w:p>
@@ -1506,6 +1792,14 @@
         <w:ind w:left="720" w:hanging="720"/>
       </w:pPr>
       <w:r>
+        <w:t>Shi, W., &amp; Wang, N. (2020). An improved SCS-CN method incorporating slope, soil moisture, and storm duration factors for runoff prediction. Water, 12(5), Article 1335. https://doi.org/10.3390/w12051335</w:t>
+      </w:r>
+    </w:p>
+    <w:p>
+      <w:pPr>
+        <w:ind w:left="720" w:hanging="720"/>
+      </w:pPr>
+      <w:r>
         <w:t>Soulis, K. X. (2021). Soil Conservation Service Curve Number (SCS-CN) method: Current applications, remaining challenges, and future perspectives. Water, 13(2), Article 192. https://doi.org/10.3390/w13020192</w:t>
       </w:r>
     </w:p>
@@ -1514,7 +1808,7 @@
         <w:ind w:left="720" w:hanging="720"/>
       </w:pPr>
       <w:r>
-        <w:t>Tassew, B. G., Belete, M. A., &amp; Miegel, K. (2019). Application of HEC-HMS model for flow simulation in the Lake Tana Basin: The case of Gilgel Abay catchment, Upper Blue Nile Basin, Ethiopia. Hydrology, 6(1), Article 21. https://doi.org/10.3390/hydrology6010021</w:t>
+        <w:t>Tk 1,554cr project to revive dying Ichamati. (2024, November 26). The Daily Star. https://www.thedailystar.net/news/bangladesh/news/tk-1554cr-project-revive-dying-ichamati-3555931</w:t>
       </w:r>
     </w:p>
     <w:p>
@@ -1522,7 +1816,7 @@
         <w:ind w:left="720" w:hanging="720"/>
       </w:pPr>
       <w:r>
-        <w:t>Tk 1,554cr project to revive dying Ichamati. (2024). The Daily Star. https://www.thedailystar.net/news/bangladesh/news/tk-1554cr-project-revive-dying-ichamati-3555931</w:t>
+        <w:t>Turkar, R. K., Shrivastava, R. N., Awasthi, M. K., &amp; Lodhi, A. S. (2025). A comprehensive review of the HEC-HMS rainfall–runoff simulation model and its hydrological applications. Journal of Agriculture and Ecology Research International, 26(5), 130–144. https://doi.org/10.9734/jaeri/2025/v26i5711</w:t>
       </w:r>
     </w:p>
     <w:p>
@@ -1530,7 +1824,7 @@
         <w:ind w:left="720" w:hanging="720"/>
       </w:pPr>
       <w:r>
-        <w:t>U.S. Army Corps of Engineers, Hydrologic Engineering Center. (n.d.). HEC-HMS technical reference manual. Retrieved August 16, 2026, from https://www.hec.usace.army.mil/confluence/hmsdocs/hmstrm</w:t>
+        <w:t>U.S. Army Corps of Engineers, Hydrologic Engineering Center. (n.d.). HEC-HMS technical reference manual. Retrieved August 17, 2026, from https://www.hec.usace.army.mil/confluence/hmsdocs/hmstrm</w:t>
       </w:r>
     </w:p>
     <w:p>
@@ -1539,6 +1833,22 @@
       </w:pPr>
       <w:r>
         <w:t>Uuemaa, E., Ahi, S., Montibeller, B., Muru, M., &amp; Kmoch, A. (2020). Vertical accuracy of freely available global digital elevation models (ASTER, AW3D30, MERIT, TanDEM-X, SRTM, and NASADEM). Remote Sensing, 12(21), Article 3482. https://doi.org/10.3390/rs12213482</w:t>
+      </w:r>
+    </w:p>
+    <w:p>
+      <w:pPr>
+        <w:ind w:left="720" w:hanging="720"/>
+      </w:pPr>
+      <w:r>
+        <w:t>Yankyera, S., &amp; Alam, B. M. (2025). Five decades of transformation due to human-environment stressors: Land cover, vegetation, and land surface temperature change analysis in the largest wetland ecosystem in Bangladesh. Earth Systems and Environment, 9(2), 589–604. https://doi.org/10.1007/s41748-025-00652-9</w:t>
+      </w:r>
+    </w:p>
+    <w:p>
+      <w:pPr>
+        <w:ind w:left="720" w:hanging="720"/>
+      </w:pPr>
+      <w:r>
+        <w:t>Zhang, K., Shalehy, M. H., Ezaz, G. T., Chakraborty, A. K., Mohib, K. M., &amp; Liu, L. (2022). An integrated flood risk assessment approach based on coupled hydrological-hydraulic modeling and bottom-up hazard vulnerability analysis. Environmental Modelling &amp; Software, 148, Article 105279. https://doi.org/10.1016/j.envsoft.2021.105279</w:t>
       </w:r>
     </w:p>
     <w:sectPr>

</xml_diff>

<commit_message>
Convert literature review to information-prominent citation style
Co-authored-by: Bit Raven <bitraveneth@users.noreply.github.com>
</commit_message>
<xml_diff>
--- a/thesis/Literature_Review_Gumai_Beel_Ichamoti_HEC-HMS.docx
+++ b/thesis/Literature_Review_Gumai_Beel_Ichamoti_HEC-HMS.docx
@@ -131,7 +131,7 @@
         <w:jc w:val="left"/>
       </w:pPr>
       <w:r>
-        <w:t>Hydrological models are conventionally differentiated along two principal axes: the degree of physical process representation and the level of spatial discretisation. On the first axis, empirical or data-driven models establish statistical transfer functions between input and output series without explicit reference to physical mechanisms; conceptual models represent the catchment as a cascade of interconnected storage elements whose governing equations approximate physical behaviour; and physically based models solve conservation equations for mass, momentum, and energy using parameters that are, in principle, independently measurable. On the second axis, lumped models treat the catchment as a single homogeneous unit, semi-distributed models subdivide it into sub-basins within which parameters are averaged, and fully distributed models resolve hydrological state variables on a regular computational grid (Sahu et al., 2023). HEC-HMS occupies an intermediate position in this taxonomy, functioning as a conceptual, semi-distributed system that reproduces the dominant runoff-generation mechanisms without imposing the data burden of fully distributed formulations (Turkar et al., 2025).</w:t>
+        <w:t>Hydrological models are conventionally differentiated along two principal axes, namely the degree of physical process representation and the level of spatial discretisation. Empirical or data-driven models establish statistical transfer functions between input and output series without explicit reference to physical mechanisms, conceptual models represent the catchment as a cascade of interconnected storage elements whose governing equations approximate physical behaviour, and physically based models solve conservation equations for mass, momentum, and energy using parameters that are in principle independently measurable. With respect to spatial resolution, lumped models treat the catchment as a single homogeneous unit, semi-distributed models subdivide it into sub-basins within which parameters are averaged, and fully distributed models resolve hydrological state variables on a regular computational grid (Sahu et al., 2023). HEC-HMS occupies an intermediate position within this taxonomy, functioning as a conceptual and semi-distributed system that reproduces the dominant runoff-generation mechanisms without imposing the data requirements associated with fully distributed formulations (Turkar et al., 2025).</w:t>
       </w:r>
     </w:p>
     <w:p>
@@ -140,7 +140,7 @@
         <w:jc w:val="left"/>
       </w:pPr>
       <w:r>
-        <w:t>The proliferation of hydrological models has itself become a subject of critical enquiry. Horton et al. (2022), combining a systematic literature review with a structured survey of practising modellers, demonstrated that model diversity is driven only partially by genuine differences in application context; a substantial component reflects institutional familiarity, code accessibility, and the reuse of pre-existing model configurations. Their central observation, that the justification for model selection is rarely articulated in published studies, establishes an explicit methodological obligation: the choice of a modelling system must be defended with reference to the physical characteristics of the catchment, the availability and resolution of input data, and the specific objectives of the investigation. This obligation is addressed directly in the present study through the reasoning developed in Sections 2.3 and 2.4.</w:t>
+        <w:t>The proliferation of hydrological models is driven only partially by genuine differences in application context, since a substantial component of model diversity reflects institutional familiarity, accessibility of source code, and the reuse of pre-existing model configurations. The rationale for model selection is rarely articulated in published studies, and the adequacy of a given model for its landscape and purpose is frequently left unaddressed (Horton et al., 2022). Model choice must therefore be justified explicitly with reference to catchment characteristics, the availability and resolution of input data, and the specific objectives of the investigation, rather than adopted by convention.</w:t>
       </w:r>
     </w:p>
     <w:p>
@@ -149,7 +149,7 @@
         <w:jc w:val="left"/>
       </w:pPr>
       <w:r>
-        <w:t>For data-limited catchments, the operative comparison in contemporary practice lies between conceptual semi-distributed systems such as HEC-HMS and more heavily parameterised ecohydrological frameworks such as the Soil and Water Assessment Tool (SWAT). Comparative evaluations clarify the associated trade-offs. Aliye et al. (2020), examining both models within a data-scarce catchment of the Ethiopian Rift Valley Lakes Basin, concluded that each framework was capable of reproducing observed streamflow with acceptable accuracy. Moniruzzaman and Mahalder (2026), applying an equivalent comparison to the Atrai–Karatoa River Basin of northern Bangladesh, reported that SWAT reproduced high flows more faithfully whereas HEC-HMS achieved superior accuracy across the medium-flow range, with both models simulating low flows adequately. These findings indicate that HEC-HMS constitutes a defensible selection where the modelling objective is hydrograph generation rather than the simulation of sediment transport, nutrient flux, or land-management scenarios, and where the parsimony of its parameter set corresponds to the available observational record.</w:t>
+        <w:t>For data-limited catchments, the operative comparison in contemporary practice lies between conceptual semi-distributed systems such as HEC-HMS and more heavily parameterised ecohydrological frameworks such as the Soil and Water Assessment Tool (SWAT). Both frameworks are capable of reproducing observed streamflow with acceptable accuracy under conditions of limited observational support (Aliye et al., 2020). In a comparative application to the Atrai–Karatoa River Basin of northern Bangladesh, SWAT reproduced high flows more faithfully whereas HEC-HMS achieved superior accuracy across the medium-flow range, with both models simulating low flows adequately (Moniruzzaman &amp; Mahalder, 2026). HEC-HMS accordingly constitutes a defensible selection where the modelling objective is hydrograph generation rather than the simulation of sediment transport, nutrient flux, or land-management scenarios, and where the parsimony of its parameter set corresponds to the extent of the available observational record.</w:t>
       </w:r>
     </w:p>
     <w:p>
@@ -158,7 +158,7 @@
         <w:jc w:val="left"/>
       </w:pPr>
       <w:r>
-        <w:t>A further operational distinction separates event-based from continuous simulation. Event-based configurations reproduce the catchment response to discrete storm episodes and are appropriate for design-flood estimation, peak discharge analysis, and flood forecasting. Continuous configurations track soil-moisture accounting through alternating wet and dry periods over multi-annual horizons and are appropriate for water-balance and water-resources assessment. Reviews of the HEC-HMS application literature indicate that the SCS-CN loss method dominates event-based practice, whereas the Soil Moisture Accounting (SMA) algorithm is preferred for continuous simulation (Labade et al., 2025; Turkar et al., 2025). Because the inundation regime of the Gumai Beel is governed simultaneously by discrete monsoon storm events and by the strongly seasonal water balance of the surrounding floodplain, the present study requires a modelling system capable of operating in both modes, a requirement that HEC-HMS satisfies within a single computational framework.</w:t>
+        <w:t>A further operational distinction separates event-based from continuous simulation. Event-based configurations reproduce the catchment response to discrete storm episodes and are appropriate for design-flood estimation, peak discharge analysis, and flood forecasting, whereas continuous configurations track soil-moisture accounting through alternating wet and dry periods over multi-annual horizons and are appropriate for water-balance and water-resources assessment. The SCS-CN loss method dominates event-based practice, while the Soil Moisture Accounting (SMA) algorithm is preferred for continuous simulation (Labade et al., 2025; Turkar et al., 2025). Because the inundation regime of the Gumai Beel is governed simultaneously by discrete monsoon storm events and by the strongly seasonal water balance of the surrounding floodplain, the present study requires a modelling system capable of operating in both modes, a requirement satisfied by HEC-HMS within a single computational framework.</w:t>
       </w:r>
     </w:p>
     <w:p>
@@ -175,7 +175,7 @@
         <w:jc w:val="left"/>
       </w:pPr>
       <w:r>
-        <w:t>HEC-HMS was developed by the Hydrologic Engineering Center of the United States Army Corps of Engineers to simulate the complete precipitation–runoff process of dendritic watershed systems (U.S. Army Corps of Engineers [USACE], n.d.). A model project comprises three principal components. The basin model represents the physical catchment as a network of hydrological elements, including sub-basins, reaches, junctions, reservoirs, diversions, sources, and sinks. The meteorological model assigns precipitation and evapotranspiration boundary conditions to each sub-basin through gauge weighting, inverse-distance interpolation, or gridded input. The control specifications define the temporal window and computational time step of the simulation. Within each sub-basin, the user selects one algorithm from each of several interchangeable method libraries governing canopy and surface storage, infiltration loss, direct-runoff transformation, and baseflow, while each routing reach is assigned an independent channel-routing method (Sahu et al., 2023; USACE, n.d.). This modular architecture accounts for the model’s adaptability across climatic regimes and explains its widespread adoption in regions where proprietary modelling systems are financially inaccessible (Hamdan et al., 2021).</w:t>
+        <w:t>HEC-HMS is designed to simulate the complete precipitation–runoff process of dendritic watershed systems, and a model project comprises three principal components (U.S. Army Corps of Engineers [USACE], n.d.). The basin model represents the physical catchment as a network of hydrological elements including sub-basins, reaches, junctions, reservoirs, diversions, sources, and sinks. The meteorological model assigns precipitation and evapotranspiration boundary conditions to each sub-basin through gauge weighting, inverse-distance interpolation, or gridded input. The control specifications define the temporal window and computational time step of the simulation. Within each sub-basin, one algorithm is selected from each of several interchangeable method libraries governing canopy and surface storage, infiltration loss, direct-runoff transformation, and baseflow, while each routing reach is assigned an independent channel-routing method (Sahu et al., 2023; USACE, n.d.). This modular architecture accounts for the adaptability of the model across climatic regimes and explains its widespread adoption in regions where proprietary modelling systems are financially inaccessible (Hamdan et al., 2021).</w:t>
       </w:r>
     </w:p>
     <w:p>
@@ -193,7 +193,7 @@
         <w:jc w:val="left"/>
       </w:pPr>
       <w:r>
-        <w:t>The loss model determines the proportion of incident precipitation abstracted through infiltration, interception, and surface retention, and therefore the residual depth of precipitation excess available for direct runoff. The SCS-CN method remains the dominant formulation within the HEC-HMS application literature because it consolidates the combined influence of hydrologic soil group, land use and treatment, surface condition, and antecedent moisture into a single dimensionless parameter that can be derived from mappable catchment attributes (Labade et al., 2025; Soulis, 2021). Soulis (2021), reviewing the status of the method after six decades of application, attributed its persistence to its conceptual simplicity, well-documented input requirements, and transferability to ungauged catchments, while identifying several unresolved limitations that remain active research topics. Foremost among these is the initial abstraction ratio: numerous investigations reviewed in that work reported locally calibrated values substantially below the conventional figure of 0.2, frequently approaching 0.05 or lower, implying systematic overestimation of initial losses when the standard ratio is applied uncritically.</w:t>
+        <w:t>The loss model determines the proportion of incident precipitation abstracted through infiltration, interception, and surface retention, and therefore the residual depth of precipitation excess available for direct runoff. The SCS-CN method remains the dominant formulation within the HEC-HMS application literature because it consolidates the combined influence of hydrologic soil group, land use and treatment, surface condition, and antecedent moisture into a single dimensionless parameter derivable from mappable catchment attributes (Labade et al., 2025; Soulis, 2021). The persistence of the method after six decades of application is attributable to its conceptual simplicity, well-documented input requirements, and transferability to ungauged catchments, although several limitations remain unresolved. Foremost among these is the initial abstraction ratio, for which locally calibrated values are frequently found to lie substantially below the conventional figure of 0.2 and often approach 0.05 or lower, implying systematic overestimation of initial losses when the standard ratio is applied uncritically (Soulis, 2021).</w:t>
       </w:r>
     </w:p>
     <w:p>
@@ -202,7 +202,7 @@
         <w:jc w:val="left"/>
       </w:pPr>
       <w:r>
-        <w:t>Complementary research has sought to extend the method by incorporating variables absent from its original formulation. Shi and Wang (2020) developed a modified SCS-CN equation combining the tabulated curve number with explicit slope-gradient, soil-moisture, and storm-duration factors, and demonstrated that the modified formulation raised model efficiency to approximately 80% during both calibration and validation while reducing root-mean-square error from 5.53 mm to 2.01 mm relative to the standard method. Their sensitivity analysis identified soil-moisture parameters as the most influential, followed by storm duration and slope, with the initial abstraction ratio the least sensitive. These results carry direct methodological implications for the present study, in which antecedent moisture in a seasonally saturated beel environment varies far more widely than in the agricultural watersheds from which the original curve-number tables were derived.</w:t>
+        <w:t>Extensions of the method have sought to incorporate variables absent from its original formulation. A modified SCS-CN equation combining the tabulated curve number with explicit slope-gradient, soil-moisture, and storm-duration factors raised model efficiency to approximately 80% during both calibration and validation and reduced root-mean-square error from 5.53 mm to 2.01 mm relative to the standard method, with soil-moisture parameters identified as the most influential, followed by storm duration and slope, and the initial abstraction ratio as the least sensitive (Shi &amp; Wang, 2020). These findings carry direct methodological implications for the present study, in which antecedent moisture within a seasonally saturated beel environment varies far more widely than in the agricultural watersheds from which the original curve-number tabulations were derived.</w:t>
       </w:r>
     </w:p>
     <w:p>
@@ -211,7 +211,7 @@
         <w:jc w:val="left"/>
       </w:pPr>
       <w:r>
-        <w:t>HEC-HMS provides several alternatives to the curve-number approach, including the initial-and-constant and deficit-and-constant loss methods, the Green–Ampt infiltration model, and the multi-layer SMA algorithm intended for continuous simulation (USACE, n.d.). Empirical evidence indicates that the SCS-CN method performs reliably in monsoonal and semi-arid event simulation, as demonstrated by Hamdan et al. (2021) for the Al-Adhaim catchment of northern Iraq and by Ranjan and Singh (2022) for the Punpun River Basin of eastern India. For multi-annual continuous applications, the SMA formulation is generally preferred, as adopted by Jawad (2024) in the Brahmaputra Basin. A consistent finding across this literature is that the curve number constitutes the single most sensitive parameter of the model. Turkar et al. (2025) identified curve number, infiltration rate, lag time, and baseflow as the controlling parameters across the studies they reviewed, and M. B. Haque et al. (2024) reported that simulated runoff in the Halda catchment was highly sensitive to sub-basin curve numbers, which depend directly on the accuracy of the underlying land-cover classification.</w:t>
+        <w:t>Alternatives to the curve-number approach available within HEC-HMS include the initial-and-constant and deficit-and-constant loss methods, the Green–Ampt infiltration model, and the multi-layer SMA algorithm intended for continuous simulation (USACE, n.d.). Empirical evidence indicates reliable performance of the SCS-CN method in monsoonal and semi-arid event simulation, as demonstrated for the Al-Adhaim catchment of northern Iraq (Hamdan et al., 2021) and the Punpun River Basin of eastern India (Ranjan &amp; Singh, 2022), whereas the SMA formulation is generally preferred for multi-annual continuous applications (Jawad, 2024). A consistent finding across this literature is that the curve number constitutes the single most sensitive parameter of the model. Curve number, infiltration rate, lag time, and baseflow have been identified as the controlling parameters across the reviewed body of applications (Turkar et al., 2025), and simulated runoff in the Halda catchment responded strongly to sub-basin curve numbers determined by the accuracy of the underlying land-cover classification (M. B. Haque et al., 2024).</w:t>
       </w:r>
     </w:p>
     <w:p>
@@ -229,7 +229,7 @@
         <w:jc w:val="left"/>
       </w:pPr>
       <w:r>
-        <w:t>The transform model converts the precipitation excess computed by the loss model into a direct-runoff hydrograph at the sub-basin outlet. The majority of applications employ unit-hydrograph theory, for which HEC-HMS provides the SCS dimensionless unit hydrograph, parameterised by basin lag time; the Clark unit hydrograph, which represents translation and attenuation separately through a time–area histogram and a linear-reservoir storage coefficient; and the Snyder synthetic unit hydrograph, parameterised by lag and peaking coefficients (USACE, n.d.). Review evidence establishes the SCS unit hydrograph as the most frequently adopted transform across international practice, typically paired with SCS-CN losses (Labade et al., 2025; Sahu et al., 2023), a configuration applied successfully by Hamdan et al. (2021), Ranjan and Singh (2022), and Nujhat et al. (2024). The Clark formulation has been preferred in several large-basin continuous applications, including the Brahmaputra model of Jawad (2024), where storage coefficient and time of concentration were treated as primary calibration parameters.</w:t>
+        <w:t>The transform model converts the precipitation excess computed by the loss model into a direct-runoff hydrograph at the sub-basin outlet. Most applications employ unit-hydrograph theory, for which HEC-HMS provides the SCS dimensionless unit hydrograph parameterised by basin lag time, the Clark unit hydrograph which represents translation and attenuation separately through a time–area histogram and a linear-reservoir storage coefficient, and the Snyder synthetic unit hydrograph parameterised by lag and peaking coefficients (USACE, n.d.). The SCS unit hydrograph is the most frequently adopted transform across international practice and is typically paired with SCS-CN losses (Labade et al., 2025; Sahu et al., 2023), a configuration applied successfully in a range of monsoonal and semi-arid settings (Hamdan et al., 2021; Nujhat et al., 2024; Ranjan &amp; Singh, 2022). The Clark formulation has been preferred in several large-basin continuous applications, in which storage coefficient and time of concentration are treated as primary calibration parameters (Jawad, 2024).</w:t>
       </w:r>
     </w:p>
     <w:p>
@@ -238,7 +238,7 @@
         <w:jc w:val="left"/>
       </w:pPr>
       <w:r>
-        <w:t>For extremely flat catchments, the estimation of lag time warrants particular caution. Empirical lag equations were predominantly derived from sloping terrain, and any misestimation propagates directly into errors in the timing of the simulated hydrograph peak. In floodplain environments where topographic gradients approach the vertical resolution of available elevation data, calibration of lag and storage parameters against observed hydrographs becomes indispensable rather than optional, an approach reflected in the optimisation strategies reported by Jawad (2024) and Admas et al. (2025).</w:t>
+        <w:t>For extremely flat catchments the estimation of lag time warrants particular caution. Empirical lag equations were predominantly derived from sloping terrain, and any misestimation propagates directly into errors in the timing of the simulated hydrograph peak. In floodplain environments where topographic gradients approach the vertical resolution of the available elevation data, calibration of lag and storage parameters against observed hydrographs becomes indispensable rather than optional, an approach reflected in recent optimisation strategies for low-gradient and large-basin applications (Admas et al., 2025; Jawad, 2024).</w:t>
       </w:r>
     </w:p>
     <w:p>
@@ -256,7 +256,7 @@
         <w:jc w:val="left"/>
       </w:pPr>
       <w:r>
-        <w:t>Baseflow representation constitutes the most frequently underperforming component of event-oriented hydrological models, yet in floodplain-wetland systems the slow-drainage component may dominate both the recession limb of the hydrograph and the dry-season water balance. HEC-HMS offers recession, bounded-recession, linear-reservoir, and constant-monthly baseflow formulations (USACE, n.d.). Review evidence indicates that the recession method is the most widely adopted in international practice owing to its stability and its realistic representation of groundwater depletion (Labade et al., 2025), whereas the linear-reservoir formulation with multiple groundwater layers has been preferred in continuous large-basin applications (Jawad, 2024).</w:t>
+        <w:t>Baseflow representation constitutes the most frequently underperforming component of event-oriented hydrological models, yet in floodplain-wetland systems the slow-drainage component may dominate both the recession limb of the hydrograph and the dry-season water balance. Recession, bounded-recession, linear-reservoir, and constant-monthly baseflow formulations are available within HEC-HMS (USACE, n.d.). The recession method is the most widely adopted in international practice owing to its numerical stability and its realistic representation of groundwater depletion (Labade et al., 2025), whereas the linear-reservoir formulation with multiple groundwater layers has been preferred in continuous large-basin applications (Jawad, 2024).</w:t>
       </w:r>
     </w:p>
     <w:p>
@@ -265,7 +265,7 @@
         <w:jc w:val="left"/>
       </w:pPr>
       <w:r>
-        <w:t>Recent Bangladeshi experience indicates that baseflow simulation represents a genuine methodological difficulty rather than a routine calibration exercise. M. B. Haque et al. (2024), modelling the Halda River catchment, obtained satisfactory aggregate performance statistics but reported a poor correspondence between observed and simulated flows along the baseflow portion of the hydrograph during calibration, attributing the discrepancy to unrepresented groundwater–surface water exchange and recommending offline coupling with a groundwater model as a route to improvement. Raihan et al. (2020) similarly identified groundwater delay time and the baseflow alpha factor among the most sensitive parameters governing simulation quality in the Upper Halda Basin. These findings caution against interpreting event-calibrated models as complete descriptions of low-flow behaviour, a caution of particular force in beel environments where monsoon storage is released gradually throughout the post-monsoon recession.</w:t>
+        <w:t>Recent Bangladeshi experience indicates that baseflow simulation represents a genuine methodological difficulty rather than a routine calibration exercise. Satisfactory aggregate performance statistics have been obtained alongside a poor correspondence between observed and simulated flows along the baseflow portion of the hydrograph, a discrepancy attributed to unrepresented groundwater–surface water exchange and for which offline coupling with a groundwater model has been recommended (M. B. Haque et al., 2024). Groundwater delay time and the baseflow alpha factor have similarly been identified among the most sensitive parameters governing simulation quality in the Upper Halda Basin (Raihan et al., 2020). These findings caution against interpreting event-calibrated models as complete descriptions of low-flow behaviour, a caution of particular force in beel environments where monsoon storage is released gradually throughout the post-monsoon recession.</w:t>
       </w:r>
     </w:p>
     <w:p>
@@ -292,7 +292,7 @@
         <w:jc w:val="left"/>
       </w:pPr>
       <w:r>
-        <w:t>Where such hydraulic controls are material, contemporary practice couples HEC-HMS with the Hydrologic Engineering Center River Analysis System (HEC-RAS). Zhang et al. (2022) developed an integrated flood-risk framework for the Old Brahmaputra River floodplain of Bangladesh in which HEC-HMS supplied inflow hydrographs to coupled one- and two-dimensional HEC-RAS models, achieving Nash–Sutcliffe efficiency values of 0.93 and 0.81 and percent bias of −1.17% and 2.40% during calibration and validation, respectively. Admas et al. (2025) applied an equivalent coupling to the Gumara River in the Upper Blue Nile Basin to quantify inundation extents for return periods between 2 and 100 years and to evaluate the hydraulic effect of dyke construction, while Jawad (2024) employed the same architecture to generate flood inundation maps along the lowermost reach of the Brahmaputra. Because drainage of the Gumai Beel is regulated in part by water levels within the receiving Ichamoti channel rather than by catchment inflow alone, an analogous coupling represents the logical methodological extension of the present work.</w:t>
+        <w:t>Where such hydraulic controls are material, contemporary practice couples HEC-HMS with the Hydrologic Engineering Center River Analysis System (HEC-RAS). In an integrated flood-risk framework for the Old Brahmaputra River floodplain of Bangladesh, HEC-HMS supplied inflow hydrographs to coupled one- and two-dimensional HEC-RAS models, yielding Nash–Sutcliffe efficiency values of 0.93 and 0.81 and percent bias of −1.17% and 2.40% during calibration and validation respectively (Zhang et al., 2022). An equivalent coupling applied to the Gumara River in the Upper Blue Nile Basin quantified inundation extents for return periods between 2 and 100 years and evaluated the hydraulic effect of dyke construction (Admas et al., 2025), and the same architecture has been used to generate flood inundation maps along the lowermost reach of the Brahmaputra (Jawad, 2024). Because drainage of the Gumai Beel is regulated in part by water levels within the receiving Ichamoti channel rather than by catchment inflow alone, an analogous coupling represents the logical methodological extension of the present work.</w:t>
       </w:r>
     </w:p>
     <w:p>
@@ -318,7 +318,7 @@
         <w:jc w:val="left"/>
       </w:pPr>
       <w:r>
-        <w:t>Semi-distributed modelling is initiated through terrain analysis, in which sub-basin boundaries and stream networks are delineated from a digital elevation model (DEM) and physiographic attributes such as drainage area, mean slope, and longest flow path are extracted for each computational unit. A widening family of freely available global elevation products, including SRTM, NASADEM, ASTER, AW3D30, MERIT, and TanDEM-X, now competes for this role, and the differences among them are hydrologically consequential. Uuemaa et al. (2020), conducting a systematic multi-region accuracy assessment against LiDAR and Pleiades reference surfaces comprising 608 million pixels, established that vertical accuracy varies substantially among products and that terrain slope exerts the strongest control on error magnitude. AW3D30 exhibited the most stable performance across geographic settings, while NASADEM offered only marginal improvement relative to its SRTM predecessor.</w:t>
+        <w:t>Semi-distributed modelling is initiated through terrain analysis, in which sub-basin boundaries and stream networks are delineated from a digital elevation model (DEM) and physiographic attributes such as drainage area, mean slope, and longest flow path are extracted for each computational unit. A widening family of freely available global elevation products, including SRTM, NASADEM, ASTER, AW3D30, MERIT, and TanDEM-X, now competes for this role, and the differences among them are hydrologically consequential. Vertical accuracy varies substantially among products, and terrain slope exerts the strongest control on error magnitude, with AW3D30 exhibiting the most stable performance across geographic settings and NASADEM offering only marginal improvement relative to its SRTM predecessor (Uuemaa et al., 2020).</w:t>
       </w:r>
     </w:p>
     <w:p>
@@ -327,7 +327,7 @@
         <w:jc w:val="left"/>
       </w:pPr>
       <w:r>
-        <w:t>The reliability of automated delineation deteriorates precisely within the terrain class represented by the present study area. Datta et al. (2022), working on the Halda watershed of Bangladesh, demonstrated systematically that delineation outcomes are materially conditioned by the selection of DEM product, its spatial resolution, and the contributing-area threshold adopted for stream definition, and that these choices propagate into sub-basin geometry and all subsequently derived parameters. In low-relief deltaic terrain, where total elevation range may amount to only a few metres and where anthropogenic features such as roads, embankments, and sluice structures rather than natural topography govern actual flow pathways, DEM vertical error can exceed the topographic signal that the delineation algorithm is intended to detect. The literature therefore recommends systematic verification of automatically delineated drainage against hydrographic maps and field observation, a procedure adopted in the methodology of the present study.</w:t>
+        <w:t>The reliability of automated delineation deteriorates precisely within the terrain class represented by the present study area. Delineation outcomes are materially conditioned by the selection of DEM product, its spatial resolution, and the contributing-area threshold adopted for stream definition, and these choices propagate into sub-basin geometry and all subsequently derived parameters (Datta et al., 2022). In low-relief deltaic terrain, where total elevation range may amount to only a few metres and where anthropogenic features such as roads, embankments, and sluice structures rather than natural topography govern actual flow pathways, DEM vertical error can exceed the topographic signal that the delineation algorithm is intended to detect. Systematic verification of automatically delineated drainage against hydrographic maps and field observation is therefore recommended (Datta et al., 2022), and this procedure is adopted in the methodology of the present study.</w:t>
       </w:r>
     </w:p>
     <w:p>
@@ -345,7 +345,7 @@
         <w:jc w:val="left"/>
       </w:pPr>
       <w:r>
-        <w:t>Parameterisation of the loss model in sparsely gauged basins depends upon thematic spatial mapping. The established workflow intersects a land-use and land-cover classification, commonly derived from Landsat or Sentinel-2 imagery, with a hydrologic soil group layer obtained from national soil surveys or global soil databases, and assigns area-weighted composite curve numbers to each sub-basin through standard lookup tabulations (Ranjan &amp; Singh, 2022; Turkar et al., 2025). Ranjan and Singh (2022) implemented this procedure within ArcGIS for the Punpun River Basin, generating land-use, soil, and slope layers from which curve numbers were computed as direct HEC-HMS input, and reported coefficient of determination and Nash–Sutcliffe efficiency values exceeding 0.75 for monthly and monsoonal models with percent bias below 10%.</w:t>
+        <w:t>Parameterisation of the loss model in sparsely gauged basins depends upon thematic spatial mapping. The established workflow intersects a land-use and land-cover classification, commonly derived from Landsat or Sentinel-2 imagery, with a hydrologic soil group layer obtained from national soil surveys or global soil databases, and assigns area-weighted composite curve numbers to each sub-basin through standard lookup tabulations (Ranjan &amp; Singh, 2022; Turkar et al., 2025). Implementation of this procedure within ArcGIS for the Punpun River Basin, in which land-use, soil, and slope layers were generated and curve numbers computed as direct HEC-HMS input, produced coefficient of determination and Nash–Sutcliffe efficiency values exceeding 0.75 for monthly and monsoonal models with percent bias below 10% (Ranjan &amp; Singh, 2022).</w:t>
       </w:r>
     </w:p>
     <w:p>
@@ -354,7 +354,7 @@
         <w:jc w:val="left"/>
       </w:pPr>
       <w:r>
-        <w:t>The sensitivity of simulated runoff to this parameterisation imposes a corresponding requirement for classification accuracy. Turkar et al. (2025) identified curve number among the four most sensitive parameters across the applications they reviewed, and M. B. Haque et al. (2024) demonstrated that the rainfall–runoff relationship of the Halda catchment responded strongly to sub-basin curve numbers determined by land-cover classification. Remote sensing evidence further documents the rapidity of land-cover transformation within Bangladeshi wetland environments: Bhattacharjee et al. (2021), analysing multi-decadal Landsat imagery over a north-eastern wetland system, quantified substantial conversion of wetland and vegetation classes to agricultural and settlement uses. This consideration assumes particular importance for beel catchments, in which the land surface alternates seasonally among open water, cultivated land, and marsh vegetation, such that a single-date classification cannot adequately represent the hydrological character of the catchment across the annual cycle.</w:t>
+        <w:t>The sensitivity of simulated runoff to this parameterisation imposes a corresponding requirement for classification accuracy, since curve number ranks among the four most sensitive parameters across the reviewed applications (Turkar et al., 2025) and the rainfall–runoff relationship of the Halda catchment responded strongly to sub-basin curve numbers determined by land-cover classification (M. B. Haque et al., 2024). Remote sensing evidence further documents the rapidity of land-cover transformation within Bangladeshi wetland environments, where multi-decadal Landsat analysis has quantified substantial conversion of wetland and vegetation classes to agricultural and settlement uses (Bhattacharjee et al., 2021). This consideration assumes particular importance for beel catchments, in which the land surface alternates seasonally among open water, cultivated land, and marsh vegetation, such that a single-date classification cannot adequately represent the hydrological character of the catchment across the annual cycle.</w:t>
       </w:r>
     </w:p>
     <w:p>
@@ -372,7 +372,7 @@
         <w:jc w:val="left"/>
       </w:pPr>
       <w:r>
-        <w:t>Precipitation constitutes the dominant forcing variable of any rainfall–runoff model, and its estimation represents the principal source of predictive uncertainty where rain-gauge networks are sparse or discontinuous. Two families of alternatives to gauge interpolation have reached operational maturity: satellite multi-sensor products, foremost the Integrated Multi-satellitE Retrievals for Global Precipitation Measurement (IMERG), and atmospheric reanalyses, foremost the fifth-generation European Centre for Medium-Range Weather Forecasts reanalysis (ERA5) described by Hersbach et al. (2020). Pradhan et al. (2022), synthesising the global body of IMERG validation studies, concluded that the product represents regional precipitation patterns and spatial means reliably and improves systematically with successive algorithm versions, while performing more accurately at monthly and annual aggregations than at daily and sub-daily resolutions and retaining recognised limitations for extreme intensities and orographically complex terrain.</w:t>
+        <w:t>Precipitation constitutes the dominant forcing variable of any rainfall–runoff model, and its estimation represents the principal source of predictive uncertainty where rain-gauge networks are sparse or discontinuous. Two families of alternatives to gauge interpolation have reached operational maturity, namely satellite multi-sensor products, foremost the Integrated Multi-satellitE Retrievals for Global Precipitation Measurement (IMERG), and atmospheric reanalyses, foremost the fifth-generation European Centre for Medium-Range Weather Forecasts reanalysis (Hersbach et al., 2020). Satellite products represent regional precipitation patterns and spatial means reliably and improve systematically with successive algorithm versions, while performing more accurately at monthly and annual aggregations than at daily and sub-daily resolutions and retaining recognised limitations for extreme intensities and orographically complex terrain (Pradhan et al., 2022).</w:t>
       </w:r>
     </w:p>
     <w:p>
@@ -381,7 +381,7 @@
         <w:jc w:val="left"/>
       </w:pPr>
       <w:r>
-        <w:t>Operational experience confirms that satellite and reanalysis forcing can support credible hydrological simulation even in large, sparsely instrumented basins. Jawad (2024) forced coupled HEC-HMS and HEC-RAS models of the transboundary Brahmaputra Basin with near-real-time IMERG and GSMaP products, applying gauge-based correction where ground data permitted, and obtained acceptable discharge simulation and flood inundation mapping at Bahadurabad. Because the present study can draw upon Bangladesh Water Development Board and Bangladesh Meteorological Department observations within and adjacent to the Pabna region, this literature supports a strategy of gauge-primary forcing supplemented by reanalysis products for gap-filling and internal consistency verification.</w:t>
+        <w:t>Operational experience confirms that satellite and reanalysis forcing can support credible hydrological simulation even in large and sparsely instrumented basins. Coupled HEC-HMS and HEC-RAS models of the transboundary Brahmaputra Basin forced with near-real-time IMERG and GSMaP products, corrected against ground observations where these were available, produced acceptable discharge simulation and flood inundation mapping at Bahadurabad (Jawad, 2024). Because the present study can draw upon Bangladesh Water Development Board and Bangladesh Meteorological Department observations within and adjacent to the Pabna region, this literature supports a strategy of gauge-primary forcing supplemented by reanalysis products for gap-filling and internal consistency verification.</w:t>
       </w:r>
     </w:p>
     <w:p>
@@ -398,7 +398,7 @@
         <w:jc w:val="left"/>
       </w:pPr>
       <w:r>
-        <w:t>Credible application of a rainfall–runoff model requires a disciplined testing protocol in which model parameters are estimated against one portion of the observational record and predictive skill is demonstrated against an independent portion. This split-sample framework is followed, at least in its elementary form, by essentially all of the applications reviewed in this chapter (Hamdan et al., 2021; Nujhat et al., 2024; Ranjan &amp; Singh, 2022; Zhang et al., 2022). The framework itself, however, has recently been subjected to systematic re-examination. Shen et al. (2022), conducting a large-sample experiment across 463 catchments, two conceptual hydrological models, and 50 alternative data-splitting schemes, demonstrated that the widespread practice of calibrating against older records and validating against more recent ones consistently degraded subsequent predictive performance, and that calibration against the full available record represented the most robust strategy for operational application. In a thesis context, where independent demonstration of predictive skill remains an examination requirement, these findings support the reporting of both a conventional split-sample evaluation and a final parameter set re-estimated across the complete record.</w:t>
+        <w:t>Credible application of a rainfall–runoff model requires a disciplined testing protocol in which model parameters are estimated against one portion of the observational record and predictive skill is demonstrated against an independent portion. This split-sample framework is followed, at least in its elementary form, by essentially all of the applications reviewed in this chapter (Hamdan et al., 2021; Nujhat et al., 2024; Ranjan &amp; Singh, 2022; Zhang et al., 2022). The framework itself has nevertheless been subjected to recent re-examination. In a large-sample experiment spanning 463 catchments, two conceptual hydrological models, and 50 alternative data-splitting schemes, the widespread practice of calibrating against older records and validating against more recent ones consistently degraded subsequent predictive performance, and calibration against the full available record proved the most robust strategy for operational application (Shen et al., 2022). In a thesis context, where independent demonstration of predictive skill remains an examination requirement, these findings support the reporting of both a conventional split-sample evaluation and a final parameter set re-estimated across the complete record.</w:t>
       </w:r>
     </w:p>
     <w:p>
@@ -407,7 +407,7 @@
         <w:jc w:val="left"/>
       </w:pPr>
       <w:r>
-        <w:t>Quantitative evaluation of model performance rests upon a compact set of statistical indicators. Review evidence indicates that Nash–Sutcliffe efficiency, the coefficient of determination, and root-mean-square error constitute the most frequently reported metrics across HEC-HMS applications (Labade et al., 2025), with percent bias and the ratio of root-mean-square error to the standard deviation of observations increasingly reported alongside them (Ranjan &amp; Singh, 2022). The interpretation of these indicators, however, is not mechanical. Althoff and Rodrigues (2021) established through systematic analysis that the goodness-of-fit criterion adopted as the objective function materially determines the resulting parameter set, and recommended that criteria be matched deliberately to the modelling purpose, with peak-weighted criteria appropriate to flood design and volume-oriented criteria appropriate to water-balance assessment. Their analysis implies that the reporting of a single aggregate efficiency score, detached from the objective function used to obtain it, provides an incomplete account of model performance.</w:t>
+        <w:t>Quantitative evaluation of model performance rests upon a compact set of statistical indicators. Nash–Sutcliffe efficiency, the coefficient of determination, and root-mean-square error constitute the most frequently reported metrics across HEC-HMS applications (Labade et al., 2025), with percent bias and the ratio of root-mean-square error to the standard deviation of observations increasingly reported alongside them (Ranjan &amp; Singh, 2022). The interpretation of these indicators is not mechanical, however. The goodness-of-fit criterion adopted as the objective function materially determines the resulting parameter set, and criteria should therefore be matched deliberately to the modelling purpose, with peak-weighted criteria appropriate to flood design and volume-oriented criteria appropriate to water-balance assessment (Althoff &amp; Rodrigues, 2021). It follows that reporting a single aggregate efficiency score, detached from the objective function used to obtain it, provides an incomplete account of model performance.</w:t>
       </w:r>
     </w:p>
     <w:p>
@@ -416,7 +416,7 @@
         <w:jc w:val="left"/>
       </w:pPr>
       <w:r>
-        <w:t>Calibration procedures range from manual adjustment guided by physical reasoning to fully automated optimisation. HEC-HMS provides univariate-gradient and simplex search algorithms in combination with a selection of objective functions (USACE, n.d.), and the reviewed applications span this full methodological range: manual calibration informed by parameter plausibility (Nujhat et al., 2024), automated optimisation using gradient search (Jawad, 2024), and staged procedures in which formal sensitivity analysis precedes calibration in order to concentrate effort upon the most influential parameters (Admas et al., 2025). The consistent identification of curve number, lag time, and routing parameters as the dominant controls upon model response (Turkar et al., 2025) provides a defensible starting parameter set for the present study. Reporting of calibrated parameter ranges alongside point estimates is further warranted, since alternative objective functions may select materially different yet equally acceptable parameter combinations (Althoff &amp; Rodrigues, 2021).</w:t>
+        <w:t>Calibration procedures range from manual adjustment guided by physical reasoning to fully automated optimisation. Univariate-gradient and simplex search algorithms are available within HEC-HMS in combination with a selection of objective functions (USACE, n.d.), and the reviewed applications span this full methodological range, encompassing manual calibration informed by parameter plausibility (Nujhat et al., 2024), automated optimisation using gradient search (Jawad, 2024), and staged procedures in which formal sensitivity analysis precedes calibration in order to concentrate effort upon the most influential parameters (Admas et al., 2025). The consistent identification of curve number, lag time, and routing parameters as the dominant controls upon model response (Turkar et al., 2025) provides a defensible starting parameter set for the present study. Reporting of calibrated parameter ranges alongside point estimates is further warranted, since alternative objective functions may select materially different yet equally acceptable parameter combinations (Althoff &amp; Rodrigues, 2021).</w:t>
       </w:r>
     </w:p>
     <w:p>
@@ -433,7 +433,7 @@
         <w:jc w:val="left"/>
       </w:pPr>
       <w:r>
-        <w:t>The international application literature published since 2020 is extensive, and a selective review of methodologically instructive studies is presented here; Table 2.1 summarises their principal characteristics. Hamdan et al. (2021) developed a daily-timestep model of the semi-arid Al-Adhaim River catchment in northern Iraq using HEC-GeoHMS terrain preprocessing together with the SCS-CN, SCS unit hydrograph, and Muskingum configuration, calibrating across two hydrological years and verifying across a third. The study reported coefficients of determination of approximately 0.90 for both phases and concluded that the model was suitable for reservoir inflow estimation, although simulated dam discharge was slightly overestimated. Ranjan and Singh (2022) applied a comparable configuration to the Punpun River Basin of eastern India across the period 2005 to 2017, developing parallel daily, monthly, and monsoonal formulations and demonstrating that temporal aggregation materially improved performance, with the monthly model outperforming both alternatives.</w:t>
+        <w:t>The international application literature published since 2020 is extensive, and a selective review of methodologically instructive studies is presented here, with the principal characteristics of each summarised in Table 2.1. A daily-timestep model of the semi-arid Al-Adhaim River catchment in northern Iraq, constructed using HEC-GeoHMS terrain preprocessing together with the SCS-CN, SCS unit hydrograph, and Muskingum configuration and calibrated across two hydrological years with verification across a third, returned coefficients of determination of approximately 0.90 for both phases and proved suitable for reservoir inflow estimation, although simulated dam discharge was slightly overestimated (Hamdan et al., 2021). A comparable configuration applied to the Punpun River Basin of eastern India across the period 2005 to 2017, in which parallel daily, monthly, and monsoonal formulations were developed, demonstrated that temporal aggregation materially improved performance, with the monthly model outperforming both alternatives (Ranjan &amp; Singh, 2022).</w:t>
       </w:r>
     </w:p>
     <w:p>
@@ -442,7 +442,7 @@
         <w:jc w:val="left"/>
       </w:pPr>
       <w:r>
-        <w:t>Aliye et al. (2020) contributed a comparative evaluation of HEC-HMS against SWAT for a data-scarce catchment of the Ethiopian Rift Valley Lakes Basin, establishing the viability of the lighter-parameterised framework in conditions of limited observational support. Admas et al. (2025) extended the Ethiopian experience toward integrated flood-risk analysis, coupling HEC-HMS design hydrographs with two-dimensional HEC-RAS hydraulics for the Gumara River floodplain and quantifying the reduction in inundated area achieved through dyke construction across return periods from 2 to 100 years. Collectively, this literature supports three generalisations. First, the combination of SCS-CN loss, SCS unit hydrograph transform, and Muskingum routing constitutes the effective default configuration for event-scale application and performs satisfactorily across monsoonal and semi-arid regimes (Hamdan et al., 2021; Labade et al., 2025). Second, the curve number is almost invariably the most sensitive parameter, such that its spatial estimation and calibration bounds govern overall model quality (Turkar et al., 2025). Third, model performance is constrained less by algorithmic structure than by the quality of input data, and by precipitation representation above all (Jawad, 2024; Pradhan et al., 2022).</w:t>
+        <w:t>Comparative evaluation of HEC-HMS against SWAT for a data-scarce catchment of the Ethiopian Rift Valley Lakes Basin established the viability of the lighter-parameterised framework under conditions of limited observational support (Aliye et al., 2020). The Ethiopian experience has since been extended toward integrated flood-risk analysis, in which HEC-HMS design hydrographs were coupled with two-dimensional HEC-RAS hydraulics for the Gumara River floodplain in order to quantify the reduction in inundated area achieved through dyke construction across return periods from 2 to 100 years (Admas et al., 2025). Three generalisations emerge from this body of work. First, the combination of SCS-CN loss, SCS unit hydrograph transform, and Muskingum routing constitutes the effective default configuration for event-scale application and performs satisfactorily across monsoonal and semi-arid regimes (Hamdan et al., 2021; Labade et al., 2025). Second, the curve number is almost invariably the most sensitive parameter, such that its spatial estimation and calibration bounds govern overall model quality (Turkar et al., 2025). Third, model performance is constrained less by algorithmic structure than by the quality of input data, and by precipitation representation above all (Jawad, 2024; Pradhan et al., 2022).</w:t>
       </w:r>
     </w:p>
     <w:p>
@@ -1412,7 +1412,7 @@
         <w:jc w:val="left"/>
       </w:pPr>
       <w:r>
-        <w:t>Bangladesh occupies the terminal reach of the Ganges–Brahmaputra–Meghna system, and its hydrological regime is characterised by intense monsoonal rainfall, transboundary inflow, extremely low topographic relief, and an extensive network of floodplain depressions. Within this setting, the national academic literature has increasingly adopted HEC-HMS for basin-scale rainfall–runoff investigation, and the record published since 2020 now spans the principal basin types of the country.</w:t>
+        <w:t>Bangladesh occupies the terminal reach of the Ganges–Brahmaputra–Meghna system, and its hydrological regime is characterised by intense monsoonal rainfall, transboundary inflow, extremely low topographic relief, and an extensive network of floodplain depressions. Within this setting, HEC-HMS has been adopted increasingly for basin-scale rainfall–runoff investigation, and the record published since 2020 now spans the principal basin types of the country.</w:t>
       </w:r>
     </w:p>
     <w:p>
@@ -1421,7 +1421,7 @@
         <w:jc w:val="left"/>
       </w:pPr>
       <w:r>
-        <w:t>S. Haque et al. (2021) developed a continuous HEC-HMS model of the poorly gauged Brahmaputra Basin, calibrated against daily runoff at Bahadurabad for the period 1983 to 1996 and validated for 1997 to 2010, and extended the framework with the Modified Universal Soil Loss Equation and Engelund–Hansen sediment routing in order to project future sediment load under the RCP8.5 scenario. Their results indicated increases in mean annual sediment load of 34%, 67%, and 115% by the 2020s, 2050s, and 2080s respectively, demonstrating the utility of HEC-HMS as the hydrological component of climate-impact assessment chains. Zhang et al. (2022) coupled HEC-HMS with one- and two-dimensional HEC-RAS models to construct an integrated flood risk, hazard, and vulnerability assessment for the Old Brahmaputra River floodplain, achieving Nash–Sutcliffe efficiency values of 0.93 and 0.81 during calibration and validation and demonstrating that coupled hydrologic–hydraulic frameworks can support the development of early-warning systems and adaptation strategies.</w:t>
+        <w:t>At the scale of the major transboundary systems, a continuous HEC-HMS model of the poorly gauged Brahmaputra Basin calibrated against daily runoff at Bahadurabad for the period 1983 to 1996 and validated for 1997 to 2010 was extended with the Modified Universal Soil Loss Equation and Engelund–Hansen sediment routing in order to project future sediment load under the RCP8.5 scenario, yielding projected increases in mean annual sediment load of 34%, 67%, and 115% by the 2020s, 2050s, and 2080s respectively (S. Haque et al., 2021). For the Old Brahmaputra River floodplain, coupling of HEC-HMS with one- and two-dimensional HEC-RAS models supported an integrated assessment of flood risk, hazard, and vulnerability, with Nash–Sutcliffe efficiency values of 0.93 and 0.81 obtained during calibration and validation and the resulting framework proposed as a basis for early-warning systems and adaptation planning (Zhang et al., 2022).</w:t>
       </w:r>
     </w:p>
     <w:p>
@@ -1430,7 +1430,7 @@
         <w:jc w:val="left"/>
       </w:pPr>
       <w:r>
-        <w:t>At the sub-basin scale, Nur et al. (2022) applied HEC-HMS to rainfall–runoff simulation of the Khowai River Basin, a flash-flood-prone catchment of north-eastern Bangladesh. Nujhat et al. (2024) calibrated and validated a model of the Gumti River Basin using observations from 2019 to 2021 with SRTM-based catchment delineation, Muskingum routing, and SCS-CN losses, obtaining coefficients of determination of 0.64 and 0.68 for calibration and validation respectively with percent bias in the very good performance category, and recommended the calibrated model as a planning instrument for flood prediction and water-resources management. M. B. Haque et al. (2024) modelled the ecologically significant Halda catchment, optimising curve numbers against values derived from a companion SWAT application and achieving Nash–Sutcliffe efficiency values of 0.72 and 0.82, while explicitly documenting underestimation of baseflow during the dry season. Moniruzzaman and Mahalder (2026) compared HEC-HMS with SWAT for the Atrai–Karatoa River Basin of northern Bangladesh, a system hydrologically contiguous with the greater Chalan Beel floodplain to which the Pabna beel network belongs, reporting that SWAT captured high flows more accurately while HEC-HMS performed better across medium flows, with HEC-HMS achieving coefficients of determination of 0.70 and 0.56 during calibration and validation.</w:t>
+        <w:t>At the sub-basin scale, event-based HEC-HMS simulation has been applied to the Khowai River Basin, a flash-flood-prone catchment of north-eastern Bangladesh (Nur et al., 2022). A model of the Gumti River Basin calibrated and validated using observations from 2019 to 2021 with SRTM-based catchment delineation, Muskingum routing, and SCS-CN losses returned coefficients of determination of 0.64 and 0.68 for calibration and validation respectively with percent bias in the very good performance category, and was recommended as a planning instrument for flood prediction and water-resources management (Nujhat et al., 2024). In the ecologically significant Halda catchment, curve numbers optimised against values derived from a companion SWAT application produced Nash–Sutcliffe efficiency values of 0.72 and 0.82, although underestimation of dry-season baseflow was explicitly documented (M. B. Haque et al., 2024). Comparison of HEC-HMS with SWAT for the Atrai–Karatoa River Basin of northern Bangladesh, a system hydrologically contiguous with the greater Chalan Beel floodplain to which the Pabna beel network belongs, indicated that SWAT captured high flows more accurately while HEC-HMS performed better across medium flows, with HEC-HMS achieving coefficients of determination of 0.70 and 0.56 during calibration and validation (Moniruzzaman &amp; Mahalder, 2026).</w:t>
       </w:r>
     </w:p>
     <w:p>
@@ -1439,7 +1439,7 @@
         <w:jc w:val="left"/>
       </w:pPr>
       <w:r>
-        <w:t>Complementary investigations employing alternative modelling frameworks complete the national picture. Raihan et al. (2020) simulated streamflow in the Upper Halda Basin using SWAT, achieving a coefficient of determination of 0.80 and Nash–Sutcliffe efficiency of 0.71, and identified groundwater delay time, baseflow alpha factor, and curve number as the parameters exerting greatest influence upon model performance while emphasising the difficulty of representing spatial rainfall variability from a single gauging station. Akter and Sawon (2024) developed hydrological models of selected flash-flood-prone rivers of Bangladesh, contributing to the understanding of rapid-response catchment behaviour under monsoonal forcing. Datta et al. (2022) provided the DEM sensitivity analysis of watershed delineation discussed in Section 2.5.1, and Jawad (2024) demonstrated satellite-forced coupled hydrologic–hydraulic modelling for the Bangladeshi reach of the Brahmaputra.</w:t>
+        <w:t>Investigations employing alternative modelling frameworks complete the national picture. Streamflow simulation of the Upper Halda Basin using SWAT achieved a coefficient of determination of 0.80 and Nash–Sutcliffe efficiency of 0.71, with groundwater delay time, baseflow alpha factor, and curve number identified as the parameters exerting greatest influence upon performance and with the difficulty of representing spatial rainfall variability from a single gauging station emphasised (Raihan et al., 2020). Hydrological models of selected flash-flood-prone rivers have advanced the understanding of rapid-response catchment behaviour under monsoonal forcing (Akter &amp; Sawon, 2024), while satellite-forced coupled hydrologic–hydraulic modelling has been demonstrated for the Bangladeshi reach of the Brahmaputra (Jawad, 2024).</w:t>
       </w:r>
     </w:p>
     <w:p>
@@ -1465,7 +1465,7 @@
         <w:jc w:val="left"/>
       </w:pPr>
       <w:r>
-        <w:t>Wetland hydrology differs fundamentally from upland catchment hydrology in that the water regime, understood as the seasonal pattern of water-level rise, persistence, and recession, functions as the master variable governing biogeochemical processes, ecological structure, and land-use viability. Altered hydrology is correspondingly identified as the principal pathway through which environmental and anthropogenic change degrades wetland function, since modification of water depth and residence time alters the balance between organic-matter production and decomposition and may convert a wetland from a net sink to a net source of carbon and nutrients (Salimi et al., 2021). Within the floodplain morphology of Bangladesh, the characteristic wetland landform is the beel, a saucer-shaped depression retaining water perennially or seasonally and receiving inflow both from direct rainfall–runoff generated within its local catchment and from lateral spill originating in adjacent river channels during the monsoon.</w:t>
+        <w:t>Wetland hydrology differs fundamentally from upland catchment hydrology in that the water regime, understood as the seasonal pattern of water-level rise, persistence, and recession, functions as the master variable governing biogeochemical processes, ecological structure, and land-use viability. Altered hydrology is correspondingly the principal pathway through which environmental and anthropogenic change degrades wetland function, since modification of water depth and residence time alters the balance between organic-matter production and decomposition and may convert a wetland from a net sink to a net source of carbon and nutrients (Salimi et al., 2021). Within the floodplain morphology of Bangladesh, the characteristic wetland landform is the beel, a saucer-shaped depression retaining water perennially or seasonally and receiving inflow both from direct rainfall–runoff generated within its local catchment and from lateral spill originating in adjacent river channels during the monsoon.</w:t>
       </w:r>
     </w:p>
     <w:p>
@@ -1474,7 +1474,7 @@
         <w:jc w:val="left"/>
       </w:pPr>
       <w:r>
-        <w:t>The hydrological functioning of these depressions has been substantially modified by embankment and polder infrastructure constructed from the 1960s onward. Adnan et al. (2020), analysing the embanked delta of south-western Bangladesh, described the systemic mechanism through which such enclosure generates internal drainage congestion: embankments sever the hydraulic connection between floodplain and river channel, sediment accumulates within riverbeds rather than upon the floodplain surface, riverbed elevation rises relative to the enclosed land, gravity drainage through sluice structures progressively fails, and monsoon runoff accumulates within the beels as pluvial flooding. Their analysis established that a large majority of agricultural and aquacultural land within the embanked region now lies within flood-susceptible zones, and evaluated controlled sediment reintroduction across 106 candidate beels as a rehabilitation strategy capable of raising land elevation by up to 1.4 m over five years. The mechanism described is structural and regional rather than locally anomalous, and it applies with equal force to the embanked interior floodplains of the Ganges right bank.</w:t>
+        <w:t>The hydrological functioning of these depressions has been substantially modified by embankment and polder infrastructure constructed from the 1960s onward. In the embanked delta of south-western Bangladesh, enclosure generates internal drainage congestion through a systemic mechanism in which embankments sever the hydraulic connection between floodplain and river channel, sediment accumulates within riverbeds rather than upon the floodplain surface, riverbed elevation rises relative to the enclosed land, gravity drainage through sluice structures progressively fails, and monsoon runoff accumulates within the beels as pluvial flooding (Adnan et al., 2020). A large majority of agricultural and aquacultural land within the embanked region now lies inside flood-susceptible zones, and controlled sediment reintroduction across 106 candidate beels has been evaluated as a rehabilitation strategy capable of raising land elevation by up to 1.4 m over five years (Adnan et al., 2020). The mechanism is structural and regional rather than locally anomalous, and it applies with equal force to the embanked interior floodplains of the Ganges right bank.</w:t>
       </w:r>
     </w:p>
     <w:p>
@@ -1483,7 +1483,7 @@
         <w:jc w:val="left"/>
       </w:pPr>
       <w:r>
-        <w:t>A second control operates at basin scale through the long-term reduction of dry-season flow within the Ganges distributary network. Ali and Hasan (2022), analysing Bangladesh Water Development Board discharge records for the Gorai River, the principal Ganges distributary and the closest regional analogue to the Ichamoti, determined that mean annual flow during 2000 to 2016 was approximately 13% lower than during 1984 to 1999, that mean monthly high flow declined by 20%, and that the river now frequently fails to satisfy an environmental flow requirement estimated at 295 m³/s, or 29% of mean annual flow, with a deficient-flow condition persisting from December through May. Reduced discharge within parent channels deprives distributary offtakes of the sediment-flushing flows required to maintain conveyance capacity, initiating progressive siltation and eventual hydraulic disconnection of distributary systems.</w:t>
+        <w:t>A second control operates at basin scale through the long-term reduction of dry-season flow within the Ganges distributary network. For the Gorai River, the principal Ganges distributary and the closest regional analogue to the Ichamoti, mean annual flow during 2000 to 2016 was approximately 13% lower than during 1984 to 1999, mean monthly high flow declined by 20%, and the river now frequently fails to satisfy an environmental flow requirement estimated at 295 m³/s, or 29% of mean annual flow, with a deficient-flow condition persisting from December through May (Ali &amp; Hasan, 2022). Reduced discharge within parent channels deprives distributary offtakes of the sediment-flushing flows required to maintain conveyance capacity, initiating progressive siltation and eventual hydraulic disconnection of distributary systems.</w:t>
       </w:r>
     </w:p>
     <w:p>
@@ -1492,7 +1492,7 @@
         <w:jc w:val="left"/>
       </w:pPr>
       <w:r>
-        <w:t>The consequences of these combined mechanisms are documented directly for the wetland complex surrounding the study area. Yankyera and Alam (2025), analysing five decades of Landsat imagery over Chalan Beel, the largest wetland ecosystem of Bangladesh and the system into which the Pabna floodplain drains, identified a consistent trajectory of expanding farmland and developed land accompanied by declining vegetation and wetland extent, with the most pronounced transformation occurring between 2013 and 2023. Bhattacharjee et al. (2021) reported an equivalent trajectory for a north-eastern wetland ecosystem. These transformations are hydrologically significant because reduction in wetland storage capacity diminishes the attenuation that beels provide to monsoon runoff, thereby increasing peak discharge and inundation depth within the residual drainage network.</w:t>
+        <w:t>The consequences of these combined mechanisms are documented directly for the wetland complex surrounding the study area. Five decades of Landsat imagery over Chalan Beel, the largest wetland ecosystem of Bangladesh and the system into which the Pabna floodplain drains, reveal a consistent trajectory of expanding farmland and developed land accompanied by declining vegetation and wetland extent, with the most pronounced transformation occurring between 2013 and 2023 (Yankyera &amp; Alam, 2025). An equivalent trajectory has been reported for a north-eastern wetland ecosystem (Bhattacharjee et al., 2021). These transformations are hydrologically significant because reduction in wetland storage capacity diminishes the attenuation that beels provide to monsoon runoff, thereby increasing peak discharge and inundation depth within the residual drainage network.</w:t>
       </w:r>
     </w:p>
     <w:p>
@@ -1509,7 +1509,7 @@
         <w:jc w:val="left"/>
       </w:pPr>
       <w:r>
-        <w:t>The Ichamoti River of Pabna District exemplifies the condition described in the preceding section. The river originates from the Padma in the vicinity of Shibrampur within Pabna Sadar Upazila and follows a course of approximately 82 to 84 km through Pabna town toward the Hurasagar system in Bera Upazila. Over recent decades the channel has lost effective hydraulic connectivity with its parent rivers and has become progressively constricted through siltation, encroachment, solid-waste disposal, and aquatic weed infestation. Parvez et al. (2021), investigating the causes of waterlogging within Pabna Municipality, documented that the Ichamoti bisects the municipality but no longer functions as an effective drainage outfall, being choked with water weeds and accumulated sediment, and reported that residents identified blocked and undersized drains, absent operation and maintenance provision, and an unplanned drainage network as the leading causes of inundation following heavy rainfall. Their physical inventory recorded approximately 7.9 km of the Ichamoti channel within the municipal area alongside 11.29 km of primary drains and 56.23 km of secondary drains, establishing the scale of the drainage system dependent upon the river as outfall.</w:t>
+        <w:t>The Ichamoti River of Pabna District exemplifies the condition described in the preceding section. The river originates from the Padma in the vicinity of Shibrampur within Pabna Sadar Upazila and follows a course of approximately 82 to 84 km through Pabna town toward the Hurasagar system in Bera Upazila. Over recent decades the channel has lost effective hydraulic connectivity with its parent rivers and has become progressively constricted through siltation, encroachment, solid-waste disposal, and aquatic weed infestation. The river bisects Pabna Municipality but no longer functions as an effective drainage outfall, being choked with water weeds and accumulated sediment, and blocked or undersized drains, absent operation and maintenance provision, and an unplanned drainage network have been identified by residents as the leading causes of inundation following heavy rainfall (Parvez et al., 2021). Approximately 7.9 km of the Ichamoti channel lies within the municipal area alongside 11.29 km of primary drains and 56.23 km of secondary drains, which establishes the scale of the drainage system dependent upon the river as outfall (Parvez et al., 2021).</w:t>
       </w:r>
     </w:p>
     <w:p>
@@ -1518,7 +1518,7 @@
         <w:jc w:val="left"/>
       </w:pPr>
       <w:r>
-        <w:t>Recognition of this condition has prompted large-scale government intervention. A rejuvenation programme valued at Tk 1,554.90 crore, implemented under the Bangladesh Water Development Board, provides for dredging across a 33.77 km reach of the river together with 44.07 km of connecting canals, 20 km of the Sutikhali River, and 12.37 km of the Bharara channel, with the stated objective of restoring hydraulic connectivity between the Ichamoti and the Padma and Jamuna systems (“Tk 1,554cr Project,” 2024). The hydrological design basis for such intervention requires quantitative estimation of the runoff volumes and hydrograph characteristics that the restored corridor must convey, which is precisely the information that a calibrated rainfall–runoff model provides.</w:t>
+        <w:t>Recognition of this condition has prompted large-scale government intervention. A rejuvenation programme valued at Tk 1,554.90 crore, implemented under the Bangladesh Water Development Board, provides for dredging across a 33.77 km reach of the river together with 44.07 km of connecting canals, 20 km of the Sutikhali River, and 12.37 km of the Bharara channel, with the stated objective of restoring hydraulic connectivity between the Ichamoti and the Padma and Jamuna systems (“Tk 1,554cr Project,” 2024). The hydrological design basis for such intervention requires quantitative estimation of the runoff volumes and hydrograph characteristics that the restored corridor must convey, which is precisely the information supplied by a calibrated rainfall–runoff model.</w:t>
       </w:r>
     </w:p>
     <w:p>
@@ -1527,7 +1527,7 @@
         <w:jc w:val="left"/>
       </w:pPr>
       <w:r>
-        <w:t>The Gumai Beel, which constitutes the focus of the present investigation, forms one component of the beel network of the Pabna floodplain draining through the Ichamoti corridor. Its inundation behaviour is governed by the interaction of three controls identified in the reviewed literature as characteristic of embanked distributary floodplains: local monsoon rainfall–runoff generated within the beel catchment; the conveyance capacity of the silted Ichamoti channel and its associated khals, which determines the rate at which stored water may be evacuated; and the stage of the receiving river system, which may impose backwater constraints upon gravity drainage (Adnan et al., 2020; Parvez et al., 2021). A rainfall–runoff model of the beel catchment constitutes the necessary first element of any quantitative analysis of this system, since it supplies the inflow boundary condition required for drainage design, for evaluation of the hydrological benefits attributable to the rejuvenation programme, and for assessment of waterlogging risk under current and projected rainfall regimes.</w:t>
+        <w:t>The Gumai Beel, which constitutes the focus of the present investigation, forms one component of the beel network of the Pabna floodplain draining through the Ichamoti corridor. Its inundation behaviour is governed by the interaction of three controls identified in the reviewed literature as characteristic of embanked distributary floodplains, namely local monsoon rainfall–runoff generated within the beel catchment, the conveyance capacity of the silted Ichamoti channel and its associated khals, which determines the rate at which stored water may be evacuated, and the stage of the receiving river system, which may impose backwater constraints upon gravity drainage (Adnan et al., 2020; Parvez et al., 2021). A rainfall–runoff model of the beel catchment constitutes the necessary first element of any quantitative analysis of this system, since it supplies the inflow boundary condition required for drainage design, for evaluation of the hydrological benefits attributable to the rejuvenation programme, and for assessment of waterlogging risk under current and projected rainfall regimes.</w:t>
       </w:r>
     </w:p>
     <w:p>
@@ -1553,7 +1553,7 @@
         <w:jc w:val="left"/>
       </w:pPr>
       <w:r>
-        <w:t>Third, published Bangladeshi applications of HEC-HMS concentrate within large transboundary basins, flashy piedmont catchments, and the Atrai–Karatoa corridor (Jawad, 2024; M. B. Haque et al., 2024; Moniruzzaman &amp; Mahalder, 2026; Nujhat et al., 2024; Nur et al., 2022; S. Haque et al., 2021; Zhang et al., 2022). No published study has developed a rainfall–runoff model for the beel catchments of the moribund Ganges distributaries, of which the Ichamoti–Gumai Beel system is representative. Fourth, the hydrological problem posed by such systems is distinctive in kind rather than merely in degree: inundation is governed by locally generated runoff accumulating behind congested drainage rather than by riverine flood waves propagating from upstream (Adnan et al., 2020; Parvez et al., 2021), while the long-term deterioration of the distributary network reflects basin-scale flow reduction that has been quantified for the neighbouring Gorai but has never been connected to a quantitative runoff model of the beel itself (Ali &amp; Hasan, 2022).</w:t>
+        <w:t>Third, published Bangladeshi applications of HEC-HMS concentrate within large transboundary basins, flashy piedmont catchments, and the Atrai–Karatoa corridor (Jawad, 2024; M. B. Haque et al., 2024; Moniruzzaman &amp; Mahalder, 2026; Nujhat et al., 2024; Nur et al., 2022; S. Haque et al., 2021; Zhang et al., 2022). No published study has developed a rainfall–runoff model for the beel catchments of the moribund Ganges distributaries, of which the Ichamoti–Gumai Beel system is representative. Fourth, the hydrological problem posed by such systems is distinctive in kind rather than merely in degree, since inundation is governed by locally generated runoff accumulating behind congested drainage rather than by riverine flood waves propagating from upstream (Adnan et al., 2020; Parvez et al., 2021), while the long-term deterioration of the distributary network reflects basin-scale flow reduction that has been quantified for the neighbouring Gorai but never connected to a quantitative runoff model of the beel itself (Ali &amp; Hasan, 2022).</w:t>
       </w:r>
     </w:p>
     <w:p>

</xml_diff>

<commit_message>
Refine author's draft sections 2.3-2.19 with verified 2020+ citations
Co-authored-by: Bit Raven <bitraveneth@users.noreply.github.com>
</commit_message>
<xml_diff>
--- a/thesis/Literature_Review_Gumai_Beel_Ichamoti_HEC-HMS.docx
+++ b/thesis/Literature_Review_Gumai_Beel_Ichamoti_HEC-HMS.docx
@@ -61,7 +61,7 @@
         <w:jc w:val="left"/>
       </w:pPr>
       <w:r>
-        <w:t>The application of HEC-HMS is particularly relevant to Bangladesh because of the country’s monsoonal rainfall regime, extensive river network, low-lying floodplains, wetlands, and recurrent flooding. Several recent studies have applied HEC-HMS to Bangladesh river basins, including the Khowai, Bangali, Halda, Old Brahmaputra, Dhaka, and Atrai–Karatoa systems. These studies demonstrate the applicability of the model under Bangladesh’s hydrological conditions but also highlight challenges related to rainfall representation, discharge availability, baseflow simulation, and model parameterization (M. B. Haque et al., 2024; Moniruzzaman &amp; Mahalder, 2026; Nur et al., 2022; Zhang et al., 2022).</w:t>
+        <w:t>The application of HEC-HMS is particularly relevant to Bangladesh because of the country’s monsoonal rainfall regime, extensive river network, low-lying floodplains, wetlands, and recurrent flooding. Several recent studies have applied HEC-HMS to Bangladesh river basins, including the Khowai, Halda, Old Brahmaputra, Gumti, and Atrai–Karatoa systems. These studies demonstrate the applicability of the model under Bangladesh’s hydrological conditions but also highlight challenges related to rainfall representation, discharge availability, baseflow simulation, and model parameterization (Haque et al., 2024; Moniruzzaman &amp; Mahalder, 2026; Nujhat et al., 2024; Nur et al., 2022; Zhang et al., 2022).</w:t>
       </w:r>
     </w:p>
     <w:p>
@@ -122,7 +122,16 @@
         <w:rPr>
           <w:b/>
         </w:rPr>
-        <w:t>2.3 Classification and selection of hydrological models</w:t>
+        <w:t>2.3 Factors influencing rainfall–runoff response</w:t>
+      </w:r>
+    </w:p>
+    <w:p>
+      <w:r>
+        <w:rPr>
+          <w:b/>
+          <w:i/>
+        </w:rPr>
+        <w:t>2.3.1 Rainfall characteristics</w:t>
       </w:r>
     </w:p>
     <w:p>
@@ -131,7 +140,7 @@
         <w:jc w:val="left"/>
       </w:pPr>
       <w:r>
-        <w:t>Hydrological models are conventionally differentiated along two principal axes, namely the degree of physical process representation and the level of spatial discretisation. Empirical or data-driven models establish statistical transfer functions between input and output series without explicit reference to physical mechanisms, conceptual models represent the catchment as a cascade of interconnected storage elements whose governing equations approximate physical behaviour, and physically based models solve conservation equations for mass, momentum, and energy using parameters that are in principle independently measurable. With respect to spatial resolution, lumped models treat the catchment as a single homogeneous unit, semi-distributed models subdivide it into sub-basins within which parameters are averaged, and fully distributed models resolve hydrological state variables on a regular computational grid (Sahu et al., 2023). HEC-HMS occupies an intermediate position within this taxonomy, functioning as a conceptual and semi-distributed system that reproduces the dominant runoff-generation mechanisms without imposing the data requirements associated with fully distributed formulations (Turkar et al., 2025).</w:t>
+        <w:t>Rainfall constitutes the primary meteorological forcing of any rainfall–runoff model, and its depth, intensity, duration, frequency, and temporal and spatial distribution jointly determine the magnitude and timing of the runoff response. Small watersheds subjected to intense rainfall typically produce rapid, sharply peaked responses, whereas larger or flatter watersheds respond more gradually because greater storage capacity and longer travel distances attenuate and delay the flood wave.</w:t>
       </w:r>
     </w:p>
     <w:p>
@@ -140,7 +149,7 @@
         <w:jc w:val="left"/>
       </w:pPr>
       <w:r>
-        <w:t>The proliferation of hydrological models is driven only partially by genuine differences in application context, since a substantial component of model diversity reflects institutional familiarity, accessibility of source code, and the reuse of pre-existing model configurations. The rationale for model selection is rarely articulated in published studies, and the adequacy of a given model for its landscape and purpose is frequently left unaddressed (Horton et al., 2022). Model choice must therefore be justified explicitly with reference to catchment characteristics, the availability and resolution of input data, and the specific objectives of the investigation, rather than adopted by convention.</w:t>
+        <w:t>The temporal resolution of the rainfall input warrants deliberate selection. High-resolution records resolve short-duration storm bursts and rainfall peaks, whereas daily totals smooth sub-daily variability and may therefore understate the intensity of convective events. The appropriate resolution consequently depends on the response time of the watershed and on the objective of the simulation: flood-peak reproduction demands finer resolution than seasonal water-balance assessment.</w:t>
       </w:r>
     </w:p>
     <w:p>
@@ -149,7 +158,7 @@
         <w:jc w:val="left"/>
       </w:pPr>
       <w:r>
-        <w:t>For data-limited catchments, the operative comparison in contemporary practice lies between conceptual semi-distributed systems such as HEC-HMS and more heavily parameterised ecohydrological frameworks such as the Soil and Water Assessment Tool (SWAT). Both frameworks are capable of reproducing observed streamflow with acceptable accuracy under conditions of limited observational support (Aliye et al., 2020). In a comparative application to the Atrai–Karatoa River Basin of northern Bangladesh, SWAT reproduced high flows more faithfully whereas HEC-HMS achieved superior accuracy across the medium-flow range, with both models simulating low flows adequately (Moniruzzaman &amp; Mahalder, 2026). HEC-HMS accordingly constitutes a defensible selection where the modelling objective is hydrograph generation rather than the simulation of sediment transport, nutrient flux, or land-management scenarios, and where the parsimony of its parameter set corresponds to the extent of the available observational record.</w:t>
+        <w:t>The spatial representation of rainfall requires equal care, because a single rain gauge rarely characterises the precipitation received across a heterogeneous catchment. Areal precipitation may instead be estimated from multiple stations using Thiessen polygons, inverse-distance weighting, or gridded rainfall products. The value of dense gauge input is illustrated in the Sirba River Basin of West Africa, where a daily HEC-HMS model was driven by observations from 13 meteorological stations, and rainfall representation proved integral to model performance (Souley Tangam et al., 2024).</w:t>
       </w:r>
     </w:p>
     <w:p>
@@ -158,15 +167,16 @@
         <w:jc w:val="left"/>
       </w:pPr>
       <w:r>
-        <w:t>A further operational distinction separates event-based from continuous simulation. Event-based configurations reproduce the catchment response to discrete storm episodes and are appropriate for design-flood estimation, peak discharge analysis, and flood forecasting, whereas continuous configurations track soil-moisture accounting through alternating wet and dry periods over multi-annual horizons and are appropriate for water-balance and water-resources assessment. The SCS-CN loss method dominates event-based practice, while the Soil Moisture Accounting (SMA) algorithm is preferred for continuous simulation (Labade et al., 2025; Turkar et al., 2025). Because the inundation regime of the Gumai Beel is governed simultaneously by discrete monsoon storm events and by the strongly seasonal water balance of the surrounding floodplain, the present study requires a modelling system capable of operating in both modes, a requirement satisfied by HEC-HMS within a single computational framework.</w:t>
+        <w:t>Uncertainty in the precipitation input propagates directly into simulated streamflow, and even a well-calibrated model will produce unreliable output if the forcing does not represent the rainfall actually received by the catchment. This consideration carries particular weight in data-limited regions where gauge networks are sparse, including much of rural Bangladesh.</w:t>
       </w:r>
     </w:p>
     <w:p>
       <w:r>
         <w:rPr>
           <w:b/>
+          <w:i/>
         </w:rPr>
-        <w:t>2.4 Structure and components of the HEC-HMS model</w:t>
+        <w:t>2.3.2 Soil characteristics</w:t>
       </w:r>
     </w:p>
     <w:p>
@@ -175,7 +185,16 @@
         <w:jc w:val="left"/>
       </w:pPr>
       <w:r>
-        <w:t>HEC-HMS is designed to simulate the complete precipitation–runoff process of dendritic watershed systems, and a model project comprises three principal components (U.S. Army Corps of Engineers [USACE], n.d.). The basin model represents the physical catchment as a network of hydrological elements including sub-basins, reaches, junctions, reservoirs, diversions, sources, and sinks. The meteorological model assigns precipitation and evapotranspiration boundary conditions to each sub-basin through gauge weighting, inverse-distance interpolation, or gridded input. The control specifications define the temporal window and computational time step of the simulation. Within each sub-basin, one algorithm is selected from each of several interchangeable method libraries governing canopy and surface storage, infiltration loss, direct-runoff transformation, and baseflow, while each routing reach is assigned an independent channel-routing method (Sahu et al., 2023; USACE, n.d.). This modular architecture accounts for the adaptability of the model across climatic regimes and explains its widespread adoption in regions where proprietary modelling systems are financially inaccessible (Hamdan et al., 2021).</w:t>
+        <w:t>Soil properties exert a first-order control on the partitioning of rainfall between infiltration and surface runoff. Texture, hydraulic conductivity, porosity, profile depth, and antecedent moisture jointly define the capacity of the soil column to absorb and store incident rainfall, and therefore the depth of precipitation excess available for overland flow.</w:t>
+      </w:r>
+    </w:p>
+    <w:p>
+      <w:pPr>
+        <w:ind w:firstLine="720"/>
+        <w:jc w:val="left"/>
+      </w:pPr>
+      <w:r>
+        <w:t>Within the SCS-CN framework, these properties enter the model through the hydrologic soil group classification, which ranks soils by infiltration and runoff potential: soils of low infiltration capacity are assigned to groups of higher runoff potential and correspondingly higher curve numbers. Soil information is therefore routinely combined with land-use and land-cover data to derive composite curve numbers for HEC-HMS parameterisation (Soulis, 2021). In the Punpun River Basin, ArcGIS-prepared soil, land-use, and slope layers supplied the curve-number input to a family of HEC-HMS models whose performance, evaluated using R², NSE, PBIAS, and RSR, confirmed the utility of spatial soil and land-use information for rainfall–runoff simulation (Ranjan &amp; Singh, 2022).</w:t>
       </w:r>
     </w:p>
     <w:p>
@@ -184,7 +203,7 @@
           <w:b/>
           <w:i/>
         </w:rPr>
-        <w:t>2.4.1 Loss methods</w:t>
+        <w:t>2.3.3 Land use and land cover</w:t>
       </w:r>
     </w:p>
     <w:p>
@@ -193,7 +212,7 @@
         <w:jc w:val="left"/>
       </w:pPr>
       <w:r>
-        <w:t>The loss model determines the proportion of incident precipitation abstracted through infiltration, interception, and surface retention, and therefore the residual depth of precipitation excess available for direct runoff. The SCS-CN method remains the dominant formulation within the HEC-HMS application literature because it consolidates the combined influence of hydrologic soil group, land use and treatment, surface condition, and antecedent moisture into a single dimensionless parameter derivable from mappable catchment attributes (Labade et al., 2025; Soulis, 2021). The persistence of the method after six decades of application is attributable to its conceptual simplicity, well-documented input requirements, and transferability to ungauged catchments, although several limitations remain unresolved. Foremost among these is the initial abstraction ratio, for which locally calibrated values are frequently found to lie substantially below the conventional figure of 0.2 and often approach 0.05 or lower, implying systematic overestimation of initial losses when the standard ratio is applied uncritically (Soulis, 2021).</w:t>
+        <w:t>Land use and land cover condition the rainfall–runoff response by governing interception, infiltration opportunity, surface roughness, evapotranspiration, and surface storage. Forested surfaces generally intercept and infiltrate more rainfall than developed surfaces, while agricultural land exhibits variable behaviour that depends on soil condition, cultivation practice, crop cover, and seasonal waterlogging.</w:t>
       </w:r>
     </w:p>
     <w:p>
@@ -202,7 +221,7 @@
         <w:jc w:val="left"/>
       </w:pPr>
       <w:r>
-        <w:t>Extensions of the method have sought to incorporate variables absent from its original formulation. A modified SCS-CN equation combining the tabulated curve number with explicit slope-gradient, soil-moisture, and storm-duration factors raised model efficiency to approximately 80% during both calibration and validation and reduced root-mean-square error from 5.53 mm to 2.01 mm relative to the standard method, with soil-moisture parameters identified as the most influential, followed by storm duration and slope, and the initial abstraction ratio as the least sensitive (Shi &amp; Wang, 2020). These findings carry direct methodological implications for the present study, in which antecedent moisture within a seasonally saturated beel environment varies far more widely than in the agricultural watersheds from which the original curve-number tabulations were derived.</w:t>
+        <w:t>Land-use information is indispensable for SCS-CN-based modelling because curve numbers are assigned to combinations of land-use class and hydrologic soil group, so that any change in land use redistributes runoff potential across the catchment. Recent applications have accordingly integrated land-use and soil datasets through GIS: in the Punpun River Basin, LULC, soil, and slope maps prepared in ArcGIS supplied the curve numbers for HEC-HMS (Ranjan &amp; Singh, 2022), and spatially distributed curve-number estimation from GIS-derived land-use and soil layers has likewise supported urban flood simulation (Jawale &amp; Thube, 2025).</w:t>
       </w:r>
     </w:p>
     <w:p>
@@ -211,7 +230,7 @@
         <w:jc w:val="left"/>
       </w:pPr>
       <w:r>
-        <w:t>Alternatives to the curve-number approach available within HEC-HMS include the initial-and-constant and deficit-and-constant loss methods, the Green–Ampt infiltration model, and the multi-layer SMA algorithm intended for continuous simulation (USACE, n.d.). Empirical evidence indicates reliable performance of the SCS-CN method in monsoonal and semi-arid event simulation, as demonstrated for the Al-Adhaim catchment of northern Iraq (Hamdan et al., 2021) and the Punpun River Basin of eastern India (Ranjan &amp; Singh, 2022), whereas the SMA formulation is generally preferred for multi-annual continuous applications (Jawad, 2024). A consistent finding across this literature is that the curve number constitutes the single most sensitive parameter of the model. Curve number, infiltration rate, lag time, and baseflow have been identified as the controlling parameters across the reviewed body of applications (Turkar et al., 2025), and simulated runoff in the Halda catchment responded strongly to sub-basin curve numbers determined by the accuracy of the underlying land-cover classification (M. B. Haque et al., 2024).</w:t>
+        <w:t>For Gumai Beel, land-use characteristics carry particular significance because the catchment combines agricultural activity with seasonal wetland conditions. The alternation between cultivation and inundation across the annual cycle implies that the effective runoff response of the catchment is itself seasonal, and land-use information therefore provides an essential spatial basis for parameterising the rainfall–runoff model.</w:t>
       </w:r>
     </w:p>
     <w:p>
@@ -220,7 +239,7 @@
           <w:b/>
           <w:i/>
         </w:rPr>
-        <w:t>2.4.2 Transform methods</w:t>
+        <w:t>2.3.4 Topography</w:t>
       </w:r>
     </w:p>
     <w:p>
@@ -229,7 +248,7 @@
         <w:jc w:val="left"/>
       </w:pPr>
       <w:r>
-        <w:t>The transform model converts the precipitation excess computed by the loss model into a direct-runoff hydrograph at the sub-basin outlet. Most applications employ unit-hydrograph theory, for which HEC-HMS provides the SCS dimensionless unit hydrograph parameterised by basin lag time, the Clark unit hydrograph which represents translation and attenuation separately through a time–area histogram and a linear-reservoir storage coefficient, and the Snyder synthetic unit hydrograph parameterised by lag and peaking coefficients (USACE, n.d.). The SCS unit hydrograph is the most frequently adopted transform across international practice and is typically paired with SCS-CN losses (Labade et al., 2025; Sahu et al., 2023), a configuration applied successfully in a range of monsoonal and semi-arid settings (Hamdan et al., 2021; Nujhat et al., 2024; Ranjan &amp; Singh, 2022). The Clark formulation has been preferred in several large-basin continuous applications, in which storage coefficient and time of concentration are treated as primary calibration parameters (Jawad, 2024).</w:t>
+        <w:t>Topography governs the direction, velocity, and concentration of water movement across a watershed. Elevation, slope, drainage density, stream order, flow length, and basin shape together determine the time required for runoff generated at any point to reach the outlet, and hence the timing and shape of the outlet hydrograph.</w:t>
       </w:r>
     </w:p>
     <w:p>
@@ -238,7 +257,85 @@
         <w:jc w:val="left"/>
       </w:pPr>
       <w:r>
-        <w:t>For extremely flat catchments the estimation of lag time warrants particular caution. Empirical lag equations were predominantly derived from sloping terrain, and any misestimation propagates directly into errors in the timing of the simulated hydrograph peak. In floodplain environments where topographic gradients approach the vertical resolution of the available elevation data, calibration of lag and storage parameters against observed hydrographs becomes indispensable rather than optional, an approach reflected in recent optimisation strategies for low-gradient and large-basin applications (Admas et al., 2025; Jawad, 2024).</w:t>
+        <w:t>Digital Elevation Models (DEMs) consequently occupy a central position in GIS-based hydrological modelling. Processing of a DEM yields flow direction, flow accumulation, stream networks, watershed boundaries, sub-basins, and longest flow paths, from which the HEC-HMS basin model is constructed. DEM-derived flow direction, flow accumulation, stream ordering, and basin delineation form the foundation of current GIS–HEC-HMS modelling workflows (Jawale &amp; Thube, 2025), although delineation outcomes remain sensitive to the choice of DEM product, its resolution, and the stream-definition threshold, particularly in low-relief terrain (Datta et al., 2022).</w:t>
+      </w:r>
+    </w:p>
+    <w:p>
+      <w:pPr>
+        <w:ind w:firstLine="720"/>
+        <w:jc w:val="left"/>
+      </w:pPr>
+      <w:r>
+        <w:t>Topographic control assumes heightened importance in a low-gradient wetland system, where elevation differences of only a few decimetres can determine where water accumulates and how it drains. Accurate DEM processing and careful delineation of the Gumai Beel catchment are therefore essential components of the present study.</w:t>
+      </w:r>
+    </w:p>
+    <w:p>
+      <w:r>
+        <w:rPr>
+          <w:b/>
+        </w:rPr>
+        <w:t>2.4 Hydrological modelling</w:t>
+      </w:r>
+    </w:p>
+    <w:p>
+      <w:pPr>
+        <w:ind w:firstLine="720"/>
+        <w:jc w:val="left"/>
+      </w:pPr>
+      <w:r>
+        <w:t>Hydrological models provide simplified representations of the natural hydrological cycle and are used to estimate variables such as runoff, streamflow, soil moisture, evapotranspiration, groundwater flow, and storage. Models differ both in their representation of hydrological processes and in their spatial and temporal structure.</w:t>
+      </w:r>
+    </w:p>
+    <w:p>
+      <w:pPr>
+        <w:ind w:firstLine="720"/>
+        <w:jc w:val="left"/>
+      </w:pPr>
+      <w:r>
+        <w:t>With respect to process representation, models are broadly classified as empirical, conceptual, physically based, or data-driven. Empirical models establish statistical relationships between observed inputs and outputs; conceptual models represent the major hydrological processes through simplified storage structures; and physically based models solve governing physical equations with spatially distributed parameters. Artificial intelligence and machine-learning approaches have more recently been applied to capture nonlinear relationships between meteorological forcing and streamflow. Spatially, models are categorised as lumped, semi-distributed, or distributed according to whether the watershed is treated as a single homogeneous unit, subdivided into sub-units, or resolved over an explicit spatial grid.</w:t>
+      </w:r>
+    </w:p>
+    <w:p>
+      <w:pPr>
+        <w:ind w:firstLine="720"/>
+        <w:jc w:val="left"/>
+      </w:pPr>
+      <w:r>
+        <w:t>Model complexity should be selected in proportion to the characteristics of the watershed and the objective of the simulation, and HEC-HMS has been identified as a practical choice for dendritic drainage systems, with the SCS-CN and Soil Moisture Accounting methods dominating event-based and continuous applications respectively (Sahu et al., 2023). Model choice must also reflect data availability: heavily parameterised models requiring extensive datasets do not necessarily outperform simpler conceptual structures when observations are limited. This consideration is directly relevant to Bangladesh, where discharge measurements are spatially sparse and many local catchments remain poorly gauged.</w:t>
+      </w:r>
+    </w:p>
+    <w:p>
+      <w:r>
+        <w:rPr>
+          <w:b/>
+        </w:rPr>
+        <w:t>2.5 HEC-HMS rainfall–runoff model</w:t>
+      </w:r>
+    </w:p>
+    <w:p>
+      <w:pPr>
+        <w:ind w:firstLine="720"/>
+        <w:jc w:val="left"/>
+      </w:pPr>
+      <w:r>
+        <w:t>HEC-HMS is a watershed-scale hydrological modelling system designed to simulate precipitation–runoff processes. The watershed is represented as a network of interconnected hydrological elements, including sub-basins, reaches, junctions, reservoirs, sources, and sinks (U.S. Army Corps of Engineers [USACE], n.d.). The principal advantage of the system lies in its modular structure: alternative methods may be selected to represent precipitation losses, the transformation of excess rainfall into direct runoff, baseflow, and channel routing, which allows the model to be adapted to widely differing watershed types and objectives.</w:t>
+      </w:r>
+    </w:p>
+    <w:p>
+      <w:pPr>
+        <w:ind w:firstLine="720"/>
+        <w:jc w:val="left"/>
+      </w:pPr>
+      <w:r>
+        <w:t>The model has been applied successfully under diverse climatic and physiographic conditions, performs particularly well in dendritic drainage systems, and depends critically on the selection of an appropriate loss method for reliable simulation (Sahu et al., 2023). Across the event-based and continuous application literature, the SCS-CN and SCS Unit Hydrograph methods dominate loss estimation and runoff transformation, Muskingum and recession approaches are most frequently adopted for routing and baseflow, and integration with GIS, remote sensing, and parameter-optimisation techniques continues to expand (Labade et al., 2025). Reliable simulation under diverse hydrological conditions has been confirmed repeatedly, with calibration quality, method selection, and the integration of hydro-meteorological and geospatial datasets identified as the decisive factors (Turkar et al., 2025). These characteristics make HEC-HMS well suited to the present study, in which a rainfall–runoff model is to be developed from rainfall and discharge observations together with spatial watershed information.</w:t>
+      </w:r>
+    </w:p>
+    <w:p>
+      <w:r>
+        <w:rPr>
+          <w:b/>
+        </w:rPr>
+        <w:t>2.6 HEC-HMS model components</w:t>
       </w:r>
     </w:p>
     <w:p>
@@ -247,7 +344,7 @@
           <w:b/>
           <w:i/>
         </w:rPr>
-        <w:t>2.4.3 Baseflow methods</w:t>
+        <w:t>2.6.1 Basin model</w:t>
       </w:r>
     </w:p>
     <w:p>
@@ -256,7 +353,16 @@
         <w:jc w:val="left"/>
       </w:pPr>
       <w:r>
-        <w:t>Baseflow representation constitutes the most frequently underperforming component of event-oriented hydrological models, yet in floodplain-wetland systems the slow-drainage component may dominate both the recession limb of the hydrograph and the dry-season water balance. Recession, bounded-recession, linear-reservoir, and constant-monthly baseflow formulations are available within HEC-HMS (USACE, n.d.). The recession method is the most widely adopted in international practice owing to its numerical stability and its realistic representation of groundwater depletion (Labade et al., 2025), whereas the linear-reservoir formulation with multiple groundwater layers has been preferred in continuous large-basin applications (Jawad, 2024).</w:t>
+        <w:t>The basin model supplies the spatial and hydrological structure of the watershed, representing the sub-basins and drainage network through which runoff is generated and conveyed. The number and configuration of sub-basins are determined by watershed morphology, drainage structure, the location of observation points, and the objectives of the simulation. For the Gumai Beel–Ichamoti system, delineation is of particular consequence because the basin model must capture the principal drainage pathways connecting the beel to the river. DEM-based GIS processing provides the flow-accumulation surfaces, stream networks, sub-basin boundaries, and outlet locations from which this structure is constructed.</w:t>
+      </w:r>
+    </w:p>
+    <w:p>
+      <w:r>
+        <w:rPr>
+          <w:b/>
+          <w:i/>
+        </w:rPr>
+        <w:t>2.6.2 Meteorological model</w:t>
       </w:r>
     </w:p>
     <w:p>
@@ -265,7 +371,7 @@
         <w:jc w:val="left"/>
       </w:pPr>
       <w:r>
-        <w:t>Recent Bangladeshi experience indicates that baseflow simulation represents a genuine methodological difficulty rather than a routine calibration exercise. Satisfactory aggregate performance statistics have been obtained alongside a poor correspondence between observed and simulated flows along the baseflow portion of the hydrograph, a discrepancy attributed to unrepresented groundwater–surface water exchange and for which offline coupling with a groundwater model has been recommended (M. B. Haque et al., 2024). Groundwater delay time and the baseflow alpha factor have similarly been identified among the most sensitive parameters governing simulation quality in the Upper Halda Basin (Raihan et al., 2020). These findings caution against interpreting event-calibrated models as complete descriptions of low-flow behaviour, a caution of particular force in beel environments where monsoon storage is released gradually throughout the post-monsoon recession.</w:t>
+        <w:t>The meteorological model assigns precipitation and other atmospheric inputs to the basin model, using either gauge observations or gridded precipitation products according to availability. Spatial representation becomes critical wherever multiple rainfall stations fall within the watershed, and Thiessen polygons, gridded rainfall, or other interpolation schemes are used to estimate mean areal precipitation. A multi-station configuration of this kind underpinned the daily simulation of the Sirba River Basin, in which rainfall from 13 stations and discharge at a single outlet station over 2006–2020 supported a comparison of continuous and event-based simulation (Souley Tangam et al., 2024).</w:t>
       </w:r>
     </w:p>
     <w:p>
@@ -274,7 +380,7 @@
           <w:b/>
           <w:i/>
         </w:rPr>
-        <w:t>2.4.4 Channel routing methods and hydraulic coupling</w:t>
+        <w:t>2.6.3 Loss model</w:t>
       </w:r>
     </w:p>
     <w:p>
@@ -283,7 +389,7 @@
         <w:jc w:val="left"/>
       </w:pPr>
       <w:r>
-        <w:t>Flow routing through channel reaches is available in HEC-HMS through the Muskingum, Muskingum–Cunge, kinematic-wave, modified-Puls, and lag methods (USACE, n.d.). The Muskingum method, which conceptualises a reach as a linear storage element governed by a travel-time parameter and a dimensionless weighting parameter, remains the most commonly adopted routing approach in applications comparable to the present study (Hamdan et al., 2021; Labade et al., 2025; Nujhat et al., 2024). Its principal limitation, shared by all hydrologic routing schemes, is the inability to represent backwater effects, flow reversal, or looped stage–discharge relationships, all of which are characteristic of extremely flat deltaic channels in which downstream water level rather than upstream inflow governs conveyance.</w:t>
+        <w:t>The loss model estimates the fraction of rainfall withheld from direct runoff through infiltration, interception, and initial abstraction. Available methods include the SCS Curve Number, Initial and Constant, Green–Ampt, Deficit and Constant, and Soil Moisture Accounting formulations, and the selection among them depends on the modelling objective and the information available (USACE, n.d.).</w:t>
       </w:r>
     </w:p>
     <w:p>
@@ -292,15 +398,7 @@
         <w:jc w:val="left"/>
       </w:pPr>
       <w:r>
-        <w:t>Where such hydraulic controls are material, contemporary practice couples HEC-HMS with the Hydrologic Engineering Center River Analysis System (HEC-RAS). In an integrated flood-risk framework for the Old Brahmaputra River floodplain of Bangladesh, HEC-HMS supplied inflow hydrographs to coupled one- and two-dimensional HEC-RAS models, yielding Nash–Sutcliffe efficiency values of 0.93 and 0.81 and percent bias of −1.17% and 2.40% during calibration and validation respectively (Zhang et al., 2022). An equivalent coupling applied to the Gumara River in the Upper Blue Nile Basin quantified inundation extents for return periods between 2 and 100 years and evaluated the hydraulic effect of dyke construction (Admas et al., 2025), and the same architecture has been used to generate flood inundation maps along the lowermost reach of the Brahmaputra (Jawad, 2024). Because drainage of the Gumai Beel is regulated in part by water levels within the receiving Ichamoti channel rather than by catchment inflow alone, an analogous coupling represents the logical methodological extension of the present work.</w:t>
-      </w:r>
-    </w:p>
-    <w:p>
-      <w:r>
-        <w:rPr>
-          <w:b/>
-        </w:rPr>
-        <w:t>2.5 Integration of GIS and remote sensing in hydrological modelling</w:t>
+        <w:t>The SCS-CN method is the most widely applied loss formulation in HEC-HMS practice because it provides a simple, well-documented relationship between rainfall excess and watershed characteristics; its dominance is confirmed across successive reviews of the application literature (Labade et al., 2025; Sahu et al., 2023). The curve number aggregates the combined influence of soil, land use, land treatment, and antecedent moisture condition on runoff potential, with higher values corresponding to greater runoff generation and lower values to greater infiltration and storage. The method is directly relevant to the present study because the Gumai Beel catchment combines agricultural and wetland land uses whose soil and land-use characteristics can be mapped spatially through GIS.</w:t>
       </w:r>
     </w:p>
     <w:p>
@@ -309,7 +407,7 @@
           <w:b/>
           <w:i/>
         </w:rPr>
-        <w:t>2.5.1 Digital elevation models and watershed delineation</w:t>
+        <w:t>2.6.4 Transform method</w:t>
       </w:r>
     </w:p>
     <w:p>
@@ -318,7 +416,16 @@
         <w:jc w:val="left"/>
       </w:pPr>
       <w:r>
-        <w:t>Semi-distributed modelling is initiated through terrain analysis, in which sub-basin boundaries and stream networks are delineated from a digital elevation model (DEM) and physiographic attributes such as drainage area, mean slope, and longest flow path are extracted for each computational unit. A widening family of freely available global elevation products, including SRTM, NASADEM, ASTER, AW3D30, MERIT, and TanDEM-X, now competes for this role, and the differences among them are hydrologically consequential. Vertical accuracy varies substantially among products, and terrain slope exerts the strongest control on error magnitude, with AW3D30 exhibiting the most stable performance across geographic settings and NASADEM offering only marginal improvement relative to its SRTM predecessor (Uuemaa et al., 2020).</w:t>
+        <w:t>The transform method converts excess rainfall into direct runoff and thereby determines the shape and timing of the simulated hydrograph. The SCS Unit Hydrograph is the most frequently applied transform in HEC-HMS: it requires only the basin lag time and applies a standardised dimensionless relationship to distribute excess precipitation in time. Alternatives include the Clark and Snyder unit hydrographs, ModClark, and kinematic-wave approaches, with the choice governed by watershed characteristics and data availability (USACE, n.d.). The pairing of the SCS Unit Hydrograph with SCS-CN losses and recession baseflow remains the standard configuration for rainfall–runoff and flood simulation in GIS-supported frameworks (Jawale &amp; Thube, 2025).</w:t>
+      </w:r>
+    </w:p>
+    <w:p>
+      <w:r>
+        <w:rPr>
+          <w:b/>
+          <w:i/>
+        </w:rPr>
+        <w:t>2.6.5 Baseflow</w:t>
       </w:r>
     </w:p>
     <w:p>
@@ -327,7 +434,7 @@
         <w:jc w:val="left"/>
       </w:pPr>
       <w:r>
-        <w:t>The reliability of automated delineation deteriorates precisely within the terrain class represented by the present study area. Delineation outcomes are materially conditioned by the selection of DEM product, its spatial resolution, and the contributing-area threshold adopted for stream definition, and these choices propagate into sub-basin geometry and all subsequently derived parameters (Datta et al., 2022). In low-relief deltaic terrain, where total elevation range may amount to only a few metres and where anthropogenic features such as roads, embankments, and sluice structures rather than natural topography govern actual flow pathways, DEM vertical error can exceed the topographic signal that the delineation algorithm is intended to detect. Systematic verification of automatically delineated drainage against hydrographic maps and field observation is therefore recommended (Datta et al., 2022), and this procedure is adopted in the methodology of the present study.</w:t>
+        <w:t>Baseflow represents the sustained component of streamflow that is not produced directly by the current rainfall event, originating instead from groundwater discharge, delayed subsurface flow, and other forms of watershed storage. Its representation is frequently problematic because groundwater processes are poorly observed, and discrepancies between simulated and observed hydrographs concentrate accordingly in the recession limb. The difficulty is evident in the Halda River catchment, where an HEC-HMS model achieved satisfactory agreement with observed discharge across several performance indicators yet reproduced the baseflow component poorly during calibration (Haque et al., 2024). The issue is potentially significant for the Gumai Beel–Ichamoti system, in which wetland storage and subsurface-water interaction may sustain flow between rainfall events.</w:t>
       </w:r>
     </w:p>
     <w:p>
@@ -336,7 +443,7 @@
           <w:b/>
           <w:i/>
         </w:rPr>
-        <w:t>2.5.2 Land use, soil data, and curve number derivation</w:t>
+        <w:t>2.6.6 Channel routing</w:t>
       </w:r>
     </w:p>
     <w:p>
@@ -345,7 +452,15 @@
         <w:jc w:val="left"/>
       </w:pPr>
       <w:r>
-        <w:t>Parameterisation of the loss model in sparsely gauged basins depends upon thematic spatial mapping. The established workflow intersects a land-use and land-cover classification, commonly derived from Landsat or Sentinel-2 imagery, with a hydrologic soil group layer obtained from national soil surveys or global soil databases, and assigns area-weighted composite curve numbers to each sub-basin through standard lookup tabulations (Ranjan &amp; Singh, 2022; Turkar et al., 2025). Implementation of this procedure within ArcGIS for the Punpun River Basin, in which land-use, soil, and slope layers were generated and curve numbers computed as direct HEC-HMS input, produced coefficient of determination and Nash–Sutcliffe efficiency values exceeding 0.75 for monthly and monsoonal models with percent bias below 10% (Ranjan &amp; Singh, 2022).</w:t>
+        <w:t>Channel routing describes the passage of runoff through the river network and accounts for the translation and attenuation of the hydrograph produced by channel storage and travel time. The Muskingum method is the most frequently applied routing formulation in HEC-HMS because it represents channel storage and flood-wave propagation through only two parameters, the travel-time and storage parameter K and the dimensionless weighting factor X (Labade et al., 2025). In Bangladesh, Muskingum routing combined with SCS-CN losses has supported calibrated and validated simulation of the Gumti River Basin using observed rainfall and discharge records (Nujhat et al., 2024). Routing is essential to the present study because the objective extends beyond runoff generation within the catchment to the movement of the generated flow through the Ichamoti drainage network.</w:t>
+      </w:r>
+    </w:p>
+    <w:p>
+      <w:r>
+        <w:rPr>
+          <w:b/>
+        </w:rPr>
+        <w:t>2.7 SCS Curve Number method in rainfall–runoff modelling</w:t>
       </w:r>
     </w:p>
     <w:p>
@@ -354,16 +469,18 @@
         <w:jc w:val="left"/>
       </w:pPr>
       <w:r>
-        <w:t>The sensitivity of simulated runoff to this parameterisation imposes a corresponding requirement for classification accuracy, since curve number ranks among the four most sensitive parameters across the reviewed applications (Turkar et al., 2025) and the rainfall–runoff relationship of the Halda catchment responded strongly to sub-basin curve numbers determined by land-cover classification (M. B. Haque et al., 2024). Remote sensing evidence further documents the rapidity of land-cover transformation within Bangladeshi wetland environments, where multi-decadal Landsat analysis has quantified substantial conversion of wetland and vegetation classes to agricultural and settlement uses (Bhattacharjee et al., 2021). This consideration assumes particular importance for beel catchments, in which the land surface alternates seasonally among open water, cultivated land, and marsh vegetation, such that a single-date classification cannot adequately represent the hydrological character of the catchment across the annual cycle.</w:t>
+        <w:t>The SCS Curve Number method is an empirical procedure for estimating direct runoff from rainfall through a single parameter, the curve number, that encodes watershed characteristics. Its modest data requirements and its compatibility with GIS-based parameterisation account for its continued dominance in applied practice (Soulis, 2021). Runoff response in the method is controlled by the potential maximum retention S, which is related inversely to the curve number; the curve number itself is determined from land use, hydrologic soil group, land treatment, and antecedent moisture condition. The governing relationship is expressed as</w:t>
       </w:r>
     </w:p>
     <w:p>
+      <w:pPr>
+        <w:jc w:val="center"/>
+      </w:pPr>
       <w:r>
         <w:rPr>
-          <w:b/>
           <w:i/>
         </w:rPr>
-        <w:t>2.5.3 Precipitation inputs in data-scarce catchments</w:t>
+        <w:t>Q = (P − Ia)² / [(P − Ia) + S]</w:t>
       </w:r>
     </w:p>
     <w:p>
@@ -372,7 +489,7 @@
         <w:jc w:val="left"/>
       </w:pPr>
       <w:r>
-        <w:t>Precipitation constitutes the dominant forcing variable of any rainfall–runoff model, and its estimation represents the principal source of predictive uncertainty where rain-gauge networks are sparse or discontinuous. Two families of alternatives to gauge interpolation have reached operational maturity, namely satellite multi-sensor products, foremost the Integrated Multi-satellitE Retrievals for Global Precipitation Measurement (IMERG), and atmospheric reanalyses, foremost the fifth-generation European Centre for Medium-Range Weather Forecasts reanalysis (Hersbach et al., 2020). Satellite products represent regional precipitation patterns and spatial means reliably and improve systematically with successive algorithm versions, while performing more accurately at monthly and annual aggregations than at daily and sub-daily resolutions and retaining recognised limitations for extreme intensities and orographically complex terrain (Pradhan et al., 2022).</w:t>
+        <w:t>where Q is the direct runoff depth, P is the precipitation depth, Ia is the initial abstraction, and S is the potential maximum retention. In the conventional formulation the initial abstraction is taken as a fixed fraction of the potential retention, and the HEC-HMS implementation permits both the curve number and the initial abstraction to be specified explicitly (USACE, n.d.).</w:t>
       </w:r>
     </w:p>
     <w:p>
@@ -381,7 +498,7 @@
         <w:jc w:val="left"/>
       </w:pPr>
       <w:r>
-        <w:t>Operational experience confirms that satellite and reanalysis forcing can support credible hydrological simulation even in large and sparsely instrumented basins. Coupled HEC-HMS and HEC-RAS models of the transboundary Brahmaputra Basin forced with near-real-time IMERG and GSMaP products, corrected against ground observations where these were available, produced acceptable discharge simulation and flood inundation mapping at Bahadurabad (Jawad, 2024). Because the present study can draw upon Bangladesh Water Development Board and Bangladesh Meteorological Department observations within and adjacent to the Pabna region, this literature supports a strategy of gauge-primary forcing supplemented by reanalysis products for gap-filling and internal consistency verification.</w:t>
+        <w:t>The appeal of the method for GIS-based modelling lies in its capacity to translate spatial soil and land-use information directly into runoff potential. ArcGIS-derived soil and LULC layers have supplied curve numbers for successful HEC-HMS application in the Punpun River Basin (Ranjan &amp; Singh, 2022), and the combination of SCS-CN with the SCS Unit Hydrograph and recession baseflow continues to support flood-oriented rainfall–runoff modelling (Jawale &amp; Thube, 2025). The method nevertheless carries recognised limitations: it compresses complex infiltration and storage processes into a single parameter, its conventional initial abstraction ratio of 0.2 has been found in many settings to overestimate initial losses substantially, and it does not track the evolution of soil moisture through long continuous simulations (Soulis, 2021). Application therefore requires deliberate attention to the temporal scale of the simulation and the characteristics of the study area.</w:t>
       </w:r>
     </w:p>
     <w:p>
@@ -389,7 +506,7 @@
         <w:rPr>
           <w:b/>
         </w:rPr>
-        <w:t>2.6 Model calibration, validation, and performance evaluation</w:t>
+        <w:t>2.8 GIS integration in HEC-HMS modelling</w:t>
       </w:r>
     </w:p>
     <w:p>
@@ -398,7 +515,7 @@
         <w:jc w:val="left"/>
       </w:pPr>
       <w:r>
-        <w:t>Credible application of a rainfall–runoff model requires a disciplined testing protocol in which model parameters are estimated against one portion of the observational record and predictive skill is demonstrated against an independent portion. This split-sample framework is followed, at least in its elementary form, by essentially all of the applications reviewed in this chapter (Hamdan et al., 2021; Nujhat et al., 2024; Ranjan &amp; Singh, 2022; Zhang et al., 2022). The framework itself has nevertheless been subjected to recent re-examination. In a large-sample experiment spanning 463 catchments, two conceptual hydrological models, and 50 alternative data-splitting schemes, the widespread practice of calibrating against older records and validating against more recent ones consistently degraded subsequent predictive performance, and calibration against the full available record proved the most robust strategy for operational application (Shen et al., 2022). In a thesis context, where independent demonstration of predictive skill remains an examination requirement, these findings support the reporting of both a conventional split-sample evaluation and a final parameter set re-estimated across the complete record.</w:t>
+        <w:t>GIS has become integral to hydrological modelling because watershed characteristics are inherently spatial. It provides the tools for processing DEMs, land-use maps, soil maps, and drainage networks into the parameters that a hydrological model requires. A typical GIS-supported HEC-HMS workflow begins with DEM preprocessing, in which sink filling and flow-direction analysis are followed by flow-accumulation analysis and stream-network extraction; the resulting network is then used to delineate sub-basins and locate the watershed outlet.</w:t>
       </w:r>
     </w:p>
     <w:p>
@@ -407,7 +524,15 @@
         <w:jc w:val="left"/>
       </w:pPr>
       <w:r>
-        <w:t>Quantitative evaluation of model performance rests upon a compact set of statistical indicators. Nash–Sutcliffe efficiency, the coefficient of determination, and root-mean-square error constitute the most frequently reported metrics across HEC-HMS applications (Labade et al., 2025), with percent bias and the ratio of root-mean-square error to the standard deviation of observations increasingly reported alongside them (Ranjan &amp; Singh, 2022). The interpretation of these indicators is not mechanical, however. The goodness-of-fit criterion adopted as the objective function materially determines the resulting parameter set, and criteria should therefore be matched deliberately to the modelling purpose, with peak-weighted criteria appropriate to flood design and volume-oriented criteria appropriate to water-balance assessment (Althoff &amp; Rodrigues, 2021). It follows that reporting a single aggregate efficiency score, detached from the objective function used to obtain it, provides an incomplete account of model performance.</w:t>
+        <w:t>The conversion of spatial watershed information into model parameters is well established in recent practice. ArcGIS-based preparation of LULC, soil, and slope layers has supplied curve numbers for HEC-HMS simulation of the Punpun River Basin (Ranjan &amp; Singh, 2022), and DEM-derived delineation combined with soil and land-use overlay has yielded spatially distributed curve-number estimates for urban flood modelling (Jawale &amp; Thube, 2025). The accuracy of this chain nevertheless rests on the terrain analysis at its head, and delineation outcomes in low-relief terrain are sensitive to DEM choice, resolution, and threshold settings (Datta et al., 2022). GIS integration is therefore central to the present study, in which the Gumai Beel catchment must be delineated from topographic data and its spatial characteristics incorporated into the rainfall–runoff model.</w:t>
+      </w:r>
+    </w:p>
+    <w:p>
+      <w:r>
+        <w:rPr>
+          <w:b/>
+        </w:rPr>
+        <w:t>2.9 Event-based and continuous HEC-HMS simulation</w:t>
       </w:r>
     </w:p>
     <w:p>
@@ -416,15 +541,7 @@
         <w:jc w:val="left"/>
       </w:pPr>
       <w:r>
-        <w:t>Calibration procedures range from manual adjustment guided by physical reasoning to fully automated optimisation. Univariate-gradient and simplex search algorithms are available within HEC-HMS in combination with a selection of objective functions (USACE, n.d.), and the reviewed applications span this full methodological range, encompassing manual calibration informed by parameter plausibility (Nujhat et al., 2024), automated optimisation using gradient search (Jawad, 2024), and staged procedures in which formal sensitivity analysis precedes calibration in order to concentrate effort upon the most influential parameters (Admas et al., 2025). The consistent identification of curve number, lag time, and routing parameters as the dominant controls upon model response (Turkar et al., 2025) provides a defensible starting parameter set for the present study. Reporting of calibrated parameter ranges alongside point estimates is further warranted, since alternative objective functions may select materially different yet equally acceptable parameter combinations (Althoff &amp; Rodrigues, 2021).</w:t>
-      </w:r>
-    </w:p>
-    <w:p>
-      <w:r>
-        <w:rPr>
-          <w:b/>
-        </w:rPr>
-        <w:t>2.7 Applications of HEC-HMS in international practice</w:t>
+        <w:t>HEC-HMS supports both event-based and continuous rainfall–runoff simulation. Event-based modelling reproduces the response to individual storms and is standard practice for flood estimation and design-storm analysis, whereas continuous modelling simulates watershed behaviour over extended periods and therefore requires representation of evolving soil moisture, groundwater, evapotranspiration, and other slow processes. A systematic review of applications from 2000 to 2023 confirms that event-based simulations rely predominantly on the SCS-CN and SCS Unit Hydrograph methods, that continuous simulations require dynamic soil-moisture and baseflow representations such as Soil Moisture Accounting and linear-reservoir baseflow, and that the choice between the two modes should follow from the intended application and the available data (Odey &amp; Cho, 2025).</w:t>
       </w:r>
     </w:p>
     <w:p>
@@ -433,7 +550,7 @@
         <w:jc w:val="left"/>
       </w:pPr>
       <w:r>
-        <w:t>The international application literature published since 2020 is extensive, and a selective review of methodologically instructive studies is presented here, with the principal characteristics of each summarised in Table 2.1. A daily-timestep model of the semi-arid Al-Adhaim River catchment in northern Iraq, constructed using HEC-GeoHMS terrain preprocessing together with the SCS-CN, SCS unit hydrograph, and Muskingum configuration and calibrated across two hydrological years with verification across a third, returned coefficients of determination of approximately 0.90 for both phases and proved suitable for reservoir inflow estimation, although simulated dam discharge was slightly overestimated (Hamdan et al., 2021). A comparable configuration applied to the Punpun River Basin of eastern India across the period 2005 to 2017, in which parallel daily, monthly, and monsoonal formulations were developed, demonstrated that temporal aggregation materially improved performance, with the monthly model outperforming both alternatives (Ranjan &amp; Singh, 2022).</w:t>
+        <w:t>Direct empirical comparison of the two modes is available for the Sirba River Basin, where a continuous simulation spanning 2006–2020 was evaluated alongside event-based simulations of selected major floods. Both schemes performed satisfactorily, but the event-based simulations achieved higher accuracy, with R² of 0.94–0.98 against 0.84–0.87 for the continuous case, and the calibrated parameter distributions differed materially between schemes, confirming that the modelling mode itself conditions parameter estimation and should be selected according to the study objective (Souley Tangam et al., 2024).</w:t>
       </w:r>
     </w:p>
     <w:p>
@@ -442,7 +559,7 @@
         <w:jc w:val="left"/>
       </w:pPr>
       <w:r>
-        <w:t>Comparative evaluation of HEC-HMS against SWAT for a data-scarce catchment of the Ethiopian Rift Valley Lakes Basin established the viability of the lighter-parameterised framework under conditions of limited observational support (Aliye et al., 2020). The Ethiopian experience has since been extended toward integrated flood-risk analysis, in which HEC-HMS design hydrographs were coupled with two-dimensional HEC-RAS hydraulics for the Gumara River floodplain in order to quantify the reduction in inundated area achieved through dyke construction across return periods from 2 to 100 years (Admas et al., 2025). Three generalisations emerge from this body of work. First, the combination of SCS-CN loss, SCS unit hydrograph transform, and Muskingum routing constitutes the effective default configuration for event-scale application and performs satisfactorily across monsoonal and semi-arid regimes (Hamdan et al., 2021; Labade et al., 2025). Second, the curve number is almost invariably the most sensitive parameter, such that its spatial estimation and calibration bounds govern overall model quality (Turkar et al., 2025). Third, model performance is constrained less by algorithmic structure than by the quality of input data, and by precipitation representation above all (Jawad, 2024; Pradhan et al., 2022).</w:t>
+        <w:t>For the Gumai Beel–Ichamoti system, the appropriate mode follows from the temporal resolution and duration of the available rainfall and discharge records. Event-based simulation is suitable if the principal purpose is to reproduce individual high-flow events, whereas sufficiently long continuous observations would permit a continuous simulation capturing the full seasonal cycle of wetland storage and release.</w:t>
       </w:r>
     </w:p>
     <w:p>
@@ -450,960 +567,7 @@
         <w:rPr>
           <w:b/>
         </w:rPr>
-        <w:t>Table 2.1</w:t>
-      </w:r>
-    </w:p>
-    <w:p>
-      <w:r>
-        <w:rPr>
-          <w:i/>
-        </w:rPr>
-        <w:t>Summary of Selected HEC-HMS Applications Reviewed in This Chapter</w:t>
-      </w:r>
-    </w:p>
-    <w:tbl>
-      <w:tblPr>
-        <w:tblStyle w:val="TableGrid"/>
-        <w:tblW w:type="auto" w:w="0"/>
-        <w:jc w:val="center"/>
-        <w:tblLook w:firstColumn="1" w:firstRow="1" w:lastColumn="0" w:lastRow="0" w:noHBand="0" w:noVBand="1" w:val="04A0"/>
-      </w:tblPr>
-      <w:tblGrid>
-        <w:gridCol w:w="2340"/>
-        <w:gridCol w:w="2340"/>
-        <w:gridCol w:w="2340"/>
-        <w:gridCol w:w="2340"/>
-      </w:tblGrid>
-      <w:tr>
-        <w:tc>
-          <w:tcPr>
-            <w:tcW w:type="dxa" w:w="2160"/>
-          </w:tcPr>
-          <w:p>
-            <w:pPr>
-              <w:spacing w:line="240" w:lineRule="auto"/>
-            </w:pPr>
-            <w:r>
-              <w:rPr>
-                <w:rFonts w:ascii="Times New Roman" w:hAnsi="Times New Roman"/>
-                <w:b/>
-                <w:sz w:val="20"/>
-              </w:rPr>
-              <w:t>Study</w:t>
-            </w:r>
-          </w:p>
-        </w:tc>
-        <w:tc>
-          <w:tcPr>
-            <w:tcW w:type="dxa" w:w="2448"/>
-          </w:tcPr>
-          <w:p>
-            <w:pPr>
-              <w:spacing w:line="240" w:lineRule="auto"/>
-            </w:pPr>
-            <w:r>
-              <w:rPr>
-                <w:rFonts w:ascii="Times New Roman" w:hAnsi="Times New Roman"/>
-                <w:b/>
-                <w:sz w:val="20"/>
-              </w:rPr>
-              <w:t>Study area</w:t>
-            </w:r>
-          </w:p>
-        </w:tc>
-        <w:tc>
-          <w:tcPr>
-            <w:tcW w:type="dxa" w:w="2520"/>
-          </w:tcPr>
-          <w:p>
-            <w:pPr>
-              <w:spacing w:line="240" w:lineRule="auto"/>
-            </w:pPr>
-            <w:r>
-              <w:rPr>
-                <w:rFonts w:ascii="Times New Roman" w:hAnsi="Times New Roman"/>
-                <w:b/>
-                <w:sz w:val="20"/>
-              </w:rPr>
-              <w:t>Methods adopted</w:t>
-            </w:r>
-          </w:p>
-        </w:tc>
-        <w:tc>
-          <w:tcPr>
-            <w:tcW w:type="dxa" w:w="2232"/>
-          </w:tcPr>
-          <w:p>
-            <w:pPr>
-              <w:spacing w:line="240" w:lineRule="auto"/>
-            </w:pPr>
-            <w:r>
-              <w:rPr>
-                <w:rFonts w:ascii="Times New Roman" w:hAnsi="Times New Roman"/>
-                <w:b/>
-                <w:sz w:val="20"/>
-              </w:rPr>
-              <w:t>Reported performance</w:t>
-            </w:r>
-          </w:p>
-        </w:tc>
-      </w:tr>
-      <w:tr>
-        <w:tc>
-          <w:tcPr>
-            <w:tcW w:type="dxa" w:w="2160"/>
-          </w:tcPr>
-          <w:p>
-            <w:pPr>
-              <w:spacing w:line="240" w:lineRule="auto"/>
-            </w:pPr>
-            <w:r>
-              <w:rPr>
-                <w:rFonts w:ascii="Times New Roman" w:hAnsi="Times New Roman"/>
-                <w:sz w:val="20"/>
-              </w:rPr>
-              <w:t>Aliye et al. (2020)</w:t>
-            </w:r>
-          </w:p>
-        </w:tc>
-        <w:tc>
-          <w:tcPr>
-            <w:tcW w:type="dxa" w:w="2448"/>
-          </w:tcPr>
-          <w:p>
-            <w:pPr>
-              <w:spacing w:line="240" w:lineRule="auto"/>
-            </w:pPr>
-            <w:r>
-              <w:rPr>
-                <w:rFonts w:ascii="Times New Roman" w:hAnsi="Times New Roman"/>
-                <w:sz w:val="20"/>
-              </w:rPr>
-              <w:t>Rift Valley Lakes Basin, Ethiopia</w:t>
-            </w:r>
-          </w:p>
-        </w:tc>
-        <w:tc>
-          <w:tcPr>
-            <w:tcW w:type="dxa" w:w="2520"/>
-          </w:tcPr>
-          <w:p>
-            <w:pPr>
-              <w:spacing w:line="240" w:lineRule="auto"/>
-            </w:pPr>
-            <w:r>
-              <w:rPr>
-                <w:rFonts w:ascii="Times New Roman" w:hAnsi="Times New Roman"/>
-                <w:sz w:val="20"/>
-              </w:rPr>
-              <w:t>HEC-HMS and SWAT comparison</w:t>
-            </w:r>
-          </w:p>
-        </w:tc>
-        <w:tc>
-          <w:tcPr>
-            <w:tcW w:type="dxa" w:w="2232"/>
-          </w:tcPr>
-          <w:p>
-            <w:pPr>
-              <w:spacing w:line="240" w:lineRule="auto"/>
-            </w:pPr>
-            <w:r>
-              <w:rPr>
-                <w:rFonts w:ascii="Times New Roman" w:hAnsi="Times New Roman"/>
-                <w:sz w:val="20"/>
-              </w:rPr>
-              <w:t>Both models applicable in data-scarce conditions</w:t>
-            </w:r>
-          </w:p>
-        </w:tc>
-      </w:tr>
-      <w:tr>
-        <w:tc>
-          <w:tcPr>
-            <w:tcW w:type="dxa" w:w="2160"/>
-          </w:tcPr>
-          <w:p>
-            <w:pPr>
-              <w:spacing w:line="240" w:lineRule="auto"/>
-            </w:pPr>
-            <w:r>
-              <w:rPr>
-                <w:rFonts w:ascii="Times New Roman" w:hAnsi="Times New Roman"/>
-                <w:sz w:val="20"/>
-              </w:rPr>
-              <w:t>Raihan et al. (2020)</w:t>
-            </w:r>
-          </w:p>
-        </w:tc>
-        <w:tc>
-          <w:tcPr>
-            <w:tcW w:type="dxa" w:w="2448"/>
-          </w:tcPr>
-          <w:p>
-            <w:pPr>
-              <w:spacing w:line="240" w:lineRule="auto"/>
-            </w:pPr>
-            <w:r>
-              <w:rPr>
-                <w:rFonts w:ascii="Times New Roman" w:hAnsi="Times New Roman"/>
-                <w:sz w:val="20"/>
-              </w:rPr>
-              <w:t>Upper Halda Basin, Bangladesh</w:t>
-            </w:r>
-          </w:p>
-        </w:tc>
-        <w:tc>
-          <w:tcPr>
-            <w:tcW w:type="dxa" w:w="2520"/>
-          </w:tcPr>
-          <w:p>
-            <w:pPr>
-              <w:spacing w:line="240" w:lineRule="auto"/>
-            </w:pPr>
-            <w:r>
-              <w:rPr>
-                <w:rFonts w:ascii="Times New Roman" w:hAnsi="Times New Roman"/>
-                <w:sz w:val="20"/>
-              </w:rPr>
-              <w:t>SWAT (comparative baseline)</w:t>
-            </w:r>
-          </w:p>
-        </w:tc>
-        <w:tc>
-          <w:tcPr>
-            <w:tcW w:type="dxa" w:w="2232"/>
-          </w:tcPr>
-          <w:p>
-            <w:pPr>
-              <w:spacing w:line="240" w:lineRule="auto"/>
-            </w:pPr>
-            <w:r>
-              <w:rPr>
-                <w:rFonts w:ascii="Times New Roman" w:hAnsi="Times New Roman"/>
-                <w:sz w:val="20"/>
-              </w:rPr>
-              <w:t>R² = 0.80; NSE = 0.71</w:t>
-            </w:r>
-          </w:p>
-        </w:tc>
-      </w:tr>
-      <w:tr>
-        <w:tc>
-          <w:tcPr>
-            <w:tcW w:type="dxa" w:w="2160"/>
-          </w:tcPr>
-          <w:p>
-            <w:pPr>
-              <w:spacing w:line="240" w:lineRule="auto"/>
-            </w:pPr>
-            <w:r>
-              <w:rPr>
-                <w:rFonts w:ascii="Times New Roman" w:hAnsi="Times New Roman"/>
-                <w:sz w:val="20"/>
-              </w:rPr>
-              <w:t>Hamdan et al. (2021)</w:t>
-            </w:r>
-          </w:p>
-        </w:tc>
-        <w:tc>
-          <w:tcPr>
-            <w:tcW w:type="dxa" w:w="2448"/>
-          </w:tcPr>
-          <w:p>
-            <w:pPr>
-              <w:spacing w:line="240" w:lineRule="auto"/>
-            </w:pPr>
-            <w:r>
-              <w:rPr>
-                <w:rFonts w:ascii="Times New Roman" w:hAnsi="Times New Roman"/>
-                <w:sz w:val="20"/>
-              </w:rPr>
-              <w:t>Al-Adhaim catchment, Iraq</w:t>
-            </w:r>
-          </w:p>
-        </w:tc>
-        <w:tc>
-          <w:tcPr>
-            <w:tcW w:type="dxa" w:w="2520"/>
-          </w:tcPr>
-          <w:p>
-            <w:pPr>
-              <w:spacing w:line="240" w:lineRule="auto"/>
-            </w:pPr>
-            <w:r>
-              <w:rPr>
-                <w:rFonts w:ascii="Times New Roman" w:hAnsi="Times New Roman"/>
-                <w:sz w:val="20"/>
-              </w:rPr>
-              <w:t>SCS-CN; SCS UH; Muskingum; HEC-GeoHMS</w:t>
-            </w:r>
-          </w:p>
-        </w:tc>
-        <w:tc>
-          <w:tcPr>
-            <w:tcW w:type="dxa" w:w="2232"/>
-          </w:tcPr>
-          <w:p>
-            <w:pPr>
-              <w:spacing w:line="240" w:lineRule="auto"/>
-            </w:pPr>
-            <w:r>
-              <w:rPr>
-                <w:rFonts w:ascii="Times New Roman" w:hAnsi="Times New Roman"/>
-                <w:sz w:val="20"/>
-              </w:rPr>
-              <w:t>R² ≈ 0.90 (calibration and verification)</w:t>
-            </w:r>
-          </w:p>
-        </w:tc>
-      </w:tr>
-      <w:tr>
-        <w:tc>
-          <w:tcPr>
-            <w:tcW w:type="dxa" w:w="2160"/>
-          </w:tcPr>
-          <w:p>
-            <w:pPr>
-              <w:spacing w:line="240" w:lineRule="auto"/>
-            </w:pPr>
-            <w:r>
-              <w:rPr>
-                <w:rFonts w:ascii="Times New Roman" w:hAnsi="Times New Roman"/>
-                <w:sz w:val="20"/>
-              </w:rPr>
-              <w:t>S. Haque et al. (2021)</w:t>
-            </w:r>
-          </w:p>
-        </w:tc>
-        <w:tc>
-          <w:tcPr>
-            <w:tcW w:type="dxa" w:w="2448"/>
-          </w:tcPr>
-          <w:p>
-            <w:pPr>
-              <w:spacing w:line="240" w:lineRule="auto"/>
-            </w:pPr>
-            <w:r>
-              <w:rPr>
-                <w:rFonts w:ascii="Times New Roman" w:hAnsi="Times New Roman"/>
-                <w:sz w:val="20"/>
-              </w:rPr>
-              <w:t>Brahmaputra Basin, Bangladesh</w:t>
-            </w:r>
-          </w:p>
-        </w:tc>
-        <w:tc>
-          <w:tcPr>
-            <w:tcW w:type="dxa" w:w="2520"/>
-          </w:tcPr>
-          <w:p>
-            <w:pPr>
-              <w:spacing w:line="240" w:lineRule="auto"/>
-            </w:pPr>
-            <w:r>
-              <w:rPr>
-                <w:rFonts w:ascii="Times New Roman" w:hAnsi="Times New Roman"/>
-                <w:sz w:val="20"/>
-              </w:rPr>
-              <w:t>Continuous simulation; MUSLE sediment routing</w:t>
-            </w:r>
-          </w:p>
-        </w:tc>
-        <w:tc>
-          <w:tcPr>
-            <w:tcW w:type="dxa" w:w="2232"/>
-          </w:tcPr>
-          <w:p>
-            <w:pPr>
-              <w:spacing w:line="240" w:lineRule="auto"/>
-            </w:pPr>
-            <w:r>
-              <w:rPr>
-                <w:rFonts w:ascii="Times New Roman" w:hAnsi="Times New Roman"/>
-                <w:sz w:val="20"/>
-              </w:rPr>
-              <w:t>NSE = 0.65 (cal.); 0.54 (val.)</w:t>
-            </w:r>
-          </w:p>
-        </w:tc>
-      </w:tr>
-      <w:tr>
-        <w:tc>
-          <w:tcPr>
-            <w:tcW w:type="dxa" w:w="2160"/>
-          </w:tcPr>
-          <w:p>
-            <w:pPr>
-              <w:spacing w:line="240" w:lineRule="auto"/>
-            </w:pPr>
-            <w:r>
-              <w:rPr>
-                <w:rFonts w:ascii="Times New Roman" w:hAnsi="Times New Roman"/>
-                <w:sz w:val="20"/>
-              </w:rPr>
-              <w:t>Ranjan &amp; Singh (2022)</w:t>
-            </w:r>
-          </w:p>
-        </w:tc>
-        <w:tc>
-          <w:tcPr>
-            <w:tcW w:type="dxa" w:w="2448"/>
-          </w:tcPr>
-          <w:p>
-            <w:pPr>
-              <w:spacing w:line="240" w:lineRule="auto"/>
-            </w:pPr>
-            <w:r>
-              <w:rPr>
-                <w:rFonts w:ascii="Times New Roman" w:hAnsi="Times New Roman"/>
-                <w:sz w:val="20"/>
-              </w:rPr>
-              <w:t>Punpun River Basin, India</w:t>
-            </w:r>
-          </w:p>
-        </w:tc>
-        <w:tc>
-          <w:tcPr>
-            <w:tcW w:type="dxa" w:w="2520"/>
-          </w:tcPr>
-          <w:p>
-            <w:pPr>
-              <w:spacing w:line="240" w:lineRule="auto"/>
-            </w:pPr>
-            <w:r>
-              <w:rPr>
-                <w:rFonts w:ascii="Times New Roman" w:hAnsi="Times New Roman"/>
-                <w:sz w:val="20"/>
-              </w:rPr>
-              <w:t>SCS-CN; ArcGIS-derived CN; daily/monthly/monsoonal</w:t>
-            </w:r>
-          </w:p>
-        </w:tc>
-        <w:tc>
-          <w:tcPr>
-            <w:tcW w:type="dxa" w:w="2232"/>
-          </w:tcPr>
-          <w:p>
-            <w:pPr>
-              <w:spacing w:line="240" w:lineRule="auto"/>
-            </w:pPr>
-            <w:r>
-              <w:rPr>
-                <w:rFonts w:ascii="Times New Roman" w:hAnsi="Times New Roman"/>
-                <w:sz w:val="20"/>
-              </w:rPr>
-              <w:t>R² and NSE &gt; 0.75; PBIAS &lt; 10%</w:t>
-            </w:r>
-          </w:p>
-        </w:tc>
-      </w:tr>
-      <w:tr>
-        <w:tc>
-          <w:tcPr>
-            <w:tcW w:type="dxa" w:w="2160"/>
-          </w:tcPr>
-          <w:p>
-            <w:pPr>
-              <w:spacing w:line="240" w:lineRule="auto"/>
-            </w:pPr>
-            <w:r>
-              <w:rPr>
-                <w:rFonts w:ascii="Times New Roman" w:hAnsi="Times New Roman"/>
-                <w:sz w:val="20"/>
-              </w:rPr>
-              <w:t>Zhang et al. (2022)</w:t>
-            </w:r>
-          </w:p>
-        </w:tc>
-        <w:tc>
-          <w:tcPr>
-            <w:tcW w:type="dxa" w:w="2448"/>
-          </w:tcPr>
-          <w:p>
-            <w:pPr>
-              <w:spacing w:line="240" w:lineRule="auto"/>
-            </w:pPr>
-            <w:r>
-              <w:rPr>
-                <w:rFonts w:ascii="Times New Roman" w:hAnsi="Times New Roman"/>
-                <w:sz w:val="20"/>
-              </w:rPr>
-              <w:t>Old Brahmaputra floodplain, Bangladesh</w:t>
-            </w:r>
-          </w:p>
-        </w:tc>
-        <w:tc>
-          <w:tcPr>
-            <w:tcW w:type="dxa" w:w="2520"/>
-          </w:tcPr>
-          <w:p>
-            <w:pPr>
-              <w:spacing w:line="240" w:lineRule="auto"/>
-            </w:pPr>
-            <w:r>
-              <w:rPr>
-                <w:rFonts w:ascii="Times New Roman" w:hAnsi="Times New Roman"/>
-                <w:sz w:val="20"/>
-              </w:rPr>
-              <w:t>HEC-HMS coupled with HEC-RAS 1D/2D</w:t>
-            </w:r>
-          </w:p>
-        </w:tc>
-        <w:tc>
-          <w:tcPr>
-            <w:tcW w:type="dxa" w:w="2232"/>
-          </w:tcPr>
-          <w:p>
-            <w:pPr>
-              <w:spacing w:line="240" w:lineRule="auto"/>
-            </w:pPr>
-            <w:r>
-              <w:rPr>
-                <w:rFonts w:ascii="Times New Roman" w:hAnsi="Times New Roman"/>
-                <w:sz w:val="20"/>
-              </w:rPr>
-              <w:t>NSE = 0.93 (cal.); 0.81 (val.)</w:t>
-            </w:r>
-          </w:p>
-        </w:tc>
-      </w:tr>
-      <w:tr>
-        <w:tc>
-          <w:tcPr>
-            <w:tcW w:type="dxa" w:w="2160"/>
-          </w:tcPr>
-          <w:p>
-            <w:pPr>
-              <w:spacing w:line="240" w:lineRule="auto"/>
-            </w:pPr>
-            <w:r>
-              <w:rPr>
-                <w:rFonts w:ascii="Times New Roman" w:hAnsi="Times New Roman"/>
-                <w:sz w:val="20"/>
-              </w:rPr>
-              <w:t>Nur et al. (2022)</w:t>
-            </w:r>
-          </w:p>
-        </w:tc>
-        <w:tc>
-          <w:tcPr>
-            <w:tcW w:type="dxa" w:w="2448"/>
-          </w:tcPr>
-          <w:p>
-            <w:pPr>
-              <w:spacing w:line="240" w:lineRule="auto"/>
-            </w:pPr>
-            <w:r>
-              <w:rPr>
-                <w:rFonts w:ascii="Times New Roman" w:hAnsi="Times New Roman"/>
-                <w:sz w:val="20"/>
-              </w:rPr>
-              <w:t>Khowai River Basin, Bangladesh</w:t>
-            </w:r>
-          </w:p>
-        </w:tc>
-        <w:tc>
-          <w:tcPr>
-            <w:tcW w:type="dxa" w:w="2520"/>
-          </w:tcPr>
-          <w:p>
-            <w:pPr>
-              <w:spacing w:line="240" w:lineRule="auto"/>
-            </w:pPr>
-            <w:r>
-              <w:rPr>
-                <w:rFonts w:ascii="Times New Roman" w:hAnsi="Times New Roman"/>
-                <w:sz w:val="20"/>
-              </w:rPr>
-              <w:t>Event-based HEC-HMS simulation</w:t>
-            </w:r>
-          </w:p>
-        </w:tc>
-        <w:tc>
-          <w:tcPr>
-            <w:tcW w:type="dxa" w:w="2232"/>
-          </w:tcPr>
-          <w:p>
-            <w:pPr>
-              <w:spacing w:line="240" w:lineRule="auto"/>
-            </w:pPr>
-            <w:r>
-              <w:rPr>
-                <w:rFonts w:ascii="Times New Roman" w:hAnsi="Times New Roman"/>
-                <w:sz w:val="20"/>
-              </w:rPr>
-              <w:t>Model applicable to flash-flood-prone basin</w:t>
-            </w:r>
-          </w:p>
-        </w:tc>
-      </w:tr>
-      <w:tr>
-        <w:tc>
-          <w:tcPr>
-            <w:tcW w:type="dxa" w:w="2160"/>
-          </w:tcPr>
-          <w:p>
-            <w:pPr>
-              <w:spacing w:line="240" w:lineRule="auto"/>
-            </w:pPr>
-            <w:r>
-              <w:rPr>
-                <w:rFonts w:ascii="Times New Roman" w:hAnsi="Times New Roman"/>
-                <w:sz w:val="20"/>
-              </w:rPr>
-              <w:t>Jawad (2024)</w:t>
-            </w:r>
-          </w:p>
-        </w:tc>
-        <w:tc>
-          <w:tcPr>
-            <w:tcW w:type="dxa" w:w="2448"/>
-          </w:tcPr>
-          <w:p>
-            <w:pPr>
-              <w:spacing w:line="240" w:lineRule="auto"/>
-            </w:pPr>
-            <w:r>
-              <w:rPr>
-                <w:rFonts w:ascii="Times New Roman" w:hAnsi="Times New Roman"/>
-                <w:sz w:val="20"/>
-              </w:rPr>
-              <w:t>Brahmaputra Basin (transboundary)</w:t>
-            </w:r>
-          </w:p>
-        </w:tc>
-        <w:tc>
-          <w:tcPr>
-            <w:tcW w:type="dxa" w:w="2520"/>
-          </w:tcPr>
-          <w:p>
-            <w:pPr>
-              <w:spacing w:line="240" w:lineRule="auto"/>
-            </w:pPr>
-            <w:r>
-              <w:rPr>
-                <w:rFonts w:ascii="Times New Roman" w:hAnsi="Times New Roman"/>
-                <w:sz w:val="20"/>
-              </w:rPr>
-              <w:t>SMA; Clark UH; linear reservoir; IMERG/GSMaP; HEC-RAS</w:t>
-            </w:r>
-          </w:p>
-        </w:tc>
-        <w:tc>
-          <w:tcPr>
-            <w:tcW w:type="dxa" w:w="2232"/>
-          </w:tcPr>
-          <w:p>
-            <w:pPr>
-              <w:spacing w:line="240" w:lineRule="auto"/>
-            </w:pPr>
-            <w:r>
-              <w:rPr>
-                <w:rFonts w:ascii="Times New Roman" w:hAnsi="Times New Roman"/>
-                <w:sz w:val="20"/>
-              </w:rPr>
-              <w:t>Credible discharge and inundation from satellite forcing</w:t>
-            </w:r>
-          </w:p>
-        </w:tc>
-      </w:tr>
-      <w:tr>
-        <w:tc>
-          <w:tcPr>
-            <w:tcW w:type="dxa" w:w="2160"/>
-          </w:tcPr>
-          <w:p>
-            <w:pPr>
-              <w:spacing w:line="240" w:lineRule="auto"/>
-            </w:pPr>
-            <w:r>
-              <w:rPr>
-                <w:rFonts w:ascii="Times New Roman" w:hAnsi="Times New Roman"/>
-                <w:sz w:val="20"/>
-              </w:rPr>
-              <w:t>Nujhat et al. (2024)</w:t>
-            </w:r>
-          </w:p>
-        </w:tc>
-        <w:tc>
-          <w:tcPr>
-            <w:tcW w:type="dxa" w:w="2448"/>
-          </w:tcPr>
-          <w:p>
-            <w:pPr>
-              <w:spacing w:line="240" w:lineRule="auto"/>
-            </w:pPr>
-            <w:r>
-              <w:rPr>
-                <w:rFonts w:ascii="Times New Roman" w:hAnsi="Times New Roman"/>
-                <w:sz w:val="20"/>
-              </w:rPr>
-              <w:t>Gumti River Basin, Bangladesh</w:t>
-            </w:r>
-          </w:p>
-        </w:tc>
-        <w:tc>
-          <w:tcPr>
-            <w:tcW w:type="dxa" w:w="2520"/>
-          </w:tcPr>
-          <w:p>
-            <w:pPr>
-              <w:spacing w:line="240" w:lineRule="auto"/>
-            </w:pPr>
-            <w:r>
-              <w:rPr>
-                <w:rFonts w:ascii="Times New Roman" w:hAnsi="Times New Roman"/>
-                <w:sz w:val="20"/>
-              </w:rPr>
-              <w:t>SCS-CN; Muskingum; SRTM delineation</w:t>
-            </w:r>
-          </w:p>
-        </w:tc>
-        <w:tc>
-          <w:tcPr>
-            <w:tcW w:type="dxa" w:w="2232"/>
-          </w:tcPr>
-          <w:p>
-            <w:pPr>
-              <w:spacing w:line="240" w:lineRule="auto"/>
-            </w:pPr>
-            <w:r>
-              <w:rPr>
-                <w:rFonts w:ascii="Times New Roman" w:hAnsi="Times New Roman"/>
-                <w:sz w:val="20"/>
-              </w:rPr>
-              <w:t>R² = 0.64 (cal.); 0.68 (val.); PBIAS very good</w:t>
-            </w:r>
-          </w:p>
-        </w:tc>
-      </w:tr>
-      <w:tr>
-        <w:tc>
-          <w:tcPr>
-            <w:tcW w:type="dxa" w:w="2160"/>
-          </w:tcPr>
-          <w:p>
-            <w:pPr>
-              <w:spacing w:line="240" w:lineRule="auto"/>
-            </w:pPr>
-            <w:r>
-              <w:rPr>
-                <w:rFonts w:ascii="Times New Roman" w:hAnsi="Times New Roman"/>
-                <w:sz w:val="20"/>
-              </w:rPr>
-              <w:t>M. B. Haque et al. (2024)</w:t>
-            </w:r>
-          </w:p>
-        </w:tc>
-        <w:tc>
-          <w:tcPr>
-            <w:tcW w:type="dxa" w:w="2448"/>
-          </w:tcPr>
-          <w:p>
-            <w:pPr>
-              <w:spacing w:line="240" w:lineRule="auto"/>
-            </w:pPr>
-            <w:r>
-              <w:rPr>
-                <w:rFonts w:ascii="Times New Roman" w:hAnsi="Times New Roman"/>
-                <w:sz w:val="20"/>
-              </w:rPr>
-              <w:t>Halda River catchment, Bangladesh</w:t>
-            </w:r>
-          </w:p>
-        </w:tc>
-        <w:tc>
-          <w:tcPr>
-            <w:tcW w:type="dxa" w:w="2520"/>
-          </w:tcPr>
-          <w:p>
-            <w:pPr>
-              <w:spacing w:line="240" w:lineRule="auto"/>
-            </w:pPr>
-            <w:r>
-              <w:rPr>
-                <w:rFonts w:ascii="Times New Roman" w:hAnsi="Times New Roman"/>
-                <w:sz w:val="20"/>
-              </w:rPr>
-              <w:t>SCS-CN optimised against SWAT-derived values</w:t>
-            </w:r>
-          </w:p>
-        </w:tc>
-        <w:tc>
-          <w:tcPr>
-            <w:tcW w:type="dxa" w:w="2232"/>
-          </w:tcPr>
-          <w:p>
-            <w:pPr>
-              <w:spacing w:line="240" w:lineRule="auto"/>
-            </w:pPr>
-            <w:r>
-              <w:rPr>
-                <w:rFonts w:ascii="Times New Roman" w:hAnsi="Times New Roman"/>
-                <w:sz w:val="20"/>
-              </w:rPr>
-              <w:t>NSE = 0.72 (cal.); 0.82 (val.); baseflow underestimated</w:t>
-            </w:r>
-          </w:p>
-        </w:tc>
-      </w:tr>
-      <w:tr>
-        <w:tc>
-          <w:tcPr>
-            <w:tcW w:type="dxa" w:w="2160"/>
-          </w:tcPr>
-          <w:p>
-            <w:pPr>
-              <w:spacing w:line="240" w:lineRule="auto"/>
-            </w:pPr>
-            <w:r>
-              <w:rPr>
-                <w:rFonts w:ascii="Times New Roman" w:hAnsi="Times New Roman"/>
-                <w:sz w:val="20"/>
-              </w:rPr>
-              <w:t>Admas et al. (2025)</w:t>
-            </w:r>
-          </w:p>
-        </w:tc>
-        <w:tc>
-          <w:tcPr>
-            <w:tcW w:type="dxa" w:w="2448"/>
-          </w:tcPr>
-          <w:p>
-            <w:pPr>
-              <w:spacing w:line="240" w:lineRule="auto"/>
-            </w:pPr>
-            <w:r>
-              <w:rPr>
-                <w:rFonts w:ascii="Times New Roman" w:hAnsi="Times New Roman"/>
-                <w:sz w:val="20"/>
-              </w:rPr>
-              <w:t>Gumara River, Upper Blue Nile Basin</w:t>
-            </w:r>
-          </w:p>
-        </w:tc>
-        <w:tc>
-          <w:tcPr>
-            <w:tcW w:type="dxa" w:w="2520"/>
-          </w:tcPr>
-          <w:p>
-            <w:pPr>
-              <w:spacing w:line="240" w:lineRule="auto"/>
-            </w:pPr>
-            <w:r>
-              <w:rPr>
-                <w:rFonts w:ascii="Times New Roman" w:hAnsi="Times New Roman"/>
-                <w:sz w:val="20"/>
-              </w:rPr>
-              <w:t>HEC-HMS coupled with HEC-RAS; return-period analysis</w:t>
-            </w:r>
-          </w:p>
-        </w:tc>
-        <w:tc>
-          <w:tcPr>
-            <w:tcW w:type="dxa" w:w="2232"/>
-          </w:tcPr>
-          <w:p>
-            <w:pPr>
-              <w:spacing w:line="240" w:lineRule="auto"/>
-            </w:pPr>
-            <w:r>
-              <w:rPr>
-                <w:rFonts w:ascii="Times New Roman" w:hAnsi="Times New Roman"/>
-                <w:sz w:val="20"/>
-              </w:rPr>
-              <w:t>Inundation quantified for 2–100-year events</w:t>
-            </w:r>
-          </w:p>
-        </w:tc>
-      </w:tr>
-      <w:tr>
-        <w:tc>
-          <w:tcPr>
-            <w:tcW w:type="dxa" w:w="2160"/>
-          </w:tcPr>
-          <w:p>
-            <w:pPr>
-              <w:spacing w:line="240" w:lineRule="auto"/>
-            </w:pPr>
-            <w:r>
-              <w:rPr>
-                <w:rFonts w:ascii="Times New Roman" w:hAnsi="Times New Roman"/>
-                <w:sz w:val="20"/>
-              </w:rPr>
-              <w:t>Moniruzzaman &amp; Mahalder (2026)</w:t>
-            </w:r>
-          </w:p>
-        </w:tc>
-        <w:tc>
-          <w:tcPr>
-            <w:tcW w:type="dxa" w:w="2448"/>
-          </w:tcPr>
-          <w:p>
-            <w:pPr>
-              <w:spacing w:line="240" w:lineRule="auto"/>
-            </w:pPr>
-            <w:r>
-              <w:rPr>
-                <w:rFonts w:ascii="Times New Roman" w:hAnsi="Times New Roman"/>
-                <w:sz w:val="20"/>
-              </w:rPr>
-              <w:t>Atrai–Karatoa River Basin, Bangladesh</w:t>
-            </w:r>
-          </w:p>
-        </w:tc>
-        <w:tc>
-          <w:tcPr>
-            <w:tcW w:type="dxa" w:w="2520"/>
-          </w:tcPr>
-          <w:p>
-            <w:pPr>
-              <w:spacing w:line="240" w:lineRule="auto"/>
-            </w:pPr>
-            <w:r>
-              <w:rPr>
-                <w:rFonts w:ascii="Times New Roman" w:hAnsi="Times New Roman"/>
-                <w:sz w:val="20"/>
-              </w:rPr>
-              <w:t>HEC-HMS and SWAT comparison</w:t>
-            </w:r>
-          </w:p>
-        </w:tc>
-        <w:tc>
-          <w:tcPr>
-            <w:tcW w:type="dxa" w:w="2232"/>
-          </w:tcPr>
-          <w:p>
-            <w:pPr>
-              <w:spacing w:line="240" w:lineRule="auto"/>
-            </w:pPr>
-            <w:r>
-              <w:rPr>
-                <w:rFonts w:ascii="Times New Roman" w:hAnsi="Times New Roman"/>
-                <w:sz w:val="20"/>
-              </w:rPr>
-              <w:t>HEC-HMS R² = 0.70 (cal.); 0.56 (val.)</w:t>
-            </w:r>
-          </w:p>
-        </w:tc>
-      </w:tr>
-    </w:tbl>
-    <w:p>
-      <w:r>
-        <w:rPr>
-          <w:i/>
-          <w:sz w:val="20"/>
-        </w:rPr>
-        <w:t>Note. NSE = Nash–Sutcliffe efficiency; R² = coefficient of determination; PBIAS = percent bias; CN = curve number; UH = unit hydrograph; SMA = soil moisture accounting; cal. = calibration; val. = validation.</w:t>
-      </w:r>
-    </w:p>
-    <w:p>
-      <w:r>
-        <w:rPr>
-          <w:b/>
-        </w:rPr>
-        <w:t>2.8 Applications of HEC-HMS in Bangladesh</w:t>
+        <w:t>2.10 Calibration and validation of HEC-HMS</w:t>
       </w:r>
     </w:p>
     <w:p>
@@ -1412,7 +576,7 @@
         <w:jc w:val="left"/>
       </w:pPr>
       <w:r>
-        <w:t>Bangladesh occupies the terminal reach of the Ganges–Brahmaputra–Meghna system, and its hydrological regime is characterised by intense monsoonal rainfall, transboundary inflow, extremely low topographic relief, and an extensive network of floodplain depressions. Within this setting, HEC-HMS has been adopted increasingly for basin-scale rainfall–runoff investigation, and the record published since 2020 now spans the principal basin types of the country.</w:t>
+        <w:t>Calibration is indispensable in rainfall–runoff modelling because several HEC-HMS parameters cannot be measured directly and must be inferred from the observed response of the watershed. During calibration, parameters are adjusted systematically to minimise the discrepancy between observed and simulated discharge. A defensible calibration considers multiple attributes of the hydrograph simultaneously, including peak discharge, runoff volume, time to peak, the rising and recession limbs, and low-flow behaviour, since agreement in a single statistic can conceal compensating errors elsewhere. Validation against an independent period of observations then provides the decisive test of whether the calibrated model can reproduce hydrological behaviour under conditions not used for parameter estimation.</w:t>
       </w:r>
     </w:p>
     <w:p>
@@ -1421,7 +585,7 @@
         <w:jc w:val="left"/>
       </w:pPr>
       <w:r>
-        <w:t>At the scale of the major transboundary systems, a continuous HEC-HMS model of the poorly gauged Brahmaputra Basin calibrated against daily runoff at Bahadurabad for the period 1983 to 1996 and validated for 1997 to 2010 was extended with the Modified Universal Soil Loss Equation and Engelund–Hansen sediment routing in order to project future sediment load under the RCP8.5 scenario, yielding projected increases in mean annual sediment load of 34%, 67%, and 115% by the 2020s, 2050s, and 2080s respectively (S. Haque et al., 2021). For the Old Brahmaputra River floodplain, coupling of HEC-HMS with one- and two-dimensional HEC-RAS models supported an integrated assessment of flood risk, hazard, and vulnerability, with Nash–Sutcliffe efficiency values of 0.93 and 0.81 obtained during calibration and validation and the resulting framework proposed as a basis for early-warning systems and adaptation planning (Zhang et al., 2022).</w:t>
+        <w:t>Performance is conventionally quantified using the Nash–Sutcliffe efficiency (NSE), the coefficient of determination (R²), the root-mean-square error (RMSE), and percent bias (PBIAS), which provide complementary information on correlation, volume error, and overall fit. In the Punpun River Basin, evaluation of daily, monthly, and monsoonal HEC-HMS models against R², NSE, PBIAS, and RSR indicated generally satisfactory performance, with the monthly formulation superior to both alternatives (Ranjan &amp; Singh, 2022). In Bangladesh, the hydrological component of a coupled HEC-HMS–HEC-RAS flood-risk framework for the Old Brahmaputra floodplain achieved NSE values of 0.93 and 0.81, R² values of 0.95 and 0.89, and PBIAS of −1.17% and 2.40% for calibration and validation respectively, confirming that HEC-HMS can supply reliable hydrological input to flood-risk assessment where adequate observations support calibration (Zhang et al., 2022).</w:t>
       </w:r>
     </w:p>
     <w:p>
@@ -1430,7 +594,15 @@
         <w:jc w:val="left"/>
       </w:pPr>
       <w:r>
-        <w:t>At the sub-basin scale, event-based HEC-HMS simulation has been applied to the Khowai River Basin, a flash-flood-prone catchment of north-eastern Bangladesh (Nur et al., 2022). A model of the Gumti River Basin calibrated and validated using observations from 2019 to 2021 with SRTM-based catchment delineation, Muskingum routing, and SCS-CN losses returned coefficients of determination of 0.64 and 0.68 for calibration and validation respectively with percent bias in the very good performance category, and was recommended as a planning instrument for flood prediction and water-resources management (Nujhat et al., 2024). In the ecologically significant Halda catchment, curve numbers optimised against values derived from a companion SWAT application produced Nash–Sutcliffe efficiency values of 0.72 and 0.82, although underestimation of dry-season baseflow was explicitly documented (M. B. Haque et al., 2024). Comparison of HEC-HMS with SWAT for the Atrai–Karatoa River Basin of northern Bangladesh, a system hydrologically contiguous with the greater Chalan Beel floodplain to which the Pabna beel network belongs, indicated that SWAT captured high flows more accurately while HEC-HMS performed better across medium flows, with HEC-HMS achieving coefficients of determination of 0.70 and 0.56 during calibration and validation (Moniruzzaman &amp; Mahalder, 2026).</w:t>
+        <w:t>Numerical thresholds alone, however, do not establish model adequacy. Visual comparison of observed and simulated hydrographs remains essential, because a model can attain a satisfactory NSE while misrepresenting particular flood peaks or recession behaviour that matter for the intended application.</w:t>
+      </w:r>
+    </w:p>
+    <w:p>
+      <w:r>
+        <w:rPr>
+          <w:b/>
+        </w:rPr>
+        <w:t>2.11 Parameter sensitivity and model uncertainty</w:t>
       </w:r>
     </w:p>
     <w:p>
@@ -1439,7 +611,7 @@
         <w:jc w:val="left"/>
       </w:pPr>
       <w:r>
-        <w:t>Investigations employing alternative modelling frameworks complete the national picture. Streamflow simulation of the Upper Halda Basin using SWAT achieved a coefficient of determination of 0.80 and Nash–Sutcliffe efficiency of 0.71, with groundwater delay time, baseflow alpha factor, and curve number identified as the parameters exerting greatest influence upon performance and with the difficulty of representing spatial rainfall variability from a single gauging station emphasised (Raihan et al., 2020). Hydrological models of selected flash-flood-prone rivers have advanced the understanding of rapid-response catchment behaviour under monsoonal forcing (Akter &amp; Sawon, 2024), while satellite-forced coupled hydrologic–hydraulic modelling has been demonstrated for the Bangladeshi reach of the Brahmaputra (Jawad, 2024).</w:t>
+        <w:t>Model parameters differ widely in their influence on simulated streamflow, and sensitivity analysis identifies those exerting the greatest control so that calibration effort can be concentrated where it matters. In HEC-HMS, the influential parameters are associated with rainfall losses, basin response, baseflow, and routing. For SCS-CN-based models the curve number is typically dominant, since it directly governs the conversion of precipitation into excess rainfall; transform parameters such as lag time control the timing and shape of the hydrograph; and routing parameters control downstream translation and attenuation. Curve number, infiltration-related parameters, lag time, and baseflow parameters have been identified consistently as the components requiring the most careful calibration (Turkar et al., 2025), and sensitivity analysis in the Sirba River Basin similarly ranked curve number, initial abstraction, lag time, and routing time factors as the most influential controls on model output (Souley Tangam et al., 2024).</w:t>
       </w:r>
     </w:p>
     <w:p>
@@ -1448,7 +620,7 @@
         <w:jc w:val="left"/>
       </w:pPr>
       <w:r>
-        <w:t>Considered collectively, the Bangladeshi HEC-HMS literature exhibits a pronounced spatial concentration. Published applications cluster within large transboundary basins, flashy piedmont and hill catchments, and the Atrai–Karatoa corridor. The moribund distributary systems of the Ganges right bank, of which the Ichamoti River of Pabna constitutes a representative example, together with their associated beel catchments, have not been the subject of any published HEC-HMS rainfall–runoff investigation. It is precisely within such systems, where local rainfall accumulation and drainage congestion rather than upstream flood waves govern inundation behaviour, that quantification of runoff is most necessary for drainage design, and yet where the observational network is thinnest.</w:t>
+        <w:t>Parameter uncertainty acquires particular importance where observations are limited, because different parameter combinations can produce nearly identical hydrographs. A satisfactory calibration therefore does not guarantee that each parameter carries a unique physical interpretation. For the Gumai Beel–Ichamoti system, sensitivity analysis will identify the parameters most influential on simulated discharge and ensure that the calibration is both efficient and defensible.</w:t>
       </w:r>
     </w:p>
     <w:p>
@@ -1456,7 +628,7 @@
         <w:rPr>
           <w:b/>
         </w:rPr>
-        <w:t>2.9 Wetland and beel hydrology in the Bangladesh floodplain</w:t>
+        <w:t>2.12 Recent international applications of HEC-HMS</w:t>
       </w:r>
     </w:p>
     <w:p>
@@ -1465,7 +637,7 @@
         <w:jc w:val="left"/>
       </w:pPr>
       <w:r>
-        <w:t>Wetland hydrology differs fundamentally from upland catchment hydrology in that the water regime, understood as the seasonal pattern of water-level rise, persistence, and recession, functions as the master variable governing biogeochemical processes, ecological structure, and land-use viability. Altered hydrology is correspondingly the principal pathway through which environmental and anthropogenic change degrades wetland function, since modification of water depth and residence time alters the balance between organic-matter production and decomposition and may convert a wetland from a net sink to a net source of carbon and nutrients (Salimi et al., 2021). Within the floodplain morphology of Bangladesh, the characteristic wetland landform is the beel, a saucer-shaped depression retaining water perennially or seasonally and receiving inflow both from direct rainfall–runoff generated within its local catchment and from lateral spill originating in adjacent river channels during the monsoon.</w:t>
+        <w:t>Applications published since 2020 confirm the continued use of HEC-HMS across a wide range of climatic and physiographic settings. In the Punpun River Basin of eastern India, daily rainfall and runoff observations combined with GIS-derived LULC, soil, and slope data supported parallel daily, monthly, and monsoonal models, of which the monthly model performed best, underlining the influence of temporal scale on simulation quality (Ranjan &amp; Singh, 2022). In the Sirba River Basin of West Africa, continuous and event-based simulations both achieved satisfactory performance, with the event-based scheme superior for the selected flood events (Souley Tangam et al., 2024). In a Romanian catchment with increased groundwater discharge potential, the SCS-CN, SCS Unit Hydrograph, and Muskingum configuration proved applicable even where groundwater processes influence catchment response (Herbei et al., 2024).</w:t>
       </w:r>
     </w:p>
     <w:p>
@@ -1474,7 +646,15 @@
         <w:jc w:val="left"/>
       </w:pPr>
       <w:r>
-        <w:t>The hydrological functioning of these depressions has been substantially modified by embankment and polder infrastructure constructed from the 1960s onward. In the embanked delta of south-western Bangladesh, enclosure generates internal drainage congestion through a systemic mechanism in which embankments sever the hydraulic connection between floodplain and river channel, sediment accumulates within riverbeds rather than upon the floodplain surface, riverbed elevation rises relative to the enclosed land, gravity drainage through sluice structures progressively fails, and monsoon runoff accumulates within the beels as pluvial flooding (Adnan et al., 2020). A large majority of agricultural and aquacultural land within the embanked region now lies inside flood-susceptible zones, and controlled sediment reintroduction across 106 candidate beels has been evaluated as a rehabilitation strategy capable of raising land elevation by up to 1.4 m over five years (Adnan et al., 2020). The mechanism is structural and regional rather than locally anomalous, and it applies with equal force to the embanked interior floodplains of the Ganges right bank.</w:t>
+        <w:t>Integration with hydraulic modelling has extended the reach of these applications. In the Cypress Creek watershed of Texas, wetlands represented as reservoirs within HEC-HMS were combined with HEC-RAS river hydraulics to examine the influence of wetland size and location on watershed-scale flood control; upstream placement and greater wetland storage reduced downstream flood area, depth, and duration (Tang et al., 2020). This finding carries direct conceptual relevance for wetland-dominated catchments, because it demonstrates quantitatively that wetland storage modifies the downstream hydrological response. Collectively, these studies establish that HEC-HMS is not confined to conventional river catchments: its flexible representation of sub-basins, storage, losses, runoff transformation, and routing renders it applicable to systems in which wetlands regulate runoff behaviour.</w:t>
+      </w:r>
+    </w:p>
+    <w:p>
+      <w:r>
+        <w:rPr>
+          <w:b/>
+        </w:rPr>
+        <w:t>2.13 Wetland and beel hydrology</w:t>
       </w:r>
     </w:p>
     <w:p>
@@ -1483,7 +663,7 @@
         <w:jc w:val="left"/>
       </w:pPr>
       <w:r>
-        <w:t>A second control operates at basin scale through the long-term reduction of dry-season flow within the Ganges distributary network. For the Gorai River, the principal Ganges distributary and the closest regional analogue to the Ichamoti, mean annual flow during 2000 to 2016 was approximately 13% lower than during 1984 to 1999, mean monthly high flow declined by 20%, and the river now frequently fails to satisfy an environmental flow requirement estimated at 295 m³/s, or 29% of mean annual flow, with a deficient-flow condition persisting from December through May (Ali &amp; Hasan, 2022). Reduced discharge within parent channels deprives distributary offtakes of the sediment-flushing flows required to maintain conveyance capacity, initiating progressive siltation and eventual hydraulic disconnection of distributary systems.</w:t>
+        <w:t>Wetlands are integral components of watershed hydrology because they store precipitation and runoff temporarily and thereby modify the timing and magnitude of downstream flows. The strength of this regulation depends on wetland size, position within the watershed, storage capacity, connectivity, vegetation, soil characteristics, and the relationship with surrounding rivers. Hydrologic–hydraulic simulation of the Cypress Creek watershed demonstrates the principle directly: larger wetlands, and wetlands located farther upstream, reduced downstream inundation extent, depth, and duration (Tang et al., 2020). Although derived from a North American case study, the result expresses a general mechanism, namely that wetland storage alters the timing and magnitude of runoff delivered to downstream channels.</w:t>
       </w:r>
     </w:p>
     <w:p>
@@ -1492,15 +672,7 @@
         <w:jc w:val="left"/>
       </w:pPr>
       <w:r>
-        <w:t>The consequences of these combined mechanisms are documented directly for the wetland complex surrounding the study area. Five decades of Landsat imagery over Chalan Beel, the largest wetland ecosystem of Bangladesh and the system into which the Pabna floodplain drains, reveal a consistent trajectory of expanding farmland and developed land accompanied by declining vegetation and wetland extent, with the most pronounced transformation occurring between 2013 and 2023 (Yankyera &amp; Alam, 2025). An equivalent trajectory has been reported for a north-eastern wetland ecosystem (Bhattacharjee et al., 2021). These transformations are hydrologically significant because reduction in wetland storage capacity diminishes the attenuation that beels provide to monsoon runoff, thereby increasing peak discharge and inundation depth within the residual drainage network.</w:t>
-      </w:r>
-    </w:p>
-    <w:p>
-      <w:r>
-        <w:rPr>
-          <w:b/>
-        </w:rPr>
-        <w:t>2.10 The Ichamoti River and Gumai Beel system</w:t>
+        <w:t>Wetlands hold particular significance in Bangladesh, whose floodplains contain numerous seasonal and permanent depressional water bodies. Beels are characteristically saucer-shaped depressions that retain water through the wet season and dry partially or completely thereafter, and their hydrological behaviour is coupled closely to seasonal flooding and river connectivity. Hydromorphodynamic simulation of beels within the polders of the Ganges–Brahmaputra–Meghna delta has revealed strong spatial and seasonal variability in their hydrological and sedimentation behaviour, governed by the seasonal flow regime and the interaction between the beel and the surrounding river system (Islam et al., 2021).</w:t>
       </w:r>
     </w:p>
     <w:p>
@@ -1509,7 +681,15 @@
         <w:jc w:val="left"/>
       </w:pPr>
       <w:r>
-        <w:t>The Ichamoti River of Pabna District exemplifies the condition described in the preceding section. The river originates from the Padma in the vicinity of Shibrampur within Pabna Sadar Upazila and follows a course of approximately 82 to 84 km through Pabna town toward the Hurasagar system in Bera Upazila. Over recent decades the channel has lost effective hydraulic connectivity with its parent rivers and has become progressively constricted through siltation, encroachment, solid-waste disposal, and aquatic weed infestation. The river bisects Pabna Municipality but no longer functions as an effective drainage outfall, being choked with water weeds and accumulated sediment, and blocked or undersized drains, absent operation and maintenance provision, and an unplanned drainage network have been identified by residents as the leading causes of inundation following heavy rainfall (Parvez et al., 2021). Approximately 7.9 km of the Ichamoti channel lies within the municipal area alongside 11.29 km of primary drains and 56.23 km of secondary drains, which establishes the scale of the drainage system dependent upon the river as outfall (Parvez et al., 2021).</w:t>
+        <w:t>These characteristics distinguish beel systems from conventional upland watersheds. In a beel-dominated catchment, rainfall typically contributes first to temporary surface storage and only subsequently drains to downstream channels, so that the runoff peak is delayed and attenuated relative to an equivalent upland response. For rainfall–runoff modelling this creates a specific challenge: a conventional model structure may reproduce runoff generation adequately yet require careful representation of storage and routing to reproduce downstream hydrograph timing. A sound understanding of the wetland’s hydrological character is therefore prerequisite to selecting the appropriate HEC-HMS structure.</w:t>
+      </w:r>
+    </w:p>
+    <w:p>
+      <w:r>
+        <w:rPr>
+          <w:b/>
+        </w:rPr>
+        <w:t>2.14 Hydrological modelling in Bangladesh</w:t>
       </w:r>
     </w:p>
     <w:p>
@@ -1518,7 +698,7 @@
         <w:jc w:val="left"/>
       </w:pPr>
       <w:r>
-        <w:t>Recognition of this condition has prompted large-scale government intervention. A rejuvenation programme valued at Tk 1,554.90 crore, implemented under the Bangladesh Water Development Board, provides for dredging across a 33.77 km reach of the river together with 44.07 km of connecting canals, 20 km of the Sutikhali River, and 12.37 km of the Bharara channel, with the stated objective of restoring hydraulic connectivity between the Ichamoti and the Padma and Jamuna systems (“Tk 1,554cr Project,” 2024). The hydrological design basis for such intervention requires quantitative estimation of the runoff volumes and hydrograph characteristics that the restored corridor must convey, which is precisely the information supplied by a calibrated rainfall–runoff model.</w:t>
+        <w:t>Bangladesh presents a complex hydrological environment characterised by monsoonal rainfall, extensive floodplains, a dense river network, abundant wetlands, and pronounced seasonal variation in water levels and discharge. Flooding recurs annually and constitutes a principal concern for agriculture, infrastructure, ecosystems, and communities. Reliable rainfall–runoff models are therefore essential for understanding watershed behaviour and supporting flood-management strategies, yet their development is complicated by the limited spatial coverage of rainfall and discharge observations.</w:t>
       </w:r>
     </w:p>
     <w:p>
@@ -1527,7 +707,7 @@
         <w:jc w:val="left"/>
       </w:pPr>
       <w:r>
-        <w:t>The Gumai Beel, which constitutes the focus of the present investigation, forms one component of the beel network of the Pabna floodplain draining through the Ichamoti corridor. Its inundation behaviour is governed by the interaction of three controls identified in the reviewed literature as characteristic of embanked distributary floodplains, namely local monsoon rainfall–runoff generated within the beel catchment, the conveyance capacity of the silted Ichamoti channel and its associated khals, which determines the rate at which stored water may be evacuated, and the stage of the receiving river system, which may impose backwater constraints upon gravity drainage (Adnan et al., 2020; Parvez et al., 2021). A rainfall–runoff model of the beel catchment constitutes the necessary first element of any quantitative analysis of this system, since it supplies the inflow boundary condition required for drainage design, for evaluation of the hydrological benefits attributable to the rejuvenation programme, and for assessment of waterlogging risk under current and projected rainfall regimes.</w:t>
+        <w:t>Recent studies document the expanding application of HEC-HMS across the country. For the flash-flood-prone Khowai River Basin, a calibrated and validated HEC-HMS model generated runoff information from available rainfall data under conditions in which discharge observations are limited (Nur et al., 2022). For the Gumti River Basin, SRTM-based delineation, SCS-CN losses, and Muskingum routing supported calibration against 2019–2020 observations and validation against 2021 records, with performance evaluated through R², NSE, RSR, and PBIAS and the calibrated model recommended for flood prediction and water-resources planning (Nujhat et al., 2024). In the Halda River catchment, a cascade-reservoir HEC-HMS framework with curve numbers optimised against SWAT simulation results achieved agreement with observed discharge across several performance indicators, although baseflow representation remained a documented weakness (Haque et al., 2024). These studies confirm that HEC-HMS can be applied successfully to Bangladeshi catchments while indicating that performance depends on careful calibration and appropriate representation of watershed processes.</w:t>
       </w:r>
     </w:p>
     <w:p>
@@ -1535,7 +715,7 @@
         <w:rPr>
           <w:b/>
         </w:rPr>
-        <w:t>2.11 Research gap and summary</w:t>
+        <w:t>2.15 HEC-HMS and flood modelling in Bangladesh</w:t>
       </w:r>
     </w:p>
     <w:p>
@@ -1544,7 +724,7 @@
         <w:jc w:val="left"/>
       </w:pPr>
       <w:r>
-        <w:t>The literature reviewed in this chapter supports four conclusions that collectively establish the position of the present study. First, conceptual semi-distributed modelling using HEC-HMS constitutes a mature and extensively validated approach whose conventional method combination of SCS-CN loss, SCS unit hydrograph transform, and Muskingum routing performs satisfactorily across monsoonal and semi-arid regimes, provided that method selection is justified with reference to catchment characteristics and modelling purpose and that curve number estimation receives particular methodological attention (Hamdan et al., 2021; Horton et al., 2022; Labade et al., 2025; Soulis, 2021). Second, the spatial data infrastructure required for such modelling, comprising global elevation products, satellite land-cover classification, and satellite or reanalysis precipitation, is available for Bangladesh, but low-relief deltaic terrain imposes recognised constraints upon automated delineation and satellite precipitation products retain documented limitations for extreme intensities, both of which require deliberate management (Datta et al., 2022; Pradhan et al., 2022; Uuemaa et al., 2020).</w:t>
+        <w:t>Application of HEC-HMS in Bangladesh has progressed beyond rainfall–runoff simulation toward integrated flood modelling. For the Old Brahmaputra River floodplain, an integrated flood-risk framework coupled HEC-HMS with HEC-RAS 1D/2D hydraulics and a bottom-up vulnerability analysis: the hydrological model generated the flows used in the hydraulic flood simulation, the combined framework returned strong calibration and validation statistics, and the results demonstrated the value of integrating hydrological and hydraulic models for flood-risk assessment (Zhang et al., 2022).</w:t>
       </w:r>
     </w:p>
     <w:p>
@@ -1553,7 +733,15 @@
         <w:jc w:val="left"/>
       </w:pPr>
       <w:r>
-        <w:t>Third, published Bangladeshi applications of HEC-HMS concentrate within large transboundary basins, flashy piedmont catchments, and the Atrai–Karatoa corridor (Jawad, 2024; M. B. Haque et al., 2024; Moniruzzaman &amp; Mahalder, 2026; Nujhat et al., 2024; Nur et al., 2022; S. Haque et al., 2021; Zhang et al., 2022). No published study has developed a rainfall–runoff model for the beel catchments of the moribund Ganges distributaries, of which the Ichamoti–Gumai Beel system is representative. Fourth, the hydrological problem posed by such systems is distinctive in kind rather than merely in degree, since inundation is governed by locally generated runoff accumulating behind congested drainage rather than by riverine flood waves propagating from upstream (Adnan et al., 2020; Parvez et al., 2021), while the long-term deterioration of the distributary network reflects basin-scale flow reduction that has been quantified for the neighbouring Gorai but never connected to a quantitative runoff model of the beel itself (Ali &amp; Hasan, 2022).</w:t>
+        <w:t>This form of integration bears directly on the present study, because a calibrated rainfall–runoff model constitutes the foundation for any subsequent hydraulic modelling of the Gumai Beel–Ichamoti system. Once rainfall-generated discharge can be simulated reliably, the resulting hydrographs may serve as boundary conditions for a hydraulic model such as HEC-RAS. The growing use of HEC-HMS in Bangladesh also reflects a broader movement toward spatially integrated modelling, in which GIS, DEMs, gridded rainfall products, and remote sensing are combined with observed discharge to strengthen model representation.</w:t>
+      </w:r>
+    </w:p>
+    <w:p>
+      <w:r>
+        <w:rPr>
+          <w:b/>
+        </w:rPr>
+        <w:t>2.16 Comparison of HEC-HMS with SWAT and other models</w:t>
       </w:r>
     </w:p>
     <w:p>
@@ -1562,7 +750,112 @@
         <w:jc w:val="left"/>
       </w:pPr>
       <w:r>
-        <w:t>The research gap addressed by the present study follows directly from these conclusions. A calibrated and validated HEC-HMS rainfall–runoff model of the Gumai Beel catchment will provide the first quantitative estimate of the runoff volumes and hydrograph dynamics that the Ichamoti drainage corridor is required to convey, thereby establishing the hydrological foundation for drainage design and for evaluation of the ongoing river rejuvenation programme. Methodologically, the study extends the Bangladeshi HEC-HMS literature into an ultra-flat, wetland-dominated, and data-scarce environment in which DEM limitations, seasonal alternation of land cover, and wetland storage behaviour present challenges that have been identified but not resolved in previous work. The methods adopted in the following chapter, comprising comparative evaluation of loss and transform formulations, field-verified catchment delineation, gauge-primary precipitation forcing supplemented by reanalysis data, split-sample testing informed by current calibration research, and performance evaluation using purpose-matched objective functions together with multiple statistical indicators, are each grounded in the literature reviewed in this chapter (Althoff &amp; Rodrigues, 2021; Shen et al., 2022; Turkar et al., 2025).</w:t>
+        <w:t>HEC-HMS is not the only framework available for rainfall–runoff simulation. SWAT, a widely used semi-distributed watershed model, is particularly suited to long-term assessments involving land-use management, agricultural practice, sediment transport, and nutrient dynamics. The essential difference between the two lies in their objectives: HEC-HMS concentrates on precipitation–runoff transformation and hydrograph simulation, whereas SWAT represents the broader watershed water balance and land-management processes. Direct comparison in the Atrai–Karatoa River Basin of Bangladesh found that SWAT performed better for high flows under daily simulation while HEC-HMS was more accurate for medium flows, leading to the conclusion that model selection should follow from the intended application and the hydrological character of the watershed (Moniruzzaman &amp; Mahalder, 2026).</w:t>
+      </w:r>
+    </w:p>
+    <w:p>
+      <w:pPr>
+        <w:ind w:firstLine="720"/>
+        <w:jc w:val="left"/>
+      </w:pPr>
+      <w:r>
+        <w:t>Machine-learning approaches, including artificial neural networks and long short-term memory networks, have also gained prominence. These models capture nonlinear rainfall–runoff relationships and can achieve high predictive accuracy where large training datasets exist, but their physical interpretability is lower than that of conceptual hydrological models. HEC-HMS is appropriate for the present study because the primary objective is to represent the rainfall–runoff response of a specific watershed through physically interpretable components, allowing rainfall losses, runoff transformation, baseflow, and channel routing to be examined separately.</w:t>
+      </w:r>
+    </w:p>
+    <w:p>
+      <w:r>
+        <w:rPr>
+          <w:b/>
+        </w:rPr>
+        <w:t>2.17 Challenges of rainfall–runoff modelling in Bangladesh</w:t>
+      </w:r>
+    </w:p>
+    <w:p>
+      <w:pPr>
+        <w:ind w:firstLine="720"/>
+        <w:jc w:val="left"/>
+      </w:pPr>
+      <w:r>
+        <w:t>Four challenges condition rainfall–runoff modelling in Bangladesh. The first is the spatial variability of rainfall: monsoon precipitation, particularly during convective events, can vary substantially over short distances, so that a limited gauge network introduces uncertainty into estimates of mean areal precipitation. The second is the scarcity of discharge data, since many local rivers and wetland systems lack long-term gauging stations, complicating calibration and validation; this constraint applies with particular force to smaller catchments such as the Gumai Beel–Ichamoti system. The third is the complexity of interaction among rivers, floodplains, wetlands, and groundwater, which conventional rainfall–runoff models necessarily simplify, at the cost of potential errors in baseflow, storage, and recession behaviour. The fourth is the seasonal variation of land use and wetland storage in agricultural wetland environments, where land may be cultivated in one season and inundated in another, so that runoff characteristics do not remain constant through the year.</w:t>
+      </w:r>
+    </w:p>
+    <w:p>
+      <w:pPr>
+        <w:ind w:firstLine="720"/>
+        <w:jc w:val="left"/>
+      </w:pPr>
+      <w:r>
+        <w:t>The Bangladeshi studies reviewed above demonstrate that HEC-HMS delivers satisfactory rainfall–runoff simulation where suitable rainfall and discharge records exist, while underscoring the need for careful calibration, appropriate selection of model components, and explicit attention to local hydrological characteristics (Haque et al., 2024; Moniruzzaman &amp; Mahalder, 2026; Nujhat et al., 2024; Nur et al., 2022).</w:t>
+      </w:r>
+    </w:p>
+    <w:p>
+      <w:r>
+        <w:rPr>
+          <w:b/>
+        </w:rPr>
+        <w:t>2.18 Research gap</w:t>
+      </w:r>
+    </w:p>
+    <w:p>
+      <w:pPr>
+        <w:ind w:firstLine="720"/>
+        <w:jc w:val="left"/>
+      </w:pPr>
+      <w:r>
+        <w:t>The reviewed literature establishes that HEC-HMS has been applied extensively to rainfall–runoff simulation and flood assessment under diverse environmental conditions, and that recent research increasingly integrates the model with GIS, remote sensing, DEM-derived watershed characteristics, and hydraulic models. Several gaps nevertheless remain relevant to the present study.</w:t>
+      </w:r>
+    </w:p>
+    <w:p>
+      <w:pPr>
+        <w:ind w:firstLine="720"/>
+        <w:jc w:val="left"/>
+      </w:pPr>
+      <w:r>
+        <w:t>First, recent HEC-HMS research in Bangladesh has concentrated on comparatively large or well-studied river basins, including the Khowai, Halda, Old Brahmaputra, Gumti, and Atrai–Karatoa systems. These studies furnish valuable methodological precedents but do not necessarily represent the hydrological behaviour of smaller wetland-dominated catchments. Second, rainfall–runoff modelling of beel–river systems has received limited attention. Wetlands and beels act as temporary storage that alters the timing and magnitude of downstream runoff; international evidence confirms the influence of wetland storage on flood response (Tang et al., 2020), and Bangladeshi evidence confirms the strong seasonal and spatial variability of beel systems (Islam et al., 2021), yet few studies have carried these characteristics into a dedicated HEC-HMS framework for a Bangladeshi beel.</w:t>
+      </w:r>
+    </w:p>
+    <w:p>
+      <w:pPr>
+        <w:ind w:firstLine="720"/>
+        <w:jc w:val="left"/>
+      </w:pPr>
+      <w:r>
+        <w:t>Third, the literature search undertaken for the present study identified very limited recent peer-reviewed research addressing the Gumai Beel–Ichamoti River system with HEC-HMS, indicating a local-scale research gap rather than any general absence of hydrological modelling research in Bangladesh. Fourth, although previous Bangladeshi studies demonstrate the value of integrating observed rainfall, discharge, and GIS-derived DEM, land-use, and soil information, these approaches have been applied predominantly to larger conventional river basins; their extension to an agricultural wetland system such as Gumai Beel can yield new information on the rainfall–runoff response of a low-lying catchment. Finally, a calibrated and validated HEC-HMS model of Gumai Beel would provide the foundation for subsequent hydrological and hydraulic investigation, since the validated model could be linked with hydraulic models to examine flood extent, water levels, drainage behaviour, or future hydrological scenarios.</w:t>
+      </w:r>
+    </w:p>
+    <w:p>
+      <w:r>
+        <w:rPr>
+          <w:b/>
+        </w:rPr>
+        <w:t>2.19 Relevance of the present study</w:t>
+      </w:r>
+    </w:p>
+    <w:p>
+      <w:pPr>
+        <w:ind w:firstLine="720"/>
+        <w:jc w:val="left"/>
+      </w:pPr>
+      <w:r>
+        <w:t>The present study addresses the identified gap by developing a rainfall–runoff model of the Gumai Beel–Ichamoti River system in HEC-HMS, integrating rainfall and discharge observations with spatial information derived from GIS and DEM datasets. Watershed delineation supplies the spatial structure of the model, rainfall provides the primary meteorological forcing, and observed discharge supports calibration and validation, so that the reliability of the simulated runoff can be evaluated against appropriate statistical performance indicators.</w:t>
+      </w:r>
+    </w:p>
+    <w:p>
+      <w:pPr>
+        <w:ind w:firstLine="720"/>
+        <w:jc w:val="left"/>
+      </w:pPr>
+      <w:r>
+        <w:t>The study derives particular significance from the character of its setting. Gumai Beel is a low-lying agricultural and wetland environment whose hydrological response is expected to reflect not only rainfall but also topography, land use, soil characteristics, drainage connectivity, and temporary wetland storage. HEC-HMS provides an interpretable framework for examining these controls, since rainfall losses, direct-runoff transformation, baseflow, and routing are represented as separable components whose relative influence can be investigated individually.</w:t>
+      </w:r>
+    </w:p>
+    <w:p>
+      <w:pPr>
+        <w:ind w:firstLine="720"/>
+        <w:jc w:val="left"/>
+      </w:pPr>
+      <w:r>
+        <w:t>The resulting model also establishes a foundation for subsequent research. The simulated discharge hydrographs could serve as inputs to HEC-RAS for hydraulic flood modelling, following the integrated HEC-HMS–HEC-RAS framework applied to the Old Brahmaputra floodplain (Zhang et al., 2022). The present study therefore contributes both to the hydrological understanding of Gumai Beel and to the wider application of GIS-supported HEC-HMS modelling in small, wetland-dominated catchments of Bangladesh.</w:t>
       </w:r>
     </w:p>
     <w:p>
@@ -1577,14 +870,6 @@
           <w:sz w:val="28"/>
         </w:rPr>
         <w:t>References</w:t>
-      </w:r>
-    </w:p>
-    <w:p>
-      <w:pPr>
-        <w:ind w:left="720" w:hanging="720"/>
-      </w:pPr>
-      <w:r>
-        <w:t>Admas, M., Asrade, T. M., &amp; Cherie, W. D. (2025). Application of the HEC-RAS and HEC-HMS models for flood risk analysis in the Gumara River, Upper Blue Nile Basin, Ethiopia. Advances in Meteorology, 2025, Article 5092932. https://doi.org/10.1155/adme/5092932</w:t>
       </w:r>
     </w:p>
     <w:p>
@@ -1608,38 +893,6 @@
         <w:ind w:left="720" w:hanging="720"/>
       </w:pPr>
       <w:r>
-        <w:t>Ali, M. S., &amp; Hasan, M. M. (2022). Environmental flow assessment of Gorai River in Bangladesh: A comparative analysis of different hydrological methods. Heliyon, 8(7), Article e09857. https://doi.org/10.1016/j.heliyon.2022.e09857</w:t>
-      </w:r>
-    </w:p>
-    <w:p>
-      <w:pPr>
-        <w:ind w:left="720" w:hanging="720"/>
-      </w:pPr>
-      <w:r>
-        <w:t>Aliye, M. A., Aga, A. O., Tadesse, T., &amp; Yohannes, P. (2020). Evaluating the performance of HEC-HMS and SWAT hydrological models in simulating the rainfall-runoff process for data scarce region of Ethiopian Rift Valley Lake Basin. Open Journal of Modern Hydrology, 10(4), 105–122. https://doi.org/10.4236/ojmh.2020.104007</w:t>
-      </w:r>
-    </w:p>
-    <w:p>
-      <w:pPr>
-        <w:ind w:left="720" w:hanging="720"/>
-      </w:pPr>
-      <w:r>
-        <w:t>Althoff, D., &amp; Rodrigues, L. N. (2021). Goodness-of-fit criteria for hydrological models: Model calibration and performance assessment. Journal of Hydrology, 600, Article 126674. https://doi.org/10.1016/j.jhydrol.2021.126674</w:t>
-      </w:r>
-    </w:p>
-    <w:p>
-      <w:pPr>
-        <w:ind w:left="720" w:hanging="720"/>
-      </w:pPr>
-      <w:r>
-        <w:t>Bhattacharjee, S., Islam, M. T., Kabir, M. E., &amp; Kabir, M. M. (2021). Land-use and land-cover change detection in a north-eastern wetland ecosystem of Bangladesh using remote sensing and GIS techniques. Earth Systems and Environment, 5(2), 319–340. https://doi.org/10.1007/s41748-021-00228-3</w:t>
-      </w:r>
-    </w:p>
-    <w:p>
-      <w:pPr>
-        <w:ind w:left="720" w:hanging="720"/>
-      </w:pPr>
-      <w:r>
         <w:t>Datta, S., Karmakar, S., Mezbahuddin, S., Chaudhary, B. S., Hossain, M. M., Hoque, M. E., Abdullah-Al-Mamun, M. M., &amp; Baul, T. K. (2022). The limits of watershed delineation: Implications of different DEMs, DEM resolutions, and area threshold values. Hydrology Research, 53(8), 1047–1062. https://doi.org/10.2166/nh.2022.126</w:t>
       </w:r>
     </w:p>
@@ -1656,14 +909,6 @@
         <w:ind w:left="720" w:hanging="720"/>
       </w:pPr>
       <w:r>
-        <w:t>Hamdan, A. N. A., Almuktar, S., &amp; Scholz, M. (2021). Rainfall-runoff modeling using the HEC-HMS model for the Al-Adhaim River catchment, northern Iraq. Hydrology, 8(2), Article 58. https://doi.org/10.3390/hydrology8020058</w:t>
-      </w:r>
-    </w:p>
-    <w:p>
-      <w:pPr>
-        <w:ind w:left="720" w:hanging="720"/>
-      </w:pPr>
-      <w:r>
         <w:t>Haque, M. B., Karmakar, S., &amp; Hossain, M. M. (2024). Rainfall-runoff modeling using the HEC-HMS flow modeling framework for the Halda River catchment, Bangladesh [Preprint]. Research Square. https://doi.org/10.21203/rs.3.rs-3824469/v1</w:t>
       </w:r>
     </w:p>
@@ -1672,7 +917,7 @@
         <w:ind w:left="720" w:hanging="720"/>
       </w:pPr>
       <w:r>
-        <w:t>Haque, S., Ali, M. M., Islam, A. K. M. S., &amp; Khan, M. J. U. (2021). Changes in flow and sediment load of poorly gauged Brahmaputra river basin under an extreme climate scenario. Journal of Water and Climate Change, 12(3), 937–954. https://doi.org/10.2166/wcc.2020.219</w:t>
+        <w:t>Herbei, M. V., Bădăluță-Minda, C., Popescu, C. A., Horablaga, A., Dragomir, L. O., Popescu, G., Kader, S., &amp; Sestras, P. (2024). Rainfall-runoff modeling based on HEC-HMS model: A case study in an area with increased groundwater discharge potential. Frontiers in Water, 6, Article 1474990. https://doi.org/10.3389/frwa.2024.1474990</w:t>
       </w:r>
     </w:p>
     <w:p>
@@ -1680,7 +925,7 @@
         <w:ind w:left="720" w:hanging="720"/>
       </w:pPr>
       <w:r>
-        <w:t>Hersbach, H., Bell, B., Berrisford, P., Hirahara, S., Horányi, A., Muñoz-Sabater, J., Nicolas, J., Peubey, C., Radu, R., Schepers, D., Simmons, A., Soci, C., Abdalla, S., Abellan, X., Balsamo, G., Bechtold, P., Biavati, G., Bidlot, J., Bonavita, M., … Thépaut, J.-N. (2020). The ERA5 global reanalysis. Quarterly Journal of the Royal Meteorological Society, 146(730), 1999–2049. https://doi.org/10.1002/qj.3803</w:t>
+        <w:t>Islam, M. F., Middelkoop, H., Schot, P. P., Dekker, S. C., &amp; Griffioen, J. (2021). Spatial and seasonal variability of sediment accumulation potential through controlled flooding of the beels located in the polders of the Ganges-Brahmaputra-Meghna delta of Southwest Bangladesh. Hydrological Processes, 35(4), Article e14119. https://doi.org/10.1002/hyp.14119</w:t>
       </w:r>
     </w:p>
     <w:p>
@@ -1688,15 +933,7 @@
         <w:ind w:left="720" w:hanging="720"/>
       </w:pPr>
       <w:r>
-        <w:t>Horton, P., Schaefli, B., &amp; Kauzlaric, M. (2022). Why do we have so many different hydrological models? A review based on the case of Switzerland. WIREs Water, 9(1), Article e1574. https://doi.org/10.1002/wat2.1574</w:t>
-      </w:r>
-    </w:p>
-    <w:p>
-      <w:pPr>
-        <w:ind w:left="720" w:hanging="720"/>
-      </w:pPr>
-      <w:r>
-        <w:t>Jawad, M. (2024). Evaluation of near real-time Global Precipitation Measurement (GPM) precipitation products for hydrological modelling and flood inundation mapping of sparsely gauged large transboundary basins—A case study of the Brahmaputra basin. Remote Sensing, 16(10), Article 1756. https://doi.org/10.3390/rs16101756</w:t>
+        <w:t>Jawale, P. S., &amp; Thube, A. D. (2025). Rainfall-runoff modeling of urban floods using GIS and HEC-HMS. MethodsX, 15, Article 103437. https://doi.org/10.1016/j.mex.2025.103437</w:t>
       </w:r>
     </w:p>
     <w:p>
@@ -1736,23 +973,7 @@
         <w:ind w:left="720" w:hanging="720"/>
       </w:pPr>
       <w:r>
-        <w:t>Parvez, M., Sadat, N., Tasnim, F., &amp; Nejhum, I. J. (2021). Identifying the causes of waterlogging on people’s perception towards a resilient community: A case study on Pabna Municipality, Bangladesh. Ecofeminism and Climate Change, 2(3), 110–126. https://doi.org/10.1108/EFCC-11-2020-0033</w:t>
-      </w:r>
-    </w:p>
-    <w:p>
-      <w:pPr>
-        <w:ind w:left="720" w:hanging="720"/>
-      </w:pPr>
-      <w:r>
-        <w:t>Pradhan, R. K., Markonis, Y., Vargas Godoy, M. R., Villalba-Pradas, A., Andreadis, K. M., Nikolopoulos, E. I., Papalexiou, S. M., Rahim, A., Tapiador, F. J., &amp; Hanel, M. (2022). Review of GPM IMERG performance: A global perspective. Remote Sensing of Environment, 268, Article 112754. https://doi.org/10.1016/j.rse.2021.112754</w:t>
-      </w:r>
-    </w:p>
-    <w:p>
-      <w:pPr>
-        <w:ind w:left="720" w:hanging="720"/>
-      </w:pPr>
-      <w:r>
-        <w:t>Raihan, F., Beaumont, L. J., Maina, J., Saiful Islam, A. K. M., &amp; Harrison, S. P. (2020). Simulating streamflow in the Upper Halda Basin of southeastern Bangladesh using SWAT model. Hydrological Sciences Journal, 65(1), 138–151. https://doi.org/10.1080/02626667.2019.1682149</w:t>
+        <w:t>Odey, G., &amp; Cho, Y. (2025). Event-based vs. continuous hydrological modeling with HEC-HMS: A review of use cases, methodologies, and performance metrics. Hydrology, 12(2), Article 39. https://doi.org/10.3390/hydrology12020039</w:t>
       </w:r>
     </w:p>
     <w:p>
@@ -1776,22 +997,6 @@
         <w:ind w:left="720" w:hanging="720"/>
       </w:pPr>
       <w:r>
-        <w:t>Salimi, S., Almuktar, S. A. A. A. N., &amp; Scholz, M. (2021). Impact of climate change on wetland ecosystems: A critical review of experimental wetlands. Journal of Environmental Management, 286, Article 112160. https://doi.org/10.1016/j.jenvman.2021.112160</w:t>
-      </w:r>
-    </w:p>
-    <w:p>
-      <w:pPr>
-        <w:ind w:left="720" w:hanging="720"/>
-      </w:pPr>
-      <w:r>
-        <w:t>Shen, H., Tolson, B. A., &amp; Mai, J. (2022). Time to update the split-sample approach in hydrological model calibration. Water Resources Research, 58(3), Article e2021WR031523. https://doi.org/10.1029/2021WR031523</w:t>
-      </w:r>
-    </w:p>
-    <w:p>
-      <w:pPr>
-        <w:ind w:left="720" w:hanging="720"/>
-      </w:pPr>
-      <w:r>
         <w:t>Shi, W., &amp; Wang, N. (2020). An improved SCS-CN method incorporating slope, soil moisture, and storm duration factors for runoff prediction. Water, 12(5), Article 1335. https://doi.org/10.3390/w12051335</w:t>
       </w:r>
     </w:p>
@@ -1808,7 +1013,15 @@
         <w:ind w:left="720" w:hanging="720"/>
       </w:pPr>
       <w:r>
-        <w:t>Tk 1,554cr project to revive dying Ichamati. (2024, November 26). The Daily Star. https://www.thedailystar.net/news/bangladesh/news/tk-1554cr-project-revive-dying-ichamati-3555931</w:t>
+        <w:t>Souley Tangam, I., Yonaba, R., Niang, D., Adamou, M. M., Keïta, A., &amp; Karambiri, H. (2024). Daily simulation of the rainfall–runoff relationship in the Sirba River Basin in West Africa: Insights from the HEC-HMS model. Hydrology, 11(3), Article 34. https://doi.org/10.3390/hydrology11030034</w:t>
+      </w:r>
+    </w:p>
+    <w:p>
+      <w:pPr>
+        <w:ind w:left="720" w:hanging="720"/>
+      </w:pPr>
+      <w:r>
+        <w:t>Tang, Y., Leon, A. S., &amp; Kavvas, M. L. (2020). Impact of size and location of wetlands on watershed-scale flood control. Water Resources Management, 34(5), 1693–1707. https://doi.org/10.1007/s11269-020-02518-3</w:t>
       </w:r>
     </w:p>
     <w:p>
@@ -1825,22 +1038,6 @@
       </w:pPr>
       <w:r>
         <w:t>U.S. Army Corps of Engineers, Hydrologic Engineering Center. (n.d.). HEC-HMS technical reference manual. Retrieved August 17, 2026, from https://www.hec.usace.army.mil/confluence/hmsdocs/hmstrm</w:t>
-      </w:r>
-    </w:p>
-    <w:p>
-      <w:pPr>
-        <w:ind w:left="720" w:hanging="720"/>
-      </w:pPr>
-      <w:r>
-        <w:t>Uuemaa, E., Ahi, S., Montibeller, B., Muru, M., &amp; Kmoch, A. (2020). Vertical accuracy of freely available global digital elevation models (ASTER, AW3D30, MERIT, TanDEM-X, SRTM, and NASADEM). Remote Sensing, 12(21), Article 3482. https://doi.org/10.3390/rs12213482</w:t>
-      </w:r>
-    </w:p>
-    <w:p>
-      <w:pPr>
-        <w:ind w:left="720" w:hanging="720"/>
-      </w:pPr>
-      <w:r>
-        <w:t>Yankyera, S., &amp; Alam, B. M. (2025). Five decades of transformation due to human-environment stressors: Land cover, vegetation, and land surface temperature change analysis in the largest wetland ecosystem in Bangladesh. Earth Systems and Environment, 9(2), 589–604. https://doi.org/10.1007/s41748-025-00652-9</w:t>
       </w:r>
     </w:p>
     <w:p>

</xml_diff>

<commit_message>
Ensure citation in every paragraph and moderate prose register
Co-authored-by: Bit Raven <bitraveneth@users.noreply.github.com>
</commit_message>
<xml_diff>
--- a/thesis/Literature_Review_Gumai_Beel_Ichamoti_HEC-HMS.docx
+++ b/thesis/Literature_Review_Gumai_Beel_Ichamoti_HEC-HMS.docx
@@ -70,7 +70,7 @@
         <w:jc w:val="left"/>
       </w:pPr>
       <w:r>
-        <w:t>The present study focuses on rainfall–runoff modelling of the Gumai Beel–Ichamoti River system using HEC-HMS. Gumai Beel represents a low-lying wetland and agricultural environment, while the Ichamoti River forms an important drainage component of the surrounding landscape. The hydrological response of such a system may differ from the conventional upland watersheds. Because wetland storage, seasonal inundation, drainage connectivity, and agricultural land use can influence the timing and magnitude of runoff. Therefore, a review of rainfall–runoff processes, hydrological modelling approaches, HEC-HMS methodology, GIS integration, wetland hydrology, and previous Bangladesh applications is necessary to establish the scientific basis for the present research.</w:t>
+        <w:t>The present study focuses on rainfall–runoff modelling of the Gumai Beel–Ichamoti River system using HEC-HMS. Gumai Beel represents a low-lying wetland and agricultural environment, while the Ichamoti River forms an important drainage component of the surrounding landscape. The hydrological response of such a system may differ from conventional upland watersheds because wetland storage, seasonal inundation, drainage connectivity, and agricultural land use can influence the timing and magnitude of runoff (Adnan et al., 2020; Tang et al., 2020). Therefore, a review of rainfall–runoff processes, hydrological modelling approaches, HEC-HMS methodology, GIS integration, wetland hydrology, and previous Bangladesh applications is necessary to establish the scientific basis for the present research (Labade et al., 2025; Sahu et al., 2023).</w:t>
       </w:r>
     </w:p>
     <w:p>
@@ -140,7 +140,7 @@
         <w:jc w:val="left"/>
       </w:pPr>
       <w:r>
-        <w:t>Rainfall constitutes the primary meteorological forcing of any rainfall–runoff model, and its depth, intensity, duration, frequency, and temporal and spatial distribution jointly determine the magnitude and timing of the runoff response. Small watersheds subjected to intense rainfall typically produce rapid, sharply peaked responses, whereas larger or flatter watersheds respond more gradually because greater storage capacity and longer travel distances attenuate and delay the flood wave.</w:t>
+        <w:t>Rainfall is the primary meteorological input to rainfall–runoff models, and its depth, intensity, duration, frequency, and temporal and spatial distribution together determine the magnitude and timing of runoff. Small watersheds under intense rainfall usually produce rapid, sharply peaked responses. In contrast, larger or flatter watersheds respond more slowly because greater storage and longer travel distances attenuate and delay the flood wave (Sahu et al., 2023; Souley Tangam et al., 2024).</w:t>
       </w:r>
     </w:p>
     <w:p>
@@ -149,7 +149,7 @@
         <w:jc w:val="left"/>
       </w:pPr>
       <w:r>
-        <w:t>The temporal resolution of the rainfall input warrants deliberate selection. High-resolution records resolve short-duration storm bursts and rainfall peaks, whereas daily totals smooth sub-daily variability and may therefore understate the intensity of convective events. The appropriate resolution consequently depends on the response time of the watershed and on the objective of the simulation: flood-peak reproduction demands finer resolution than seasonal water-balance assessment.</w:t>
+        <w:t>The temporal resolution of the rainfall input must be chosen deliberately. High-resolution records capture short-duration storm bursts and rainfall peaks, whereas daily totals smooth this variability and may understate the intensity of convective events. The appropriate resolution therefore depends on the response time of the watershed and on the purpose of the simulation. Evidence from the Punpun River Basin illustrates this dependence: models built at daily, monthly, and monsoonal scales from the same data produced clearly different performance, with the monthly formulation performing best (Ranjan &amp; Singh, 2022).</w:t>
       </w:r>
     </w:p>
     <w:p>
@@ -158,7 +158,7 @@
         <w:jc w:val="left"/>
       </w:pPr>
       <w:r>
-        <w:t>The spatial representation of rainfall requires equal care, because a single rain gauge rarely characterises the precipitation received across a heterogeneous catchment. Areal precipitation may instead be estimated from multiple stations using Thiessen polygons, inverse-distance weighting, or gridded rainfall products. The value of dense gauge input is illustrated in the Sirba River Basin of West Africa, where a daily HEC-HMS model was driven by observations from 13 meteorological stations, and rainfall representation proved integral to model performance (Souley Tangam et al., 2024).</w:t>
+        <w:t>The spatial representation of rainfall requires equal care, because a single rain gauge rarely represents the precipitation received across a heterogeneous catchment. Areal precipitation is therefore estimated from multiple stations using Thiessen polygons, inverse-distance weighting, or gridded rainfall products. In the Sirba River Basin of West Africa, a daily HEC-HMS model driven by observations from 13 meteorological stations confirmed that rainfall representation is a central component of successful rainfall–runoff modelling (Souley Tangam et al., 2024).</w:t>
       </w:r>
     </w:p>
     <w:p>
@@ -167,7 +167,7 @@
         <w:jc w:val="left"/>
       </w:pPr>
       <w:r>
-        <w:t>Uncertainty in the precipitation input propagates directly into simulated streamflow, and even a well-calibrated model will produce unreliable output if the forcing does not represent the rainfall actually received by the catchment. This consideration carries particular weight in data-limited regions where gauge networks are sparse, including much of rural Bangladesh.</w:t>
+        <w:t>Uncertainty in the precipitation input propagates directly into simulated streamflow. Even a well-calibrated model will produce unreliable output if the forcing does not represent the rainfall actually received by the catchment. This issue is most serious in data-limited regions where gauges are sparse, a condition that applies to many Bangladeshi catchments, including the smaller basins for which HEC-HMS has been used to generate runoff information from limited observations (Nur et al., 2022).</w:t>
       </w:r>
     </w:p>
     <w:p>
@@ -185,7 +185,7 @@
         <w:jc w:val="left"/>
       </w:pPr>
       <w:r>
-        <w:t>Soil properties exert a first-order control on the partitioning of rainfall between infiltration and surface runoff. Texture, hydraulic conductivity, porosity, profile depth, and antecedent moisture jointly define the capacity of the soil column to absorb and store incident rainfall, and therefore the depth of precipitation excess available for overland flow.</w:t>
+        <w:t>Soil properties strongly influence the partitioning of rainfall between infiltration and surface runoff. Soil texture, hydraulic conductivity, porosity, profile depth, and antecedent moisture together define how much rainfall the soil column can absorb and store, and therefore how much excess remains for overland flow. Antecedent moisture is especially influential, and modified curve-number formulations that account for soil moisture and storm duration have improved runoff prediction substantially compared with the standard method (Shi &amp; Wang, 2020).</w:t>
       </w:r>
     </w:p>
     <w:p>
@@ -194,7 +194,7 @@
         <w:jc w:val="left"/>
       </w:pPr>
       <w:r>
-        <w:t>Within the SCS-CN framework, these properties enter the model through the hydrologic soil group classification, which ranks soils by infiltration and runoff potential: soils of low infiltration capacity are assigned to groups of higher runoff potential and correspondingly higher curve numbers. Soil information is therefore routinely combined with land-use and land-cover data to derive composite curve numbers for HEC-HMS parameterisation (Soulis, 2021). In the Punpun River Basin, ArcGIS-prepared soil, land-use, and slope layers supplied the curve-number input to a family of HEC-HMS models whose performance, evaluated using R², NSE, PBIAS, and RSR, confirmed the utility of spatial soil and land-use information for rainfall–runoff simulation (Ranjan &amp; Singh, 2022).</w:t>
+        <w:t>Within the SCS-CN framework, soil information enters the model through hydrologic soil groups, which rank soils by infiltration and runoff potential; soils with low infiltration capacity receive higher runoff potential and higher curve numbers (Soulis, 2021). Soil data are therefore combined routinely with land-use and land-cover information to derive composite curve numbers for HEC-HMS. In the Punpun River Basin, soil, land-use, and slope layers prepared in ArcGIS supplied the curve numbers for a set of HEC-HMS models whose performance, judged by R², NSE, PBIAS, and RSR, confirmed the value of spatial soil and land-use information for rainfall–runoff simulation (Ranjan &amp; Singh, 2022).</w:t>
       </w:r>
     </w:p>
     <w:p>
@@ -212,7 +212,7 @@
         <w:jc w:val="left"/>
       </w:pPr>
       <w:r>
-        <w:t>Land use and land cover condition the rainfall–runoff response by governing interception, infiltration opportunity, surface roughness, evapotranspiration, and surface storage. Forested surfaces generally intercept and infiltrate more rainfall than developed surfaces, while agricultural land exhibits variable behaviour that depends on soil condition, cultivation practice, crop cover, and seasonal waterlogging.</w:t>
+        <w:t>Land use and land cover shape the rainfall–runoff response by controlling interception, infiltration, surface roughness, evapotranspiration, and surface storage. Forested surfaces generally intercept and infiltrate more rainfall than developed surfaces, while agricultural land shows variable behaviour that depends on soil condition, cultivation practice, crop cover, and seasonal waterlogging (Dibaba et al., 2020).</w:t>
       </w:r>
     </w:p>
     <w:p>
@@ -221,7 +221,7 @@
         <w:jc w:val="left"/>
       </w:pPr>
       <w:r>
-        <w:t>Land-use information is indispensable for SCS-CN-based modelling because curve numbers are assigned to combinations of land-use class and hydrologic soil group, so that any change in land use redistributes runoff potential across the catchment. Recent applications have accordingly integrated land-use and soil datasets through GIS: in the Punpun River Basin, LULC, soil, and slope maps prepared in ArcGIS supplied the curve numbers for HEC-HMS (Ranjan &amp; Singh, 2022), and spatially distributed curve-number estimation from GIS-derived land-use and soil layers has likewise supported urban flood simulation (Jawale &amp; Thube, 2025).</w:t>
+        <w:t>Land-use information is essential for SCS-CN-based modelling because curve numbers are assigned to combinations of land-use class and hydrologic soil group, so any change in land use redistributes runoff potential across the catchment (Soulis, 2021). Recent applications have therefore integrated land-use and soil datasets through GIS. In the Punpun River Basin, LULC, soil, and slope maps prepared in ArcGIS supplied the curve numbers for HEC-HMS (Ranjan &amp; Singh, 2022), and spatially distributed curve-number estimation from GIS-derived land-use and soil layers has likewise supported urban flood simulation (Jawale &amp; Thube, 2025).</w:t>
       </w:r>
     </w:p>
     <w:p>
@@ -230,7 +230,7 @@
         <w:jc w:val="left"/>
       </w:pPr>
       <w:r>
-        <w:t>For Gumai Beel, land-use characteristics carry particular significance because the catchment combines agricultural activity with seasonal wetland conditions. The alternation between cultivation and inundation across the annual cycle implies that the effective runoff response of the catchment is itself seasonal, and land-use information therefore provides an essential spatial basis for parameterising the rainfall–runoff model.</w:t>
+        <w:t>For Gumai Beel, land-use characteristics are particularly relevant because the catchment combines agricultural activity with seasonal wetland conditions. Land in such environments alternates between cultivation and inundation across the year, so the effective runoff response of the catchment is itself seasonal, as shown for the beels of the Ganges–Brahmaputra–Meghna delta, where hydrological behaviour varies strongly with the seasonal flow regime (Islam et al., 2021). Land-use information therefore provides an essential spatial basis for parameterising the rainfall–runoff model.</w:t>
       </w:r>
     </w:p>
     <w:p>
@@ -248,7 +248,7 @@
         <w:jc w:val="left"/>
       </w:pPr>
       <w:r>
-        <w:t>Topography governs the direction, velocity, and concentration of water movement across a watershed. Elevation, slope, drainage density, stream order, flow length, and basin shape together determine the time required for runoff generated at any point to reach the outlet, and hence the timing and shape of the outlet hydrograph.</w:t>
+        <w:t>Topography controls the direction, velocity, and concentration of water movement within a watershed. Elevation, slope, drainage density, stream order, flow length, and basin shape together determine the time required for runoff to reach the outlet, and hence the timing and shape of the outlet hydrograph (Sahu et al., 2023).</w:t>
       </w:r>
     </w:p>
     <w:p>
@@ -257,7 +257,7 @@
         <w:jc w:val="left"/>
       </w:pPr>
       <w:r>
-        <w:t>Digital Elevation Models (DEMs) consequently occupy a central position in GIS-based hydrological modelling. Processing of a DEM yields flow direction, flow accumulation, stream networks, watershed boundaries, sub-basins, and longest flow paths, from which the HEC-HMS basin model is constructed. DEM-derived flow direction, flow accumulation, stream ordering, and basin delineation form the foundation of current GIS–HEC-HMS modelling workflows (Jawale &amp; Thube, 2025), although delineation outcomes remain sensitive to the choice of DEM product, its resolution, and the stream-definition threshold, particularly in low-relief terrain (Datta et al., 2022).</w:t>
+        <w:t>Digital Elevation Models (DEMs) are therefore central to GIS-based hydrological modelling. Processing a DEM yields flow direction, flow accumulation, stream networks, watershed boundaries, sub-basins, and longest flow paths, from which the HEC-HMS basin model is constructed. DEM-derived flow direction, flow accumulation, stream ordering, and basin delineation form the foundation of current GIS–HEC-HMS workflows (Jawale &amp; Thube, 2025). Delineation outcomes, however, remain sensitive to the choice of DEM product, its resolution, and the stream-definition threshold, and this sensitivity is greatest in low-relief terrain (Datta et al., 2022).</w:t>
       </w:r>
     </w:p>
     <w:p>
@@ -266,7 +266,7 @@
         <w:jc w:val="left"/>
       </w:pPr>
       <w:r>
-        <w:t>Topographic control assumes heightened importance in a low-gradient wetland system, where elevation differences of only a few decimetres can determine where water accumulates and how it drains. Accurate DEM processing and careful delineation of the Gumai Beel catchment are therefore essential components of the present study.</w:t>
+        <w:t>Topography matters most in low-gradient wetland systems, where elevation differences of only a few decimetres can decide where water accumulates and how it drains. Because DEM error in such terrain can approach the topographic signal itself, accurate DEM processing and careful delineation of the Gumai Beel catchment are essential components of the present study (Datta et al., 2022).</w:t>
       </w:r>
     </w:p>
     <w:p>
@@ -283,7 +283,7 @@
         <w:jc w:val="left"/>
       </w:pPr>
       <w:r>
-        <w:t>Hydrological models provide simplified representations of the natural hydrological cycle and are used to estimate variables such as runoff, streamflow, soil moisture, evapotranspiration, groundwater flow, and storage. Models differ both in their representation of hydrological processes and in their spatial and temporal structure.</w:t>
+        <w:t>Hydrological models provide simplified representations of the natural hydrological cycle and are used to estimate runoff, streamflow, soil moisture, evapotranspiration, groundwater flow, and storage. Models differ both in how they represent hydrological processes and in their spatial and temporal structure (Sahu et al., 2023).</w:t>
       </w:r>
     </w:p>
     <w:p>
@@ -292,7 +292,7 @@
         <w:jc w:val="left"/>
       </w:pPr>
       <w:r>
-        <w:t>With respect to process representation, models are broadly classified as empirical, conceptual, physically based, or data-driven. Empirical models establish statistical relationships between observed inputs and outputs; conceptual models represent the major hydrological processes through simplified storage structures; and physically based models solve governing physical equations with spatially distributed parameters. Artificial intelligence and machine-learning approaches have more recently been applied to capture nonlinear relationships between meteorological forcing and streamflow. Spatially, models are categorised as lumped, semi-distributed, or distributed according to whether the watershed is treated as a single homogeneous unit, subdivided into sub-units, or resolved over an explicit spatial grid.</w:t>
+        <w:t>With respect to process representation, models are broadly classified as empirical, conceptual, physically based, or data-driven. Empirical models establish statistical relationships between observed inputs and outputs; conceptual models represent the major processes through simplified storage structures; and physically based models solve governing physical equations with spatially distributed parameters. Artificial intelligence and machine-learning approaches have more recently been used to capture nonlinear relationships between meteorological inputs and streamflow. Spatially, models are categorised as lumped, semi-distributed, or distributed, according to whether the watershed is treated as one homogeneous unit, divided into sub-units, or resolved over an explicit grid (Sahu et al., 2023).</w:t>
       </w:r>
     </w:p>
     <w:p>
@@ -301,7 +301,7 @@
         <w:jc w:val="left"/>
       </w:pPr>
       <w:r>
-        <w:t>Model complexity should be selected in proportion to the characteristics of the watershed and the objective of the simulation, and HEC-HMS has been identified as a practical choice for dendritic drainage systems, with the SCS-CN and Soil Moisture Accounting methods dominating event-based and continuous applications respectively (Sahu et al., 2023). Model choice must also reflect data availability: heavily parameterised models requiring extensive datasets do not necessarily outperform simpler conceptual structures when observations are limited. This consideration is directly relevant to Bangladesh, where discharge measurements are spatially sparse and many local catchments remain poorly gauged.</w:t>
+        <w:t>Model complexity should match the characteristics of the watershed and the objective of the study. HEC-HMS has been identified as a practical choice for dendritic drainage systems, with the SCS-CN and Soil Moisture Accounting methods dominating event-based and continuous applications respectively (Sahu et al., 2023). Model choice must also reflect data availability, because heavily parameterised models do not necessarily outperform simpler conceptual structures when observations are limited (Odey &amp; Cho, 2025). This consideration is directly relevant to Bangladesh, where discharge measurements are spatially sparse and many local catchments remain poorly gauged (Nur et al., 2022).</w:t>
       </w:r>
     </w:p>
     <w:p>
@@ -318,7 +318,7 @@
         <w:jc w:val="left"/>
       </w:pPr>
       <w:r>
-        <w:t>HEC-HMS is a watershed-scale hydrological modelling system designed to simulate precipitation–runoff processes. The watershed is represented as a network of interconnected hydrological elements, including sub-basins, reaches, junctions, reservoirs, sources, and sinks (U.S. Army Corps of Engineers [USACE], n.d.). The principal advantage of the system lies in its modular structure: alternative methods may be selected to represent precipitation losses, the transformation of excess rainfall into direct runoff, baseflow, and channel routing, which allows the model to be adapted to widely differing watershed types and objectives.</w:t>
+        <w:t>HEC-HMS is a watershed-scale hydrological modelling system developed to simulate precipitation–runoff processes. The watershed is represented as a network of interconnected hydrological elements, including sub-basins, reaches, junctions, reservoirs, sources, and sinks (U.S. Army Corps of Engineers [USACE], n.d.). The principal advantage of the system is its modular structure: alternative methods can be selected for precipitation losses, runoff transformation, baseflow, and channel routing, which allows the model to be adapted to different watershed types and objectives (Sahu et al., 2023).</w:t>
       </w:r>
     </w:p>
     <w:p>
@@ -327,7 +327,7 @@
         <w:jc w:val="left"/>
       </w:pPr>
       <w:r>
-        <w:t>The model has been applied successfully under diverse climatic and physiographic conditions, performs particularly well in dendritic drainage systems, and depends critically on the selection of an appropriate loss method for reliable simulation (Sahu et al., 2023). Across the event-based and continuous application literature, the SCS-CN and SCS Unit Hydrograph methods dominate loss estimation and runoff transformation, Muskingum and recession approaches are most frequently adopted for routing and baseflow, and integration with GIS, remote sensing, and parameter-optimisation techniques continues to expand (Labade et al., 2025). Reliable simulation under diverse hydrological conditions has been confirmed repeatedly, with calibration quality, method selection, and the integration of hydro-meteorological and geospatial datasets identified as the decisive factors (Turkar et al., 2025). These characteristics make HEC-HMS well suited to the present study, in which a rainfall–runoff model is to be developed from rainfall and discharge observations together with spatial watershed information.</w:t>
+        <w:t>The model has been applied successfully under diverse climatic and physiographic conditions and performs particularly well in dendritic drainage systems, provided that an appropriate loss method is selected (Sahu et al., 2023). Across the application literature, the SCS-CN and SCS Unit Hydrograph methods dominate loss estimation and runoff transformation, Muskingum and recession approaches are most common for routing and baseflow, and integration with GIS, remote sensing, and parameter optimisation continues to expand (Labade et al., 2025). Reliable performance under varied hydrological conditions has been confirmed repeatedly, with calibration quality, method selection, and the integration of hydro-meteorological and geospatial datasets identified as the decisive factors (Turkar et al., 2025). These characteristics make HEC-HMS suitable for the present study, in which a rainfall–runoff model is developed from rainfall and discharge observations together with spatial watershed information.</w:t>
       </w:r>
     </w:p>
     <w:p>
@@ -353,7 +353,7 @@
         <w:jc w:val="left"/>
       </w:pPr>
       <w:r>
-        <w:t>The basin model supplies the spatial and hydrological structure of the watershed, representing the sub-basins and drainage network through which runoff is generated and conveyed. The number and configuration of sub-basins are determined by watershed morphology, drainage structure, the location of observation points, and the objectives of the simulation. For the Gumai Beel–Ichamoti system, delineation is of particular consequence because the basin model must capture the principal drainage pathways connecting the beel to the river. DEM-based GIS processing provides the flow-accumulation surfaces, stream networks, sub-basin boundaries, and outlet locations from which this structure is constructed.</w:t>
+        <w:t>The basin model provides the spatial and hydrological structure of the watershed. It represents the sub-basins and drainage network through which runoff is generated and conveyed, and its configuration depends on watershed morphology, drainage structure, the location of observation points, and the modelling objective (USACE, n.d.). For the Gumai Beel–Ichamoti system, delineation is especially important because the basin model must capture the main drainage pathways connecting the beel to the river. DEM-based GIS processing provides the flow accumulation, stream networks, sub-basin boundaries, and outlet locations from which this structure is built (Jawale &amp; Thube, 2025).</w:t>
       </w:r>
     </w:p>
     <w:p>
@@ -371,7 +371,7 @@
         <w:jc w:val="left"/>
       </w:pPr>
       <w:r>
-        <w:t>The meteorological model assigns precipitation and other atmospheric inputs to the basin model, using either gauge observations or gridded precipitation products according to availability. Spatial representation becomes critical wherever multiple rainfall stations fall within the watershed, and Thiessen polygons, gridded rainfall, or other interpolation schemes are used to estimate mean areal precipitation. A multi-station configuration of this kind underpinned the daily simulation of the Sirba River Basin, in which rainfall from 13 stations and discharge at a single outlet station over 2006–2020 supported a comparison of continuous and event-based simulation (Souley Tangam et al., 2024).</w:t>
+        <w:t>The meteorological model supplies precipitation and other meteorological inputs to HEC-HMS, using either gauge observations or gridded products according to availability (USACE, n.d.). Spatial representation becomes critical when several rainfall stations fall within the watershed, and Thiessen polygons, gridded rainfall, or other interpolation methods are then used to estimate mean areal precipitation. A multi-station configuration of this kind supported the daily simulation of the Sirba River Basin, where rainfall from 13 stations and discharge at one outlet station over 2006–2020 enabled a comparison of continuous and event-based simulation (Souley Tangam et al., 2024).</w:t>
       </w:r>
     </w:p>
     <w:p>
@@ -389,7 +389,7 @@
         <w:jc w:val="left"/>
       </w:pPr>
       <w:r>
-        <w:t>The loss model estimates the fraction of rainfall withheld from direct runoff through infiltration, interception, and initial abstraction. Available methods include the SCS Curve Number, Initial and Constant, Green–Ampt, Deficit and Constant, and Soil Moisture Accounting formulations, and the selection among them depends on the modelling objective and the information available (USACE, n.d.).</w:t>
+        <w:t>The loss model estimates the fraction of rainfall that does not become surface runoff, accounting for infiltration, interception, and initial abstraction. Available methods include the SCS Curve Number, Initial and Constant, Green–Ampt, Deficit and Constant, and Soil Moisture Accounting formulations, and the choice among them depends on the modelling objective and the information available (USACE, n.d.).</w:t>
       </w:r>
     </w:p>
     <w:p>
@@ -398,7 +398,7 @@
         <w:jc w:val="left"/>
       </w:pPr>
       <w:r>
-        <w:t>The SCS-CN method is the most widely applied loss formulation in HEC-HMS practice because it provides a simple, well-documented relationship between rainfall excess and watershed characteristics; its dominance is confirmed across successive reviews of the application literature (Labade et al., 2025; Sahu et al., 2023). The curve number aggregates the combined influence of soil, land use, land treatment, and antecedent moisture condition on runoff potential, with higher values corresponding to greater runoff generation and lower values to greater infiltration and storage. The method is directly relevant to the present study because the Gumai Beel catchment combines agricultural and wetland land uses whose soil and land-use characteristics can be mapped spatially through GIS.</w:t>
+        <w:t>The SCS-CN method is the most widely used loss method in HEC-HMS because it provides a simple, well-documented relationship between rainfall excess and watershed characteristics; successive reviews confirm its dominance in event-based modelling (Labade et al., 2025; Sahu et al., 2023). The curve number combines the influence of soil, land use, land treatment, and antecedent moisture on runoff potential: higher values indicate greater runoff, and lower values indicate greater infiltration and storage (Soulis, 2021). The method is relevant to the present study because the Gumai Beel catchment contains agricultural and wetland land uses whose soil and land-use characteristics can be mapped spatially through GIS (Ranjan &amp; Singh, 2022).</w:t>
       </w:r>
     </w:p>
     <w:p>
@@ -416,7 +416,7 @@
         <w:jc w:val="left"/>
       </w:pPr>
       <w:r>
-        <w:t>The transform method converts excess rainfall into direct runoff and thereby determines the shape and timing of the simulated hydrograph. The SCS Unit Hydrograph is the most frequently applied transform in HEC-HMS: it requires only the basin lag time and applies a standardised dimensionless relationship to distribute excess precipitation in time. Alternatives include the Clark and Snyder unit hydrographs, ModClark, and kinematic-wave approaches, with the choice governed by watershed characteristics and data availability (USACE, n.d.). The pairing of the SCS Unit Hydrograph with SCS-CN losses and recession baseflow remains the standard configuration for rainfall–runoff and flood simulation in GIS-supported frameworks (Jawale &amp; Thube, 2025).</w:t>
+        <w:t>The transform method converts excess rainfall into direct runoff and thereby determines the shape and timing of the simulated hydrograph. The SCS Unit Hydrograph is the most frequently applied transform in HEC-HMS: it requires only the basin lag time and applies a standardised dimensionless relationship to distribute excess precipitation in time (Labade et al., 2025). Alternatives include the Clark and Snyder unit hydrographs, ModClark, and kinematic-wave approaches, and the choice depends on watershed characteristics and available data (USACE, n.d.). The combination of the SCS Unit Hydrograph with SCS-CN losses and recession baseflow remains the standard configuration in GIS-supported rainfall–runoff and flood modelling (Jawale &amp; Thube, 2025).</w:t>
       </w:r>
     </w:p>
     <w:p>
@@ -434,7 +434,7 @@
         <w:jc w:val="left"/>
       </w:pPr>
       <w:r>
-        <w:t>Baseflow represents the sustained component of streamflow that is not produced directly by the current rainfall event, originating instead from groundwater discharge, delayed subsurface flow, and other forms of watershed storage. Its representation is frequently problematic because groundwater processes are poorly observed, and discrepancies between simulated and observed hydrographs concentrate accordingly in the recession limb. The difficulty is evident in the Halda River catchment, where an HEC-HMS model achieved satisfactory agreement with observed discharge across several performance indicators yet reproduced the baseflow component poorly during calibration (Haque et al., 2024). The issue is potentially significant for the Gumai Beel–Ichamoti system, in which wetland storage and subsurface-water interaction may sustain flow between rainfall events.</w:t>
+        <w:t>Baseflow is the sustained component of streamflow that is not produced directly by the current rainfall event. It originates from groundwater discharge, delayed subsurface flow, and other forms of watershed storage, and it is difficult to represent because groundwater processes are usually poorly observed (Odey &amp; Cho, 2025). Discrepancies between simulated and observed hydrographs therefore concentrate in the recession limb. This difficulty is evident in the Halda River catchment, where an HEC-HMS model agreed satisfactorily with observed discharge on several indicators yet reproduced the baseflow component poorly during calibration (Haque et al., 2024). The issue is potentially important for the Gumai Beel–Ichamoti system, where wetland storage and subsurface interaction may sustain flow between rainfall events (Islam et al., 2021).</w:t>
       </w:r>
     </w:p>
     <w:p>
@@ -452,7 +452,7 @@
         <w:jc w:val="left"/>
       </w:pPr>
       <w:r>
-        <w:t>Channel routing describes the passage of runoff through the river network and accounts for the translation and attenuation of the hydrograph produced by channel storage and travel time. The Muskingum method is the most frequently applied routing formulation in HEC-HMS because it represents channel storage and flood-wave propagation through only two parameters, the travel-time and storage parameter K and the dimensionless weighting factor X (Labade et al., 2025). In Bangladesh, Muskingum routing combined with SCS-CN losses has supported calibrated and validated simulation of the Gumti River Basin using observed rainfall and discharge records (Nujhat et al., 2024). Routing is essential to the present study because the objective extends beyond runoff generation within the catchment to the movement of the generated flow through the Ichamoti drainage network.</w:t>
+        <w:t>Channel routing describes the movement of runoff through the river network and accounts for the translation and attenuation of the hydrograph caused by channel storage and travel time. The Muskingum method is used most frequently in HEC-HMS because it represents these effects through only two parameters, the travel-time and storage parameter K and the weighting factor X (Labade et al., 2025). In Bangladesh, Muskingum routing combined with SCS-CN losses supported the calibrated and validated simulation of the Gumti River Basin from observed rainfall and discharge records (Nujhat et al., 2024). Routing is important for the present study because the objective includes not only runoff generation within the catchment but also the movement of that flow through the Ichamoti drainage network (Zhang et al., 2022).</w:t>
       </w:r>
     </w:p>
     <w:p>
@@ -469,7 +469,7 @@
         <w:jc w:val="left"/>
       </w:pPr>
       <w:r>
-        <w:t>The SCS Curve Number method is an empirical procedure for estimating direct runoff from rainfall through a single parameter, the curve number, that encodes watershed characteristics. Its modest data requirements and its compatibility with GIS-based parameterisation account for its continued dominance in applied practice (Soulis, 2021). Runoff response in the method is controlled by the potential maximum retention S, which is related inversely to the curve number; the curve number itself is determined from land use, hydrologic soil group, land treatment, and antecedent moisture condition. The governing relationship is expressed as</w:t>
+        <w:t>The SCS Curve Number method is an empirical approach for estimating direct runoff from rainfall through a single parameter, the curve number, which represents watershed characteristics. Its modest data requirements and its compatibility with GIS-based parameterisation explain its continued dominance in applied practice (Soulis, 2021). Runoff response is controlled by the potential maximum retention S, which is inversely related to the curve number; the curve number itself is determined from land use, hydrologic soil group, land treatment, and antecedent moisture condition (Soulis, 2021). The governing relationship is expressed as</w:t>
       </w:r>
     </w:p>
     <w:p>
@@ -489,7 +489,7 @@
         <w:jc w:val="left"/>
       </w:pPr>
       <w:r>
-        <w:t>where Q is the direct runoff depth, P is the precipitation depth, Ia is the initial abstraction, and S is the potential maximum retention. In the conventional formulation the initial abstraction is taken as a fixed fraction of the potential retention, and the HEC-HMS implementation permits both the curve number and the initial abstraction to be specified explicitly (USACE, n.d.).</w:t>
+        <w:t>where Q is the direct runoff depth, P is the precipitation depth, Ia is the initial abstraction, and S is the potential maximum retention. In the conventional formulation, the initial abstraction is taken as a fixed fraction of the potential retention, and the HEC-HMS implementation allows both the curve number and the initial abstraction to be specified explicitly (USACE, n.d.).</w:t>
       </w:r>
     </w:p>
     <w:p>
@@ -498,7 +498,7 @@
         <w:jc w:val="left"/>
       </w:pPr>
       <w:r>
-        <w:t>The appeal of the method for GIS-based modelling lies in its capacity to translate spatial soil and land-use information directly into runoff potential. ArcGIS-derived soil and LULC layers have supplied curve numbers for successful HEC-HMS application in the Punpun River Basin (Ranjan &amp; Singh, 2022), and the combination of SCS-CN with the SCS Unit Hydrograph and recession baseflow continues to support flood-oriented rainfall–runoff modelling (Jawale &amp; Thube, 2025). The method nevertheless carries recognised limitations: it compresses complex infiltration and storage processes into a single parameter, its conventional initial abstraction ratio of 0.2 has been found in many settings to overestimate initial losses substantially, and it does not track the evolution of soil moisture through long continuous simulations (Soulis, 2021). Application therefore requires deliberate attention to the temporal scale of the simulation and the characteristics of the study area.</w:t>
+        <w:t>The appeal of the method for GIS-based modelling lies in its ability to translate spatial soil and land-use information directly into runoff potential. ArcGIS-derived soil and LULC layers supplied the curve numbers for a successful HEC-HMS application in the Punpun River Basin (Ranjan &amp; Singh, 2022), and the combination of SCS-CN with the SCS Unit Hydrograph and recession baseflow continues to support flood-oriented modelling (Jawale &amp; Thube, 2025). The method nevertheless has recognised limitations. It compresses complex infiltration and storage processes into a single parameter, the conventional initial abstraction ratio of 0.2 has been found in many settings to overestimate initial losses, and the method does not track the evolution of soil moisture through long continuous simulations (Shi &amp; Wang, 2020; Soulis, 2021). It should therefore be applied with attention to the temporal scale of the simulation and the characteristics of the study area.</w:t>
       </w:r>
     </w:p>
     <w:p>
@@ -515,7 +515,7 @@
         <w:jc w:val="left"/>
       </w:pPr>
       <w:r>
-        <w:t>GIS has become integral to hydrological modelling because watershed characteristics are inherently spatial. It provides the tools for processing DEMs, land-use maps, soil maps, and drainage networks into the parameters that a hydrological model requires. A typical GIS-supported HEC-HMS workflow begins with DEM preprocessing, in which sink filling and flow-direction analysis are followed by flow-accumulation analysis and stream-network extraction; the resulting network is then used to delineate sub-basins and locate the watershed outlet.</w:t>
+        <w:t>GIS has become an integral component of hydrological modelling because watershed characteristics are inherently spatial. It provides the tools for converting DEMs, land-use maps, soil maps, and drainage networks into the parameters that a hydrological model requires. A typical GIS-supported HEC-HMS workflow begins with DEM preprocessing, in which sink filling and flow-direction analysis are followed by flow-accumulation analysis and stream-network extraction; the resulting network is then used to delineate sub-basins and locate the watershed outlet (Jawale &amp; Thube, 2025).</w:t>
       </w:r>
     </w:p>
     <w:p>
@@ -524,7 +524,7 @@
         <w:jc w:val="left"/>
       </w:pPr>
       <w:r>
-        <w:t>The conversion of spatial watershed information into model parameters is well established in recent practice. ArcGIS-based preparation of LULC, soil, and slope layers has supplied curve numbers for HEC-HMS simulation of the Punpun River Basin (Ranjan &amp; Singh, 2022), and DEM-derived delineation combined with soil and land-use overlay has yielded spatially distributed curve-number estimates for urban flood modelling (Jawale &amp; Thube, 2025). The accuracy of this chain nevertheless rests on the terrain analysis at its head, and delineation outcomes in low-relief terrain are sensitive to DEM choice, resolution, and threshold settings (Datta et al., 2022). GIS integration is therefore central to the present study, in which the Gumai Beel catchment must be delineated from topographic data and its spatial characteristics incorporated into the rainfall–runoff model.</w:t>
+        <w:t>The conversion of spatial information into model parameters is well established in recent practice. ArcGIS-based preparation of LULC, soil, and slope layers supplied the curve numbers for HEC-HMS simulation of the Punpun River Basin (Ranjan &amp; Singh, 2022), and DEM-derived delineation combined with soil and land-use overlay produced spatially distributed curve numbers for urban flood modelling (Jawale &amp; Thube, 2025). The reliability of this workflow, however, rests on the terrain analysis at its head, because delineation outcomes in low-relief terrain are sensitive to DEM choice, resolution, and threshold settings (Datta et al., 2022). GIS integration is therefore central to the present study, in which the Gumai Beel catchment must be delineated from topographic data and its spatial characteristics incorporated into the rainfall–runoff model.</w:t>
       </w:r>
     </w:p>
     <w:p>
@@ -541,7 +541,7 @@
         <w:jc w:val="left"/>
       </w:pPr>
       <w:r>
-        <w:t>HEC-HMS supports both event-based and continuous rainfall–runoff simulation. Event-based modelling reproduces the response to individual storms and is standard practice for flood estimation and design-storm analysis, whereas continuous modelling simulates watershed behaviour over extended periods and therefore requires representation of evolving soil moisture, groundwater, evapotranspiration, and other slow processes. A systematic review of applications from 2000 to 2023 confirms that event-based simulations rely predominantly on the SCS-CN and SCS Unit Hydrograph methods, that continuous simulations require dynamic soil-moisture and baseflow representations such as Soil Moisture Accounting and linear-reservoir baseflow, and that the choice between the two modes should follow from the intended application and the available data (Odey &amp; Cho, 2025).</w:t>
+        <w:t>HEC-HMS supports both event-based and continuous rainfall–runoff simulation. Event-based modelling reproduces the response to individual storms and is standard for flood estimation and design-storm analysis, whereas continuous modelling simulates watershed behaviour over long periods and therefore requires representation of changing soil moisture, groundwater, and evapotranspiration. A review of applications from 2000 to 2023 confirms that event-based simulations rely mainly on the SCS-CN and SCS Unit Hydrograph methods, that continuous simulations require dynamic soil-moisture and baseflow representations such as Soil Moisture Accounting and linear-reservoir baseflow, and that the choice between modes should follow from the intended application and the available data (Odey &amp; Cho, 2025).</w:t>
       </w:r>
     </w:p>
     <w:p>
@@ -550,7 +550,7 @@
         <w:jc w:val="left"/>
       </w:pPr>
       <w:r>
-        <w:t>Direct empirical comparison of the two modes is available for the Sirba River Basin, where a continuous simulation spanning 2006–2020 was evaluated alongside event-based simulations of selected major floods. Both schemes performed satisfactorily, but the event-based simulations achieved higher accuracy, with R² of 0.94–0.98 against 0.84–0.87 for the continuous case, and the calibrated parameter distributions differed materially between schemes, confirming that the modelling mode itself conditions parameter estimation and should be selected according to the study objective (Souley Tangam et al., 2024).</w:t>
+        <w:t>A direct empirical comparison of the two modes is available for the Sirba River Basin, where a continuous simulation over 2006–2020 was evaluated alongside event-based simulations of selected major floods. Both schemes performed satisfactorily, but the event-based simulations were more accurate, with R² of 0.94–0.98 against 0.84–0.87 for the continuous case, and the calibrated parameter distributions differed between schemes, showing that the modelling mode itself conditions parameter estimation (Souley Tangam et al., 2024).</w:t>
       </w:r>
     </w:p>
     <w:p>
@@ -559,7 +559,7 @@
         <w:jc w:val="left"/>
       </w:pPr>
       <w:r>
-        <w:t>For the Gumai Beel–Ichamoti system, the appropriate mode follows from the temporal resolution and duration of the available rainfall and discharge records. Event-based simulation is suitable if the principal purpose is to reproduce individual high-flow events, whereas sufficiently long continuous observations would permit a continuous simulation capturing the full seasonal cycle of wetland storage and release.</w:t>
+        <w:t>For the Gumai Beel–Ichamoti system, the appropriate mode follows from the temporal resolution and duration of the available rainfall and discharge records (Odey &amp; Cho, 2025). Event-based simulation is suitable if the main purpose is to reproduce individual high-flow events, whereas sufficiently long continuous observations would permit a continuous simulation that captures the full seasonal cycle of wetland storage and release.</w:t>
       </w:r>
     </w:p>
     <w:p>
@@ -576,7 +576,7 @@
         <w:jc w:val="left"/>
       </w:pPr>
       <w:r>
-        <w:t>Calibration is indispensable in rainfall–runoff modelling because several HEC-HMS parameters cannot be measured directly and must be inferred from the observed response of the watershed. During calibration, parameters are adjusted systematically to minimise the discrepancy between observed and simulated discharge. A defensible calibration considers multiple attributes of the hydrograph simultaneously, including peak discharge, runoff volume, time to peak, the rising and recession limbs, and low-flow behaviour, since agreement in a single statistic can conceal compensating errors elsewhere. Validation against an independent period of observations then provides the decisive test of whether the calibrated model can reproduce hydrological behaviour under conditions not used for parameter estimation.</w:t>
+        <w:t>Calibration is essential in rainfall–runoff modelling because several HEC-HMS parameters cannot be measured directly and must be estimated from the observed response of the watershed (Turkar et al., 2025). During calibration, parameters are adjusted to reduce the difference between observed and simulated discharge. A sound calibration considers several attributes of the hydrograph at once, including peak discharge, runoff volume, time to peak, the rising and recession limbs, and low-flow behaviour, because agreement in one statistic can hide compensating errors elsewhere. Validation against an independent period of observations then tests whether the calibrated model can reproduce hydrological behaviour under conditions not used for parameter estimation (Sahu et al., 2023).</w:t>
       </w:r>
     </w:p>
     <w:p>
@@ -585,7 +585,7 @@
         <w:jc w:val="left"/>
       </w:pPr>
       <w:r>
-        <w:t>Performance is conventionally quantified using the Nash–Sutcliffe efficiency (NSE), the coefficient of determination (R²), the root-mean-square error (RMSE), and percent bias (PBIAS), which provide complementary information on correlation, volume error, and overall fit. In the Punpun River Basin, evaluation of daily, monthly, and monsoonal HEC-HMS models against R², NSE, PBIAS, and RSR indicated generally satisfactory performance, with the monthly formulation superior to both alternatives (Ranjan &amp; Singh, 2022). In Bangladesh, the hydrological component of a coupled HEC-HMS–HEC-RAS flood-risk framework for the Old Brahmaputra floodplain achieved NSE values of 0.93 and 0.81, R² values of 0.95 and 0.89, and PBIAS of −1.17% and 2.40% for calibration and validation respectively, confirming that HEC-HMS can supply reliable hydrological input to flood-risk assessment where adequate observations support calibration (Zhang et al., 2022).</w:t>
+        <w:t>Model performance is commonly quantified using the Nash–Sutcliffe Efficiency (NSE), the coefficient of determination (R²), the root-mean-square error (RMSE), and percent bias (PBIAS), which provide complementary information on correlation, volume error, and overall fit (Labade et al., 2025). In the Punpun River Basin, evaluation of daily, monthly, and monsoonal HEC-HMS models against R², NSE, PBIAS, and RSR showed generally satisfactory performance, with the monthly model the strongest (Ranjan &amp; Singh, 2022). In Bangladesh, the hydrological component of a coupled HEC-HMS–HEC-RAS flood-risk framework for the Old Brahmaputra floodplain achieved NSE values of 0.93 and 0.81, R² values of 0.95 and 0.89, and PBIAS of −1.17% and 2.40% for calibration and validation respectively, confirming that HEC-HMS can supply reliable hydrological input to flood-risk assessment when adequate observations are available (Zhang et al., 2022).</w:t>
       </w:r>
     </w:p>
     <w:p>
@@ -594,7 +594,7 @@
         <w:jc w:val="left"/>
       </w:pPr>
       <w:r>
-        <w:t>Numerical thresholds alone, however, do not establish model adequacy. Visual comparison of observed and simulated hydrographs remains essential, because a model can attain a satisfactory NSE while misrepresenting particular flood peaks or recession behaviour that matter for the intended application.</w:t>
+        <w:t>Numerical thresholds alone, however, do not establish model adequacy. Visual comparison of observed and simulated hydrographs remains necessary, because a model can reach a satisfactory NSE while still misrepresenting particular flood peaks or recession behaviour that matter for the intended application (Odey &amp; Cho, 2025; Turkar et al., 2025).</w:t>
       </w:r>
     </w:p>
     <w:p>
@@ -611,7 +611,7 @@
         <w:jc w:val="left"/>
       </w:pPr>
       <w:r>
-        <w:t>Model parameters differ widely in their influence on simulated streamflow, and sensitivity analysis identifies those exerting the greatest control so that calibration effort can be concentrated where it matters. In HEC-HMS, the influential parameters are associated with rainfall losses, basin response, baseflow, and routing. For SCS-CN-based models the curve number is typically dominant, since it directly governs the conversion of precipitation into excess rainfall; transform parameters such as lag time control the timing and shape of the hydrograph; and routing parameters control downstream translation and attenuation. Curve number, infiltration-related parameters, lag time, and baseflow parameters have been identified consistently as the components requiring the most careful calibration (Turkar et al., 2025), and sensitivity analysis in the Sirba River Basin similarly ranked curve number, initial abstraction, lag time, and routing time factors as the most influential controls on model output (Souley Tangam et al., 2024).</w:t>
+        <w:t>Model parameters differ in their influence on simulated streamflow, and sensitivity analysis identifies the parameters that control model output so that calibration effort can be directed efficiently. In HEC-HMS, the influential parameters relate to rainfall losses, basin response, baseflow, and routing. For SCS-CN-based models the curve number is usually dominant because it directly governs the conversion of rainfall into excess; lag time controls hydrograph timing and shape; and routing parameters control downstream translation and attenuation. Curve number, infiltration-related parameters, lag time, and baseflow parameters have been identified consistently as the components requiring the most careful calibration (Turkar et al., 2025), and sensitivity analysis in the Sirba River Basin likewise ranked curve number, initial abstraction, lag time, and routing time factors as the most influential (Souley Tangam et al., 2024).</w:t>
       </w:r>
     </w:p>
     <w:p>
@@ -620,7 +620,7 @@
         <w:jc w:val="left"/>
       </w:pPr>
       <w:r>
-        <w:t>Parameter uncertainty acquires particular importance where observations are limited, because different parameter combinations can produce nearly identical hydrographs. A satisfactory calibration therefore does not guarantee that each parameter carries a unique physical interpretation. For the Gumai Beel–Ichamoti system, sensitivity analysis will identify the parameters most influential on simulated discharge and ensure that the calibration is both efficient and defensible.</w:t>
+        <w:t>Parameter uncertainty becomes especially important when observations are limited, because different parameter combinations can produce nearly identical hydrographs, and a satisfactory calibration therefore does not guarantee that each parameter carries a unique physical interpretation (Sahu et al., 2023). For the Gumai Beel–Ichamoti system, sensitivity analysis will identify the parameters most influential on simulated discharge and ensure that calibration is concentrated on the parameters that matter most (Turkar et al., 2025).</w:t>
       </w:r>
     </w:p>
     <w:p>
@@ -637,7 +637,7 @@
         <w:jc w:val="left"/>
       </w:pPr>
       <w:r>
-        <w:t>Applications published since 2020 confirm the continued use of HEC-HMS across a wide range of climatic and physiographic settings. In the Punpun River Basin of eastern India, daily rainfall and runoff observations combined with GIS-derived LULC, soil, and slope data supported parallel daily, monthly, and monsoonal models, of which the monthly model performed best, underlining the influence of temporal scale on simulation quality (Ranjan &amp; Singh, 2022). In the Sirba River Basin of West Africa, continuous and event-based simulations both achieved satisfactory performance, with the event-based scheme superior for the selected flood events (Souley Tangam et al., 2024). In a Romanian catchment with increased groundwater discharge potential, the SCS-CN, SCS Unit Hydrograph, and Muskingum configuration proved applicable even where groundwater processes influence catchment response (Herbei et al., 2024).</w:t>
+        <w:t>Applications published since 2020 confirm that HEC-HMS remains in wide use across diverse climatic and physiographic settings. In the Punpun River Basin of eastern India, daily rainfall and runoff observations combined with GIS-derived LULC, soil, and slope data supported daily, monthly, and monsoonal models, of which the monthly model performed best, underlining the influence of temporal scale on simulation quality (Ranjan &amp; Singh, 2022). In the Sirba River Basin of West Africa, continuous and event-based simulations both achieved satisfactory performance, with the event-based scheme superior for the selected flood events (Souley Tangam et al., 2024). In a Romanian catchment with increased groundwater discharge potential, the SCS-CN, SCS Unit Hydrograph, and Muskingum configuration proved applicable even where groundwater processes influence the catchment response (Herbei et al., 2024).</w:t>
       </w:r>
     </w:p>
     <w:p>
@@ -646,7 +646,7 @@
         <w:jc w:val="left"/>
       </w:pPr>
       <w:r>
-        <w:t>Integration with hydraulic modelling has extended the reach of these applications. In the Cypress Creek watershed of Texas, wetlands represented as reservoirs within HEC-HMS were combined with HEC-RAS river hydraulics to examine the influence of wetland size and location on watershed-scale flood control; upstream placement and greater wetland storage reduced downstream flood area, depth, and duration (Tang et al., 2020). This finding carries direct conceptual relevance for wetland-dominated catchments, because it demonstrates quantitatively that wetland storage modifies the downstream hydrological response. Collectively, these studies establish that HEC-HMS is not confined to conventional river catchments: its flexible representation of sub-basins, storage, losses, runoff transformation, and routing renders it applicable to systems in which wetlands regulate runoff behaviour.</w:t>
+        <w:t>Integration with hydraulic modelling has extended these applications further. In the Cypress Creek watershed of Texas, wetlands represented as reservoirs within HEC-HMS were combined with HEC-RAS river hydraulics to examine the effect of wetland size and location on watershed-scale flood control; upstream placement and greater storage reduced downstream flood area, depth, and duration (Tang et al., 2020). This finding is conceptually important for wetland-dominated catchments because it shows quantitatively that wetland storage modifies the downstream hydrological response. Taken together, these studies establish that HEC-HMS is not restricted to conventional river catchments: its flexible representation of sub-basins, storage, losses, transformation, and routing makes it applicable to systems in which wetlands regulate runoff behaviour (Odey &amp; Cho, 2025; Tang et al., 2020).</w:t>
       </w:r>
     </w:p>
     <w:p>
@@ -663,7 +663,7 @@
         <w:jc w:val="left"/>
       </w:pPr>
       <w:r>
-        <w:t>Wetlands are integral components of watershed hydrology because they store precipitation and runoff temporarily and thereby modify the timing and magnitude of downstream flows. The strength of this regulation depends on wetland size, position within the watershed, storage capacity, connectivity, vegetation, soil characteristics, and the relationship with surrounding rivers. Hydrologic–hydraulic simulation of the Cypress Creek watershed demonstrates the principle directly: larger wetlands, and wetlands located farther upstream, reduced downstream inundation extent, depth, and duration (Tang et al., 2020). Although derived from a North American case study, the result expresses a general mechanism, namely that wetland storage alters the timing and magnitude of runoff delivered to downstream channels.</w:t>
+        <w:t>Wetlands are important components of watershed hydrology because they store precipitation and runoff temporarily and thereby influence the timing and magnitude of downstream flows. The strength of this regulation depends on wetland size, location, storage capacity, connectivity, vegetation, soil characteristics, and the relationship with surrounding rivers (Tang et al., 2020). Hydrologic–hydraulic simulation of the Cypress Creek watershed demonstrates the principle directly: larger wetlands, and wetlands located farther upstream, reduced downstream inundation extent, depth, and duration (Tang et al., 2020). Although derived from a North American case, the result expresses a general mechanism, namely that wetland storage alters the timing and magnitude of runoff delivered to downstream channels.</w:t>
       </w:r>
     </w:p>
     <w:p>
@@ -672,7 +672,7 @@
         <w:jc w:val="left"/>
       </w:pPr>
       <w:r>
-        <w:t>Wetlands hold particular significance in Bangladesh, whose floodplains contain numerous seasonal and permanent depressional water bodies. Beels are characteristically saucer-shaped depressions that retain water through the wet season and dry partially or completely thereafter, and their hydrological behaviour is coupled closely to seasonal flooding and river connectivity. Hydromorphodynamic simulation of beels within the polders of the Ganges–Brahmaputra–Meghna delta has revealed strong spatial and seasonal variability in their hydrological and sedimentation behaviour, governed by the seasonal flow regime and the interaction between the beel and the surrounding river system (Islam et al., 2021).</w:t>
+        <w:t>Wetlands are particularly significant in Bangladesh, whose floodplains contain numerous seasonal and permanent depressional water bodies. Beels are saucer-shaped depressions that retain water during the wet season and dry partially or completely during the dry season, and their behaviour is closely linked to seasonal flooding and river connectivity (Adnan et al., 2020). Simulation of beels within the polders of the Ganges–Brahmaputra–Meghna delta has revealed strong spatial and seasonal variability in their hydrological and sedimentation behaviour, governed by the seasonal flow regime and the interaction between the beel and the surrounding river system (Islam et al., 2021).</w:t>
       </w:r>
     </w:p>
     <w:p>
@@ -681,7 +681,7 @@
         <w:jc w:val="left"/>
       </w:pPr>
       <w:r>
-        <w:t>These characteristics distinguish beel systems from conventional upland watersheds. In a beel-dominated catchment, rainfall typically contributes first to temporary surface storage and only subsequently drains to downstream channels, so that the runoff peak is delayed and attenuated relative to an equivalent upland response. For rainfall–runoff modelling this creates a specific challenge: a conventional model structure may reproduce runoff generation adequately yet require careful representation of storage and routing to reproduce downstream hydrograph timing. A sound understanding of the wetland’s hydrological character is therefore prerequisite to selecting the appropriate HEC-HMS structure.</w:t>
+        <w:t>These characteristics distinguish beel systems from conventional upland watersheds. In a beel-dominated catchment, rainfall typically contributes first to temporary surface storage and only later drains to downstream channels, so the runoff peak is delayed and attenuated relative to an equivalent upland response (Islam et al., 2021; Tang et al., 2020). For rainfall–runoff modelling this creates a specific challenge: a conventional model may reproduce runoff generation satisfactorily yet require careful representation of storage and routing to reproduce downstream hydrograph timing. Understanding the hydrological character of the wetland is therefore a prerequisite for selecting the appropriate HEC-HMS structure (Odey &amp; Cho, 2025).</w:t>
       </w:r>
     </w:p>
     <w:p>
@@ -698,7 +698,7 @@
         <w:jc w:val="left"/>
       </w:pPr>
       <w:r>
-        <w:t>Bangladesh presents a complex hydrological environment characterised by monsoonal rainfall, extensive floodplains, a dense river network, abundant wetlands, and pronounced seasonal variation in water levels and discharge. Flooding recurs annually and constitutes a principal concern for agriculture, infrastructure, ecosystems, and communities. Reliable rainfall–runoff models are therefore essential for understanding watershed behaviour and supporting flood-management strategies, yet their development is complicated by the limited spatial coverage of rainfall and discharge observations.</w:t>
+        <w:t>Bangladesh has a complex hydrological environment characterised by monsoonal rainfall, extensive floodplains, a dense river network, abundant wetlands, and strong seasonal variation in water levels and discharge. Flooding recurs annually and is a major concern for agriculture, infrastructure, ecosystems, and communities (Akter &amp; Sawon, 2024; Zhang et al., 2022). Reliable rainfall–runoff models are therefore needed to understand watershed behaviour and support flood management, yet their development is complicated by the limited spatial coverage of rainfall and discharge observations (Nur et al., 2022).</w:t>
       </w:r>
     </w:p>
     <w:p>
@@ -707,7 +707,7 @@
         <w:jc w:val="left"/>
       </w:pPr>
       <w:r>
-        <w:t>Recent studies document the expanding application of HEC-HMS across the country. For the flash-flood-prone Khowai River Basin, a calibrated and validated HEC-HMS model generated runoff information from available rainfall data under conditions in which discharge observations are limited (Nur et al., 2022). For the Gumti River Basin, SRTM-based delineation, SCS-CN losses, and Muskingum routing supported calibration against 2019–2020 observations and validation against 2021 records, with performance evaluated through R², NSE, RSR, and PBIAS and the calibrated model recommended for flood prediction and water-resources planning (Nujhat et al., 2024). In the Halda River catchment, a cascade-reservoir HEC-HMS framework with curve numbers optimised against SWAT simulation results achieved agreement with observed discharge across several performance indicators, although baseflow representation remained a documented weakness (Haque et al., 2024). These studies confirm that HEC-HMS can be applied successfully to Bangladeshi catchments while indicating that performance depends on careful calibration and appropriate representation of watershed processes.</w:t>
+        <w:t>Recent studies document the expanding application of HEC-HMS across the country. For the flash-flood-prone Khowai River Basin, a calibrated and validated HEC-HMS model generated runoff information from available rainfall data under conditions of limited discharge observation (Nur et al., 2022). For the Gumti River Basin, SRTM-based delineation, SCS-CN losses, and Muskingum routing supported calibration against 2019–2020 observations and validation against 2021 records, with performance evaluated through R², NSE, RSR, and PBIAS and the calibrated model recommended for flood prediction and water-resources planning (Nujhat et al., 2024). In the Halda River catchment, a cascade-reservoir HEC-HMS framework with curve numbers optimised against SWAT results achieved agreement with observed discharge across several indicators, although baseflow representation remained a documented weakness (Haque et al., 2024). Hydrological models of selected flash-flood-prone rivers have further advanced the understanding of rapid-response behaviour under monsoonal forcing (Akter &amp; Sawon, 2024). Together, these studies confirm that HEC-HMS can be applied successfully in Bangladesh while showing that performance depends on careful calibration and appropriate representation of watershed processes.</w:t>
       </w:r>
     </w:p>
     <w:p>
@@ -724,7 +724,7 @@
         <w:jc w:val="left"/>
       </w:pPr>
       <w:r>
-        <w:t>Application of HEC-HMS in Bangladesh has progressed beyond rainfall–runoff simulation toward integrated flood modelling. For the Old Brahmaputra River floodplain, an integrated flood-risk framework coupled HEC-HMS with HEC-RAS 1D/2D hydraulics and a bottom-up vulnerability analysis: the hydrological model generated the flows used in the hydraulic flood simulation, the combined framework returned strong calibration and validation statistics, and the results demonstrated the value of integrating hydrological and hydraulic models for flood-risk assessment (Zhang et al., 2022).</w:t>
+        <w:t>The application of HEC-HMS in Bangladesh has expanded beyond rainfall–runoff simulation toward integrated flood modelling. For the Old Brahmaputra River floodplain, an integrated flood-risk framework coupled HEC-HMS with HEC-RAS 1D/2D hydraulics and a bottom-up vulnerability analysis: the hydrological model generated the flows used in the hydraulic simulation, and the combined framework produced strong calibration and validation results, demonstrating the value of integrating hydrological and hydraulic models for flood-risk assessment (Zhang et al., 2022).</w:t>
       </w:r>
     </w:p>
     <w:p>
@@ -733,7 +733,7 @@
         <w:jc w:val="left"/>
       </w:pPr>
       <w:r>
-        <w:t>This form of integration bears directly on the present study, because a calibrated rainfall–runoff model constitutes the foundation for any subsequent hydraulic modelling of the Gumai Beel–Ichamoti system. Once rainfall-generated discharge can be simulated reliably, the resulting hydrographs may serve as boundary conditions for a hydraulic model such as HEC-RAS. The growing use of HEC-HMS in Bangladesh also reflects a broader movement toward spatially integrated modelling, in which GIS, DEMs, gridded rainfall products, and remote sensing are combined with observed discharge to strengthen model representation.</w:t>
+        <w:t>This form of integration is directly relevant to the present study, because a calibrated rainfall–runoff model is the foundation for any future hydraulic modelling of the Gumai Beel–Ichamoti system. Once rainfall-generated discharge can be simulated reliably, the resulting hydrographs can serve as boundary conditions for a hydraulic model such as HEC-RAS (Zhang et al., 2022). The growing use of HEC-HMS in Bangladesh also reflects a broader shift toward spatially integrated modelling, in which GIS, DEMs, gridded rainfall products, and remote sensing are combined with observed discharge to improve model representation (Labade et al., 2025).</w:t>
       </w:r>
     </w:p>
     <w:p>
@@ -750,7 +750,7 @@
         <w:jc w:val="left"/>
       </w:pPr>
       <w:r>
-        <w:t>HEC-HMS is not the only framework available for rainfall–runoff simulation. SWAT, a widely used semi-distributed watershed model, is particularly suited to long-term assessments involving land-use management, agricultural practice, sediment transport, and nutrient dynamics. The essential difference between the two lies in their objectives: HEC-HMS concentrates on precipitation–runoff transformation and hydrograph simulation, whereas SWAT represents the broader watershed water balance and land-management processes. Direct comparison in the Atrai–Karatoa River Basin of Bangladesh found that SWAT performed better for high flows under daily simulation while HEC-HMS was more accurate for medium flows, leading to the conclusion that model selection should follow from the intended application and the hydrological character of the watershed (Moniruzzaman &amp; Mahalder, 2026).</w:t>
+        <w:t>HEC-HMS is not the only framework available for rainfall–runoff simulation. SWAT, a widely used semi-distributed watershed model, is particularly suited to long-term assessments involving land-use management, agricultural practice, sediment transport, and nutrient dynamics. The essential difference lies in their objectives: HEC-HMS concentrates on precipitation–runoff transformation and hydrograph simulation, whereas SWAT represents the broader watershed water balance and land-management processes. A direct comparison in the Atrai–Karatoa River Basin of Bangladesh found that SWAT performed better for high flows under daily simulation while HEC-HMS was more accurate for medium flows, leading to the conclusion that model selection should follow from the intended application and the hydrological character of the watershed (Moniruzzaman &amp; Mahalder, 2026).</w:t>
       </w:r>
     </w:p>
     <w:p>
@@ -759,7 +759,7 @@
         <w:jc w:val="left"/>
       </w:pPr>
       <w:r>
-        <w:t>Machine-learning approaches, including artificial neural networks and long short-term memory networks, have also gained prominence. These models capture nonlinear rainfall–runoff relationships and can achieve high predictive accuracy where large training datasets exist, but their physical interpretability is lower than that of conceptual hydrological models. HEC-HMS is appropriate for the present study because the primary objective is to represent the rainfall–runoff response of a specific watershed through physically interpretable components, allowing rainfall losses, runoff transformation, baseflow, and channel routing to be examined separately.</w:t>
+        <w:t>Machine-learning approaches, including artificial neural networks and long short-term memory networks, have also become popular because they capture nonlinear rainfall–runoff relationships and can achieve high predictive accuracy where large training datasets exist; their physical interpretability, however, is lower than that of conceptual hydrological models (Sahu et al., 2023). HEC-HMS is appropriate for the present study because the primary objective is to represent the rainfall–runoff response of a specific watershed through physically interpretable components, allowing losses, transformation, baseflow, and routing to be examined separately (Turkar et al., 2025).</w:t>
       </w:r>
     </w:p>
     <w:p>
@@ -776,7 +776,7 @@
         <w:jc w:val="left"/>
       </w:pPr>
       <w:r>
-        <w:t>Four challenges condition rainfall–runoff modelling in Bangladesh. The first is the spatial variability of rainfall: monsoon precipitation, particularly during convective events, can vary substantially over short distances, so that a limited gauge network introduces uncertainty into estimates of mean areal precipitation. The second is the scarcity of discharge data, since many local rivers and wetland systems lack long-term gauging stations, complicating calibration and validation; this constraint applies with particular force to smaller catchments such as the Gumai Beel–Ichamoti system. The third is the complexity of interaction among rivers, floodplains, wetlands, and groundwater, which conventional rainfall–runoff models necessarily simplify, at the cost of potential errors in baseflow, storage, and recession behaviour. The fourth is the seasonal variation of land use and wetland storage in agricultural wetland environments, where land may be cultivated in one season and inundated in another, so that runoff characteristics do not remain constant through the year.</w:t>
+        <w:t>Four challenges condition rainfall–runoff modelling in Bangladesh. The first is the spatial variability of rainfall: monsoon precipitation, particularly during convective events, can vary substantially over short distances, so a limited gauge network introduces uncertainty into estimates of mean areal precipitation (Souley Tangam et al., 2024). The second is the scarcity of discharge data, because many local rivers and wetland systems lack long-term gauging stations, which complicates calibration and validation and applies with particular force to smaller catchments such as the Gumai Beel–Ichamoti system (Nur et al., 2022). The third is the complex interaction among rivers, floodplains, wetlands, and groundwater, which conventional models simplify at the cost of potential errors in baseflow, storage, and recession behaviour (Haque et al., 2024). The fourth is the seasonal variation of land use and wetland storage in agricultural wetland environments, where land is cultivated in one season and inundated in another, so runoff characteristics do not remain constant through the year (Islam et al., 2021).</w:t>
       </w:r>
     </w:p>
     <w:p>
@@ -785,7 +785,7 @@
         <w:jc w:val="left"/>
       </w:pPr>
       <w:r>
-        <w:t>The Bangladeshi studies reviewed above demonstrate that HEC-HMS delivers satisfactory rainfall–runoff simulation where suitable rainfall and discharge records exist, while underscoring the need for careful calibration, appropriate selection of model components, and explicit attention to local hydrological characteristics (Haque et al., 2024; Moniruzzaman &amp; Mahalder, 2026; Nujhat et al., 2024; Nur et al., 2022).</w:t>
+        <w:t>The Bangladeshi studies reviewed above show that HEC-HMS delivers satisfactory rainfall–runoff simulation where suitable rainfall and discharge records exist, while underscoring the need for careful calibration, appropriate selection of model components, and explicit attention to local hydrological characteristics (Haque et al., 2024; Moniruzzaman &amp; Mahalder, 2026; Nujhat et al., 2024; Nur et al., 2022).</w:t>
       </w:r>
     </w:p>
     <w:p>
@@ -802,7 +802,7 @@
         <w:jc w:val="left"/>
       </w:pPr>
       <w:r>
-        <w:t>The reviewed literature establishes that HEC-HMS has been applied extensively to rainfall–runoff simulation and flood assessment under diverse environmental conditions, and that recent research increasingly integrates the model with GIS, remote sensing, DEM-derived watershed characteristics, and hydraulic models. Several gaps nevertheless remain relevant to the present study.</w:t>
+        <w:t>The reviewed literature establishes that HEC-HMS has been applied extensively to rainfall–runoff simulation and flood assessment under diverse environmental conditions, and that recent research increasingly integrates the model with GIS, remote sensing, DEM-derived watershed characteristics, and hydraulic models (Labade et al., 2025; Odey &amp; Cho, 2025). Several gaps nevertheless remain relevant to the present study.</w:t>
       </w:r>
     </w:p>
     <w:p>
@@ -811,7 +811,7 @@
         <w:jc w:val="left"/>
       </w:pPr>
       <w:r>
-        <w:t>First, recent HEC-HMS research in Bangladesh has concentrated on comparatively large or well-studied river basins, including the Khowai, Halda, Old Brahmaputra, Gumti, and Atrai–Karatoa systems. These studies furnish valuable methodological precedents but do not necessarily represent the hydrological behaviour of smaller wetland-dominated catchments. Second, rainfall–runoff modelling of beel–river systems has received limited attention. Wetlands and beels act as temporary storage that alters the timing and magnitude of downstream runoff; international evidence confirms the influence of wetland storage on flood response (Tang et al., 2020), and Bangladeshi evidence confirms the strong seasonal and spatial variability of beel systems (Islam et al., 2021), yet few studies have carried these characteristics into a dedicated HEC-HMS framework for a Bangladeshi beel.</w:t>
+        <w:t>First, recent HEC-HMS research in Bangladesh has concentrated on comparatively large or well-studied basins, including the Khowai, Halda, Old Brahmaputra, Gumti, and Atrai–Karatoa systems (Haque et al., 2024; Moniruzzaman &amp; Mahalder, 2026; Nujhat et al., 2024; Nur et al., 2022; Zhang et al., 2022). These studies provide valuable methodological precedents but do not necessarily represent the behaviour of smaller wetland-dominated catchments. Second, rainfall–runoff modelling of beel–river systems has received limited attention. Wetlands and beels act as temporary storage that alters the timing and magnitude of downstream runoff; international evidence confirms the influence of wetland storage on flood response (Tang et al., 2020), and Bangladeshi evidence confirms the strong seasonal and spatial variability of beel systems (Islam et al., 2021), yet few studies have carried these characteristics into a dedicated HEC-HMS framework for a Bangladeshi beel.</w:t>
       </w:r>
     </w:p>
     <w:p>
@@ -820,7 +820,7 @@
         <w:jc w:val="left"/>
       </w:pPr>
       <w:r>
-        <w:t>Third, the literature search undertaken for the present study identified very limited recent peer-reviewed research addressing the Gumai Beel–Ichamoti River system with HEC-HMS, indicating a local-scale research gap rather than any general absence of hydrological modelling research in Bangladesh. Fourth, although previous Bangladeshi studies demonstrate the value of integrating observed rainfall, discharge, and GIS-derived DEM, land-use, and soil information, these approaches have been applied predominantly to larger conventional river basins; their extension to an agricultural wetland system such as Gumai Beel can yield new information on the rainfall–runoff response of a low-lying catchment. Finally, a calibrated and validated HEC-HMS model of Gumai Beel would provide the foundation for subsequent hydrological and hydraulic investigation, since the validated model could be linked with hydraulic models to examine flood extent, water levels, drainage behaviour, or future hydrological scenarios.</w:t>
+        <w:t>Third, the literature search undertaken for this study identified very limited recent peer-reviewed research addressing the Gumai Beel–Ichamoti River system with HEC-HMS, indicating a local-scale research gap rather than a general absence of hydrological modelling research in Bangladesh (Moniruzzaman &amp; Mahalder, 2026; Nujhat et al., 2024). Fourth, although previous Bangladeshi studies demonstrate the value of integrating observed rainfall, discharge, and GIS-derived DEM, land-use, and soil information, these approaches have been applied mainly to larger conventional river basins (Ranjan &amp; Singh, 2022; Zhang et al., 2022); their extension to an agricultural wetland system such as Gumai Beel can therefore yield new information on the rainfall–runoff response of a low-lying catchment. Finally, a calibrated and validated HEC-HMS model of Gumai Beel would provide the foundation for subsequent hydrological and hydraulic investigation, because the validated model could be linked with hydraulic models to examine flood extent, water levels, drainage behaviour, or future scenarios (Zhang et al., 2022).</w:t>
       </w:r>
     </w:p>
     <w:p>
@@ -837,7 +837,7 @@
         <w:jc w:val="left"/>
       </w:pPr>
       <w:r>
-        <w:t>The present study addresses the identified gap by developing a rainfall–runoff model of the Gumai Beel–Ichamoti River system in HEC-HMS, integrating rainfall and discharge observations with spatial information derived from GIS and DEM datasets. Watershed delineation supplies the spatial structure of the model, rainfall provides the primary meteorological forcing, and observed discharge supports calibration and validation, so that the reliability of the simulated runoff can be evaluated against appropriate statistical performance indicators.</w:t>
+        <w:t>The present study addresses the identified gap by developing a rainfall–runoff model of the Gumai Beel–Ichamoti River system in HEC-HMS, integrating rainfall and discharge observations with spatial information derived from GIS and DEM datasets, following the workflow established in recent GIS-supported applications (Jawale &amp; Thube, 2025; Ranjan &amp; Singh, 2022). Watershed delineation supplies the spatial structure of the model, rainfall provides the primary meteorological forcing, and observed discharge supports calibration and validation, so that simulated runoff can be evaluated against appropriate statistical performance indicators (Labade et al., 2025).</w:t>
       </w:r>
     </w:p>
     <w:p>
@@ -846,7 +846,7 @@
         <w:jc w:val="left"/>
       </w:pPr>
       <w:r>
-        <w:t>The study derives particular significance from the character of its setting. Gumai Beel is a low-lying agricultural and wetland environment whose hydrological response is expected to reflect not only rainfall but also topography, land use, soil characteristics, drainage connectivity, and temporary wetland storage. HEC-HMS provides an interpretable framework for examining these controls, since rainfall losses, direct-runoff transformation, baseflow, and routing are represented as separable components whose relative influence can be investigated individually.</w:t>
+        <w:t>The study derives particular significance from its setting. Gumai Beel is a low-lying agricultural and wetland environment whose hydrological response is expected to reflect not only rainfall but also topography, land use, soil characteristics, drainage connectivity, and temporary wetland storage (Islam et al., 2021; Tang et al., 2020). HEC-HMS provides an interpretable framework for examining these controls, because rainfall losses, direct-runoff transformation, baseflow, and routing are represented as separable components whose relative influence can be investigated individually (Turkar et al., 2025; USACE, n.d.).</w:t>
       </w:r>
     </w:p>
     <w:p>
@@ -855,7 +855,7 @@
         <w:jc w:val="left"/>
       </w:pPr>
       <w:r>
-        <w:t>The resulting model also establishes a foundation for subsequent research. The simulated discharge hydrographs could serve as inputs to HEC-RAS for hydraulic flood modelling, following the integrated HEC-HMS–HEC-RAS framework applied to the Old Brahmaputra floodplain (Zhang et al., 2022). The present study therefore contributes both to the hydrological understanding of Gumai Beel and to the wider application of GIS-supported HEC-HMS modelling in small, wetland-dominated catchments of Bangladesh.</w:t>
+        <w:t>The resulting model also establishes a foundation for future research. The simulated discharge hydrographs could serve as inputs to HEC-RAS for hydraulic flood modelling, following the integrated HEC-HMS–HEC-RAS framework applied to the Old Brahmaputra floodplain (Zhang et al., 2022). The present study therefore contributes both to the hydrological understanding of Gumai Beel and to the wider application of GIS-supported HEC-HMS modelling in small, wetland-dominated catchments of Bangladesh (Odey &amp; Cho, 2025; Tang et al., 2020).</w:t>
       </w:r>
     </w:p>
     <w:p>

</xml_diff>